<commit_message>
Agrega la introducción al documento de diseño
</commit_message>
<xml_diff>
--- a/Documento de diseno Iteracion 1.docx
+++ b/Documento de diseno Iteracion 1.docx
@@ -7,7 +7,6 @@
         <w:spacing w:after="160" w:line="480" w:lineRule="auto"/>
         <w:jc w:val="center"/>
         <w:rPr>
-          <w:rFonts w:ascii="Times New Roman" w:cs="Times New Roman" w:eastAsia="Times New Roman" w:hAnsi="Times New Roman"/>
           <w:sz w:val="24"/>
           <w:szCs w:val="24"/>
         </w:rPr>
@@ -16,7 +15,6 @@
       <w:bookmarkEnd w:id="0"/>
       <w:r>
         <w:rPr>
-          <w:rFonts w:ascii="Times New Roman" w:cs="Times New Roman" w:eastAsia="Times New Roman" w:hAnsi="Times New Roman"/>
           <w:sz w:val="24"/>
           <w:szCs w:val="24"/>
         </w:rPr>
@@ -64,14 +62,12 @@
         <w:spacing w:after="160" w:line="480" w:lineRule="auto"/>
         <w:jc w:val="center"/>
         <w:rPr>
-          <w:rFonts w:ascii="Times New Roman" w:cs="Times New Roman" w:eastAsia="Times New Roman" w:hAnsi="Times New Roman"/>
-          <w:sz w:val="24"/>
-          <w:szCs w:val="24"/>
-        </w:rPr>
-      </w:pPr>
-      <w:r>
-        <w:rPr>
-          <w:rFonts w:ascii="Times New Roman" w:cs="Times New Roman" w:eastAsia="Times New Roman" w:hAnsi="Times New Roman"/>
+          <w:sz w:val="24"/>
+          <w:szCs w:val="24"/>
+        </w:rPr>
+      </w:pPr>
+      <w:r>
+        <w:rPr>
           <w:sz w:val="24"/>
           <w:szCs w:val="24"/>
           <w:rtl w:val="0"/>
@@ -84,7 +80,6 @@
         <w:spacing w:after="160" w:line="480" w:lineRule="auto"/>
         <w:jc w:val="center"/>
         <w:rPr>
-          <w:rFonts w:ascii="Times New Roman" w:cs="Times New Roman" w:eastAsia="Times New Roman" w:hAnsi="Times New Roman"/>
           <w:sz w:val="24"/>
           <w:szCs w:val="24"/>
         </w:rPr>
@@ -100,14 +95,12 @@
         <w:spacing w:after="160" w:line="480" w:lineRule="auto"/>
         <w:jc w:val="center"/>
         <w:rPr>
-          <w:rFonts w:ascii="Times New Roman" w:cs="Times New Roman" w:eastAsia="Times New Roman" w:hAnsi="Times New Roman"/>
-          <w:sz w:val="24"/>
-          <w:szCs w:val="24"/>
-        </w:rPr>
-      </w:pPr>
-      <w:r>
-        <w:rPr>
-          <w:rFonts w:ascii="Times New Roman" w:cs="Times New Roman" w:eastAsia="Times New Roman" w:hAnsi="Times New Roman"/>
+          <w:sz w:val="24"/>
+          <w:szCs w:val="24"/>
+        </w:rPr>
+      </w:pPr>
+      <w:r>
+        <w:rPr>
           <w:sz w:val="24"/>
           <w:szCs w:val="24"/>
           <w:rtl w:val="0"/>
@@ -120,7 +113,6 @@
         <w:spacing w:after="160" w:line="480" w:lineRule="auto"/>
         <w:jc w:val="center"/>
         <w:rPr>
-          <w:rFonts w:ascii="Times New Roman" w:cs="Times New Roman" w:eastAsia="Times New Roman" w:hAnsi="Times New Roman"/>
           <w:sz w:val="24"/>
           <w:szCs w:val="24"/>
         </w:rPr>
@@ -136,14 +128,12 @@
         <w:spacing w:after="160" w:line="480" w:lineRule="auto"/>
         <w:jc w:val="center"/>
         <w:rPr>
-          <w:rFonts w:ascii="Times New Roman" w:cs="Times New Roman" w:eastAsia="Times New Roman" w:hAnsi="Times New Roman"/>
-          <w:sz w:val="24"/>
-          <w:szCs w:val="24"/>
-        </w:rPr>
-      </w:pPr>
-      <w:r>
-        <w:rPr>
-          <w:rFonts w:ascii="Times New Roman" w:cs="Times New Roman" w:eastAsia="Times New Roman" w:hAnsi="Times New Roman"/>
+          <w:sz w:val="24"/>
+          <w:szCs w:val="24"/>
+        </w:rPr>
+      </w:pPr>
+      <w:r>
+        <w:rPr>
           <w:b w:val="1"/>
           <w:bCs w:val="1"/>
           <w:sz w:val="24"/>
@@ -163,7 +153,6 @@
         <w:spacing w:after="160" w:line="480" w:lineRule="auto"/>
         <w:jc w:val="center"/>
         <w:rPr>
-          <w:rFonts w:ascii="Times New Roman" w:cs="Times New Roman" w:eastAsia="Times New Roman" w:hAnsi="Times New Roman"/>
           <w:sz w:val="24"/>
           <w:szCs w:val="24"/>
         </w:rPr>
@@ -179,14 +168,12 @@
         <w:spacing w:line="480" w:lineRule="auto"/>
         <w:jc w:val="center"/>
         <w:rPr>
-          <w:rFonts w:ascii="Times New Roman" w:cs="Times New Roman" w:eastAsia="Times New Roman" w:hAnsi="Times New Roman"/>
-          <w:sz w:val="24"/>
-          <w:szCs w:val="24"/>
-        </w:rPr>
-      </w:pPr>
-      <w:r>
-        <w:rPr>
-          <w:rFonts w:ascii="Times New Roman" w:cs="Times New Roman" w:eastAsia="Times New Roman" w:hAnsi="Times New Roman"/>
+          <w:sz w:val="24"/>
+          <w:szCs w:val="24"/>
+        </w:rPr>
+      </w:pPr>
+      <w:r>
+        <w:rPr>
           <w:sz w:val="24"/>
           <w:szCs w:val="24"/>
           <w:rtl w:val="0"/>
@@ -199,14 +186,12 @@
         <w:spacing w:line="480" w:lineRule="auto"/>
         <w:jc w:val="center"/>
         <w:rPr>
-          <w:rFonts w:ascii="Times New Roman" w:cs="Times New Roman" w:eastAsia="Times New Roman" w:hAnsi="Times New Roman"/>
-          <w:sz w:val="24"/>
-          <w:szCs w:val="24"/>
-        </w:rPr>
-      </w:pPr>
-      <w:r>
-        <w:rPr>
-          <w:rFonts w:ascii="Times New Roman" w:cs="Times New Roman" w:eastAsia="Times New Roman" w:hAnsi="Times New Roman"/>
+          <w:sz w:val="24"/>
+          <w:szCs w:val="24"/>
+        </w:rPr>
+      </w:pPr>
+      <w:r>
+        <w:rPr>
           <w:sz w:val="24"/>
           <w:szCs w:val="24"/>
           <w:rtl w:val="0"/>
@@ -219,14 +204,12 @@
         <w:spacing w:line="480" w:lineRule="auto"/>
         <w:jc w:val="center"/>
         <w:rPr>
-          <w:rFonts w:ascii="Times New Roman" w:cs="Times New Roman" w:eastAsia="Times New Roman" w:hAnsi="Times New Roman"/>
-          <w:sz w:val="24"/>
-          <w:szCs w:val="24"/>
-        </w:rPr>
-      </w:pPr>
-      <w:r>
-        <w:rPr>
-          <w:rFonts w:ascii="Times New Roman" w:cs="Times New Roman" w:eastAsia="Times New Roman" w:hAnsi="Times New Roman"/>
+          <w:sz w:val="24"/>
+          <w:szCs w:val="24"/>
+        </w:rPr>
+      </w:pPr>
+      <w:r>
+        <w:rPr>
           <w:sz w:val="24"/>
           <w:szCs w:val="24"/>
           <w:rtl w:val="0"/>
@@ -239,14 +222,12 @@
         <w:spacing w:line="480" w:lineRule="auto"/>
         <w:jc w:val="center"/>
         <w:rPr>
-          <w:rFonts w:ascii="Times New Roman" w:cs="Times New Roman" w:eastAsia="Times New Roman" w:hAnsi="Times New Roman"/>
-          <w:sz w:val="24"/>
-          <w:szCs w:val="24"/>
-        </w:rPr>
-      </w:pPr>
-      <w:r>
-        <w:rPr>
-          <w:rFonts w:ascii="Times New Roman" w:cs="Times New Roman" w:eastAsia="Times New Roman" w:hAnsi="Times New Roman"/>
+          <w:sz w:val="24"/>
+          <w:szCs w:val="24"/>
+        </w:rPr>
+      </w:pPr>
+      <w:r>
+        <w:rPr>
           <w:sz w:val="24"/>
           <w:szCs w:val="24"/>
           <w:rtl w:val="0"/>
@@ -259,7 +240,6 @@
         <w:spacing w:after="160" w:line="480" w:lineRule="auto"/>
         <w:jc w:val="center"/>
         <w:rPr>
-          <w:rFonts w:ascii="Times New Roman" w:cs="Times New Roman" w:eastAsia="Times New Roman" w:hAnsi="Times New Roman"/>
           <w:sz w:val="24"/>
           <w:szCs w:val="24"/>
         </w:rPr>
@@ -275,14 +255,12 @@
         <w:spacing w:after="160" w:line="480" w:lineRule="auto"/>
         <w:jc w:val="center"/>
         <w:rPr>
-          <w:rFonts w:ascii="Times New Roman" w:cs="Times New Roman" w:eastAsia="Times New Roman" w:hAnsi="Times New Roman"/>
-          <w:sz w:val="24"/>
-          <w:szCs w:val="24"/>
-        </w:rPr>
-      </w:pPr>
-      <w:r>
-        <w:rPr>
-          <w:rFonts w:ascii="Times New Roman" w:cs="Times New Roman" w:eastAsia="Times New Roman" w:hAnsi="Times New Roman"/>
+          <w:sz w:val="24"/>
+          <w:szCs w:val="24"/>
+        </w:rPr>
+      </w:pPr>
+      <w:r>
+        <w:rPr>
           <w:sz w:val="24"/>
           <w:szCs w:val="24"/>
           <w:rtl w:val="0"/>
@@ -295,14 +273,12 @@
         <w:spacing w:after="160" w:line="480" w:lineRule="auto"/>
         <w:jc w:val="center"/>
         <w:rPr>
-          <w:rFonts w:ascii="Times New Roman" w:cs="Times New Roman" w:eastAsia="Times New Roman" w:hAnsi="Times New Roman"/>
-          <w:sz w:val="24"/>
-          <w:szCs w:val="24"/>
-        </w:rPr>
-      </w:pPr>
-      <w:r>
-        <w:rPr>
-          <w:rFonts w:ascii="Times New Roman" w:cs="Times New Roman" w:eastAsia="Times New Roman" w:hAnsi="Times New Roman"/>
+          <w:sz w:val="24"/>
+          <w:szCs w:val="24"/>
+        </w:rPr>
+      </w:pPr>
+      <w:r>
+        <w:rPr>
           <w:sz w:val="24"/>
           <w:szCs w:val="24"/>
           <w:rtl w:val="0"/>
@@ -315,7 +291,6 @@
         <w:spacing w:after="160" w:line="480" w:lineRule="auto"/>
         <w:jc w:val="center"/>
         <w:rPr>
-          <w:rFonts w:ascii="Times New Roman" w:cs="Times New Roman" w:eastAsia="Times New Roman" w:hAnsi="Times New Roman"/>
           <w:sz w:val="24"/>
           <w:szCs w:val="24"/>
         </w:rPr>
@@ -337,19 +312,1051 @@
         <w:spacing w:after="160" w:before="320" w:line="240" w:lineRule="auto"/>
         <w:ind w:firstLine="720"/>
         <w:jc w:val="center"/>
-        <w:rPr/>
+        <w:rPr>
+          <w:sz w:val="24"/>
+          <w:szCs w:val="24"/>
+        </w:rPr>
       </w:pPr>
       <w:bookmarkStart w:colFirst="0" w:colLast="0" w:name="_1vwp6qc2q93m" w:id="1"/>
       <w:bookmarkEnd w:id="1"/>
       <w:r>
         <w:rPr>
-          <w:rFonts w:ascii="Times New Roman" w:cs="Times New Roman" w:eastAsia="Times New Roman" w:hAnsi="Times New Roman"/>
           <w:sz w:val="24"/>
           <w:szCs w:val="24"/>
           <w:rtl w:val="0"/>
         </w:rPr>
         <w:t xml:space="preserve">Fecha: 4 de octubre, 2026</w:t>
       </w:r>
+    </w:p>
+    <w:p>
+      <w:pPr>
+        <w:rPr/>
+      </w:pPr>
+      <w:r>
+        <w:rPr>
+          <w:rtl w:val="0"/>
+        </w:rPr>
+      </w:r>
+    </w:p>
+    <w:p>
+      <w:pPr>
+        <w:rPr/>
+      </w:pPr>
+      <w:r>
+        <w:rPr>
+          <w:rtl w:val="0"/>
+        </w:rPr>
+      </w:r>
+    </w:p>
+    <w:p>
+      <w:pPr>
+        <w:rPr/>
+      </w:pPr>
+      <w:r>
+        <w:rPr>
+          <w:rtl w:val="0"/>
+        </w:rPr>
+      </w:r>
+    </w:p>
+    <w:p>
+      <w:pPr>
+        <w:rPr/>
+      </w:pPr>
+      <w:r>
+        <w:rPr>
+          <w:rtl w:val="0"/>
+        </w:rPr>
+      </w:r>
+    </w:p>
+    <w:p>
+      <w:pPr>
+        <w:rPr/>
+      </w:pPr>
+      <w:r>
+        <w:rPr>
+          <w:rtl w:val="0"/>
+        </w:rPr>
+      </w:r>
+    </w:p>
+    <w:p>
+      <w:pPr>
+        <w:rPr/>
+      </w:pPr>
+      <w:r>
+        <w:rPr>
+          <w:rtl w:val="0"/>
+        </w:rPr>
+      </w:r>
+    </w:p>
+    <w:p>
+      <w:pPr>
+        <w:rPr/>
+      </w:pPr>
+      <w:r>
+        <w:rPr>
+          <w:rtl w:val="0"/>
+        </w:rPr>
+      </w:r>
+    </w:p>
+    <w:p>
+      <w:pPr>
+        <w:pStyle w:val="Heading1"/>
+        <w:keepNext w:val="0"/>
+        <w:keepLines w:val="0"/>
+        <w:pBdr>
+          <w:bottom w:color="2e75b6" w:space="4" w:sz="6" w:val="single"/>
+        </w:pBdr>
+        <w:spacing w:after="160" w:before="320" w:line="240" w:lineRule="auto"/>
+        <w:rPr>
+          <w:b w:val="1"/>
+          <w:bCs w:val="1"/>
+          <w:color w:val="1f4e79"/>
+          <w:sz w:val="30"/>
+          <w:szCs w:val="30"/>
+        </w:rPr>
+      </w:pPr>
+      <w:r>
+        <w:rPr>
+          <w:b w:val="1"/>
+          <w:bCs w:val="1"/>
+          <w:color w:val="1f4e79"/>
+          <w:sz w:val="30"/>
+          <w:szCs w:val="30"/>
+          <w:rtl w:val="0"/>
+        </w:rPr>
+        <w:t xml:space="preserve">1. Introducción</w:t>
+      </w:r>
+    </w:p>
+    <w:p>
+      <w:pPr>
+        <w:pStyle w:val="Heading2"/>
+        <w:keepNext w:val="0"/>
+        <w:keepLines w:val="0"/>
+        <w:spacing w:before="220" w:line="240" w:lineRule="auto"/>
+        <w:rPr/>
+      </w:pPr>
+      <w:bookmarkStart w:colFirst="0" w:colLast="0" w:name="_2ydmuqh2zn7" w:id="2"/>
+      <w:bookmarkEnd w:id="2"/>
+      <w:r>
+        <w:rPr>
+          <w:b w:val="1"/>
+          <w:bCs w:val="1"/>
+          <w:color w:val="2e75b6"/>
+          <w:sz w:val="25"/>
+          <w:szCs w:val="25"/>
+          <w:rtl w:val="0"/>
+        </w:rPr>
+        <w:t xml:space="preserve">1.1 Propósito</w:t>
+      </w:r>
+      <w:r>
+        <w:rPr>
+          <w:rtl w:val="0"/>
+        </w:rPr>
+      </w:r>
+    </w:p>
+    <w:p>
+      <w:pPr>
+        <w:spacing w:after="240" w:before="240" w:lineRule="auto"/>
+        <w:rPr/>
+      </w:pPr>
+      <w:r>
+        <w:rPr>
+          <w:rtl w:val="0"/>
+        </w:rPr>
+        <w:t xml:space="preserve">Este documento define la arquitectura, la estructura de las páginas y el diseño de la interfaz de la primera iteración del sistema web para la gestión y estandarización de la información de los cursos de la Universidad CENFOTEC. Servirá como referencia común para el equipo de desarrollo y el profesor, además de orientar la maquetación HTML, los estilos CSS, la validación con JavaScript y las pruebas del prototipo.</w:t>
+      </w:r>
+    </w:p>
+    <w:p>
+      <w:pPr>
+        <w:pStyle w:val="Heading2"/>
+        <w:keepNext w:val="0"/>
+        <w:keepLines w:val="0"/>
+        <w:spacing w:before="220" w:line="240" w:lineRule="auto"/>
+        <w:rPr>
+          <w:b w:val="1"/>
+          <w:bCs w:val="1"/>
+          <w:color w:val="2e75b6"/>
+          <w:sz w:val="25"/>
+          <w:szCs w:val="25"/>
+        </w:rPr>
+      </w:pPr>
+      <w:bookmarkStart w:colFirst="0" w:colLast="0" w:name="_yh17kmtjzxlt" w:id="3"/>
+      <w:bookmarkEnd w:id="3"/>
+      <w:r>
+        <w:rPr>
+          <w:b w:val="1"/>
+          <w:bCs w:val="1"/>
+          <w:color w:val="2e75b6"/>
+          <w:sz w:val="25"/>
+          <w:szCs w:val="25"/>
+          <w:rtl w:val="0"/>
+        </w:rPr>
+        <w:t xml:space="preserve">1.2 Alcance</w:t>
+      </w:r>
+    </w:p>
+    <w:p>
+      <w:pPr>
+        <w:spacing w:after="240" w:before="240" w:lineRule="auto"/>
+        <w:rPr/>
+      </w:pPr>
+      <w:r>
+        <w:rPr>
+          <w:rtl w:val="0"/>
+        </w:rPr>
+        <w:t xml:space="preserve">El diseño de esta iteración incluye la página de presentación, las pantallas de inicio de sesión y gestión de contraseñas, el panel principal y las pantallas de registro, listado y modificación de usuarios, catálogos institucionales y cursos. Contempla la asignación de roles predefinidos a los usuarios y el registro progresivo de la información de los cursos. También incluye los bocetos de las interfaces, la organización de los archivos HTML, CSS y JavaScript nativo —sin Bootstrap ni jQuery—, las reglas de validación de los formularios, los criterios de accesibilidad y los casos de prueba que orientarán la implementación del prototipo. La información del prototipo se almacenará en localStorage.</w:t>
+      </w:r>
+    </w:p>
+    <w:p>
+      <w:pPr>
+        <w:spacing w:after="240" w:before="240" w:lineRule="auto"/>
+        <w:rPr/>
+      </w:pPr>
+      <w:r>
+        <w:rPr>
+          <w:rtl w:val="0"/>
+        </w:rPr>
+        <w:t xml:space="preserve">Quedan fuera de esta iteración la integración con una base de datos, los filtros avanzados, las funciones de eliminación, el envío real de notificaciones, la implementación completa de reportes y la asistencia de inteligencia artificial. Se mantienen fuera del alcance del sistema la matrícula o el registro de estudiantes, la creación de roles por parte de los usuarios, la eliminación física de cursos y la gestión de pagos o ventas del e-commerce.</w:t>
+      </w:r>
+    </w:p>
+    <w:p>
+      <w:pPr>
+        <w:pStyle w:val="Heading2"/>
+        <w:keepNext w:val="0"/>
+        <w:keepLines w:val="0"/>
+        <w:spacing w:before="220" w:line="240" w:lineRule="auto"/>
+        <w:rPr/>
+      </w:pPr>
+      <w:bookmarkStart w:colFirst="0" w:colLast="0" w:name="_hc2r7yrv4279" w:id="4"/>
+      <w:bookmarkEnd w:id="4"/>
+      <w:r>
+        <w:rPr>
+          <w:b w:val="1"/>
+          <w:bCs w:val="1"/>
+          <w:color w:val="2e75b6"/>
+          <w:sz w:val="25"/>
+          <w:szCs w:val="25"/>
+          <w:rtl w:val="0"/>
+        </w:rPr>
+        <w:t xml:space="preserve">1.3 Definiciones, acrónimos y abreviaturas</w:t>
+      </w:r>
+      <w:r>
+        <w:rPr>
+          <w:rtl w:val="0"/>
+        </w:rPr>
+      </w:r>
+    </w:p>
+    <w:tbl>
+      <w:tblPr>
+        <w:tblStyle w:val="Table1"/>
+        <w:tblW w:w="9025.511811023624" w:type="dxa"/>
+        <w:jc w:val="left"/>
+        <w:tblBorders>
+          <w:top w:color="000000" w:space="0" w:sz="0" w:val="nil"/>
+          <w:left w:color="000000" w:space="0" w:sz="0" w:val="nil"/>
+          <w:bottom w:color="000000" w:space="0" w:sz="0" w:val="nil"/>
+          <w:right w:color="000000" w:space="0" w:sz="0" w:val="nil"/>
+          <w:insideH w:color="000000" w:space="0" w:sz="0" w:val="nil"/>
+          <w:insideV w:color="000000" w:space="0" w:sz="0" w:val="nil"/>
+        </w:tblBorders>
+        <w:tblLayout w:type="fixed"/>
+        <w:tblLook w:val="0600"/>
+      </w:tblPr>
+      <w:tblGrid>
+        <w:gridCol w:w="3182.071471835252"/>
+        <w:gridCol w:w="5843.440339188372"/>
+        <w:tblGridChange w:id="0">
+          <w:tblGrid>
+            <w:gridCol w:w="3182.071471835252"/>
+            <w:gridCol w:w="5843.440339188372"/>
+          </w:tblGrid>
+        </w:tblGridChange>
+      </w:tblGrid>
+      <w:tr>
+        <w:trPr>
+          <w:cantSplit w:val="0"/>
+          <w:trHeight w:val="690" w:hRule="atLeast"/>
+          <w:tblHeader w:val="0"/>
+        </w:trPr>
+        <w:tc>
+          <w:tcPr>
+            <w:tcBorders>
+              <w:top w:color="000000" w:space="0" w:sz="0" w:val="nil"/>
+              <w:left w:color="bfbfbf" w:space="0" w:sz="4" w:val="single"/>
+              <w:bottom w:color="bfbfbf" w:space="0" w:sz="4" w:val="single"/>
+              <w:right w:color="bfbfbf" w:space="0" w:sz="4" w:val="single"/>
+            </w:tcBorders>
+            <w:shd w:fill="dce6f1" w:val="clear"/>
+            <w:tcMar>
+              <w:top w:w="80.0" w:type="dxa"/>
+              <w:left w:w="140.0" w:type="dxa"/>
+              <w:bottom w:w="80.0" w:type="dxa"/>
+              <w:right w:w="140.0" w:type="dxa"/>
+            </w:tcMar>
+            <w:vAlign w:val="top"/>
+          </w:tcPr>
+          <w:p>
+            <w:pPr>
+              <w:rPr>
+                <w:b w:val="1"/>
+                <w:bCs w:val="1"/>
+              </w:rPr>
+            </w:pPr>
+            <w:r>
+              <w:rPr>
+                <w:b w:val="1"/>
+                <w:bCs w:val="1"/>
+                <w:rtl w:val="0"/>
+              </w:rPr>
+              <w:t xml:space="preserve">HTML</w:t>
+            </w:r>
+          </w:p>
+        </w:tc>
+        <w:tc>
+          <w:tcPr>
+            <w:tcBorders>
+              <w:top w:color="000000" w:space="0" w:sz="0" w:val="nil"/>
+              <w:left w:color="000000" w:space="0" w:sz="0" w:val="nil"/>
+              <w:bottom w:color="bfbfbf" w:space="0" w:sz="4" w:val="single"/>
+              <w:right w:color="bfbfbf" w:space="0" w:sz="4" w:val="single"/>
+            </w:tcBorders>
+            <w:tcMar>
+              <w:top w:w="80.0" w:type="dxa"/>
+              <w:left w:w="140.0" w:type="dxa"/>
+              <w:bottom w:w="80.0" w:type="dxa"/>
+              <w:right w:w="140.0" w:type="dxa"/>
+            </w:tcMar>
+            <w:vAlign w:val="top"/>
+          </w:tcPr>
+          <w:p>
+            <w:pPr>
+              <w:rPr/>
+            </w:pPr>
+            <w:r>
+              <w:rPr>
+                <w:rtl w:val="0"/>
+              </w:rPr>
+              <w:t xml:space="preserve">Lenguaje utilizado para definir la estructura y los controles de las páginas web.</w:t>
+            </w:r>
+          </w:p>
+        </w:tc>
+      </w:tr>
+      <w:tr>
+        <w:trPr>
+          <w:cantSplit w:val="0"/>
+          <w:trHeight w:val="420" w:hRule="atLeast"/>
+          <w:tblHeader w:val="0"/>
+        </w:trPr>
+        <w:tc>
+          <w:tcPr>
+            <w:tcBorders>
+              <w:top w:color="000000" w:space="0" w:sz="0" w:val="nil"/>
+              <w:left w:color="bfbfbf" w:space="0" w:sz="4" w:val="single"/>
+              <w:bottom w:color="bfbfbf" w:space="0" w:sz="4" w:val="single"/>
+              <w:right w:color="bfbfbf" w:space="0" w:sz="4" w:val="single"/>
+            </w:tcBorders>
+            <w:shd w:fill="dce6f1" w:val="clear"/>
+            <w:tcMar>
+              <w:top w:w="80.0" w:type="dxa"/>
+              <w:left w:w="140.0" w:type="dxa"/>
+              <w:bottom w:w="80.0" w:type="dxa"/>
+              <w:right w:w="140.0" w:type="dxa"/>
+            </w:tcMar>
+            <w:vAlign w:val="top"/>
+          </w:tcPr>
+          <w:p>
+            <w:pPr>
+              <w:rPr>
+                <w:b w:val="1"/>
+                <w:bCs w:val="1"/>
+              </w:rPr>
+            </w:pPr>
+            <w:r>
+              <w:rPr>
+                <w:b w:val="1"/>
+                <w:bCs w:val="1"/>
+                <w:rtl w:val="0"/>
+              </w:rPr>
+              <w:t xml:space="preserve">CSS</w:t>
+            </w:r>
+          </w:p>
+        </w:tc>
+        <w:tc>
+          <w:tcPr>
+            <w:tcBorders>
+              <w:top w:color="000000" w:space="0" w:sz="0" w:val="nil"/>
+              <w:left w:color="000000" w:space="0" w:sz="0" w:val="nil"/>
+              <w:bottom w:color="bfbfbf" w:space="0" w:sz="4" w:val="single"/>
+              <w:right w:color="bfbfbf" w:space="0" w:sz="4" w:val="single"/>
+            </w:tcBorders>
+            <w:tcMar>
+              <w:top w:w="80.0" w:type="dxa"/>
+              <w:left w:w="140.0" w:type="dxa"/>
+              <w:bottom w:w="80.0" w:type="dxa"/>
+              <w:right w:w="140.0" w:type="dxa"/>
+            </w:tcMar>
+            <w:vAlign w:val="top"/>
+          </w:tcPr>
+          <w:p>
+            <w:pPr>
+              <w:rPr/>
+            </w:pPr>
+            <w:r>
+              <w:rPr>
+                <w:rtl w:val="0"/>
+              </w:rPr>
+              <w:t xml:space="preserve">Lenguaje que define la presentación visual de las páginas.</w:t>
+            </w:r>
+          </w:p>
+        </w:tc>
+      </w:tr>
+      <w:tr>
+        <w:trPr>
+          <w:cantSplit w:val="0"/>
+          <w:trHeight w:val="420" w:hRule="atLeast"/>
+          <w:tblHeader w:val="0"/>
+        </w:trPr>
+        <w:tc>
+          <w:tcPr>
+            <w:tcBorders>
+              <w:top w:color="000000" w:space="0" w:sz="0" w:val="nil"/>
+              <w:left w:color="bfbfbf" w:space="0" w:sz="4" w:val="single"/>
+              <w:bottom w:color="bfbfbf" w:space="0" w:sz="4" w:val="single"/>
+              <w:right w:color="bfbfbf" w:space="0" w:sz="4" w:val="single"/>
+            </w:tcBorders>
+            <w:shd w:fill="dce6f1" w:val="clear"/>
+            <w:tcMar>
+              <w:top w:w="80.0" w:type="dxa"/>
+              <w:left w:w="140.0" w:type="dxa"/>
+              <w:bottom w:w="80.0" w:type="dxa"/>
+              <w:right w:w="140.0" w:type="dxa"/>
+            </w:tcMar>
+            <w:vAlign w:val="top"/>
+          </w:tcPr>
+          <w:p>
+            <w:pPr>
+              <w:rPr>
+                <w:b w:val="1"/>
+                <w:bCs w:val="1"/>
+              </w:rPr>
+            </w:pPr>
+            <w:r>
+              <w:rPr>
+                <w:b w:val="1"/>
+                <w:bCs w:val="1"/>
+                <w:rtl w:val="0"/>
+              </w:rPr>
+              <w:t xml:space="preserve">JavaScript (JS)</w:t>
+            </w:r>
+          </w:p>
+        </w:tc>
+        <w:tc>
+          <w:tcPr>
+            <w:tcBorders>
+              <w:top w:color="000000" w:space="0" w:sz="0" w:val="nil"/>
+              <w:left w:color="000000" w:space="0" w:sz="0" w:val="nil"/>
+              <w:bottom w:color="bfbfbf" w:space="0" w:sz="4" w:val="single"/>
+              <w:right w:color="bfbfbf" w:space="0" w:sz="4" w:val="single"/>
+            </w:tcBorders>
+            <w:tcMar>
+              <w:top w:w="80.0" w:type="dxa"/>
+              <w:left w:w="140.0" w:type="dxa"/>
+              <w:bottom w:w="80.0" w:type="dxa"/>
+              <w:right w:w="140.0" w:type="dxa"/>
+            </w:tcMar>
+            <w:vAlign w:val="top"/>
+          </w:tcPr>
+          <w:p>
+            <w:pPr>
+              <w:rPr/>
+            </w:pPr>
+            <w:r>
+              <w:rPr>
+                <w:rtl w:val="0"/>
+              </w:rPr>
+              <w:t xml:space="preserve">Lenguaje de programación utilizado para implementar la interacción y la validación de los formularios en el navegador.</w:t>
+            </w:r>
+          </w:p>
+        </w:tc>
+      </w:tr>
+      <w:tr>
+        <w:trPr>
+          <w:cantSplit w:val="0"/>
+          <w:trHeight w:val="420" w:hRule="atLeast"/>
+          <w:tblHeader w:val="0"/>
+        </w:trPr>
+        <w:tc>
+          <w:tcPr>
+            <w:tcBorders>
+              <w:top w:color="000000" w:space="0" w:sz="0" w:val="nil"/>
+              <w:left w:color="bfbfbf" w:space="0" w:sz="4" w:val="single"/>
+              <w:bottom w:color="bfbfbf" w:space="0" w:sz="4" w:val="single"/>
+              <w:right w:color="bfbfbf" w:space="0" w:sz="4" w:val="single"/>
+            </w:tcBorders>
+            <w:shd w:fill="dce6f1" w:val="clear"/>
+            <w:tcMar>
+              <w:top w:w="80.0" w:type="dxa"/>
+              <w:left w:w="140.0" w:type="dxa"/>
+              <w:bottom w:w="80.0" w:type="dxa"/>
+              <w:right w:w="140.0" w:type="dxa"/>
+            </w:tcMar>
+            <w:vAlign w:val="top"/>
+          </w:tcPr>
+          <w:p>
+            <w:pPr>
+              <w:rPr>
+                <w:b w:val="1"/>
+                <w:bCs w:val="1"/>
+              </w:rPr>
+            </w:pPr>
+            <w:r>
+              <w:rPr>
+                <w:b w:val="1"/>
+                <w:bCs w:val="1"/>
+                <w:rtl w:val="0"/>
+              </w:rPr>
+              <w:t xml:space="preserve">JavaScript nativo</w:t>
+            </w:r>
+          </w:p>
+        </w:tc>
+        <w:tc>
+          <w:tcPr>
+            <w:tcBorders>
+              <w:top w:color="000000" w:space="0" w:sz="0" w:val="nil"/>
+              <w:left w:color="000000" w:space="0" w:sz="0" w:val="nil"/>
+              <w:bottom w:color="bfbfbf" w:space="0" w:sz="4" w:val="single"/>
+              <w:right w:color="bfbfbf" w:space="0" w:sz="4" w:val="single"/>
+            </w:tcBorders>
+            <w:tcMar>
+              <w:top w:w="80.0" w:type="dxa"/>
+              <w:left w:w="140.0" w:type="dxa"/>
+              <w:bottom w:w="80.0" w:type="dxa"/>
+              <w:right w:w="140.0" w:type="dxa"/>
+            </w:tcMar>
+            <w:vAlign w:val="top"/>
+          </w:tcPr>
+          <w:p>
+            <w:pPr>
+              <w:rPr/>
+            </w:pPr>
+            <w:r>
+              <w:rPr>
+                <w:rtl w:val="0"/>
+              </w:rPr>
+              <w:t xml:space="preserve">JavaScript utilizado sin librerías ni frameworks externos.</w:t>
+            </w:r>
+          </w:p>
+        </w:tc>
+      </w:tr>
+      <w:tr>
+        <w:trPr>
+          <w:cantSplit w:val="0"/>
+          <w:trHeight w:val="420" w:hRule="atLeast"/>
+          <w:tblHeader w:val="0"/>
+        </w:trPr>
+        <w:tc>
+          <w:tcPr>
+            <w:tcBorders>
+              <w:top w:color="000000" w:space="0" w:sz="0" w:val="nil"/>
+              <w:left w:color="bfbfbf" w:space="0" w:sz="4" w:val="single"/>
+              <w:bottom w:color="bfbfbf" w:space="0" w:sz="4" w:val="single"/>
+              <w:right w:color="bfbfbf" w:space="0" w:sz="4" w:val="single"/>
+            </w:tcBorders>
+            <w:shd w:fill="dce6f1" w:val="clear"/>
+            <w:tcMar>
+              <w:top w:w="80.0" w:type="dxa"/>
+              <w:left w:w="140.0" w:type="dxa"/>
+              <w:bottom w:w="80.0" w:type="dxa"/>
+              <w:right w:w="140.0" w:type="dxa"/>
+            </w:tcMar>
+            <w:vAlign w:val="top"/>
+          </w:tcPr>
+          <w:p>
+            <w:pPr>
+              <w:rPr>
+                <w:b w:val="1"/>
+                <w:bCs w:val="1"/>
+              </w:rPr>
+            </w:pPr>
+            <w:r>
+              <w:rPr>
+                <w:b w:val="1"/>
+                <w:bCs w:val="1"/>
+                <w:rtl w:val="0"/>
+              </w:rPr>
+              <w:t xml:space="preserve">DOM</w:t>
+            </w:r>
+          </w:p>
+        </w:tc>
+        <w:tc>
+          <w:tcPr>
+            <w:tcBorders>
+              <w:top w:color="000000" w:space="0" w:sz="0" w:val="nil"/>
+              <w:left w:color="000000" w:space="0" w:sz="0" w:val="nil"/>
+              <w:bottom w:color="bfbfbf" w:space="0" w:sz="4" w:val="single"/>
+              <w:right w:color="bfbfbf" w:space="0" w:sz="4" w:val="single"/>
+            </w:tcBorders>
+            <w:tcMar>
+              <w:top w:w="80.0" w:type="dxa"/>
+              <w:left w:w="140.0" w:type="dxa"/>
+              <w:bottom w:w="80.0" w:type="dxa"/>
+              <w:right w:w="140.0" w:type="dxa"/>
+            </w:tcMar>
+            <w:vAlign w:val="top"/>
+          </w:tcPr>
+          <w:p>
+            <w:pPr>
+              <w:rPr/>
+            </w:pPr>
+            <w:r>
+              <w:rPr>
+                <w:rtl w:val="0"/>
+              </w:rPr>
+              <w:t xml:space="preserve">Representación de la página que JavaScript utiliza para consultar o modificar sus elementos.</w:t>
+            </w:r>
+          </w:p>
+        </w:tc>
+      </w:tr>
+      <w:tr>
+        <w:trPr>
+          <w:cantSplit w:val="0"/>
+          <w:trHeight w:val="420" w:hRule="atLeast"/>
+          <w:tblHeader w:val="0"/>
+        </w:trPr>
+        <w:tc>
+          <w:tcPr>
+            <w:tcBorders>
+              <w:top w:color="000000" w:space="0" w:sz="0" w:val="nil"/>
+              <w:left w:color="bfbfbf" w:space="0" w:sz="4" w:val="single"/>
+              <w:bottom w:color="bfbfbf" w:space="0" w:sz="4" w:val="single"/>
+              <w:right w:color="bfbfbf" w:space="0" w:sz="4" w:val="single"/>
+            </w:tcBorders>
+            <w:shd w:fill="dce6f1" w:val="clear"/>
+            <w:tcMar>
+              <w:top w:w="80.0" w:type="dxa"/>
+              <w:left w:w="140.0" w:type="dxa"/>
+              <w:bottom w:w="80.0" w:type="dxa"/>
+              <w:right w:w="140.0" w:type="dxa"/>
+            </w:tcMar>
+            <w:vAlign w:val="top"/>
+          </w:tcPr>
+          <w:p>
+            <w:pPr>
+              <w:rPr>
+                <w:b w:val="1"/>
+                <w:bCs w:val="1"/>
+              </w:rPr>
+            </w:pPr>
+            <w:r>
+              <w:rPr>
+                <w:b w:val="1"/>
+                <w:bCs w:val="1"/>
+                <w:rtl w:val="0"/>
+              </w:rPr>
+              <w:t xml:space="preserve">Validación del lado del cliente</w:t>
+            </w:r>
+          </w:p>
+        </w:tc>
+        <w:tc>
+          <w:tcPr>
+            <w:tcBorders>
+              <w:top w:color="000000" w:space="0" w:sz="0" w:val="nil"/>
+              <w:left w:color="000000" w:space="0" w:sz="0" w:val="nil"/>
+              <w:bottom w:color="bfbfbf" w:space="0" w:sz="4" w:val="single"/>
+              <w:right w:color="bfbfbf" w:space="0" w:sz="4" w:val="single"/>
+            </w:tcBorders>
+            <w:tcMar>
+              <w:top w:w="80.0" w:type="dxa"/>
+              <w:left w:w="140.0" w:type="dxa"/>
+              <w:bottom w:w="80.0" w:type="dxa"/>
+              <w:right w:w="140.0" w:type="dxa"/>
+            </w:tcMar>
+            <w:vAlign w:val="top"/>
+          </w:tcPr>
+          <w:p>
+            <w:pPr>
+              <w:rPr/>
+            </w:pPr>
+            <w:r>
+              <w:rPr>
+                <w:rtl w:val="0"/>
+              </w:rPr>
+              <w:t xml:space="preserve">Comprobación de los datos de un formulario directamente en el navegador.</w:t>
+            </w:r>
+          </w:p>
+        </w:tc>
+      </w:tr>
+      <w:tr>
+        <w:trPr>
+          <w:cantSplit w:val="0"/>
+          <w:trHeight w:val="420" w:hRule="atLeast"/>
+          <w:tblHeader w:val="0"/>
+        </w:trPr>
+        <w:tc>
+          <w:tcPr>
+            <w:tcBorders>
+              <w:top w:color="000000" w:space="0" w:sz="0" w:val="nil"/>
+              <w:left w:color="bfbfbf" w:space="0" w:sz="4" w:val="single"/>
+              <w:bottom w:color="bfbfbf" w:space="0" w:sz="4" w:val="single"/>
+              <w:right w:color="bfbfbf" w:space="0" w:sz="4" w:val="single"/>
+            </w:tcBorders>
+            <w:shd w:fill="dce6f1" w:val="clear"/>
+            <w:tcMar>
+              <w:top w:w="80.0" w:type="dxa"/>
+              <w:left w:w="140.0" w:type="dxa"/>
+              <w:bottom w:w="80.0" w:type="dxa"/>
+              <w:right w:w="140.0" w:type="dxa"/>
+            </w:tcMar>
+            <w:vAlign w:val="top"/>
+          </w:tcPr>
+          <w:p>
+            <w:pPr>
+              <w:rPr>
+                <w:b w:val="1"/>
+                <w:bCs w:val="1"/>
+              </w:rPr>
+            </w:pPr>
+            <w:r>
+              <w:rPr>
+                <w:b w:val="1"/>
+                <w:bCs w:val="1"/>
+                <w:rtl w:val="0"/>
+              </w:rPr>
+              <w:t xml:space="preserve">Boceto o wireframe</w:t>
+            </w:r>
+          </w:p>
+        </w:tc>
+        <w:tc>
+          <w:tcPr>
+            <w:tcBorders>
+              <w:top w:color="000000" w:space="0" w:sz="0" w:val="nil"/>
+              <w:left w:color="000000" w:space="0" w:sz="0" w:val="nil"/>
+              <w:bottom w:color="bfbfbf" w:space="0" w:sz="4" w:val="single"/>
+              <w:right w:color="bfbfbf" w:space="0" w:sz="4" w:val="single"/>
+            </w:tcBorders>
+            <w:tcMar>
+              <w:top w:w="80.0" w:type="dxa"/>
+              <w:left w:w="140.0" w:type="dxa"/>
+              <w:bottom w:w="80.0" w:type="dxa"/>
+              <w:right w:w="140.0" w:type="dxa"/>
+            </w:tcMar>
+            <w:vAlign w:val="top"/>
+          </w:tcPr>
+          <w:p>
+            <w:pPr>
+              <w:rPr/>
+            </w:pPr>
+            <w:r>
+              <w:rPr>
+                <w:rtl w:val="0"/>
+              </w:rPr>
+              <w:t xml:space="preserve">Representación preliminar de una interfaz que muestra la ubicación de sus elementos principales.</w:t>
+            </w:r>
+          </w:p>
+        </w:tc>
+      </w:tr>
+      <w:tr>
+        <w:trPr>
+          <w:cantSplit w:val="0"/>
+          <w:trHeight w:val="420" w:hRule="atLeast"/>
+          <w:tblHeader w:val="0"/>
+        </w:trPr>
+        <w:tc>
+          <w:tcPr>
+            <w:tcBorders>
+              <w:top w:color="000000" w:space="0" w:sz="0" w:val="nil"/>
+              <w:left w:color="bfbfbf" w:space="0" w:sz="4" w:val="single"/>
+              <w:bottom w:color="bfbfbf" w:space="0" w:sz="4" w:val="single"/>
+              <w:right w:color="bfbfbf" w:space="0" w:sz="4" w:val="single"/>
+            </w:tcBorders>
+            <w:shd w:fill="dce6f1" w:val="clear"/>
+            <w:tcMar>
+              <w:top w:w="80.0" w:type="dxa"/>
+              <w:left w:w="140.0" w:type="dxa"/>
+              <w:bottom w:w="80.0" w:type="dxa"/>
+              <w:right w:w="140.0" w:type="dxa"/>
+            </w:tcMar>
+            <w:vAlign w:val="top"/>
+          </w:tcPr>
+          <w:p>
+            <w:pPr>
+              <w:rPr>
+                <w:b w:val="1"/>
+                <w:bCs w:val="1"/>
+              </w:rPr>
+            </w:pPr>
+            <w:r>
+              <w:rPr>
+                <w:b w:val="1"/>
+                <w:bCs w:val="1"/>
+                <w:rtl w:val="0"/>
+              </w:rPr>
+              <w:t xml:space="preserve">Maquetación</w:t>
+            </w:r>
+          </w:p>
+        </w:tc>
+        <w:tc>
+          <w:tcPr>
+            <w:tcBorders>
+              <w:top w:color="000000" w:space="0" w:sz="0" w:val="nil"/>
+              <w:left w:color="000000" w:space="0" w:sz="0" w:val="nil"/>
+              <w:bottom w:color="bfbfbf" w:space="0" w:sz="4" w:val="single"/>
+              <w:right w:color="bfbfbf" w:space="0" w:sz="4" w:val="single"/>
+            </w:tcBorders>
+            <w:tcMar>
+              <w:top w:w="80.0" w:type="dxa"/>
+              <w:left w:w="140.0" w:type="dxa"/>
+              <w:bottom w:w="80.0" w:type="dxa"/>
+              <w:right w:w="140.0" w:type="dxa"/>
+            </w:tcMar>
+            <w:vAlign w:val="top"/>
+          </w:tcPr>
+          <w:p>
+            <w:pPr>
+              <w:rPr/>
+            </w:pPr>
+            <w:r>
+              <w:rPr>
+                <w:rtl w:val="0"/>
+              </w:rPr>
+              <w:t xml:space="preserve">Organización de los elementos de una página mediante HTML y CSS, de acuerdo con el diseño establecido.</w:t>
+            </w:r>
+          </w:p>
+        </w:tc>
+      </w:tr>
+      <w:tr>
+        <w:trPr>
+          <w:cantSplit w:val="0"/>
+          <w:trHeight w:val="420" w:hRule="atLeast"/>
+          <w:tblHeader w:val="0"/>
+        </w:trPr>
+        <w:tc>
+          <w:tcPr>
+            <w:tcBorders>
+              <w:top w:color="000000" w:space="0" w:sz="0" w:val="nil"/>
+              <w:left w:color="bfbfbf" w:space="0" w:sz="4" w:val="single"/>
+              <w:bottom w:color="bfbfbf" w:space="0" w:sz="4" w:val="single"/>
+              <w:right w:color="bfbfbf" w:space="0" w:sz="4" w:val="single"/>
+            </w:tcBorders>
+            <w:shd w:fill="dce6f1" w:val="clear"/>
+            <w:tcMar>
+              <w:top w:w="80.0" w:type="dxa"/>
+              <w:left w:w="140.0" w:type="dxa"/>
+              <w:bottom w:w="80.0" w:type="dxa"/>
+              <w:right w:w="140.0" w:type="dxa"/>
+            </w:tcMar>
+            <w:vAlign w:val="top"/>
+          </w:tcPr>
+          <w:p>
+            <w:pPr>
+              <w:rPr>
+                <w:b w:val="1"/>
+                <w:bCs w:val="1"/>
+              </w:rPr>
+            </w:pPr>
+            <w:r>
+              <w:rPr>
+                <w:b w:val="1"/>
+                <w:bCs w:val="1"/>
+                <w:rtl w:val="0"/>
+              </w:rPr>
+              <w:t xml:space="preserve">Diseño adaptable o responsive</w:t>
+            </w:r>
+          </w:p>
+        </w:tc>
+        <w:tc>
+          <w:tcPr>
+            <w:tcBorders>
+              <w:top w:color="000000" w:space="0" w:sz="0" w:val="nil"/>
+              <w:left w:color="000000" w:space="0" w:sz="0" w:val="nil"/>
+              <w:bottom w:color="bfbfbf" w:space="0" w:sz="4" w:val="single"/>
+              <w:right w:color="bfbfbf" w:space="0" w:sz="4" w:val="single"/>
+            </w:tcBorders>
+            <w:tcMar>
+              <w:top w:w="80.0" w:type="dxa"/>
+              <w:left w:w="140.0" w:type="dxa"/>
+              <w:bottom w:w="80.0" w:type="dxa"/>
+              <w:right w:w="140.0" w:type="dxa"/>
+            </w:tcMar>
+            <w:vAlign w:val="top"/>
+          </w:tcPr>
+          <w:p>
+            <w:pPr>
+              <w:rPr/>
+            </w:pPr>
+            <w:r>
+              <w:rPr>
+                <w:rtl w:val="0"/>
+              </w:rPr>
+              <w:t xml:space="preserve">Diseño que permite ajustar la presentación de las páginas a distintos tamaños de pantalla.</w:t>
+            </w:r>
+          </w:p>
+        </w:tc>
+      </w:tr>
+      <w:tr>
+        <w:trPr>
+          <w:cantSplit w:val="0"/>
+          <w:trHeight w:val="420" w:hRule="atLeast"/>
+          <w:tblHeader w:val="0"/>
+        </w:trPr>
+        <w:tc>
+          <w:tcPr>
+            <w:tcBorders>
+              <w:top w:color="000000" w:space="0" w:sz="0" w:val="nil"/>
+              <w:left w:color="bfbfbf" w:space="0" w:sz="4" w:val="single"/>
+              <w:bottom w:color="bfbfbf" w:space="0" w:sz="4" w:val="single"/>
+              <w:right w:color="bfbfbf" w:space="0" w:sz="4" w:val="single"/>
+            </w:tcBorders>
+            <w:shd w:fill="dce6f1" w:val="clear"/>
+            <w:tcMar>
+              <w:top w:w="80.0" w:type="dxa"/>
+              <w:left w:w="140.0" w:type="dxa"/>
+              <w:bottom w:w="80.0" w:type="dxa"/>
+              <w:right w:w="140.0" w:type="dxa"/>
+            </w:tcMar>
+            <w:vAlign w:val="top"/>
+          </w:tcPr>
+          <w:p>
+            <w:pPr>
+              <w:rPr>
+                <w:b w:val="1"/>
+                <w:bCs w:val="1"/>
+              </w:rPr>
+            </w:pPr>
+            <w:r>
+              <w:rPr>
+                <w:b w:val="1"/>
+                <w:bCs w:val="1"/>
+                <w:rtl w:val="0"/>
+              </w:rPr>
+              <w:t xml:space="preserve">localStorage</w:t>
+            </w:r>
+          </w:p>
+        </w:tc>
+        <w:tc>
+          <w:tcPr>
+            <w:tcBorders>
+              <w:top w:color="000000" w:space="0" w:sz="0" w:val="nil"/>
+              <w:left w:color="000000" w:space="0" w:sz="0" w:val="nil"/>
+              <w:bottom w:color="bfbfbf" w:space="0" w:sz="4" w:val="single"/>
+              <w:right w:color="bfbfbf" w:space="0" w:sz="4" w:val="single"/>
+            </w:tcBorders>
+            <w:tcMar>
+              <w:top w:w="80.0" w:type="dxa"/>
+              <w:left w:w="140.0" w:type="dxa"/>
+              <w:bottom w:w="80.0" w:type="dxa"/>
+              <w:right w:w="140.0" w:type="dxa"/>
+            </w:tcMar>
+            <w:vAlign w:val="top"/>
+          </w:tcPr>
+          <w:p>
+            <w:pPr>
+              <w:rPr/>
+            </w:pPr>
+            <w:r>
+              <w:rPr>
+                <w:rtl w:val="0"/>
+              </w:rPr>
+              <w:t xml:space="preserve">Mecanismo del navegador utilizado para almacenar información localmente y conservarla entre sesiones.</w:t>
+            </w:r>
+          </w:p>
+        </w:tc>
+      </w:tr>
+      <w:tr>
+        <w:trPr>
+          <w:cantSplit w:val="0"/>
+          <w:trHeight w:val="420" w:hRule="atLeast"/>
+          <w:tblHeader w:val="0"/>
+        </w:trPr>
+        <w:tc>
+          <w:tcPr>
+            <w:tcBorders>
+              <w:top w:color="000000" w:space="0" w:sz="0" w:val="nil"/>
+              <w:left w:color="bfbfbf" w:space="0" w:sz="4" w:val="single"/>
+              <w:bottom w:color="bfbfbf" w:space="0" w:sz="4" w:val="single"/>
+              <w:right w:color="bfbfbf" w:space="0" w:sz="4" w:val="single"/>
+            </w:tcBorders>
+            <w:shd w:fill="dce6f1" w:val="clear"/>
+            <w:tcMar>
+              <w:top w:w="80.0" w:type="dxa"/>
+              <w:left w:w="140.0" w:type="dxa"/>
+              <w:bottom w:w="80.0" w:type="dxa"/>
+              <w:right w:w="140.0" w:type="dxa"/>
+            </w:tcMar>
+            <w:vAlign w:val="top"/>
+          </w:tcPr>
+          <w:p>
+            <w:pPr>
+              <w:rPr>
+                <w:b w:val="1"/>
+                <w:bCs w:val="1"/>
+              </w:rPr>
+            </w:pPr>
+            <w:r>
+              <w:rPr>
+                <w:b w:val="1"/>
+                <w:bCs w:val="1"/>
+                <w:rtl w:val="0"/>
+              </w:rPr>
+              <w:t xml:space="preserve">Catálogo</w:t>
+            </w:r>
+          </w:p>
+        </w:tc>
+        <w:tc>
+          <w:tcPr>
+            <w:tcBorders>
+              <w:top w:color="000000" w:space="0" w:sz="0" w:val="nil"/>
+              <w:left w:color="000000" w:space="0" w:sz="0" w:val="nil"/>
+              <w:bottom w:color="bfbfbf" w:space="0" w:sz="4" w:val="single"/>
+              <w:right w:color="bfbfbf" w:space="0" w:sz="4" w:val="single"/>
+            </w:tcBorders>
+            <w:tcMar>
+              <w:top w:w="80.0" w:type="dxa"/>
+              <w:left w:w="140.0" w:type="dxa"/>
+              <w:bottom w:w="80.0" w:type="dxa"/>
+              <w:right w:w="140.0" w:type="dxa"/>
+            </w:tcMar>
+            <w:vAlign w:val="top"/>
+          </w:tcPr>
+          <w:p>
+            <w:pPr>
+              <w:rPr/>
+            </w:pPr>
+            <w:r>
+              <w:rPr>
+                <w:rtl w:val="0"/>
+              </w:rPr>
+              <w:t xml:space="preserve">Conjunto administrable de valores utilizados para clasificar la información, normalmente con código, nombre y descripción.</w:t>
+            </w:r>
+          </w:p>
+        </w:tc>
+      </w:tr>
+    </w:tbl>
+    <w:p>
+      <w:pPr>
+        <w:spacing w:after="240" w:before="240" w:lineRule="auto"/>
+        <w:rPr/>
+      </w:pPr>
+      <w:r>
+        <w:rPr>
+          <w:rtl w:val="0"/>
+        </w:rPr>
+      </w:r>
+    </w:p>
+    <w:p>
+      <w:pPr>
+        <w:spacing w:after="240" w:before="240" w:lineRule="auto"/>
+        <w:rPr/>
+      </w:pPr>
+      <w:r>
+        <w:rPr>
+          <w:rtl w:val="0"/>
+        </w:rPr>
+      </w:r>
+    </w:p>
+    <w:p>
+      <w:pPr>
+        <w:rPr/>
+      </w:pPr>
       <w:r>
         <w:rPr>
           <w:rtl w:val="0"/>
@@ -533,6 +1540,14 @@
       <w:sz w:val="30"/>
       <w:szCs w:val="30"/>
     </w:rPr>
+  </w:style>
+  <w:style w:type="table" w:styleId="Table1">
+    <w:basedOn w:val="TableNormal"/>
+    <w:tblPr>
+      <w:tblStyleRowBandSize w:val="1"/>
+      <w:tblStyleColBandSize w:val="1"/>
+      <w:tblCellMar/>
+    </w:tblPr>
   </w:style>
 </w:styles>
 </file>

</xml_diff>

<commit_message>
Agrega la descripción general del diseño
</commit_message>
<xml_diff>
--- a/Documento de diseno Iteracion 1.docx
+++ b/Documento de diseno Iteracion 1.docx
@@ -1344,7 +1344,568 @@
     </w:p>
     <w:p>
       <w:pPr>
+        <w:pStyle w:val="Heading1"/>
+        <w:keepNext w:val="0"/>
+        <w:keepLines w:val="0"/>
+        <w:pBdr>
+          <w:bottom w:color="2e75b6" w:space="4" w:sz="6" w:val="single"/>
+        </w:pBdr>
+        <w:spacing w:after="160" w:before="320" w:line="240" w:lineRule="auto"/>
+        <w:rPr>
+          <w:b w:val="1"/>
+          <w:bCs w:val="1"/>
+          <w:color w:val="1f4e79"/>
+          <w:sz w:val="30"/>
+          <w:szCs w:val="30"/>
+        </w:rPr>
+      </w:pPr>
+      <w:bookmarkStart w:colFirst="0" w:colLast="0" w:name="_ofhmfh818q36" w:id="5"/>
+      <w:bookmarkEnd w:id="5"/>
+      <w:r>
+        <w:rPr>
+          <w:b w:val="1"/>
+          <w:bCs w:val="1"/>
+          <w:color w:val="1f4e79"/>
+          <w:sz w:val="30"/>
+          <w:szCs w:val="30"/>
+          <w:rtl w:val="0"/>
+        </w:rPr>
+        <w:t xml:space="preserve">2. Descripción General del Diseño</w:t>
+      </w:r>
+    </w:p>
+    <w:p>
+      <w:pPr>
+        <w:pStyle w:val="Heading2"/>
+        <w:keepNext w:val="0"/>
+        <w:keepLines w:val="0"/>
+        <w:spacing w:before="220" w:line="240" w:lineRule="auto"/>
+        <w:rPr>
+          <w:b w:val="1"/>
+          <w:bCs w:val="1"/>
+          <w:color w:val="2e75b6"/>
+          <w:sz w:val="25"/>
+          <w:szCs w:val="25"/>
+        </w:rPr>
+      </w:pPr>
+      <w:bookmarkStart w:colFirst="0" w:colLast="0" w:name="_5s1p2um3k30p" w:id="6"/>
+      <w:bookmarkEnd w:id="6"/>
+      <w:r>
+        <w:rPr>
+          <w:b w:val="1"/>
+          <w:bCs w:val="1"/>
+          <w:color w:val="2e75b6"/>
+          <w:sz w:val="25"/>
+          <w:szCs w:val="25"/>
+          <w:rtl w:val="0"/>
+        </w:rPr>
+        <w:t xml:space="preserve">2.1 Visión del producto</w:t>
+      </w:r>
+    </w:p>
+    <w:p>
+      <w:pPr>
         <w:spacing w:after="240" w:before="240" w:lineRule="auto"/>
+        <w:rPr/>
+      </w:pPr>
+      <w:r>
+        <w:rPr>
+          <w:rtl w:val="0"/>
+        </w:rPr>
+        <w:t xml:space="preserve">Para las personas responsables de la gestión curricular de la Universidad CENFOTEC que necesitan mantener información organizada y consistente sobre los cursos, el Sistema de Gestión Curricular es una aplicación web que centraliza y estandariza esa información. Su finalidad es facilitar el registro, la revisión, la aprobación y la consulta de los cursos, de acuerdo con los roles y los criterios institucionales.</w:t>
+      </w:r>
+    </w:p>
+    <w:p>
+      <w:pPr>
+        <w:pStyle w:val="Heading2"/>
+        <w:keepNext w:val="0"/>
+        <w:keepLines w:val="0"/>
+        <w:spacing w:before="220" w:line="240" w:lineRule="auto"/>
+        <w:rPr>
+          <w:b w:val="1"/>
+          <w:bCs w:val="1"/>
+          <w:color w:val="2e75b6"/>
+          <w:sz w:val="25"/>
+          <w:szCs w:val="25"/>
+        </w:rPr>
+      </w:pPr>
+      <w:bookmarkStart w:colFirst="0" w:colLast="0" w:name="_xamy2xtevluv" w:id="7"/>
+      <w:bookmarkEnd w:id="7"/>
+      <w:r>
+        <w:rPr>
+          <w:b w:val="1"/>
+          <w:bCs w:val="1"/>
+          <w:color w:val="2e75b6"/>
+          <w:sz w:val="25"/>
+          <w:szCs w:val="25"/>
+          <w:rtl w:val="0"/>
+        </w:rPr>
+        <w:t xml:space="preserve">2.2 Objetivos del diseño</w:t>
+      </w:r>
+    </w:p>
+    <w:tbl>
+      <w:tblPr>
+        <w:tblStyle w:val="Table2"/>
+        <w:tblW w:w="9360.0" w:type="dxa"/>
+        <w:jc w:val="left"/>
+        <w:tblBorders>
+          <w:top w:color="000000" w:space="0" w:sz="4" w:val="single"/>
+          <w:left w:color="000000" w:space="0" w:sz="4" w:val="single"/>
+          <w:bottom w:color="000000" w:space="0" w:sz="4" w:val="single"/>
+          <w:right w:color="000000" w:space="0" w:sz="4" w:val="single"/>
+          <w:insideH w:color="000000" w:space="0" w:sz="4" w:val="single"/>
+          <w:insideV w:color="000000" w:space="0" w:sz="4" w:val="single"/>
+        </w:tblBorders>
+        <w:tblLayout w:type="fixed"/>
+        <w:tblLook w:val="0400"/>
+      </w:tblPr>
+      <w:tblGrid>
+        <w:gridCol w:w="2400"/>
+        <w:gridCol w:w="6960"/>
+        <w:tblGridChange w:id="0">
+          <w:tblGrid>
+            <w:gridCol w:w="2400"/>
+            <w:gridCol w:w="6960"/>
+          </w:tblGrid>
+        </w:tblGridChange>
+      </w:tblGrid>
+      <w:tr>
+        <w:trPr>
+          <w:cantSplit w:val="0"/>
+          <w:tblHeader w:val="0"/>
+        </w:trPr>
+        <w:tc>
+          <w:tcPr>
+            <w:tcBorders>
+              <w:top w:color="bfbfbf" w:space="0" w:sz="4" w:val="single"/>
+              <w:left w:color="bfbfbf" w:space="0" w:sz="4" w:val="single"/>
+              <w:bottom w:color="bfbfbf" w:space="0" w:sz="4" w:val="single"/>
+              <w:right w:color="bfbfbf" w:space="0" w:sz="4" w:val="single"/>
+            </w:tcBorders>
+            <w:shd w:fill="d4eadd" w:val="clear"/>
+            <w:tcMar>
+              <w:top w:w="60.0" w:type="dxa"/>
+              <w:left w:w="110.0" w:type="dxa"/>
+              <w:bottom w:w="60.0" w:type="dxa"/>
+              <w:right w:w="110.0" w:type="dxa"/>
+            </w:tcMar>
+            <w:vAlign w:val="center"/>
+          </w:tcPr>
+          <w:p>
+            <w:pPr>
+              <w:spacing w:line="240" w:lineRule="auto"/>
+              <w:rPr/>
+            </w:pPr>
+            <w:r>
+              <w:rPr>
+                <w:b w:val="1"/>
+                <w:bCs w:val="1"/>
+                <w:rtl w:val="0"/>
+              </w:rPr>
+              <w:t xml:space="preserve">OBJ-01 (general)</w:t>
+            </w:r>
+            <w:r>
+              <w:rPr>
+                <w:rtl w:val="0"/>
+              </w:rPr>
+            </w:r>
+          </w:p>
+        </w:tc>
+        <w:tc>
+          <w:tcPr>
+            <w:tcBorders>
+              <w:top w:color="bfbfbf" w:space="0" w:sz="4" w:val="single"/>
+              <w:left w:color="bfbfbf" w:space="0" w:sz="4" w:val="single"/>
+              <w:bottom w:color="bfbfbf" w:space="0" w:sz="4" w:val="single"/>
+              <w:right w:color="bfbfbf" w:space="0" w:sz="4" w:val="single"/>
+            </w:tcBorders>
+            <w:tcMar>
+              <w:top w:w="60.0" w:type="dxa"/>
+              <w:left w:w="110.0" w:type="dxa"/>
+              <w:bottom w:w="60.0" w:type="dxa"/>
+              <w:right w:w="110.0" w:type="dxa"/>
+            </w:tcMar>
+            <w:vAlign w:val="center"/>
+          </w:tcPr>
+          <w:p>
+            <w:pPr>
+              <w:spacing w:line="240" w:lineRule="auto"/>
+              <w:rPr/>
+            </w:pPr>
+            <w:r>
+              <w:rPr>
+                <w:rtl w:val="0"/>
+              </w:rPr>
+              <w:t xml:space="preserve">Definir el diseño de la primera iteración del Sistema de Gestión Curricular, estableciendo la estructura de las páginas, los estilos, las validaciones de los formularios y el almacenamiento de la información mediante localStorage.</w:t>
+            </w:r>
+          </w:p>
+        </w:tc>
+      </w:tr>
+      <w:tr>
+        <w:trPr>
+          <w:cantSplit w:val="0"/>
+          <w:tblHeader w:val="0"/>
+        </w:trPr>
+        <w:tc>
+          <w:tcPr>
+            <w:tcBorders>
+              <w:top w:color="bfbfbf" w:space="0" w:sz="4" w:val="single"/>
+              <w:left w:color="bfbfbf" w:space="0" w:sz="4" w:val="single"/>
+              <w:bottom w:color="bfbfbf" w:space="0" w:sz="4" w:val="single"/>
+              <w:right w:color="bfbfbf" w:space="0" w:sz="4" w:val="single"/>
+            </w:tcBorders>
+            <w:shd w:fill="d4eadd" w:val="clear"/>
+            <w:tcMar>
+              <w:top w:w="60.0" w:type="dxa"/>
+              <w:left w:w="110.0" w:type="dxa"/>
+              <w:bottom w:w="60.0" w:type="dxa"/>
+              <w:right w:w="110.0" w:type="dxa"/>
+            </w:tcMar>
+            <w:vAlign w:val="center"/>
+          </w:tcPr>
+          <w:p>
+            <w:pPr>
+              <w:spacing w:line="240" w:lineRule="auto"/>
+              <w:rPr/>
+            </w:pPr>
+            <w:r>
+              <w:rPr>
+                <w:b w:val="1"/>
+                <w:bCs w:val="1"/>
+                <w:rtl w:val="0"/>
+              </w:rPr>
+              <w:t xml:space="preserve">OBJ-02</w:t>
+            </w:r>
+            <w:r>
+              <w:rPr>
+                <w:rtl w:val="0"/>
+              </w:rPr>
+            </w:r>
+          </w:p>
+        </w:tc>
+        <w:tc>
+          <w:tcPr>
+            <w:tcBorders>
+              <w:top w:color="bfbfbf" w:space="0" w:sz="4" w:val="single"/>
+              <w:left w:color="bfbfbf" w:space="0" w:sz="4" w:val="single"/>
+              <w:bottom w:color="bfbfbf" w:space="0" w:sz="4" w:val="single"/>
+              <w:right w:color="bfbfbf" w:space="0" w:sz="4" w:val="single"/>
+            </w:tcBorders>
+            <w:tcMar>
+              <w:top w:w="60.0" w:type="dxa"/>
+              <w:left w:w="110.0" w:type="dxa"/>
+              <w:bottom w:w="60.0" w:type="dxa"/>
+              <w:right w:w="110.0" w:type="dxa"/>
+            </w:tcMar>
+            <w:vAlign w:val="center"/>
+          </w:tcPr>
+          <w:p>
+            <w:pPr>
+              <w:spacing w:line="240" w:lineRule="auto"/>
+              <w:rPr/>
+            </w:pPr>
+            <w:r>
+              <w:rPr>
+                <w:rtl w:val="0"/>
+              </w:rPr>
+              <w:t xml:space="preserve">Documentar la estructura de carpetas, el propósito de cada página y la maquetación HTML semántica de todas las vistas incluidas en esta iteración.</w:t>
+            </w:r>
+          </w:p>
+        </w:tc>
+      </w:tr>
+      <w:tr>
+        <w:trPr>
+          <w:cantSplit w:val="0"/>
+          <w:tblHeader w:val="0"/>
+        </w:trPr>
+        <w:tc>
+          <w:tcPr>
+            <w:tcBorders>
+              <w:top w:color="bfbfbf" w:space="0" w:sz="4" w:val="single"/>
+              <w:left w:color="bfbfbf" w:space="0" w:sz="4" w:val="single"/>
+              <w:bottom w:color="bfbfbf" w:space="0" w:sz="4" w:val="single"/>
+              <w:right w:color="bfbfbf" w:space="0" w:sz="4" w:val="single"/>
+            </w:tcBorders>
+            <w:shd w:fill="d4eadd" w:val="clear"/>
+            <w:tcMar>
+              <w:top w:w="60.0" w:type="dxa"/>
+              <w:left w:w="110.0" w:type="dxa"/>
+              <w:bottom w:w="60.0" w:type="dxa"/>
+              <w:right w:w="110.0" w:type="dxa"/>
+            </w:tcMar>
+            <w:vAlign w:val="center"/>
+          </w:tcPr>
+          <w:p>
+            <w:pPr>
+              <w:spacing w:line="240" w:lineRule="auto"/>
+              <w:rPr/>
+            </w:pPr>
+            <w:r>
+              <w:rPr>
+                <w:b w:val="1"/>
+                <w:bCs w:val="1"/>
+                <w:rtl w:val="0"/>
+              </w:rPr>
+              <w:t xml:space="preserve">OBJ-03</w:t>
+            </w:r>
+            <w:r>
+              <w:rPr>
+                <w:rtl w:val="0"/>
+              </w:rPr>
+            </w:r>
+          </w:p>
+        </w:tc>
+        <w:tc>
+          <w:tcPr>
+            <w:tcBorders>
+              <w:top w:color="bfbfbf" w:space="0" w:sz="4" w:val="single"/>
+              <w:left w:color="bfbfbf" w:space="0" w:sz="4" w:val="single"/>
+              <w:bottom w:color="bfbfbf" w:space="0" w:sz="4" w:val="single"/>
+              <w:right w:color="bfbfbf" w:space="0" w:sz="4" w:val="single"/>
+            </w:tcBorders>
+            <w:tcMar>
+              <w:top w:w="60.0" w:type="dxa"/>
+              <w:left w:w="110.0" w:type="dxa"/>
+              <w:bottom w:w="60.0" w:type="dxa"/>
+              <w:right w:w="110.0" w:type="dxa"/>
+            </w:tcMar>
+            <w:vAlign w:val="center"/>
+          </w:tcPr>
+          <w:p>
+            <w:pPr>
+              <w:spacing w:line="240" w:lineRule="auto"/>
+              <w:rPr/>
+            </w:pPr>
+            <w:r>
+              <w:rPr>
+                <w:rtl w:val="0"/>
+              </w:rPr>
+              <w:t xml:space="preserve">Establecer una guía de estilos que defina colores, tipografía, botones, presentación de formularios, adaptación a distintos tamaños de pantalla y criterios de accesibilidad.</w:t>
+            </w:r>
+          </w:p>
+        </w:tc>
+      </w:tr>
+      <w:tr>
+        <w:trPr>
+          <w:cantSplit w:val="0"/>
+          <w:tblHeader w:val="0"/>
+        </w:trPr>
+        <w:tc>
+          <w:tcPr>
+            <w:tcBorders>
+              <w:top w:color="bfbfbf" w:space="0" w:sz="4" w:val="single"/>
+              <w:left w:color="bfbfbf" w:space="0" w:sz="4" w:val="single"/>
+              <w:bottom w:color="bfbfbf" w:space="0" w:sz="4" w:val="single"/>
+              <w:right w:color="bfbfbf" w:space="0" w:sz="4" w:val="single"/>
+            </w:tcBorders>
+            <w:shd w:fill="d4eadd" w:val="clear"/>
+            <w:tcMar>
+              <w:top w:w="60.0" w:type="dxa"/>
+              <w:left w:w="110.0" w:type="dxa"/>
+              <w:bottom w:w="60.0" w:type="dxa"/>
+              <w:right w:w="110.0" w:type="dxa"/>
+            </w:tcMar>
+            <w:vAlign w:val="center"/>
+          </w:tcPr>
+          <w:p>
+            <w:pPr>
+              <w:spacing w:line="240" w:lineRule="auto"/>
+              <w:rPr/>
+            </w:pPr>
+            <w:r>
+              <w:rPr>
+                <w:b w:val="1"/>
+                <w:bCs w:val="1"/>
+                <w:rtl w:val="0"/>
+              </w:rPr>
+              <w:t xml:space="preserve">OBJ-04</w:t>
+            </w:r>
+            <w:r>
+              <w:rPr>
+                <w:rtl w:val="0"/>
+              </w:rPr>
+            </w:r>
+          </w:p>
+        </w:tc>
+        <w:tc>
+          <w:tcPr>
+            <w:tcBorders>
+              <w:top w:color="bfbfbf" w:space="0" w:sz="4" w:val="single"/>
+              <w:left w:color="bfbfbf" w:space="0" w:sz="4" w:val="single"/>
+              <w:bottom w:color="bfbfbf" w:space="0" w:sz="4" w:val="single"/>
+              <w:right w:color="bfbfbf" w:space="0" w:sz="4" w:val="single"/>
+            </w:tcBorders>
+            <w:tcMar>
+              <w:top w:w="60.0" w:type="dxa"/>
+              <w:left w:w="110.0" w:type="dxa"/>
+              <w:bottom w:w="60.0" w:type="dxa"/>
+              <w:right w:w="110.0" w:type="dxa"/>
+            </w:tcMar>
+            <w:vAlign w:val="center"/>
+          </w:tcPr>
+          <w:p>
+            <w:pPr>
+              <w:spacing w:line="240" w:lineRule="auto"/>
+              <w:rPr/>
+            </w:pPr>
+            <w:r>
+              <w:rPr>
+                <w:rtl w:val="0"/>
+              </w:rPr>
+              <w:t xml:space="preserve">Diseñar las reglas de validación de cada formulario, especificando las restricciones por campo, los mensajes de error y un pseudocódigo general reutilizable mediante JavaScript nativo.</w:t>
+            </w:r>
+          </w:p>
+        </w:tc>
+      </w:tr>
+      <w:tr>
+        <w:trPr>
+          <w:cantSplit w:val="0"/>
+          <w:tblHeader w:val="0"/>
+        </w:trPr>
+        <w:tc>
+          <w:tcPr>
+            <w:tcBorders>
+              <w:top w:color="bfbfbf" w:space="0" w:sz="4" w:val="single"/>
+              <w:left w:color="bfbfbf" w:space="0" w:sz="4" w:val="single"/>
+              <w:bottom w:color="bfbfbf" w:space="0" w:sz="4" w:val="single"/>
+              <w:right w:color="bfbfbf" w:space="0" w:sz="4" w:val="single"/>
+            </w:tcBorders>
+            <w:shd w:fill="d4eadd" w:val="clear"/>
+            <w:tcMar>
+              <w:top w:w="60.0" w:type="dxa"/>
+              <w:left w:w="110.0" w:type="dxa"/>
+              <w:bottom w:w="60.0" w:type="dxa"/>
+              <w:right w:w="110.0" w:type="dxa"/>
+            </w:tcMar>
+            <w:vAlign w:val="center"/>
+          </w:tcPr>
+          <w:p>
+            <w:pPr>
+              <w:spacing w:line="240" w:lineRule="auto"/>
+              <w:rPr>
+                <w:b w:val="1"/>
+                <w:bCs w:val="1"/>
+              </w:rPr>
+            </w:pPr>
+            <w:r>
+              <w:rPr>
+                <w:b w:val="1"/>
+                <w:bCs w:val="1"/>
+                <w:rtl w:val="0"/>
+              </w:rPr>
+              <w:t xml:space="preserve">OBJ-05</w:t>
+            </w:r>
+          </w:p>
+        </w:tc>
+        <w:tc>
+          <w:tcPr>
+            <w:tcBorders>
+              <w:top w:color="bfbfbf" w:space="0" w:sz="4" w:val="single"/>
+              <w:left w:color="bfbfbf" w:space="0" w:sz="4" w:val="single"/>
+              <w:bottom w:color="bfbfbf" w:space="0" w:sz="4" w:val="single"/>
+              <w:right w:color="bfbfbf" w:space="0" w:sz="4" w:val="single"/>
+            </w:tcBorders>
+            <w:tcMar>
+              <w:top w:w="60.0" w:type="dxa"/>
+              <w:left w:w="110.0" w:type="dxa"/>
+              <w:bottom w:w="60.0" w:type="dxa"/>
+              <w:right w:w="110.0" w:type="dxa"/>
+            </w:tcMar>
+            <w:vAlign w:val="center"/>
+          </w:tcPr>
+          <w:p>
+            <w:pPr>
+              <w:spacing w:line="240" w:lineRule="auto"/>
+              <w:rPr/>
+            </w:pPr>
+            <w:r>
+              <w:rPr>
+                <w:rtl w:val="0"/>
+              </w:rPr>
+              <w:t xml:space="preserve">Definir al menos un caso de prueba por cada interfaz representada en los bocetos, indicando las entradas y los resultados esperados y contemplando escenarios válidos e inválidos en el conjunto.</w:t>
+            </w:r>
+          </w:p>
+        </w:tc>
+      </w:tr>
+    </w:tbl>
+    <w:p>
+      <w:pPr>
+        <w:rPr/>
+      </w:pPr>
+      <w:r>
+        <w:rPr>
+          <w:rtl w:val="0"/>
+        </w:rPr>
+      </w:r>
+    </w:p>
+    <w:p>
+      <w:pPr>
+        <w:pStyle w:val="Heading2"/>
+        <w:keepNext w:val="0"/>
+        <w:keepLines w:val="0"/>
+        <w:spacing w:before="220" w:line="240" w:lineRule="auto"/>
+        <w:rPr>
+          <w:b w:val="1"/>
+          <w:bCs w:val="1"/>
+          <w:color w:val="2e75b6"/>
+          <w:sz w:val="25"/>
+          <w:szCs w:val="25"/>
+        </w:rPr>
+      </w:pPr>
+      <w:bookmarkStart w:colFirst="0" w:colLast="0" w:name="_jt3bm5oqp0aa" w:id="8"/>
+      <w:bookmarkEnd w:id="8"/>
+      <w:r>
+        <w:rPr>
+          <w:b w:val="1"/>
+          <w:bCs w:val="1"/>
+          <w:color w:val="2e75b6"/>
+          <w:sz w:val="25"/>
+          <w:szCs w:val="25"/>
+          <w:rtl w:val="0"/>
+        </w:rPr>
+        <w:t xml:space="preserve">2.3 Supuestos y dependencias</w:t>
+      </w:r>
+    </w:p>
+    <w:p>
+      <w:pPr>
+        <w:spacing w:after="240" w:before="240" w:lineRule="auto"/>
+        <w:rPr/>
+      </w:pPr>
+      <w:r>
+        <w:rPr>
+          <w:b w:val="1"/>
+          <w:bCs w:val="1"/>
+          <w:rtl w:val="0"/>
+        </w:rPr>
+        <w:t xml:space="preserve">Supuestos.</w:t>
+      </w:r>
+      <w:r>
+        <w:rPr>
+          <w:rtl w:val="0"/>
+        </w:rPr>
+        <w:t xml:space="preserve"> El prototipo se ejecutará en un navegador con JavaScript habilitado y soporte para localStorage. Las páginas compartirán el mismo origen para acceder a la información almacenada. Durante la implementación y la verificación se utilizarán datos de prueba para los usuarios, los catálogos y los cursos.</w:t>
+      </w:r>
+    </w:p>
+    <w:p>
+      <w:pPr>
+        <w:spacing w:after="240" w:before="240" w:lineRule="auto"/>
+        <w:rPr/>
+      </w:pPr>
+      <w:r>
+        <w:rPr>
+          <w:b w:val="1"/>
+          <w:bCs w:val="1"/>
+          <w:rtl w:val="0"/>
+        </w:rPr>
+        <w:t xml:space="preserve">Dependencias.</w:t>
+      </w:r>
+      <w:r>
+        <w:rPr>
+          <w:rtl w:val="0"/>
+        </w:rPr>
+        <w:t xml:space="preserve"> El diseño dependerá de la ERS del proyecto para definir los campos, los roles, las restricciones y las reglas de los formularios. También requerirá los valores de los catálogos institucionales y los recursos gráficos y lineamientos visuales necesarios para elaborar la guía de estilo. La integración de la maquetación HTML, los estilos CSS y la validación con JavaScript dependerá de que el equipo acuerde nombres de campos, identificadores y formatos de datos comunes.</w:t>
+      </w:r>
+    </w:p>
+    <w:p>
+      <w:pPr>
         <w:rPr/>
       </w:pPr>
       <w:r>
@@ -1547,6 +2108,19 @@
       <w:tblStyleRowBandSize w:val="1"/>
       <w:tblStyleColBandSize w:val="1"/>
       <w:tblCellMar/>
+    </w:tblPr>
+  </w:style>
+  <w:style w:type="table" w:styleId="Table2">
+    <w:basedOn w:val="TableNormal"/>
+    <w:tblPr>
+      <w:tblStyleRowBandSize w:val="1"/>
+      <w:tblStyleColBandSize w:val="1"/>
+      <w:tblCellMar>
+        <w:top w:w="0.0" w:type="dxa"/>
+        <w:left w:w="10.0" w:type="dxa"/>
+        <w:bottom w:w="0.0" w:type="dxa"/>
+        <w:right w:w="10.0" w:type="dxa"/>
+      </w:tblCellMar>
     </w:tblPr>
   </w:style>
 </w:styles>

</xml_diff>

<commit_message>
Agrega la arquitectura y la estructura del proyecto
</commit_message>
<xml_diff>
--- a/Documento de diseno Iteracion 1.docx
+++ b/Documento de diseno Iteracion 1.docx
@@ -1904,6 +1904,2070 @@
         <w:t xml:space="preserve"> El diseño dependerá de la ERS del proyecto para definir los campos, los roles, las restricciones y las reglas de los formularios. También requerirá los valores de los catálogos institucionales y los recursos gráficos y lineamientos visuales necesarios para elaborar la guía de estilo. La integración de la maquetación HTML, los estilos CSS y la validación con JavaScript dependerá de que el equipo acuerde nombres de campos, identificadores y formatos de datos comunes.</w:t>
       </w:r>
     </w:p>
+    <w:p>
+      <w:pPr>
+        <w:rPr/>
+      </w:pPr>
+      <w:r>
+        <w:rPr>
+          <w:rtl w:val="0"/>
+        </w:rPr>
+      </w:r>
+    </w:p>
+    <w:p>
+      <w:pPr>
+        <w:pStyle w:val="Heading1"/>
+        <w:keepNext w:val="0"/>
+        <w:keepLines w:val="0"/>
+        <w:pBdr>
+          <w:bottom w:color="2e75b6" w:space="4" w:sz="6" w:val="single"/>
+        </w:pBdr>
+        <w:spacing w:after="160" w:before="320" w:line="240" w:lineRule="auto"/>
+        <w:rPr>
+          <w:b w:val="1"/>
+          <w:bCs w:val="1"/>
+          <w:color w:val="1f4e79"/>
+          <w:sz w:val="30"/>
+          <w:szCs w:val="30"/>
+        </w:rPr>
+      </w:pPr>
+      <w:bookmarkStart w:colFirst="0" w:colLast="0" w:name="_s9bdcvv8rruk" w:id="9"/>
+      <w:bookmarkEnd w:id="9"/>
+      <w:r>
+        <w:rPr>
+          <w:b w:val="1"/>
+          <w:bCs w:val="1"/>
+          <w:color w:val="1f4e79"/>
+          <w:sz w:val="30"/>
+          <w:szCs w:val="30"/>
+          <w:rtl w:val="0"/>
+        </w:rPr>
+        <w:t xml:space="preserve">3. Arquitectura y Estructura del Proyecto</w:t>
+      </w:r>
+    </w:p>
+    <w:p>
+      <w:pPr>
+        <w:pStyle w:val="Heading2"/>
+        <w:keepNext w:val="0"/>
+        <w:keepLines w:val="0"/>
+        <w:spacing w:before="220" w:line="240" w:lineRule="auto"/>
+        <w:rPr/>
+      </w:pPr>
+      <w:bookmarkStart w:colFirst="0" w:colLast="0" w:name="_mloulht7jwvy" w:id="10"/>
+      <w:bookmarkEnd w:id="10"/>
+      <w:r>
+        <w:rPr>
+          <w:b w:val="1"/>
+          <w:bCs w:val="1"/>
+          <w:color w:val="2e75b6"/>
+          <w:sz w:val="25"/>
+          <w:szCs w:val="25"/>
+          <w:rtl w:val="0"/>
+        </w:rPr>
+        <w:t xml:space="preserve">3.1 Estructura de carpetas y archivos</w:t>
+      </w:r>
+      <w:r>
+        <w:rPr>
+          <w:rtl w:val="0"/>
+        </w:rPr>
+      </w:r>
+    </w:p>
+    <w:p>
+      <w:pPr>
+        <w:rPr/>
+      </w:pPr>
+      <w:r>
+        <w:rPr>
+          <w:rtl w:val="0"/>
+        </w:rPr>
+      </w:r>
+    </w:p>
+    <w:p>
+      <w:pPr>
+        <w:shd w:fill="d9d9d9" w:val="clear"/>
+        <w:spacing w:line="240" w:lineRule="auto"/>
+        <w:rPr>
+          <w:rFonts w:ascii="Consolas" w:cs="Consolas" w:eastAsia="Consolas" w:hAnsi="Consolas"/>
+        </w:rPr>
+      </w:pPr>
+      <w:r>
+        <w:rPr>
+          <w:rFonts w:ascii="Consolas" w:cs="Consolas" w:eastAsia="Consolas" w:hAnsi="Consolas"/>
+          <w:rtl w:val="0"/>
+        </w:rPr>
+        <w:t xml:space="preserve">Proyecto-Integrador-1/</w:t>
+      </w:r>
+    </w:p>
+    <w:p>
+      <w:pPr>
+        <w:shd w:fill="d9d9d9" w:val="clear"/>
+        <w:spacing w:line="240" w:lineRule="auto"/>
+        <w:rPr>
+          <w:rFonts w:ascii="Consolas" w:cs="Consolas" w:eastAsia="Consolas" w:hAnsi="Consolas"/>
+        </w:rPr>
+      </w:pPr>
+      <w:r>
+        <w:rPr>
+          <w:rFonts w:ascii="Consolas" w:cs="Consolas" w:eastAsia="Consolas" w:hAnsi="Consolas"/>
+          <w:rtl w:val="0"/>
+        </w:rPr>
+        <w:t xml:space="preserve">├── index.html</w:t>
+      </w:r>
+    </w:p>
+    <w:p>
+      <w:pPr>
+        <w:shd w:fill="d9d9d9" w:val="clear"/>
+        <w:spacing w:line="240" w:lineRule="auto"/>
+        <w:rPr>
+          <w:rFonts w:ascii="Consolas" w:cs="Consolas" w:eastAsia="Consolas" w:hAnsi="Consolas"/>
+        </w:rPr>
+      </w:pPr>
+      <w:r>
+        <w:rPr>
+          <w:rFonts w:ascii="Consolas" w:cs="Consolas" w:eastAsia="Consolas" w:hAnsi="Consolas"/>
+          <w:rtl w:val="0"/>
+        </w:rPr>
+        <w:t xml:space="preserve">├── pages/</w:t>
+      </w:r>
+    </w:p>
+    <w:p>
+      <w:pPr>
+        <w:shd w:fill="d9d9d9" w:val="clear"/>
+        <w:spacing w:line="240" w:lineRule="auto"/>
+        <w:rPr>
+          <w:rFonts w:ascii="Consolas" w:cs="Consolas" w:eastAsia="Consolas" w:hAnsi="Consolas"/>
+        </w:rPr>
+      </w:pPr>
+      <w:r>
+        <w:rPr>
+          <w:rFonts w:ascii="Consolas" w:cs="Consolas" w:eastAsia="Consolas" w:hAnsi="Consolas"/>
+          <w:rtl w:val="0"/>
+        </w:rPr>
+        <w:t xml:space="preserve">│   ├── login.html</w:t>
+      </w:r>
+    </w:p>
+    <w:p>
+      <w:pPr>
+        <w:shd w:fill="d9d9d9" w:val="clear"/>
+        <w:spacing w:line="240" w:lineRule="auto"/>
+        <w:rPr>
+          <w:rFonts w:ascii="Consolas" w:cs="Consolas" w:eastAsia="Consolas" w:hAnsi="Consolas"/>
+        </w:rPr>
+      </w:pPr>
+      <w:r>
+        <w:rPr>
+          <w:rFonts w:ascii="Consolas" w:cs="Consolas" w:eastAsia="Consolas" w:hAnsi="Consolas"/>
+          <w:rtl w:val="0"/>
+        </w:rPr>
+        <w:t xml:space="preserve">│   ├── inicio.html</w:t>
+      </w:r>
+    </w:p>
+    <w:p>
+      <w:pPr>
+        <w:shd w:fill="d9d9d9" w:val="clear"/>
+        <w:spacing w:line="240" w:lineRule="auto"/>
+        <w:rPr>
+          <w:rFonts w:ascii="Consolas" w:cs="Consolas" w:eastAsia="Consolas" w:hAnsi="Consolas"/>
+        </w:rPr>
+      </w:pPr>
+      <w:r>
+        <w:rPr>
+          <w:rFonts w:ascii="Consolas" w:cs="Consolas" w:eastAsia="Consolas" w:hAnsi="Consolas"/>
+          <w:rtl w:val="0"/>
+        </w:rPr>
+        <w:t xml:space="preserve">│   ├── usuarios.html</w:t>
+      </w:r>
+    </w:p>
+    <w:p>
+      <w:pPr>
+        <w:shd w:fill="d9d9d9" w:val="clear"/>
+        <w:spacing w:line="240" w:lineRule="auto"/>
+        <w:rPr>
+          <w:rFonts w:ascii="Consolas" w:cs="Consolas" w:eastAsia="Consolas" w:hAnsi="Consolas"/>
+        </w:rPr>
+      </w:pPr>
+      <w:r>
+        <w:rPr>
+          <w:rFonts w:ascii="Consolas" w:cs="Consolas" w:eastAsia="Consolas" w:hAnsi="Consolas"/>
+          <w:rtl w:val="0"/>
+        </w:rPr>
+        <w:t xml:space="preserve">│   ├── usuario-formulario.html</w:t>
+      </w:r>
+    </w:p>
+    <w:p>
+      <w:pPr>
+        <w:shd w:fill="d9d9d9" w:val="clear"/>
+        <w:spacing w:line="240" w:lineRule="auto"/>
+        <w:rPr>
+          <w:rFonts w:ascii="Consolas" w:cs="Consolas" w:eastAsia="Consolas" w:hAnsi="Consolas"/>
+        </w:rPr>
+      </w:pPr>
+      <w:r>
+        <w:rPr>
+          <w:rFonts w:ascii="Consolas" w:cs="Consolas" w:eastAsia="Consolas" w:hAnsi="Consolas"/>
+          <w:rtl w:val="0"/>
+        </w:rPr>
+        <w:t xml:space="preserve">│   ├── catalogos.html</w:t>
+      </w:r>
+    </w:p>
+    <w:p>
+      <w:pPr>
+        <w:shd w:fill="d9d9d9" w:val="clear"/>
+        <w:spacing w:line="240" w:lineRule="auto"/>
+        <w:rPr>
+          <w:rFonts w:ascii="Consolas" w:cs="Consolas" w:eastAsia="Consolas" w:hAnsi="Consolas"/>
+        </w:rPr>
+      </w:pPr>
+      <w:r>
+        <w:rPr>
+          <w:rFonts w:ascii="Consolas" w:cs="Consolas" w:eastAsia="Consolas" w:hAnsi="Consolas"/>
+          <w:rtl w:val="0"/>
+        </w:rPr>
+        <w:t xml:space="preserve">│   ├── catalogo-listado.html</w:t>
+      </w:r>
+    </w:p>
+    <w:p>
+      <w:pPr>
+        <w:shd w:fill="d9d9d9" w:val="clear"/>
+        <w:spacing w:line="240" w:lineRule="auto"/>
+        <w:rPr>
+          <w:rFonts w:ascii="Consolas" w:cs="Consolas" w:eastAsia="Consolas" w:hAnsi="Consolas"/>
+        </w:rPr>
+      </w:pPr>
+      <w:r>
+        <w:rPr>
+          <w:rFonts w:ascii="Consolas" w:cs="Consolas" w:eastAsia="Consolas" w:hAnsi="Consolas"/>
+          <w:rtl w:val="0"/>
+        </w:rPr>
+        <w:t xml:space="preserve">│   ├── catalogo-formulario.html</w:t>
+      </w:r>
+    </w:p>
+    <w:p>
+      <w:pPr>
+        <w:shd w:fill="d9d9d9" w:val="clear"/>
+        <w:spacing w:line="240" w:lineRule="auto"/>
+        <w:rPr>
+          <w:rFonts w:ascii="Consolas" w:cs="Consolas" w:eastAsia="Consolas" w:hAnsi="Consolas"/>
+        </w:rPr>
+      </w:pPr>
+      <w:r>
+        <w:rPr>
+          <w:rFonts w:ascii="Consolas" w:cs="Consolas" w:eastAsia="Consolas" w:hAnsi="Consolas"/>
+          <w:rtl w:val="0"/>
+        </w:rPr>
+        <w:t xml:space="preserve">│   ├── cursos.html</w:t>
+      </w:r>
+    </w:p>
+    <w:p>
+      <w:pPr>
+        <w:shd w:fill="d9d9d9" w:val="clear"/>
+        <w:spacing w:line="240" w:lineRule="auto"/>
+        <w:rPr>
+          <w:rFonts w:ascii="Consolas" w:cs="Consolas" w:eastAsia="Consolas" w:hAnsi="Consolas"/>
+        </w:rPr>
+      </w:pPr>
+      <w:r>
+        <w:rPr>
+          <w:rFonts w:ascii="Consolas" w:cs="Consolas" w:eastAsia="Consolas" w:hAnsi="Consolas"/>
+          <w:rtl w:val="0"/>
+        </w:rPr>
+        <w:t xml:space="preserve">│   ├── curso-formulario.html</w:t>
+      </w:r>
+    </w:p>
+    <w:p>
+      <w:pPr>
+        <w:shd w:fill="d9d9d9" w:val="clear"/>
+        <w:spacing w:line="240" w:lineRule="auto"/>
+        <w:rPr>
+          <w:rFonts w:ascii="Consolas" w:cs="Consolas" w:eastAsia="Consolas" w:hAnsi="Consolas"/>
+        </w:rPr>
+      </w:pPr>
+      <w:r>
+        <w:rPr>
+          <w:rFonts w:ascii="Consolas" w:cs="Consolas" w:eastAsia="Consolas" w:hAnsi="Consolas"/>
+          <w:rtl w:val="0"/>
+        </w:rPr>
+        <w:t xml:space="preserve">│   ├── curso-detalle.html</w:t>
+      </w:r>
+    </w:p>
+    <w:p>
+      <w:pPr>
+        <w:shd w:fill="d9d9d9" w:val="clear"/>
+        <w:spacing w:line="240" w:lineRule="auto"/>
+        <w:rPr>
+          <w:rFonts w:ascii="Consolas" w:cs="Consolas" w:eastAsia="Consolas" w:hAnsi="Consolas"/>
+        </w:rPr>
+      </w:pPr>
+      <w:r>
+        <w:rPr>
+          <w:rFonts w:ascii="Consolas" w:cs="Consolas" w:eastAsia="Consolas" w:hAnsi="Consolas"/>
+          <w:rtl w:val="0"/>
+        </w:rPr>
+        <w:t xml:space="preserve">│   ├── cambiar-contrasena.html</w:t>
+      </w:r>
+    </w:p>
+    <w:p>
+      <w:pPr>
+        <w:shd w:fill="d9d9d9" w:val="clear"/>
+        <w:spacing w:line="240" w:lineRule="auto"/>
+        <w:rPr>
+          <w:rFonts w:ascii="Consolas" w:cs="Consolas" w:eastAsia="Consolas" w:hAnsi="Consolas"/>
+        </w:rPr>
+      </w:pPr>
+      <w:r>
+        <w:rPr>
+          <w:rFonts w:ascii="Consolas" w:cs="Consolas" w:eastAsia="Consolas" w:hAnsi="Consolas"/>
+          <w:rtl w:val="0"/>
+        </w:rPr>
+        <w:t xml:space="preserve">│   └── recuperar-contrasena.html</w:t>
+      </w:r>
+    </w:p>
+    <w:p>
+      <w:pPr>
+        <w:shd w:fill="d9d9d9" w:val="clear"/>
+        <w:spacing w:line="240" w:lineRule="auto"/>
+        <w:rPr>
+          <w:rFonts w:ascii="Consolas" w:cs="Consolas" w:eastAsia="Consolas" w:hAnsi="Consolas"/>
+        </w:rPr>
+      </w:pPr>
+      <w:r>
+        <w:rPr>
+          <w:rFonts w:ascii="Consolas" w:cs="Consolas" w:eastAsia="Consolas" w:hAnsi="Consolas"/>
+          <w:rtl w:val="0"/>
+        </w:rPr>
+        <w:t xml:space="preserve">├── css/</w:t>
+      </w:r>
+    </w:p>
+    <w:p>
+      <w:pPr>
+        <w:shd w:fill="d9d9d9" w:val="clear"/>
+        <w:spacing w:line="240" w:lineRule="auto"/>
+        <w:rPr>
+          <w:rFonts w:ascii="Consolas" w:cs="Consolas" w:eastAsia="Consolas" w:hAnsi="Consolas"/>
+        </w:rPr>
+      </w:pPr>
+      <w:r>
+        <w:rPr>
+          <w:rFonts w:ascii="Consolas" w:cs="Consolas" w:eastAsia="Consolas" w:hAnsi="Consolas"/>
+          <w:rtl w:val="0"/>
+        </w:rPr>
+        <w:t xml:space="preserve">│   └── estilos.css</w:t>
+      </w:r>
+    </w:p>
+    <w:p>
+      <w:pPr>
+        <w:shd w:fill="d9d9d9" w:val="clear"/>
+        <w:spacing w:line="240" w:lineRule="auto"/>
+        <w:rPr>
+          <w:rFonts w:ascii="Consolas" w:cs="Consolas" w:eastAsia="Consolas" w:hAnsi="Consolas"/>
+        </w:rPr>
+      </w:pPr>
+      <w:r>
+        <w:rPr>
+          <w:rFonts w:ascii="Consolas" w:cs="Consolas" w:eastAsia="Consolas" w:hAnsi="Consolas"/>
+          <w:rtl w:val="0"/>
+        </w:rPr>
+        <w:t xml:space="preserve">├── js/</w:t>
+      </w:r>
+    </w:p>
+    <w:p>
+      <w:pPr>
+        <w:shd w:fill="d9d9d9" w:val="clear"/>
+        <w:spacing w:line="240" w:lineRule="auto"/>
+        <w:rPr>
+          <w:rFonts w:ascii="Consolas" w:cs="Consolas" w:eastAsia="Consolas" w:hAnsi="Consolas"/>
+        </w:rPr>
+      </w:pPr>
+      <w:r>
+        <w:rPr>
+          <w:rFonts w:ascii="Consolas" w:cs="Consolas" w:eastAsia="Consolas" w:hAnsi="Consolas"/>
+          <w:rtl w:val="0"/>
+        </w:rPr>
+        <w:t xml:space="preserve">│   ├── validacion.js</w:t>
+      </w:r>
+    </w:p>
+    <w:p>
+      <w:pPr>
+        <w:shd w:fill="d9d9d9" w:val="clear"/>
+        <w:spacing w:line="240" w:lineRule="auto"/>
+        <w:rPr>
+          <w:rFonts w:ascii="Consolas" w:cs="Consolas" w:eastAsia="Consolas" w:hAnsi="Consolas"/>
+        </w:rPr>
+      </w:pPr>
+      <w:r>
+        <w:rPr>
+          <w:rFonts w:ascii="Consolas" w:cs="Consolas" w:eastAsia="Consolas" w:hAnsi="Consolas"/>
+          <w:rtl w:val="0"/>
+        </w:rPr>
+        <w:t xml:space="preserve">│   ├── almacenamiento.js</w:t>
+      </w:r>
+    </w:p>
+    <w:p>
+      <w:pPr>
+        <w:shd w:fill="d9d9d9" w:val="clear"/>
+        <w:spacing w:line="240" w:lineRule="auto"/>
+        <w:rPr>
+          <w:rFonts w:ascii="Consolas" w:cs="Consolas" w:eastAsia="Consolas" w:hAnsi="Consolas"/>
+        </w:rPr>
+      </w:pPr>
+      <w:r>
+        <w:rPr>
+          <w:rFonts w:ascii="Consolas" w:cs="Consolas" w:eastAsia="Consolas" w:hAnsi="Consolas"/>
+          <w:rtl w:val="0"/>
+        </w:rPr>
+        <w:t xml:space="preserve">│   ├── autenticacion.js</w:t>
+      </w:r>
+    </w:p>
+    <w:p>
+      <w:pPr>
+        <w:shd w:fill="d9d9d9" w:val="clear"/>
+        <w:spacing w:line="240" w:lineRule="auto"/>
+        <w:rPr>
+          <w:rFonts w:ascii="Consolas" w:cs="Consolas" w:eastAsia="Consolas" w:hAnsi="Consolas"/>
+        </w:rPr>
+      </w:pPr>
+      <w:r>
+        <w:rPr>
+          <w:rFonts w:ascii="Consolas" w:cs="Consolas" w:eastAsia="Consolas" w:hAnsi="Consolas"/>
+          <w:rtl w:val="0"/>
+        </w:rPr>
+        <w:t xml:space="preserve">│   ├── usuarios.js</w:t>
+      </w:r>
+    </w:p>
+    <w:p>
+      <w:pPr>
+        <w:shd w:fill="d9d9d9" w:val="clear"/>
+        <w:spacing w:line="240" w:lineRule="auto"/>
+        <w:rPr>
+          <w:rFonts w:ascii="Consolas" w:cs="Consolas" w:eastAsia="Consolas" w:hAnsi="Consolas"/>
+        </w:rPr>
+      </w:pPr>
+      <w:r>
+        <w:rPr>
+          <w:rFonts w:ascii="Consolas" w:cs="Consolas" w:eastAsia="Consolas" w:hAnsi="Consolas"/>
+          <w:rtl w:val="0"/>
+        </w:rPr>
+        <w:t xml:space="preserve">│   ├── catalogos.js</w:t>
+      </w:r>
+    </w:p>
+    <w:p>
+      <w:pPr>
+        <w:shd w:fill="d9d9d9" w:val="clear"/>
+        <w:spacing w:line="240" w:lineRule="auto"/>
+        <w:rPr>
+          <w:rFonts w:ascii="Consolas" w:cs="Consolas" w:eastAsia="Consolas" w:hAnsi="Consolas"/>
+        </w:rPr>
+      </w:pPr>
+      <w:r>
+        <w:rPr>
+          <w:rFonts w:ascii="Consolas" w:cs="Consolas" w:eastAsia="Consolas" w:hAnsi="Consolas"/>
+          <w:rtl w:val="0"/>
+        </w:rPr>
+        <w:t xml:space="preserve">│   └── cursos.js</w:t>
+      </w:r>
+    </w:p>
+    <w:p>
+      <w:pPr>
+        <w:shd w:fill="d9d9d9" w:val="clear"/>
+        <w:spacing w:line="240" w:lineRule="auto"/>
+        <w:rPr>
+          <w:rFonts w:ascii="Consolas" w:cs="Consolas" w:eastAsia="Consolas" w:hAnsi="Consolas"/>
+        </w:rPr>
+      </w:pPr>
+      <w:r>
+        <w:rPr>
+          <w:rFonts w:ascii="Consolas" w:cs="Consolas" w:eastAsia="Consolas" w:hAnsi="Consolas"/>
+          <w:rtl w:val="0"/>
+        </w:rPr>
+        <w:t xml:space="preserve">├── img/            → logotipos, iconos y recursos gráficos</w:t>
+      </w:r>
+    </w:p>
+    <w:p>
+      <w:pPr>
+        <w:shd w:fill="d9d9d9" w:val="clear"/>
+        <w:spacing w:line="240" w:lineRule="auto"/>
+        <w:rPr>
+          <w:rFonts w:ascii="Consolas" w:cs="Consolas" w:eastAsia="Consolas" w:hAnsi="Consolas"/>
+        </w:rPr>
+      </w:pPr>
+      <w:r>
+        <w:rPr>
+          <w:rFonts w:ascii="Consolas" w:cs="Consolas" w:eastAsia="Consolas" w:hAnsi="Consolas"/>
+          <w:rtl w:val="0"/>
+        </w:rPr>
+        <w:t xml:space="preserve">├── documentacion/  → ERS y documentos de referencia</w:t>
+      </w:r>
+    </w:p>
+    <w:p>
+      <w:pPr>
+        <w:shd w:fill="d9d9d9" w:val="clear"/>
+        <w:spacing w:line="240" w:lineRule="auto"/>
+        <w:rPr>
+          <w:rFonts w:ascii="Consolas" w:cs="Consolas" w:eastAsia="Consolas" w:hAnsi="Consolas"/>
+        </w:rPr>
+      </w:pPr>
+      <w:r>
+        <w:rPr>
+          <w:rFonts w:ascii="Consolas" w:cs="Consolas" w:eastAsia="Consolas" w:hAnsi="Consolas"/>
+          <w:rtl w:val="0"/>
+        </w:rPr>
+        <w:t xml:space="preserve">├── Documento de diseno Iteracion 1.docx</w:t>
+      </w:r>
+    </w:p>
+    <w:p>
+      <w:pPr>
+        <w:shd w:fill="d9d9d9" w:val="clear"/>
+        <w:spacing w:line="240" w:lineRule="auto"/>
+        <w:rPr>
+          <w:rFonts w:ascii="Consolas" w:cs="Consolas" w:eastAsia="Consolas" w:hAnsi="Consolas"/>
+        </w:rPr>
+      </w:pPr>
+      <w:r>
+        <w:rPr>
+          <w:rFonts w:ascii="Consolas" w:cs="Consolas" w:eastAsia="Consolas" w:hAnsi="Consolas"/>
+          <w:rtl w:val="0"/>
+        </w:rPr>
+        <w:t xml:space="preserve">└── </w:t>
+      </w:r>
+      <w:r>
+        <w:rPr>
+          <w:rFonts w:ascii="Consolas" w:cs="Consolas" w:eastAsia="Consolas" w:hAnsi="Consolas"/>
+          <w:rtl w:val="0"/>
+        </w:rPr>
+        <w:t xml:space="preserve">README.md</w:t>
+      </w:r>
+    </w:p>
+    <w:p>
+      <w:pPr>
+        <w:pStyle w:val="Heading2"/>
+        <w:keepNext w:val="0"/>
+        <w:keepLines w:val="0"/>
+        <w:spacing w:before="220" w:line="240" w:lineRule="auto"/>
+        <w:rPr>
+          <w:b w:val="1"/>
+          <w:bCs w:val="1"/>
+          <w:color w:val="2e75b6"/>
+          <w:sz w:val="25"/>
+          <w:szCs w:val="25"/>
+        </w:rPr>
+      </w:pPr>
+      <w:bookmarkStart w:colFirst="0" w:colLast="0" w:name="_7rnh465wggyo" w:id="11"/>
+      <w:bookmarkEnd w:id="11"/>
+      <w:r>
+        <w:rPr>
+          <w:rtl w:val="0"/>
+        </w:rPr>
+      </w:r>
+    </w:p>
+    <w:p>
+      <w:pPr>
+        <w:pStyle w:val="Heading2"/>
+        <w:keepNext w:val="0"/>
+        <w:keepLines w:val="0"/>
+        <w:spacing w:before="220" w:line="240" w:lineRule="auto"/>
+        <w:rPr>
+          <w:b w:val="1"/>
+          <w:bCs w:val="1"/>
+          <w:color w:val="2e75b6"/>
+          <w:sz w:val="25"/>
+          <w:szCs w:val="25"/>
+        </w:rPr>
+      </w:pPr>
+      <w:bookmarkStart w:colFirst="0" w:colLast="0" w:name="_998rgwjk6480" w:id="12"/>
+      <w:bookmarkEnd w:id="12"/>
+      <w:r>
+        <w:rPr>
+          <w:rtl w:val="0"/>
+        </w:rPr>
+      </w:r>
+    </w:p>
+    <w:p>
+      <w:pPr>
+        <w:pStyle w:val="Heading2"/>
+        <w:keepNext w:val="0"/>
+        <w:keepLines w:val="0"/>
+        <w:spacing w:before="220" w:line="240" w:lineRule="auto"/>
+        <w:rPr>
+          <w:b w:val="1"/>
+          <w:bCs w:val="1"/>
+          <w:color w:val="2e75b6"/>
+          <w:sz w:val="25"/>
+          <w:szCs w:val="25"/>
+        </w:rPr>
+      </w:pPr>
+      <w:bookmarkStart w:colFirst="0" w:colLast="0" w:name="_75j96lh3bspm" w:id="13"/>
+      <w:bookmarkEnd w:id="13"/>
+      <w:r>
+        <w:rPr>
+          <w:rtl w:val="0"/>
+        </w:rPr>
+      </w:r>
+    </w:p>
+    <w:p>
+      <w:pPr>
+        <w:pStyle w:val="Heading2"/>
+        <w:keepNext w:val="0"/>
+        <w:keepLines w:val="0"/>
+        <w:spacing w:before="220" w:line="240" w:lineRule="auto"/>
+        <w:rPr>
+          <w:b w:val="1"/>
+          <w:bCs w:val="1"/>
+          <w:color w:val="2e75b6"/>
+          <w:sz w:val="25"/>
+          <w:szCs w:val="25"/>
+        </w:rPr>
+      </w:pPr>
+      <w:bookmarkStart w:colFirst="0" w:colLast="0" w:name="_bbhkl7w2rylr" w:id="14"/>
+      <w:bookmarkEnd w:id="14"/>
+      <w:r>
+        <w:rPr>
+          <w:b w:val="1"/>
+          <w:bCs w:val="1"/>
+          <w:color w:val="2e75b6"/>
+          <w:sz w:val="25"/>
+          <w:szCs w:val="25"/>
+          <w:rtl w:val="0"/>
+        </w:rPr>
+        <w:t xml:space="preserve">3.2 Páginas / vistas</w:t>
+      </w:r>
+    </w:p>
+    <w:p>
+      <w:pPr>
+        <w:rPr/>
+      </w:pPr>
+      <w:r>
+        <w:rPr>
+          <w:rtl w:val="0"/>
+        </w:rPr>
+      </w:r>
+    </w:p>
+    <w:tbl>
+      <w:tblPr>
+        <w:tblStyle w:val="Table3"/>
+        <w:tblW w:w="9025.511811023624" w:type="dxa"/>
+        <w:jc w:val="left"/>
+        <w:tblBorders>
+          <w:top w:color="000000" w:space="0" w:sz="0" w:val="nil"/>
+          <w:left w:color="000000" w:space="0" w:sz="0" w:val="nil"/>
+          <w:bottom w:color="000000" w:space="0" w:sz="0" w:val="nil"/>
+          <w:right w:color="000000" w:space="0" w:sz="0" w:val="nil"/>
+          <w:insideH w:color="000000" w:space="0" w:sz="0" w:val="nil"/>
+          <w:insideV w:color="000000" w:space="0" w:sz="0" w:val="nil"/>
+        </w:tblBorders>
+        <w:tblLayout w:type="fixed"/>
+        <w:tblLook w:val="0600"/>
+      </w:tblPr>
+      <w:tblGrid>
+        <w:gridCol w:w="2404.8715258907246"/>
+        <w:gridCol w:w="4041.9226248404348"/>
+        <w:gridCol w:w="2578.7176602924637"/>
+        <w:tblGridChange w:id="0">
+          <w:tblGrid>
+            <w:gridCol w:w="2404.8715258907246"/>
+            <w:gridCol w:w="4041.9226248404348"/>
+            <w:gridCol w:w="2578.7176602924637"/>
+          </w:tblGrid>
+        </w:tblGridChange>
+      </w:tblGrid>
+      <w:tr>
+        <w:trPr>
+          <w:cantSplit w:val="0"/>
+          <w:trHeight w:val="420" w:hRule="atLeast"/>
+          <w:tblHeader w:val="0"/>
+        </w:trPr>
+        <w:tc>
+          <w:tcPr>
+            <w:tcBorders>
+              <w:top w:color="bfbfbf" w:space="0" w:sz="4" w:val="single"/>
+              <w:left w:color="bfbfbf" w:space="0" w:sz="4" w:val="single"/>
+              <w:bottom w:color="bfbfbf" w:space="0" w:sz="4" w:val="single"/>
+              <w:right w:color="bfbfbf" w:space="0" w:sz="4" w:val="single"/>
+            </w:tcBorders>
+            <w:shd w:fill="1f4e79" w:val="clear"/>
+            <w:tcMar>
+              <w:top w:w="80.0" w:type="dxa"/>
+              <w:left w:w="140.0" w:type="dxa"/>
+              <w:bottom w:w="80.0" w:type="dxa"/>
+              <w:right w:w="140.0" w:type="dxa"/>
+            </w:tcMar>
+            <w:vAlign w:val="top"/>
+          </w:tcPr>
+          <w:p>
+            <w:pPr>
+              <w:rPr>
+                <w:b w:val="1"/>
+                <w:bCs w:val="1"/>
+                <w:color w:val="ffffff"/>
+              </w:rPr>
+            </w:pPr>
+            <w:r>
+              <w:rPr>
+                <w:b w:val="1"/>
+                <w:bCs w:val="1"/>
+                <w:color w:val="ffffff"/>
+                <w:rtl w:val="0"/>
+              </w:rPr>
+              <w:t xml:space="preserve">Página</w:t>
+            </w:r>
+          </w:p>
+        </w:tc>
+        <w:tc>
+          <w:tcPr>
+            <w:tcBorders>
+              <w:top w:color="bfbfbf" w:space="0" w:sz="4" w:val="single"/>
+              <w:left w:color="000000" w:space="0" w:sz="0" w:val="nil"/>
+              <w:bottom w:color="bfbfbf" w:space="0" w:sz="4" w:val="single"/>
+              <w:right w:color="bfbfbf" w:space="0" w:sz="4" w:val="single"/>
+            </w:tcBorders>
+            <w:shd w:fill="1f4e79" w:val="clear"/>
+            <w:tcMar>
+              <w:top w:w="80.0" w:type="dxa"/>
+              <w:left w:w="140.0" w:type="dxa"/>
+              <w:bottom w:w="80.0" w:type="dxa"/>
+              <w:right w:w="140.0" w:type="dxa"/>
+            </w:tcMar>
+            <w:vAlign w:val="top"/>
+          </w:tcPr>
+          <w:p>
+            <w:pPr>
+              <w:rPr>
+                <w:b w:val="1"/>
+                <w:bCs w:val="1"/>
+                <w:color w:val="ffffff"/>
+              </w:rPr>
+            </w:pPr>
+            <w:r>
+              <w:rPr>
+                <w:b w:val="1"/>
+                <w:bCs w:val="1"/>
+                <w:color w:val="ffffff"/>
+                <w:rtl w:val="0"/>
+              </w:rPr>
+              <w:t xml:space="preserve">Propósito</w:t>
+            </w:r>
+          </w:p>
+        </w:tc>
+        <w:tc>
+          <w:tcPr>
+            <w:tcBorders>
+              <w:top w:color="bfbfbf" w:space="0" w:sz="4" w:val="single"/>
+              <w:left w:color="000000" w:space="0" w:sz="0" w:val="nil"/>
+              <w:bottom w:color="bfbfbf" w:space="0" w:sz="4" w:val="single"/>
+              <w:right w:color="bfbfbf" w:space="0" w:sz="4" w:val="single"/>
+            </w:tcBorders>
+            <w:shd w:fill="1f4e79" w:val="clear"/>
+            <w:tcMar>
+              <w:top w:w="80.0" w:type="dxa"/>
+              <w:left w:w="140.0" w:type="dxa"/>
+              <w:bottom w:w="80.0" w:type="dxa"/>
+              <w:right w:w="140.0" w:type="dxa"/>
+            </w:tcMar>
+            <w:vAlign w:val="top"/>
+          </w:tcPr>
+          <w:p>
+            <w:pPr>
+              <w:rPr>
+                <w:b w:val="1"/>
+                <w:bCs w:val="1"/>
+                <w:color w:val="ffffff"/>
+              </w:rPr>
+            </w:pPr>
+            <w:r>
+              <w:rPr>
+                <w:b w:val="1"/>
+                <w:bCs w:val="1"/>
+                <w:color w:val="ffffff"/>
+                <w:rtl w:val="0"/>
+              </w:rPr>
+              <w:t xml:space="preserve">Elementos principales</w:t>
+            </w:r>
+          </w:p>
+        </w:tc>
+      </w:tr>
+      <w:tr>
+        <w:trPr>
+          <w:cantSplit w:val="0"/>
+          <w:trHeight w:val="420" w:hRule="atLeast"/>
+          <w:tblHeader w:val="0"/>
+        </w:trPr>
+        <w:tc>
+          <w:tcPr>
+            <w:tcBorders>
+              <w:top w:color="000000" w:space="0" w:sz="0" w:val="nil"/>
+              <w:left w:color="bfbfbf" w:space="0" w:sz="4" w:val="single"/>
+              <w:bottom w:color="bfbfbf" w:space="0" w:sz="4" w:val="single"/>
+              <w:right w:color="bfbfbf" w:space="0" w:sz="4" w:val="single"/>
+            </w:tcBorders>
+            <w:tcMar>
+              <w:top w:w="80.0" w:type="dxa"/>
+              <w:left w:w="140.0" w:type="dxa"/>
+              <w:bottom w:w="80.0" w:type="dxa"/>
+              <w:right w:w="140.0" w:type="dxa"/>
+            </w:tcMar>
+            <w:vAlign w:val="top"/>
+          </w:tcPr>
+          <w:p>
+            <w:pPr>
+              <w:rPr>
+                <w:b w:val="1"/>
+                <w:bCs w:val="1"/>
+              </w:rPr>
+            </w:pPr>
+            <w:r>
+              <w:rPr>
+                <w:b w:val="1"/>
+                <w:bCs w:val="1"/>
+                <w:rtl w:val="0"/>
+              </w:rPr>
+              <w:t xml:space="preserve">index.html</w:t>
+            </w:r>
+          </w:p>
+        </w:tc>
+        <w:tc>
+          <w:tcPr>
+            <w:tcBorders>
+              <w:top w:color="000000" w:space="0" w:sz="0" w:val="nil"/>
+              <w:left w:color="000000" w:space="0" w:sz="0" w:val="nil"/>
+              <w:bottom w:color="bfbfbf" w:space="0" w:sz="4" w:val="single"/>
+              <w:right w:color="bfbfbf" w:space="0" w:sz="4" w:val="single"/>
+            </w:tcBorders>
+            <w:tcMar>
+              <w:top w:w="80.0" w:type="dxa"/>
+              <w:left w:w="140.0" w:type="dxa"/>
+              <w:bottom w:w="80.0" w:type="dxa"/>
+              <w:right w:w="140.0" w:type="dxa"/>
+            </w:tcMar>
+            <w:vAlign w:val="top"/>
+          </w:tcPr>
+          <w:p>
+            <w:pPr>
+              <w:rPr/>
+            </w:pPr>
+            <w:r>
+              <w:rPr>
+                <w:rtl w:val="0"/>
+              </w:rPr>
+              <w:t xml:space="preserve">Presentar el sistema y ofrecer acceso al inicio de sesión.</w:t>
+            </w:r>
+          </w:p>
+        </w:tc>
+        <w:tc>
+          <w:tcPr>
+            <w:tcBorders>
+              <w:top w:color="000000" w:space="0" w:sz="0" w:val="nil"/>
+              <w:left w:color="000000" w:space="0" w:sz="0" w:val="nil"/>
+              <w:bottom w:color="bfbfbf" w:space="0" w:sz="4" w:val="single"/>
+              <w:right w:color="bfbfbf" w:space="0" w:sz="4" w:val="single"/>
+            </w:tcBorders>
+            <w:tcMar>
+              <w:top w:w="80.0" w:type="dxa"/>
+              <w:left w:w="140.0" w:type="dxa"/>
+              <w:bottom w:w="80.0" w:type="dxa"/>
+              <w:right w:w="140.0" w:type="dxa"/>
+            </w:tcMar>
+            <w:vAlign w:val="top"/>
+          </w:tcPr>
+          <w:p>
+            <w:pPr>
+              <w:rPr/>
+            </w:pPr>
+            <w:r>
+              <w:rPr>
+                <w:rtl w:val="0"/>
+              </w:rPr>
+              <w:t xml:space="preserve">Identidad visual, nombre del sistema, descripción general y enlace para ingresar.</w:t>
+            </w:r>
+            <w:r>
+              <w:rPr>
+                <w:rtl w:val="0"/>
+              </w:rPr>
+            </w:r>
+          </w:p>
+        </w:tc>
+      </w:tr>
+      <w:tr>
+        <w:trPr>
+          <w:cantSplit w:val="0"/>
+          <w:trHeight w:val="420" w:hRule="atLeast"/>
+          <w:tblHeader w:val="0"/>
+        </w:trPr>
+        <w:tc>
+          <w:tcPr>
+            <w:tcBorders>
+              <w:top w:color="000000" w:space="0" w:sz="0" w:val="nil"/>
+              <w:left w:color="bfbfbf" w:space="0" w:sz="4" w:val="single"/>
+              <w:bottom w:color="bfbfbf" w:space="0" w:sz="4" w:val="single"/>
+              <w:right w:color="bfbfbf" w:space="0" w:sz="4" w:val="single"/>
+            </w:tcBorders>
+            <w:tcMar>
+              <w:top w:w="80.0" w:type="dxa"/>
+              <w:left w:w="140.0" w:type="dxa"/>
+              <w:bottom w:w="80.0" w:type="dxa"/>
+              <w:right w:w="140.0" w:type="dxa"/>
+            </w:tcMar>
+            <w:vAlign w:val="top"/>
+          </w:tcPr>
+          <w:p>
+            <w:pPr>
+              <w:rPr>
+                <w:b w:val="1"/>
+                <w:bCs w:val="1"/>
+              </w:rPr>
+            </w:pPr>
+            <w:r>
+              <w:rPr>
+                <w:b w:val="1"/>
+                <w:bCs w:val="1"/>
+                <w:rtl w:val="0"/>
+              </w:rPr>
+              <w:t xml:space="preserve">pages/login.html</w:t>
+            </w:r>
+            <w:r>
+              <w:rPr>
+                <w:rtl w:val="0"/>
+              </w:rPr>
+            </w:r>
+          </w:p>
+        </w:tc>
+        <w:tc>
+          <w:tcPr>
+            <w:tcBorders>
+              <w:top w:color="000000" w:space="0" w:sz="0" w:val="nil"/>
+              <w:left w:color="000000" w:space="0" w:sz="0" w:val="nil"/>
+              <w:bottom w:color="bfbfbf" w:space="0" w:sz="4" w:val="single"/>
+              <w:right w:color="bfbfbf" w:space="0" w:sz="4" w:val="single"/>
+            </w:tcBorders>
+            <w:tcMar>
+              <w:top w:w="80.0" w:type="dxa"/>
+              <w:left w:w="140.0" w:type="dxa"/>
+              <w:bottom w:w="80.0" w:type="dxa"/>
+              <w:right w:w="140.0" w:type="dxa"/>
+            </w:tcMar>
+            <w:vAlign w:val="top"/>
+          </w:tcPr>
+          <w:p>
+            <w:pPr>
+              <w:rPr/>
+            </w:pPr>
+            <w:r>
+              <w:rPr>
+                <w:rtl w:val="0"/>
+              </w:rPr>
+              <w:t xml:space="preserve">Permitir el inicio de sesión de los usuarios del prototipo.</w:t>
+            </w:r>
+            <w:r>
+              <w:rPr>
+                <w:rtl w:val="0"/>
+              </w:rPr>
+            </w:r>
+          </w:p>
+        </w:tc>
+        <w:tc>
+          <w:tcPr>
+            <w:tcBorders>
+              <w:top w:color="000000" w:space="0" w:sz="0" w:val="nil"/>
+              <w:left w:color="000000" w:space="0" w:sz="0" w:val="nil"/>
+              <w:bottom w:color="bfbfbf" w:space="0" w:sz="4" w:val="single"/>
+              <w:right w:color="bfbfbf" w:space="0" w:sz="4" w:val="single"/>
+            </w:tcBorders>
+            <w:tcMar>
+              <w:top w:w="80.0" w:type="dxa"/>
+              <w:left w:w="140.0" w:type="dxa"/>
+              <w:bottom w:w="80.0" w:type="dxa"/>
+              <w:right w:w="140.0" w:type="dxa"/>
+            </w:tcMar>
+            <w:vAlign w:val="top"/>
+          </w:tcPr>
+          <w:p>
+            <w:pPr>
+              <w:rPr/>
+            </w:pPr>
+            <w:r>
+              <w:rPr>
+                <w:rtl w:val="0"/>
+              </w:rPr>
+              <w:t xml:space="preserve">Campos de correo y contraseña, botón de ingreso, enlace de recuperación y mensajes de validación.</w:t>
+            </w:r>
+            <w:r>
+              <w:rPr>
+                <w:rtl w:val="0"/>
+              </w:rPr>
+            </w:r>
+          </w:p>
+        </w:tc>
+      </w:tr>
+      <w:tr>
+        <w:trPr>
+          <w:cantSplit w:val="0"/>
+          <w:trHeight w:val="420" w:hRule="atLeast"/>
+          <w:tblHeader w:val="0"/>
+        </w:trPr>
+        <w:tc>
+          <w:tcPr>
+            <w:tcBorders>
+              <w:top w:color="000000" w:space="0" w:sz="0" w:val="nil"/>
+              <w:left w:color="bfbfbf" w:space="0" w:sz="4" w:val="single"/>
+              <w:bottom w:color="bfbfbf" w:space="0" w:sz="4" w:val="single"/>
+              <w:right w:color="bfbfbf" w:space="0" w:sz="4" w:val="single"/>
+            </w:tcBorders>
+            <w:tcMar>
+              <w:top w:w="80.0" w:type="dxa"/>
+              <w:left w:w="140.0" w:type="dxa"/>
+              <w:bottom w:w="80.0" w:type="dxa"/>
+              <w:right w:w="140.0" w:type="dxa"/>
+            </w:tcMar>
+            <w:vAlign w:val="top"/>
+          </w:tcPr>
+          <w:p>
+            <w:pPr>
+              <w:rPr>
+                <w:b w:val="1"/>
+                <w:bCs w:val="1"/>
+              </w:rPr>
+            </w:pPr>
+            <w:r>
+              <w:rPr>
+                <w:b w:val="1"/>
+                <w:bCs w:val="1"/>
+                <w:rtl w:val="0"/>
+              </w:rPr>
+              <w:t xml:space="preserve">pages/inicio.html</w:t>
+            </w:r>
+            <w:r>
+              <w:rPr>
+                <w:rtl w:val="0"/>
+              </w:rPr>
+            </w:r>
+          </w:p>
+        </w:tc>
+        <w:tc>
+          <w:tcPr>
+            <w:tcBorders>
+              <w:top w:color="000000" w:space="0" w:sz="0" w:val="nil"/>
+              <w:left w:color="000000" w:space="0" w:sz="0" w:val="nil"/>
+              <w:bottom w:color="bfbfbf" w:space="0" w:sz="4" w:val="single"/>
+              <w:right w:color="bfbfbf" w:space="0" w:sz="4" w:val="single"/>
+            </w:tcBorders>
+            <w:tcMar>
+              <w:top w:w="80.0" w:type="dxa"/>
+              <w:left w:w="140.0" w:type="dxa"/>
+              <w:bottom w:w="80.0" w:type="dxa"/>
+              <w:right w:w="140.0" w:type="dxa"/>
+            </w:tcMar>
+            <w:vAlign w:val="top"/>
+          </w:tcPr>
+          <w:p>
+            <w:pPr>
+              <w:rPr/>
+            </w:pPr>
+            <w:r>
+              <w:rPr>
+                <w:rtl w:val="0"/>
+              </w:rPr>
+              <w:t xml:space="preserve">Mostrar el panel principal y los accesos disponibles según el rol del usuario.</w:t>
+            </w:r>
+            <w:r>
+              <w:rPr>
+                <w:rtl w:val="0"/>
+              </w:rPr>
+            </w:r>
+          </w:p>
+        </w:tc>
+        <w:tc>
+          <w:tcPr>
+            <w:tcBorders>
+              <w:top w:color="000000" w:space="0" w:sz="0" w:val="nil"/>
+              <w:left w:color="000000" w:space="0" w:sz="0" w:val="nil"/>
+              <w:bottom w:color="bfbfbf" w:space="0" w:sz="4" w:val="single"/>
+              <w:right w:color="bfbfbf" w:space="0" w:sz="4" w:val="single"/>
+            </w:tcBorders>
+            <w:tcMar>
+              <w:top w:w="80.0" w:type="dxa"/>
+              <w:left w:w="140.0" w:type="dxa"/>
+              <w:bottom w:w="80.0" w:type="dxa"/>
+              <w:right w:w="140.0" w:type="dxa"/>
+            </w:tcMar>
+            <w:vAlign w:val="top"/>
+          </w:tcPr>
+          <w:p>
+            <w:pPr>
+              <w:rPr/>
+            </w:pPr>
+            <w:r>
+              <w:rPr>
+                <w:rtl w:val="0"/>
+              </w:rPr>
+              <w:t xml:space="preserve">Menú de navegación, accesos a los módulos, identificación del usuario y opción de cerrar sesión.</w:t>
+            </w:r>
+            <w:r>
+              <w:rPr>
+                <w:rtl w:val="0"/>
+              </w:rPr>
+            </w:r>
+          </w:p>
+        </w:tc>
+      </w:tr>
+      <w:tr>
+        <w:trPr>
+          <w:cantSplit w:val="0"/>
+          <w:trHeight w:val="420" w:hRule="atLeast"/>
+          <w:tblHeader w:val="0"/>
+        </w:trPr>
+        <w:tc>
+          <w:tcPr>
+            <w:tcBorders>
+              <w:top w:color="000000" w:space="0" w:sz="0" w:val="nil"/>
+              <w:left w:color="bfbfbf" w:space="0" w:sz="4" w:val="single"/>
+              <w:bottom w:color="bfbfbf" w:space="0" w:sz="4" w:val="single"/>
+              <w:right w:color="bfbfbf" w:space="0" w:sz="4" w:val="single"/>
+            </w:tcBorders>
+            <w:tcMar>
+              <w:top w:w="80.0" w:type="dxa"/>
+              <w:left w:w="140.0" w:type="dxa"/>
+              <w:bottom w:w="80.0" w:type="dxa"/>
+              <w:right w:w="140.0" w:type="dxa"/>
+            </w:tcMar>
+            <w:vAlign w:val="top"/>
+          </w:tcPr>
+          <w:p>
+            <w:pPr>
+              <w:rPr>
+                <w:b w:val="1"/>
+                <w:bCs w:val="1"/>
+              </w:rPr>
+            </w:pPr>
+            <w:r>
+              <w:rPr>
+                <w:b w:val="1"/>
+                <w:bCs w:val="1"/>
+                <w:rtl w:val="0"/>
+              </w:rPr>
+              <w:t xml:space="preserve">pages/usuarios.html</w:t>
+            </w:r>
+          </w:p>
+        </w:tc>
+        <w:tc>
+          <w:tcPr>
+            <w:tcBorders>
+              <w:top w:color="000000" w:space="0" w:sz="0" w:val="nil"/>
+              <w:left w:color="000000" w:space="0" w:sz="0" w:val="nil"/>
+              <w:bottom w:color="bfbfbf" w:space="0" w:sz="4" w:val="single"/>
+              <w:right w:color="bfbfbf" w:space="0" w:sz="4" w:val="single"/>
+            </w:tcBorders>
+            <w:tcMar>
+              <w:top w:w="80.0" w:type="dxa"/>
+              <w:left w:w="140.0" w:type="dxa"/>
+              <w:bottom w:w="80.0" w:type="dxa"/>
+              <w:right w:w="140.0" w:type="dxa"/>
+            </w:tcMar>
+            <w:vAlign w:val="top"/>
+          </w:tcPr>
+          <w:p>
+            <w:pPr>
+              <w:rPr/>
+            </w:pPr>
+            <w:r>
+              <w:rPr>
+                <w:rtl w:val="0"/>
+              </w:rPr>
+              <w:t xml:space="preserve">Listar los usuarios registrados y ofrecer las acciones de registro y modificación.</w:t>
+            </w:r>
+          </w:p>
+        </w:tc>
+        <w:tc>
+          <w:tcPr>
+            <w:tcBorders>
+              <w:top w:color="000000" w:space="0" w:sz="0" w:val="nil"/>
+              <w:left w:color="000000" w:space="0" w:sz="0" w:val="nil"/>
+              <w:bottom w:color="bfbfbf" w:space="0" w:sz="4" w:val="single"/>
+              <w:right w:color="bfbfbf" w:space="0" w:sz="4" w:val="single"/>
+            </w:tcBorders>
+            <w:tcMar>
+              <w:top w:w="80.0" w:type="dxa"/>
+              <w:left w:w="140.0" w:type="dxa"/>
+              <w:bottom w:w="80.0" w:type="dxa"/>
+              <w:right w:w="140.0" w:type="dxa"/>
+            </w:tcMar>
+            <w:vAlign w:val="top"/>
+          </w:tcPr>
+          <w:p>
+            <w:pPr>
+              <w:rPr/>
+            </w:pPr>
+            <w:r>
+              <w:rPr>
+                <w:rtl w:val="0"/>
+              </w:rPr>
+              <w:t xml:space="preserve">Tabla de usuarios, información del rol, botón de registro y acciones de edición.</w:t>
+            </w:r>
+          </w:p>
+        </w:tc>
+      </w:tr>
+      <w:tr>
+        <w:trPr>
+          <w:cantSplit w:val="0"/>
+          <w:trHeight w:val="420" w:hRule="atLeast"/>
+          <w:tblHeader w:val="0"/>
+        </w:trPr>
+        <w:tc>
+          <w:tcPr>
+            <w:tcBorders>
+              <w:top w:color="000000" w:space="0" w:sz="0" w:val="nil"/>
+              <w:left w:color="bfbfbf" w:space="0" w:sz="4" w:val="single"/>
+              <w:bottom w:color="bfbfbf" w:space="0" w:sz="4" w:val="single"/>
+              <w:right w:color="bfbfbf" w:space="0" w:sz="4" w:val="single"/>
+            </w:tcBorders>
+            <w:tcMar>
+              <w:top w:w="80.0" w:type="dxa"/>
+              <w:left w:w="140.0" w:type="dxa"/>
+              <w:bottom w:w="80.0" w:type="dxa"/>
+              <w:right w:w="140.0" w:type="dxa"/>
+            </w:tcMar>
+            <w:vAlign w:val="top"/>
+          </w:tcPr>
+          <w:p>
+            <w:pPr>
+              <w:rPr>
+                <w:b w:val="1"/>
+                <w:bCs w:val="1"/>
+              </w:rPr>
+            </w:pPr>
+            <w:r>
+              <w:rPr>
+                <w:b w:val="1"/>
+                <w:bCs w:val="1"/>
+                <w:rtl w:val="0"/>
+              </w:rPr>
+              <w:t xml:space="preserve">pages/usuario-formulario.html</w:t>
+            </w:r>
+          </w:p>
+        </w:tc>
+        <w:tc>
+          <w:tcPr>
+            <w:tcBorders>
+              <w:top w:color="000000" w:space="0" w:sz="0" w:val="nil"/>
+              <w:left w:color="000000" w:space="0" w:sz="0" w:val="nil"/>
+              <w:bottom w:color="bfbfbf" w:space="0" w:sz="4" w:val="single"/>
+              <w:right w:color="bfbfbf" w:space="0" w:sz="4" w:val="single"/>
+            </w:tcBorders>
+            <w:tcMar>
+              <w:top w:w="80.0" w:type="dxa"/>
+              <w:left w:w="140.0" w:type="dxa"/>
+              <w:bottom w:w="80.0" w:type="dxa"/>
+              <w:right w:w="140.0" w:type="dxa"/>
+            </w:tcMar>
+            <w:vAlign w:val="top"/>
+          </w:tcPr>
+          <w:p>
+            <w:pPr>
+              <w:rPr/>
+            </w:pPr>
+            <w:r>
+              <w:rPr>
+                <w:rtl w:val="0"/>
+              </w:rPr>
+              <w:t xml:space="preserve">Registrar un usuario o modificar sus datos.</w:t>
+            </w:r>
+          </w:p>
+        </w:tc>
+        <w:tc>
+          <w:tcPr>
+            <w:tcBorders>
+              <w:top w:color="000000" w:space="0" w:sz="0" w:val="nil"/>
+              <w:left w:color="000000" w:space="0" w:sz="0" w:val="nil"/>
+              <w:bottom w:color="bfbfbf" w:space="0" w:sz="4" w:val="single"/>
+              <w:right w:color="bfbfbf" w:space="0" w:sz="4" w:val="single"/>
+            </w:tcBorders>
+            <w:tcMar>
+              <w:top w:w="80.0" w:type="dxa"/>
+              <w:left w:w="140.0" w:type="dxa"/>
+              <w:bottom w:w="80.0" w:type="dxa"/>
+              <w:right w:w="140.0" w:type="dxa"/>
+            </w:tcMar>
+            <w:vAlign w:val="top"/>
+          </w:tcPr>
+          <w:p>
+            <w:pPr>
+              <w:rPr/>
+            </w:pPr>
+            <w:r>
+              <w:rPr>
+                <w:rtl w:val="0"/>
+              </w:rPr>
+              <w:t xml:space="preserve">Campos de datos personales, correo y rol, mensajes de validación y botones para guardar o cancelar.</w:t>
+            </w:r>
+          </w:p>
+        </w:tc>
+      </w:tr>
+      <w:tr>
+        <w:trPr>
+          <w:cantSplit w:val="0"/>
+          <w:trHeight w:val="420" w:hRule="atLeast"/>
+          <w:tblHeader w:val="0"/>
+        </w:trPr>
+        <w:tc>
+          <w:tcPr>
+            <w:tcBorders>
+              <w:top w:color="000000" w:space="0" w:sz="0" w:val="nil"/>
+              <w:left w:color="bfbfbf" w:space="0" w:sz="4" w:val="single"/>
+              <w:bottom w:color="bfbfbf" w:space="0" w:sz="4" w:val="single"/>
+              <w:right w:color="bfbfbf" w:space="0" w:sz="4" w:val="single"/>
+            </w:tcBorders>
+            <w:tcMar>
+              <w:top w:w="80.0" w:type="dxa"/>
+              <w:left w:w="140.0" w:type="dxa"/>
+              <w:bottom w:w="80.0" w:type="dxa"/>
+              <w:right w:w="140.0" w:type="dxa"/>
+            </w:tcMar>
+            <w:vAlign w:val="top"/>
+          </w:tcPr>
+          <w:p>
+            <w:pPr>
+              <w:rPr>
+                <w:b w:val="1"/>
+                <w:bCs w:val="1"/>
+              </w:rPr>
+            </w:pPr>
+            <w:r>
+              <w:rPr>
+                <w:b w:val="1"/>
+                <w:bCs w:val="1"/>
+                <w:rtl w:val="0"/>
+              </w:rPr>
+              <w:t xml:space="preserve">pages/catalogos.html</w:t>
+            </w:r>
+          </w:p>
+        </w:tc>
+        <w:tc>
+          <w:tcPr>
+            <w:tcBorders>
+              <w:top w:color="000000" w:space="0" w:sz="0" w:val="nil"/>
+              <w:left w:color="000000" w:space="0" w:sz="0" w:val="nil"/>
+              <w:bottom w:color="bfbfbf" w:space="0" w:sz="4" w:val="single"/>
+              <w:right w:color="bfbfbf" w:space="0" w:sz="4" w:val="single"/>
+            </w:tcBorders>
+            <w:tcMar>
+              <w:top w:w="80.0" w:type="dxa"/>
+              <w:left w:w="140.0" w:type="dxa"/>
+              <w:bottom w:w="80.0" w:type="dxa"/>
+              <w:right w:w="140.0" w:type="dxa"/>
+            </w:tcMar>
+            <w:vAlign w:val="top"/>
+          </w:tcPr>
+          <w:p>
+            <w:pPr>
+              <w:rPr/>
+            </w:pPr>
+            <w:r>
+              <w:rPr>
+                <w:rtl w:val="0"/>
+              </w:rPr>
+              <w:t xml:space="preserve">Seleccionar el catálogo institucional que se desea administrar.</w:t>
+            </w:r>
+          </w:p>
+        </w:tc>
+        <w:tc>
+          <w:tcPr>
+            <w:tcBorders>
+              <w:top w:color="000000" w:space="0" w:sz="0" w:val="nil"/>
+              <w:left w:color="000000" w:space="0" w:sz="0" w:val="nil"/>
+              <w:bottom w:color="bfbfbf" w:space="0" w:sz="4" w:val="single"/>
+              <w:right w:color="bfbfbf" w:space="0" w:sz="4" w:val="single"/>
+            </w:tcBorders>
+            <w:tcMar>
+              <w:top w:w="80.0" w:type="dxa"/>
+              <w:left w:w="140.0" w:type="dxa"/>
+              <w:bottom w:w="80.0" w:type="dxa"/>
+              <w:right w:w="140.0" w:type="dxa"/>
+            </w:tcMar>
+            <w:vAlign w:val="top"/>
+          </w:tcPr>
+          <w:p>
+            <w:pPr>
+              <w:rPr/>
+            </w:pPr>
+            <w:r>
+              <w:rPr>
+                <w:rtl w:val="0"/>
+              </w:rPr>
+              <w:t xml:space="preserve">Opciones de selección de catálogos y acceso al listado correspondiente.</w:t>
+            </w:r>
+          </w:p>
+        </w:tc>
+      </w:tr>
+      <w:tr>
+        <w:trPr>
+          <w:cantSplit w:val="0"/>
+          <w:trHeight w:val="420" w:hRule="atLeast"/>
+          <w:tblHeader w:val="0"/>
+        </w:trPr>
+        <w:tc>
+          <w:tcPr>
+            <w:tcBorders>
+              <w:top w:color="000000" w:space="0" w:sz="0" w:val="nil"/>
+              <w:left w:color="bfbfbf" w:space="0" w:sz="4" w:val="single"/>
+              <w:bottom w:color="bfbfbf" w:space="0" w:sz="4" w:val="single"/>
+              <w:right w:color="bfbfbf" w:space="0" w:sz="4" w:val="single"/>
+            </w:tcBorders>
+            <w:tcMar>
+              <w:top w:w="80.0" w:type="dxa"/>
+              <w:left w:w="140.0" w:type="dxa"/>
+              <w:bottom w:w="80.0" w:type="dxa"/>
+              <w:right w:w="140.0" w:type="dxa"/>
+            </w:tcMar>
+            <w:vAlign w:val="top"/>
+          </w:tcPr>
+          <w:p>
+            <w:pPr>
+              <w:rPr>
+                <w:b w:val="1"/>
+                <w:bCs w:val="1"/>
+              </w:rPr>
+            </w:pPr>
+            <w:r>
+              <w:rPr>
+                <w:b w:val="1"/>
+                <w:bCs w:val="1"/>
+                <w:rtl w:val="0"/>
+              </w:rPr>
+              <w:t xml:space="preserve">pages/catalogo-listado.html</w:t>
+            </w:r>
+          </w:p>
+        </w:tc>
+        <w:tc>
+          <w:tcPr>
+            <w:tcBorders>
+              <w:top w:color="000000" w:space="0" w:sz="0" w:val="nil"/>
+              <w:left w:color="000000" w:space="0" w:sz="0" w:val="nil"/>
+              <w:bottom w:color="bfbfbf" w:space="0" w:sz="4" w:val="single"/>
+              <w:right w:color="bfbfbf" w:space="0" w:sz="4" w:val="single"/>
+            </w:tcBorders>
+            <w:tcMar>
+              <w:top w:w="80.0" w:type="dxa"/>
+              <w:left w:w="140.0" w:type="dxa"/>
+              <w:bottom w:w="80.0" w:type="dxa"/>
+              <w:right w:w="140.0" w:type="dxa"/>
+            </w:tcMar>
+            <w:vAlign w:val="top"/>
+          </w:tcPr>
+          <w:p>
+            <w:pPr>
+              <w:rPr/>
+            </w:pPr>
+            <w:r>
+              <w:rPr>
+                <w:rtl w:val="0"/>
+              </w:rPr>
+              <w:t xml:space="preserve">Listar los registros del catálogo seleccionado.</w:t>
+            </w:r>
+          </w:p>
+        </w:tc>
+        <w:tc>
+          <w:tcPr>
+            <w:tcBorders>
+              <w:top w:color="000000" w:space="0" w:sz="0" w:val="nil"/>
+              <w:left w:color="000000" w:space="0" w:sz="0" w:val="nil"/>
+              <w:bottom w:color="bfbfbf" w:space="0" w:sz="4" w:val="single"/>
+              <w:right w:color="bfbfbf" w:space="0" w:sz="4" w:val="single"/>
+            </w:tcBorders>
+            <w:tcMar>
+              <w:top w:w="80.0" w:type="dxa"/>
+              <w:left w:w="140.0" w:type="dxa"/>
+              <w:bottom w:w="80.0" w:type="dxa"/>
+              <w:right w:w="140.0" w:type="dxa"/>
+            </w:tcMar>
+            <w:vAlign w:val="top"/>
+          </w:tcPr>
+          <w:p>
+            <w:pPr>
+              <w:rPr/>
+            </w:pPr>
+            <w:r>
+              <w:rPr>
+                <w:rtl w:val="0"/>
+              </w:rPr>
+              <w:t xml:space="preserve">Nombre del catálogo, tabla de registros y acciones para registrar o modificar información.</w:t>
+            </w:r>
+          </w:p>
+        </w:tc>
+      </w:tr>
+      <w:tr>
+        <w:trPr>
+          <w:cantSplit w:val="0"/>
+          <w:trHeight w:val="420" w:hRule="atLeast"/>
+          <w:tblHeader w:val="0"/>
+        </w:trPr>
+        <w:tc>
+          <w:tcPr>
+            <w:tcBorders>
+              <w:top w:color="000000" w:space="0" w:sz="0" w:val="nil"/>
+              <w:left w:color="bfbfbf" w:space="0" w:sz="4" w:val="single"/>
+              <w:bottom w:color="bfbfbf" w:space="0" w:sz="4" w:val="single"/>
+              <w:right w:color="bfbfbf" w:space="0" w:sz="4" w:val="single"/>
+            </w:tcBorders>
+            <w:tcMar>
+              <w:top w:w="80.0" w:type="dxa"/>
+              <w:left w:w="140.0" w:type="dxa"/>
+              <w:bottom w:w="80.0" w:type="dxa"/>
+              <w:right w:w="140.0" w:type="dxa"/>
+            </w:tcMar>
+            <w:vAlign w:val="top"/>
+          </w:tcPr>
+          <w:p>
+            <w:pPr>
+              <w:rPr>
+                <w:b w:val="1"/>
+                <w:bCs w:val="1"/>
+              </w:rPr>
+            </w:pPr>
+            <w:r>
+              <w:rPr>
+                <w:b w:val="1"/>
+                <w:bCs w:val="1"/>
+                <w:rtl w:val="0"/>
+              </w:rPr>
+              <w:t xml:space="preserve">pages/catalogo-formulario.html</w:t>
+            </w:r>
+          </w:p>
+        </w:tc>
+        <w:tc>
+          <w:tcPr>
+            <w:tcBorders>
+              <w:top w:color="000000" w:space="0" w:sz="0" w:val="nil"/>
+              <w:left w:color="000000" w:space="0" w:sz="0" w:val="nil"/>
+              <w:bottom w:color="bfbfbf" w:space="0" w:sz="4" w:val="single"/>
+              <w:right w:color="bfbfbf" w:space="0" w:sz="4" w:val="single"/>
+            </w:tcBorders>
+            <w:tcMar>
+              <w:top w:w="80.0" w:type="dxa"/>
+              <w:left w:w="140.0" w:type="dxa"/>
+              <w:bottom w:w="80.0" w:type="dxa"/>
+              <w:right w:w="140.0" w:type="dxa"/>
+            </w:tcMar>
+            <w:vAlign w:val="top"/>
+          </w:tcPr>
+          <w:p>
+            <w:pPr>
+              <w:rPr/>
+            </w:pPr>
+            <w:r>
+              <w:rPr>
+                <w:rtl w:val="0"/>
+              </w:rPr>
+              <w:t xml:space="preserve">Registrar o modificar un elemento del catálogo seleccionado.</w:t>
+            </w:r>
+          </w:p>
+        </w:tc>
+        <w:tc>
+          <w:tcPr>
+            <w:tcBorders>
+              <w:top w:color="000000" w:space="0" w:sz="0" w:val="nil"/>
+              <w:left w:color="000000" w:space="0" w:sz="0" w:val="nil"/>
+              <w:bottom w:color="bfbfbf" w:space="0" w:sz="4" w:val="single"/>
+              <w:right w:color="bfbfbf" w:space="0" w:sz="4" w:val="single"/>
+            </w:tcBorders>
+            <w:tcMar>
+              <w:top w:w="80.0" w:type="dxa"/>
+              <w:left w:w="140.0" w:type="dxa"/>
+              <w:bottom w:w="80.0" w:type="dxa"/>
+              <w:right w:w="140.0" w:type="dxa"/>
+            </w:tcMar>
+            <w:vAlign w:val="top"/>
+          </w:tcPr>
+          <w:p>
+            <w:pPr>
+              <w:rPr/>
+            </w:pPr>
+            <w:r>
+              <w:rPr>
+                <w:rtl w:val="0"/>
+              </w:rPr>
+              <w:t xml:space="preserve">Campos correspondientes al catálogo, mensajes de validación y botones para guardar o cancelar.</w:t>
+            </w:r>
+          </w:p>
+        </w:tc>
+      </w:tr>
+      <w:tr>
+        <w:trPr>
+          <w:cantSplit w:val="0"/>
+          <w:trHeight w:val="420" w:hRule="atLeast"/>
+          <w:tblHeader w:val="0"/>
+        </w:trPr>
+        <w:tc>
+          <w:tcPr>
+            <w:tcBorders>
+              <w:top w:color="000000" w:space="0" w:sz="0" w:val="nil"/>
+              <w:left w:color="bfbfbf" w:space="0" w:sz="4" w:val="single"/>
+              <w:bottom w:color="bfbfbf" w:space="0" w:sz="4" w:val="single"/>
+              <w:right w:color="bfbfbf" w:space="0" w:sz="4" w:val="single"/>
+            </w:tcBorders>
+            <w:tcMar>
+              <w:top w:w="80.0" w:type="dxa"/>
+              <w:left w:w="140.0" w:type="dxa"/>
+              <w:bottom w:w="80.0" w:type="dxa"/>
+              <w:right w:w="140.0" w:type="dxa"/>
+            </w:tcMar>
+            <w:vAlign w:val="top"/>
+          </w:tcPr>
+          <w:p>
+            <w:pPr>
+              <w:rPr>
+                <w:b w:val="1"/>
+                <w:bCs w:val="1"/>
+              </w:rPr>
+            </w:pPr>
+            <w:r>
+              <w:rPr>
+                <w:b w:val="1"/>
+                <w:bCs w:val="1"/>
+                <w:rtl w:val="0"/>
+              </w:rPr>
+              <w:t xml:space="preserve">pages/cursos.html</w:t>
+            </w:r>
+          </w:p>
+        </w:tc>
+        <w:tc>
+          <w:tcPr>
+            <w:tcBorders>
+              <w:top w:color="000000" w:space="0" w:sz="0" w:val="nil"/>
+              <w:left w:color="000000" w:space="0" w:sz="0" w:val="nil"/>
+              <w:bottom w:color="bfbfbf" w:space="0" w:sz="4" w:val="single"/>
+              <w:right w:color="bfbfbf" w:space="0" w:sz="4" w:val="single"/>
+            </w:tcBorders>
+            <w:tcMar>
+              <w:top w:w="80.0" w:type="dxa"/>
+              <w:left w:w="140.0" w:type="dxa"/>
+              <w:bottom w:w="80.0" w:type="dxa"/>
+              <w:right w:w="140.0" w:type="dxa"/>
+            </w:tcMar>
+            <w:vAlign w:val="top"/>
+          </w:tcPr>
+          <w:p>
+            <w:pPr>
+              <w:rPr/>
+            </w:pPr>
+            <w:r>
+              <w:rPr>
+                <w:rtl w:val="0"/>
+              </w:rPr>
+              <w:t xml:space="preserve">Listar los cursos registrados y ofrecer acceso a su registro, consulta y modificación.</w:t>
+            </w:r>
+          </w:p>
+        </w:tc>
+        <w:tc>
+          <w:tcPr>
+            <w:tcBorders>
+              <w:top w:color="000000" w:space="0" w:sz="0" w:val="nil"/>
+              <w:left w:color="000000" w:space="0" w:sz="0" w:val="nil"/>
+              <w:bottom w:color="bfbfbf" w:space="0" w:sz="4" w:val="single"/>
+              <w:right w:color="bfbfbf" w:space="0" w:sz="4" w:val="single"/>
+            </w:tcBorders>
+            <w:tcMar>
+              <w:top w:w="80.0" w:type="dxa"/>
+              <w:left w:w="140.0" w:type="dxa"/>
+              <w:bottom w:w="80.0" w:type="dxa"/>
+              <w:right w:w="140.0" w:type="dxa"/>
+            </w:tcMar>
+            <w:vAlign w:val="top"/>
+          </w:tcPr>
+          <w:p>
+            <w:pPr>
+              <w:rPr/>
+            </w:pPr>
+            <w:r>
+              <w:rPr>
+                <w:rtl w:val="0"/>
+              </w:rPr>
+              <w:t xml:space="preserve">Tabla con información general de los cursos y acciones para registrar, consultar o editar.</w:t>
+            </w:r>
+          </w:p>
+        </w:tc>
+      </w:tr>
+      <w:tr>
+        <w:trPr>
+          <w:cantSplit w:val="0"/>
+          <w:trHeight w:val="420" w:hRule="atLeast"/>
+          <w:tblHeader w:val="0"/>
+        </w:trPr>
+        <w:tc>
+          <w:tcPr>
+            <w:tcBorders>
+              <w:top w:color="000000" w:space="0" w:sz="0" w:val="nil"/>
+              <w:left w:color="bfbfbf" w:space="0" w:sz="4" w:val="single"/>
+              <w:bottom w:color="bfbfbf" w:space="0" w:sz="4" w:val="single"/>
+              <w:right w:color="bfbfbf" w:space="0" w:sz="4" w:val="single"/>
+            </w:tcBorders>
+            <w:tcMar>
+              <w:top w:w="80.0" w:type="dxa"/>
+              <w:left w:w="140.0" w:type="dxa"/>
+              <w:bottom w:w="80.0" w:type="dxa"/>
+              <w:right w:w="140.0" w:type="dxa"/>
+            </w:tcMar>
+            <w:vAlign w:val="top"/>
+          </w:tcPr>
+          <w:p>
+            <w:pPr>
+              <w:rPr>
+                <w:b w:val="1"/>
+                <w:bCs w:val="1"/>
+              </w:rPr>
+            </w:pPr>
+            <w:r>
+              <w:rPr>
+                <w:b w:val="1"/>
+                <w:bCs w:val="1"/>
+                <w:rtl w:val="0"/>
+              </w:rPr>
+              <w:t xml:space="preserve">pages/curso-formulario.html</w:t>
+            </w:r>
+          </w:p>
+        </w:tc>
+        <w:tc>
+          <w:tcPr>
+            <w:tcBorders>
+              <w:top w:color="000000" w:space="0" w:sz="0" w:val="nil"/>
+              <w:left w:color="000000" w:space="0" w:sz="0" w:val="nil"/>
+              <w:bottom w:color="bfbfbf" w:space="0" w:sz="4" w:val="single"/>
+              <w:right w:color="bfbfbf" w:space="0" w:sz="4" w:val="single"/>
+            </w:tcBorders>
+            <w:tcMar>
+              <w:top w:w="80.0" w:type="dxa"/>
+              <w:left w:w="140.0" w:type="dxa"/>
+              <w:bottom w:w="80.0" w:type="dxa"/>
+              <w:right w:w="140.0" w:type="dxa"/>
+            </w:tcMar>
+            <w:vAlign w:val="top"/>
+          </w:tcPr>
+          <w:p>
+            <w:pPr>
+              <w:rPr/>
+            </w:pPr>
+            <w:r>
+              <w:rPr>
+                <w:rtl w:val="0"/>
+              </w:rPr>
+              <w:t xml:space="preserve">Registrar progresivamente la información de un curso o modificar un registro existente.</w:t>
+            </w:r>
+          </w:p>
+        </w:tc>
+        <w:tc>
+          <w:tcPr>
+            <w:tcBorders>
+              <w:top w:color="000000" w:space="0" w:sz="0" w:val="nil"/>
+              <w:left w:color="000000" w:space="0" w:sz="0" w:val="nil"/>
+              <w:bottom w:color="bfbfbf" w:space="0" w:sz="4" w:val="single"/>
+              <w:right w:color="bfbfbf" w:space="0" w:sz="4" w:val="single"/>
+            </w:tcBorders>
+            <w:tcMar>
+              <w:top w:w="80.0" w:type="dxa"/>
+              <w:left w:w="140.0" w:type="dxa"/>
+              <w:bottom w:w="80.0" w:type="dxa"/>
+              <w:right w:w="140.0" w:type="dxa"/>
+            </w:tcMar>
+            <w:vAlign w:val="top"/>
+          </w:tcPr>
+          <w:p>
+            <w:pPr>
+              <w:rPr/>
+            </w:pPr>
+            <w:r>
+              <w:rPr>
+                <w:rtl w:val="0"/>
+              </w:rPr>
+              <w:t xml:space="preserve">Campos organizados por secciones, selección de valores de catálogos, mensajes de validación y opciones de guardado.</w:t>
+            </w:r>
+          </w:p>
+        </w:tc>
+      </w:tr>
+      <w:tr>
+        <w:trPr>
+          <w:cantSplit w:val="0"/>
+          <w:trHeight w:val="420" w:hRule="atLeast"/>
+          <w:tblHeader w:val="0"/>
+        </w:trPr>
+        <w:tc>
+          <w:tcPr>
+            <w:tcBorders>
+              <w:top w:color="000000" w:space="0" w:sz="0" w:val="nil"/>
+              <w:left w:color="bfbfbf" w:space="0" w:sz="4" w:val="single"/>
+              <w:bottom w:color="bfbfbf" w:space="0" w:sz="4" w:val="single"/>
+              <w:right w:color="bfbfbf" w:space="0" w:sz="4" w:val="single"/>
+            </w:tcBorders>
+            <w:tcMar>
+              <w:top w:w="80.0" w:type="dxa"/>
+              <w:left w:w="140.0" w:type="dxa"/>
+              <w:bottom w:w="80.0" w:type="dxa"/>
+              <w:right w:w="140.0" w:type="dxa"/>
+            </w:tcMar>
+            <w:vAlign w:val="top"/>
+          </w:tcPr>
+          <w:p>
+            <w:pPr>
+              <w:rPr>
+                <w:b w:val="1"/>
+                <w:bCs w:val="1"/>
+              </w:rPr>
+            </w:pPr>
+            <w:r>
+              <w:rPr>
+                <w:b w:val="1"/>
+                <w:bCs w:val="1"/>
+                <w:rtl w:val="0"/>
+              </w:rPr>
+              <w:t xml:space="preserve">pages/curso-detalle.html</w:t>
+            </w:r>
+          </w:p>
+        </w:tc>
+        <w:tc>
+          <w:tcPr>
+            <w:tcBorders>
+              <w:top w:color="000000" w:space="0" w:sz="0" w:val="nil"/>
+              <w:left w:color="000000" w:space="0" w:sz="0" w:val="nil"/>
+              <w:bottom w:color="bfbfbf" w:space="0" w:sz="4" w:val="single"/>
+              <w:right w:color="bfbfbf" w:space="0" w:sz="4" w:val="single"/>
+            </w:tcBorders>
+            <w:tcMar>
+              <w:top w:w="80.0" w:type="dxa"/>
+              <w:left w:w="140.0" w:type="dxa"/>
+              <w:bottom w:w="80.0" w:type="dxa"/>
+              <w:right w:w="140.0" w:type="dxa"/>
+            </w:tcMar>
+            <w:vAlign w:val="top"/>
+          </w:tcPr>
+          <w:p>
+            <w:pPr>
+              <w:rPr/>
+            </w:pPr>
+            <w:r>
+              <w:rPr>
+                <w:rtl w:val="0"/>
+              </w:rPr>
+              <w:t xml:space="preserve">Consultar la información registrada de un curso.</w:t>
+            </w:r>
+          </w:p>
+        </w:tc>
+        <w:tc>
+          <w:tcPr>
+            <w:tcBorders>
+              <w:top w:color="000000" w:space="0" w:sz="0" w:val="nil"/>
+              <w:left w:color="000000" w:space="0" w:sz="0" w:val="nil"/>
+              <w:bottom w:color="bfbfbf" w:space="0" w:sz="4" w:val="single"/>
+              <w:right w:color="bfbfbf" w:space="0" w:sz="4" w:val="single"/>
+            </w:tcBorders>
+            <w:tcMar>
+              <w:top w:w="80.0" w:type="dxa"/>
+              <w:left w:w="140.0" w:type="dxa"/>
+              <w:bottom w:w="80.0" w:type="dxa"/>
+              <w:right w:w="140.0" w:type="dxa"/>
+            </w:tcMar>
+            <w:vAlign w:val="top"/>
+          </w:tcPr>
+          <w:p>
+            <w:pPr>
+              <w:rPr/>
+            </w:pPr>
+            <w:r>
+              <w:rPr>
+                <w:rtl w:val="0"/>
+              </w:rPr>
+              <w:t xml:space="preserve">Datos del curso organizados por secciones y opciones para regresar al listado o acceder a la edición según el rol.</w:t>
+            </w:r>
+          </w:p>
+        </w:tc>
+      </w:tr>
+      <w:tr>
+        <w:trPr>
+          <w:cantSplit w:val="0"/>
+          <w:trHeight w:val="420" w:hRule="atLeast"/>
+          <w:tblHeader w:val="0"/>
+        </w:trPr>
+        <w:tc>
+          <w:tcPr>
+            <w:tcBorders>
+              <w:top w:color="000000" w:space="0" w:sz="0" w:val="nil"/>
+              <w:left w:color="bfbfbf" w:space="0" w:sz="4" w:val="single"/>
+              <w:bottom w:color="bfbfbf" w:space="0" w:sz="4" w:val="single"/>
+              <w:right w:color="bfbfbf" w:space="0" w:sz="4" w:val="single"/>
+            </w:tcBorders>
+            <w:tcMar>
+              <w:top w:w="80.0" w:type="dxa"/>
+              <w:left w:w="140.0" w:type="dxa"/>
+              <w:bottom w:w="80.0" w:type="dxa"/>
+              <w:right w:w="140.0" w:type="dxa"/>
+            </w:tcMar>
+            <w:vAlign w:val="top"/>
+          </w:tcPr>
+          <w:p>
+            <w:pPr>
+              <w:rPr>
+                <w:b w:val="1"/>
+                <w:bCs w:val="1"/>
+              </w:rPr>
+            </w:pPr>
+            <w:r>
+              <w:rPr>
+                <w:b w:val="1"/>
+                <w:bCs w:val="1"/>
+                <w:rtl w:val="0"/>
+              </w:rPr>
+              <w:t xml:space="preserve">pages/cambiar-contrasena.html</w:t>
+            </w:r>
+          </w:p>
+        </w:tc>
+        <w:tc>
+          <w:tcPr>
+            <w:tcBorders>
+              <w:top w:color="000000" w:space="0" w:sz="0" w:val="nil"/>
+              <w:left w:color="000000" w:space="0" w:sz="0" w:val="nil"/>
+              <w:bottom w:color="bfbfbf" w:space="0" w:sz="4" w:val="single"/>
+              <w:right w:color="bfbfbf" w:space="0" w:sz="4" w:val="single"/>
+            </w:tcBorders>
+            <w:tcMar>
+              <w:top w:w="80.0" w:type="dxa"/>
+              <w:left w:w="140.0" w:type="dxa"/>
+              <w:bottom w:w="80.0" w:type="dxa"/>
+              <w:right w:w="140.0" w:type="dxa"/>
+            </w:tcMar>
+            <w:vAlign w:val="top"/>
+          </w:tcPr>
+          <w:p>
+            <w:pPr>
+              <w:rPr/>
+            </w:pPr>
+            <w:r>
+              <w:rPr>
+                <w:rtl w:val="0"/>
+              </w:rPr>
+              <w:t xml:space="preserve">Permitir el cambio de contraseña dentro del prototipo.</w:t>
+            </w:r>
+          </w:p>
+        </w:tc>
+        <w:tc>
+          <w:tcPr>
+            <w:tcBorders>
+              <w:top w:color="000000" w:space="0" w:sz="0" w:val="nil"/>
+              <w:left w:color="000000" w:space="0" w:sz="0" w:val="nil"/>
+              <w:bottom w:color="bfbfbf" w:space="0" w:sz="4" w:val="single"/>
+              <w:right w:color="bfbfbf" w:space="0" w:sz="4" w:val="single"/>
+            </w:tcBorders>
+            <w:tcMar>
+              <w:top w:w="80.0" w:type="dxa"/>
+              <w:left w:w="140.0" w:type="dxa"/>
+              <w:bottom w:w="80.0" w:type="dxa"/>
+              <w:right w:w="140.0" w:type="dxa"/>
+            </w:tcMar>
+            <w:vAlign w:val="top"/>
+          </w:tcPr>
+          <w:p>
+            <w:pPr>
+              <w:rPr/>
+            </w:pPr>
+            <w:r>
+              <w:rPr>
+                <w:rtl w:val="0"/>
+              </w:rPr>
+              <w:t xml:space="preserve">Campos de contraseña actual, nueva contraseña y confirmación, botón para guardar y mensajes de validación.</w:t>
+            </w:r>
+          </w:p>
+        </w:tc>
+      </w:tr>
+      <w:tr>
+        <w:trPr>
+          <w:cantSplit w:val="0"/>
+          <w:trHeight w:val="420" w:hRule="atLeast"/>
+          <w:tblHeader w:val="0"/>
+        </w:trPr>
+        <w:tc>
+          <w:tcPr>
+            <w:tcBorders>
+              <w:top w:color="000000" w:space="0" w:sz="0" w:val="nil"/>
+              <w:left w:color="bfbfbf" w:space="0" w:sz="4" w:val="single"/>
+              <w:bottom w:color="bfbfbf" w:space="0" w:sz="4" w:val="single"/>
+              <w:right w:color="bfbfbf" w:space="0" w:sz="4" w:val="single"/>
+            </w:tcBorders>
+            <w:tcMar>
+              <w:top w:w="80.0" w:type="dxa"/>
+              <w:left w:w="140.0" w:type="dxa"/>
+              <w:bottom w:w="80.0" w:type="dxa"/>
+              <w:right w:w="140.0" w:type="dxa"/>
+            </w:tcMar>
+            <w:vAlign w:val="top"/>
+          </w:tcPr>
+          <w:p>
+            <w:pPr>
+              <w:rPr>
+                <w:b w:val="1"/>
+                <w:bCs w:val="1"/>
+              </w:rPr>
+            </w:pPr>
+            <w:r>
+              <w:rPr>
+                <w:b w:val="1"/>
+                <w:bCs w:val="1"/>
+                <w:rtl w:val="0"/>
+              </w:rPr>
+              <w:t xml:space="preserve">pages/recuperar-contrasena.html</w:t>
+            </w:r>
+          </w:p>
+        </w:tc>
+        <w:tc>
+          <w:tcPr>
+            <w:tcBorders>
+              <w:top w:color="000000" w:space="0" w:sz="0" w:val="nil"/>
+              <w:left w:color="000000" w:space="0" w:sz="0" w:val="nil"/>
+              <w:bottom w:color="bfbfbf" w:space="0" w:sz="4" w:val="single"/>
+              <w:right w:color="bfbfbf" w:space="0" w:sz="4" w:val="single"/>
+            </w:tcBorders>
+            <w:tcMar>
+              <w:top w:w="80.0" w:type="dxa"/>
+              <w:left w:w="140.0" w:type="dxa"/>
+              <w:bottom w:w="80.0" w:type="dxa"/>
+              <w:right w:w="140.0" w:type="dxa"/>
+            </w:tcMar>
+            <w:vAlign w:val="top"/>
+          </w:tcPr>
+          <w:p>
+            <w:pPr>
+              <w:rPr/>
+            </w:pPr>
+            <w:r>
+              <w:rPr>
+                <w:rtl w:val="0"/>
+              </w:rPr>
+              <w:t xml:space="preserve">Representar la solicitud de recuperación de contraseña.</w:t>
+            </w:r>
+          </w:p>
+        </w:tc>
+        <w:tc>
+          <w:tcPr>
+            <w:tcBorders>
+              <w:top w:color="000000" w:space="0" w:sz="0" w:val="nil"/>
+              <w:left w:color="000000" w:space="0" w:sz="0" w:val="nil"/>
+              <w:bottom w:color="bfbfbf" w:space="0" w:sz="4" w:val="single"/>
+              <w:right w:color="bfbfbf" w:space="0" w:sz="4" w:val="single"/>
+            </w:tcBorders>
+            <w:tcMar>
+              <w:top w:w="80.0" w:type="dxa"/>
+              <w:left w:w="140.0" w:type="dxa"/>
+              <w:bottom w:w="80.0" w:type="dxa"/>
+              <w:right w:w="140.0" w:type="dxa"/>
+            </w:tcMar>
+            <w:vAlign w:val="top"/>
+          </w:tcPr>
+          <w:p>
+            <w:pPr>
+              <w:rPr/>
+            </w:pPr>
+            <w:r>
+              <w:rPr>
+                <w:rtl w:val="0"/>
+              </w:rPr>
+              <w:t xml:space="preserve">Campo de correo, botón de solicitud y mensajes de validación.</w:t>
+            </w:r>
+          </w:p>
+        </w:tc>
+      </w:tr>
+    </w:tbl>
     <w:p>
       <w:pPr>
         <w:rPr/>
@@ -2121,6 +4185,14 @@
         <w:bottom w:w="0.0" w:type="dxa"/>
         <w:right w:w="10.0" w:type="dxa"/>
       </w:tblCellMar>
+    </w:tblPr>
+  </w:style>
+  <w:style w:type="table" w:styleId="Table3">
+    <w:basedOn w:val="TableNormal"/>
+    <w:tblPr>
+      <w:tblStyleRowBandSize w:val="1"/>
+      <w:tblStyleColBandSize w:val="1"/>
+      <w:tblCellMar/>
     </w:tblPr>
   </w:style>
 </w:styles>

</xml_diff>

<commit_message>
Agrega el diseño de la maquetación HTML
</commit_message>
<xml_diff>
--- a/Documento de diseno Iteracion 1.docx
+++ b/Documento de diseno Iteracion 1.docx
@@ -3978,6 +3978,4211 @@
         </w:rPr>
       </w:r>
     </w:p>
+    <w:p>
+      <w:pPr>
+        <w:pStyle w:val="Heading1"/>
+        <w:keepNext w:val="0"/>
+        <w:keepLines w:val="0"/>
+        <w:pBdr>
+          <w:bottom w:color="2e75b6" w:space="4" w:sz="6" w:val="single"/>
+        </w:pBdr>
+        <w:spacing w:after="160" w:before="320" w:line="240" w:lineRule="auto"/>
+        <w:rPr>
+          <w:b w:val="1"/>
+          <w:bCs w:val="1"/>
+          <w:color w:val="1f4e79"/>
+          <w:sz w:val="30"/>
+          <w:szCs w:val="30"/>
+        </w:rPr>
+      </w:pPr>
+      <w:bookmarkStart w:colFirst="0" w:colLast="0" w:name="_f2qv5aifks7" w:id="15"/>
+      <w:bookmarkEnd w:id="15"/>
+      <w:r>
+        <w:rPr>
+          <w:b w:val="1"/>
+          <w:bCs w:val="1"/>
+          <w:color w:val="1f4e79"/>
+          <w:sz w:val="30"/>
+          <w:szCs w:val="30"/>
+          <w:rtl w:val="0"/>
+        </w:rPr>
+        <w:t xml:space="preserve">4. Diseño de la Interfaz</w:t>
+      </w:r>
+    </w:p>
+    <w:p>
+      <w:pPr>
+        <w:rPr/>
+      </w:pPr>
+      <w:r>
+        <w:rPr>
+          <w:rtl w:val="0"/>
+        </w:rPr>
+        <w:t xml:space="preserve">Pendiente de agregar</w:t>
+      </w:r>
+    </w:p>
+    <w:p>
+      <w:pPr>
+        <w:rPr/>
+      </w:pPr>
+      <w:r>
+        <w:rPr>
+          <w:rtl w:val="0"/>
+        </w:rPr>
+      </w:r>
+    </w:p>
+    <w:p>
+      <w:pPr>
+        <w:pStyle w:val="Heading1"/>
+        <w:keepNext w:val="0"/>
+        <w:keepLines w:val="0"/>
+        <w:pBdr>
+          <w:bottom w:color="2e75b6" w:space="4" w:sz="6" w:val="single"/>
+        </w:pBdr>
+        <w:spacing w:after="160" w:before="320" w:line="240" w:lineRule="auto"/>
+        <w:rPr>
+          <w:b w:val="1"/>
+          <w:bCs w:val="1"/>
+          <w:color w:val="1f4e79"/>
+          <w:sz w:val="30"/>
+          <w:szCs w:val="30"/>
+        </w:rPr>
+      </w:pPr>
+      <w:bookmarkStart w:colFirst="0" w:colLast="0" w:name="_ooklqu8sd59s" w:id="16"/>
+      <w:bookmarkEnd w:id="16"/>
+      <w:r>
+        <w:rPr>
+          <w:rtl w:val="0"/>
+        </w:rPr>
+      </w:r>
+    </w:p>
+    <w:p>
+      <w:pPr>
+        <w:pStyle w:val="Heading1"/>
+        <w:keepNext w:val="0"/>
+        <w:keepLines w:val="0"/>
+        <w:pBdr>
+          <w:bottom w:color="2e75b6" w:space="4" w:sz="6" w:val="single"/>
+        </w:pBdr>
+        <w:spacing w:after="160" w:before="320" w:line="240" w:lineRule="auto"/>
+        <w:rPr>
+          <w:b w:val="1"/>
+          <w:bCs w:val="1"/>
+          <w:color w:val="1f4e79"/>
+          <w:sz w:val="30"/>
+          <w:szCs w:val="30"/>
+        </w:rPr>
+      </w:pPr>
+      <w:bookmarkStart w:colFirst="0" w:colLast="0" w:name="_cm00ez9i76uc" w:id="17"/>
+      <w:bookmarkEnd w:id="17"/>
+      <w:r>
+        <w:rPr>
+          <w:rtl w:val="0"/>
+        </w:rPr>
+      </w:r>
+    </w:p>
+    <w:p>
+      <w:pPr>
+        <w:pStyle w:val="Heading1"/>
+        <w:keepNext w:val="0"/>
+        <w:keepLines w:val="0"/>
+        <w:pBdr>
+          <w:bottom w:color="2e75b6" w:space="4" w:sz="6" w:val="single"/>
+        </w:pBdr>
+        <w:spacing w:after="160" w:before="320" w:line="240" w:lineRule="auto"/>
+        <w:rPr>
+          <w:b w:val="1"/>
+          <w:bCs w:val="1"/>
+          <w:color w:val="1f4e79"/>
+          <w:sz w:val="30"/>
+          <w:szCs w:val="30"/>
+        </w:rPr>
+      </w:pPr>
+      <w:bookmarkStart w:colFirst="0" w:colLast="0" w:name="_96dpemfb6fdo" w:id="18"/>
+      <w:bookmarkEnd w:id="18"/>
+      <w:r>
+        <w:rPr>
+          <w:rtl w:val="0"/>
+        </w:rPr>
+      </w:r>
+    </w:p>
+    <w:p>
+      <w:pPr>
+        <w:pStyle w:val="Heading1"/>
+        <w:keepNext w:val="0"/>
+        <w:keepLines w:val="0"/>
+        <w:pBdr>
+          <w:bottom w:color="2e75b6" w:space="4" w:sz="6" w:val="single"/>
+        </w:pBdr>
+        <w:spacing w:after="160" w:before="320" w:line="240" w:lineRule="auto"/>
+        <w:rPr>
+          <w:b w:val="1"/>
+          <w:bCs w:val="1"/>
+          <w:color w:val="1f4e79"/>
+          <w:sz w:val="30"/>
+          <w:szCs w:val="30"/>
+        </w:rPr>
+      </w:pPr>
+      <w:bookmarkStart w:colFirst="0" w:colLast="0" w:name="_o74fz5c0o4z8" w:id="19"/>
+      <w:bookmarkEnd w:id="19"/>
+      <w:r>
+        <w:rPr>
+          <w:b w:val="1"/>
+          <w:bCs w:val="1"/>
+          <w:color w:val="1f4e79"/>
+          <w:sz w:val="30"/>
+          <w:szCs w:val="30"/>
+          <w:rtl w:val="0"/>
+        </w:rPr>
+        <w:t xml:space="preserve">5. Diseño de la Maquetación (HTML)</w:t>
+      </w:r>
+    </w:p>
+    <w:p>
+      <w:pPr>
+        <w:spacing w:after="240" w:before="240" w:lineRule="auto"/>
+        <w:rPr/>
+      </w:pPr>
+      <w:r>
+        <w:rPr>
+          <w:rtl w:val="0"/>
+        </w:rPr>
+        <w:t xml:space="preserve">Se utilizarán etiquetas semánticas para organizar el contenido y controles de formulario adecuados para cada dato. La estructura mantendrá nombres e identificadores comunes para facilitar su integración con los estilos CSS y la validación mediante JavaScript nativo.</w:t>
+      </w:r>
+    </w:p>
+    <w:p>
+      <w:pPr>
+        <w:pStyle w:val="Heading2"/>
+        <w:keepNext w:val="0"/>
+        <w:keepLines w:val="0"/>
+        <w:spacing w:before="220" w:line="240" w:lineRule="auto"/>
+        <w:rPr>
+          <w:b w:val="1"/>
+          <w:bCs w:val="1"/>
+          <w:color w:val="2e75b6"/>
+          <w:sz w:val="25"/>
+          <w:szCs w:val="25"/>
+        </w:rPr>
+      </w:pPr>
+      <w:bookmarkStart w:colFirst="0" w:colLast="0" w:name="_bg0elh38v47x" w:id="20"/>
+      <w:bookmarkEnd w:id="20"/>
+      <w:r>
+        <w:rPr>
+          <w:b w:val="1"/>
+          <w:bCs w:val="1"/>
+          <w:color w:val="2e75b6"/>
+          <w:sz w:val="25"/>
+          <w:szCs w:val="25"/>
+          <w:rtl w:val="0"/>
+        </w:rPr>
+        <w:t xml:space="preserve">5.1 Estructura semántica</w:t>
+      </w:r>
+    </w:p>
+    <w:p>
+      <w:pPr>
+        <w:rPr/>
+      </w:pPr>
+      <w:r>
+        <w:rPr>
+          <w:rtl w:val="0"/>
+        </w:rPr>
+      </w:r>
+    </w:p>
+    <w:tbl>
+      <w:tblPr>
+        <w:tblStyle w:val="Table4"/>
+        <w:tblW w:w="6446.794150731159" w:type="dxa"/>
+        <w:jc w:val="left"/>
+        <w:tblBorders>
+          <w:top w:color="000000" w:space="0" w:sz="0" w:val="nil"/>
+          <w:left w:color="000000" w:space="0" w:sz="0" w:val="nil"/>
+          <w:bottom w:color="000000" w:space="0" w:sz="0" w:val="nil"/>
+          <w:right w:color="000000" w:space="0" w:sz="0" w:val="nil"/>
+          <w:insideH w:color="000000" w:space="0" w:sz="0" w:val="nil"/>
+          <w:insideV w:color="000000" w:space="0" w:sz="0" w:val="nil"/>
+        </w:tblBorders>
+        <w:tblLayout w:type="fixed"/>
+        <w:tblLook w:val="0600"/>
+      </w:tblPr>
+      <w:tblGrid>
+        <w:gridCol w:w="2404.8715258907246"/>
+        <w:gridCol w:w="4041.9226248404348"/>
+        <w:tblGridChange w:id="0">
+          <w:tblGrid>
+            <w:gridCol w:w="2404.8715258907246"/>
+            <w:gridCol w:w="4041.9226248404348"/>
+          </w:tblGrid>
+        </w:tblGridChange>
+      </w:tblGrid>
+      <w:tr>
+        <w:trPr>
+          <w:cantSplit w:val="0"/>
+          <w:trHeight w:val="420" w:hRule="atLeast"/>
+          <w:tblHeader w:val="0"/>
+        </w:trPr>
+        <w:tc>
+          <w:tcPr>
+            <w:tcBorders>
+              <w:top w:color="bfbfbf" w:space="0" w:sz="4" w:val="single"/>
+              <w:left w:color="bfbfbf" w:space="0" w:sz="4" w:val="single"/>
+              <w:bottom w:color="bfbfbf" w:space="0" w:sz="4" w:val="single"/>
+              <w:right w:color="bfbfbf" w:space="0" w:sz="4" w:val="single"/>
+            </w:tcBorders>
+            <w:shd w:fill="1f4e79" w:val="clear"/>
+            <w:tcMar>
+              <w:top w:w="80.0" w:type="dxa"/>
+              <w:left w:w="140.0" w:type="dxa"/>
+              <w:bottom w:w="80.0" w:type="dxa"/>
+              <w:right w:w="140.0" w:type="dxa"/>
+            </w:tcMar>
+            <w:vAlign w:val="top"/>
+          </w:tcPr>
+          <w:p>
+            <w:pPr>
+              <w:rPr>
+                <w:b w:val="1"/>
+                <w:bCs w:val="1"/>
+                <w:color w:val="ffffff"/>
+              </w:rPr>
+            </w:pPr>
+            <w:r>
+              <w:rPr>
+                <w:b w:val="1"/>
+                <w:bCs w:val="1"/>
+                <w:color w:val="ffffff"/>
+                <w:rtl w:val="0"/>
+              </w:rPr>
+              <w:t xml:space="preserve">Etiqueta</w:t>
+            </w:r>
+          </w:p>
+        </w:tc>
+        <w:tc>
+          <w:tcPr>
+            <w:tcBorders>
+              <w:top w:color="bfbfbf" w:space="0" w:sz="4" w:val="single"/>
+              <w:left w:color="000000" w:space="0" w:sz="0" w:val="nil"/>
+              <w:bottom w:color="bfbfbf" w:space="0" w:sz="4" w:val="single"/>
+              <w:right w:color="bfbfbf" w:space="0" w:sz="4" w:val="single"/>
+            </w:tcBorders>
+            <w:shd w:fill="1f4e79" w:val="clear"/>
+            <w:tcMar>
+              <w:top w:w="80.0" w:type="dxa"/>
+              <w:left w:w="140.0" w:type="dxa"/>
+              <w:bottom w:w="80.0" w:type="dxa"/>
+              <w:right w:w="140.0" w:type="dxa"/>
+            </w:tcMar>
+            <w:vAlign w:val="top"/>
+          </w:tcPr>
+          <w:p>
+            <w:pPr>
+              <w:rPr>
+                <w:b w:val="1"/>
+                <w:bCs w:val="1"/>
+                <w:color w:val="ffffff"/>
+              </w:rPr>
+            </w:pPr>
+            <w:r>
+              <w:rPr>
+                <w:b w:val="1"/>
+                <w:bCs w:val="1"/>
+                <w:color w:val="ffffff"/>
+                <w:rtl w:val="0"/>
+              </w:rPr>
+              <w:t xml:space="preserve">Aplicación</w:t>
+            </w:r>
+          </w:p>
+        </w:tc>
+      </w:tr>
+      <w:tr>
+        <w:trPr>
+          <w:cantSplit w:val="0"/>
+          <w:trHeight w:val="420" w:hRule="atLeast"/>
+          <w:tblHeader w:val="0"/>
+        </w:trPr>
+        <w:tc>
+          <w:tcPr>
+            <w:tcBorders>
+              <w:top w:color="000000" w:space="0" w:sz="0" w:val="nil"/>
+              <w:left w:color="bfbfbf" w:space="0" w:sz="4" w:val="single"/>
+              <w:bottom w:color="bfbfbf" w:space="0" w:sz="4" w:val="single"/>
+              <w:right w:color="bfbfbf" w:space="0" w:sz="4" w:val="single"/>
+            </w:tcBorders>
+            <w:tcMar>
+              <w:top w:w="80.0" w:type="dxa"/>
+              <w:left w:w="140.0" w:type="dxa"/>
+              <w:bottom w:w="80.0" w:type="dxa"/>
+              <w:right w:w="140.0" w:type="dxa"/>
+            </w:tcMar>
+            <w:vAlign w:val="top"/>
+          </w:tcPr>
+          <w:p>
+            <w:pPr>
+              <w:rPr>
+                <w:b w:val="1"/>
+                <w:bCs w:val="1"/>
+              </w:rPr>
+            </w:pPr>
+            <w:r>
+              <w:rPr>
+                <w:b w:val="1"/>
+                <w:bCs w:val="1"/>
+                <w:rtl w:val="0"/>
+              </w:rPr>
+              <w:t xml:space="preserve">header</w:t>
+            </w:r>
+          </w:p>
+        </w:tc>
+        <w:tc>
+          <w:tcPr>
+            <w:tcBorders>
+              <w:top w:color="000000" w:space="0" w:sz="0" w:val="nil"/>
+              <w:left w:color="000000" w:space="0" w:sz="0" w:val="nil"/>
+              <w:bottom w:color="bfbfbf" w:space="0" w:sz="4" w:val="single"/>
+              <w:right w:color="bfbfbf" w:space="0" w:sz="4" w:val="single"/>
+            </w:tcBorders>
+            <w:tcMar>
+              <w:top w:w="80.0" w:type="dxa"/>
+              <w:left w:w="140.0" w:type="dxa"/>
+              <w:bottom w:w="80.0" w:type="dxa"/>
+              <w:right w:w="140.0" w:type="dxa"/>
+            </w:tcMar>
+            <w:vAlign w:val="top"/>
+          </w:tcPr>
+          <w:p>
+            <w:pPr>
+              <w:rPr/>
+            </w:pPr>
+            <w:r>
+              <w:rPr>
+                <w:rtl w:val="0"/>
+              </w:rPr>
+              <w:t xml:space="preserve">Presentar la identidad visual y el nombre del sistema o de la página.</w:t>
+            </w:r>
+          </w:p>
+        </w:tc>
+      </w:tr>
+      <w:tr>
+        <w:trPr>
+          <w:cantSplit w:val="0"/>
+          <w:trHeight w:val="420" w:hRule="atLeast"/>
+          <w:tblHeader w:val="0"/>
+        </w:trPr>
+        <w:tc>
+          <w:tcPr>
+            <w:tcBorders>
+              <w:top w:color="000000" w:space="0" w:sz="0" w:val="nil"/>
+              <w:left w:color="bfbfbf" w:space="0" w:sz="4" w:val="single"/>
+              <w:bottom w:color="bfbfbf" w:space="0" w:sz="4" w:val="single"/>
+              <w:right w:color="bfbfbf" w:space="0" w:sz="4" w:val="single"/>
+            </w:tcBorders>
+            <w:tcMar>
+              <w:top w:w="80.0" w:type="dxa"/>
+              <w:left w:w="140.0" w:type="dxa"/>
+              <w:bottom w:w="80.0" w:type="dxa"/>
+              <w:right w:w="140.0" w:type="dxa"/>
+            </w:tcMar>
+            <w:vAlign w:val="top"/>
+          </w:tcPr>
+          <w:p>
+            <w:pPr>
+              <w:rPr>
+                <w:b w:val="1"/>
+                <w:bCs w:val="1"/>
+              </w:rPr>
+            </w:pPr>
+            <w:r>
+              <w:rPr>
+                <w:b w:val="1"/>
+                <w:bCs w:val="1"/>
+                <w:rtl w:val="0"/>
+              </w:rPr>
+              <w:t xml:space="preserve">nav</w:t>
+            </w:r>
+          </w:p>
+        </w:tc>
+        <w:tc>
+          <w:tcPr>
+            <w:tcBorders>
+              <w:top w:color="000000" w:space="0" w:sz="0" w:val="nil"/>
+              <w:left w:color="000000" w:space="0" w:sz="0" w:val="nil"/>
+              <w:bottom w:color="bfbfbf" w:space="0" w:sz="4" w:val="single"/>
+              <w:right w:color="bfbfbf" w:space="0" w:sz="4" w:val="single"/>
+            </w:tcBorders>
+            <w:tcMar>
+              <w:top w:w="80.0" w:type="dxa"/>
+              <w:left w:w="140.0" w:type="dxa"/>
+              <w:bottom w:w="80.0" w:type="dxa"/>
+              <w:right w:w="140.0" w:type="dxa"/>
+            </w:tcMar>
+            <w:vAlign w:val="top"/>
+          </w:tcPr>
+          <w:p>
+            <w:pPr>
+              <w:rPr/>
+            </w:pPr>
+            <w:r>
+              <w:rPr>
+                <w:rtl w:val="0"/>
+              </w:rPr>
+              <w:t xml:space="preserve">Agrupar los enlaces de navegación y los accesos a los módulos disponibles.</w:t>
+            </w:r>
+          </w:p>
+        </w:tc>
+      </w:tr>
+      <w:tr>
+        <w:trPr>
+          <w:cantSplit w:val="0"/>
+          <w:trHeight w:val="420" w:hRule="atLeast"/>
+          <w:tblHeader w:val="0"/>
+        </w:trPr>
+        <w:tc>
+          <w:tcPr>
+            <w:tcBorders>
+              <w:top w:color="000000" w:space="0" w:sz="0" w:val="nil"/>
+              <w:left w:color="bfbfbf" w:space="0" w:sz="4" w:val="single"/>
+              <w:bottom w:color="bfbfbf" w:space="0" w:sz="4" w:val="single"/>
+              <w:right w:color="bfbfbf" w:space="0" w:sz="4" w:val="single"/>
+            </w:tcBorders>
+            <w:tcMar>
+              <w:top w:w="80.0" w:type="dxa"/>
+              <w:left w:w="140.0" w:type="dxa"/>
+              <w:bottom w:w="80.0" w:type="dxa"/>
+              <w:right w:w="140.0" w:type="dxa"/>
+            </w:tcMar>
+            <w:vAlign w:val="top"/>
+          </w:tcPr>
+          <w:p>
+            <w:pPr>
+              <w:rPr>
+                <w:b w:val="1"/>
+                <w:bCs w:val="1"/>
+              </w:rPr>
+            </w:pPr>
+            <w:r>
+              <w:rPr>
+                <w:b w:val="1"/>
+                <w:bCs w:val="1"/>
+                <w:rtl w:val="0"/>
+              </w:rPr>
+              <w:t xml:space="preserve">main</w:t>
+            </w:r>
+          </w:p>
+        </w:tc>
+        <w:tc>
+          <w:tcPr>
+            <w:tcBorders>
+              <w:top w:color="000000" w:space="0" w:sz="0" w:val="nil"/>
+              <w:left w:color="000000" w:space="0" w:sz="0" w:val="nil"/>
+              <w:bottom w:color="bfbfbf" w:space="0" w:sz="4" w:val="single"/>
+              <w:right w:color="bfbfbf" w:space="0" w:sz="4" w:val="single"/>
+            </w:tcBorders>
+            <w:tcMar>
+              <w:top w:w="80.0" w:type="dxa"/>
+              <w:left w:w="140.0" w:type="dxa"/>
+              <w:bottom w:w="80.0" w:type="dxa"/>
+              <w:right w:w="140.0" w:type="dxa"/>
+            </w:tcMar>
+            <w:vAlign w:val="top"/>
+          </w:tcPr>
+          <w:p>
+            <w:pPr>
+              <w:rPr/>
+            </w:pPr>
+            <w:r>
+              <w:rPr>
+                <w:rtl w:val="0"/>
+              </w:rPr>
+              <w:t xml:space="preserve">Contener la información principal de cada página, como el panel, el listado o el formulario.</w:t>
+            </w:r>
+          </w:p>
+        </w:tc>
+      </w:tr>
+      <w:tr>
+        <w:trPr>
+          <w:cantSplit w:val="0"/>
+          <w:trHeight w:val="420" w:hRule="atLeast"/>
+          <w:tblHeader w:val="0"/>
+        </w:trPr>
+        <w:tc>
+          <w:tcPr>
+            <w:tcBorders>
+              <w:top w:color="000000" w:space="0" w:sz="0" w:val="nil"/>
+              <w:left w:color="bfbfbf" w:space="0" w:sz="4" w:val="single"/>
+              <w:bottom w:color="bfbfbf" w:space="0" w:sz="4" w:val="single"/>
+              <w:right w:color="bfbfbf" w:space="0" w:sz="4" w:val="single"/>
+            </w:tcBorders>
+            <w:tcMar>
+              <w:top w:w="80.0" w:type="dxa"/>
+              <w:left w:w="140.0" w:type="dxa"/>
+              <w:bottom w:w="80.0" w:type="dxa"/>
+              <w:right w:w="140.0" w:type="dxa"/>
+            </w:tcMar>
+            <w:vAlign w:val="top"/>
+          </w:tcPr>
+          <w:p>
+            <w:pPr>
+              <w:rPr>
+                <w:b w:val="1"/>
+                <w:bCs w:val="1"/>
+              </w:rPr>
+            </w:pPr>
+            <w:r>
+              <w:rPr>
+                <w:b w:val="1"/>
+                <w:bCs w:val="1"/>
+                <w:rtl w:val="0"/>
+              </w:rPr>
+              <w:t xml:space="preserve">section</w:t>
+            </w:r>
+          </w:p>
+        </w:tc>
+        <w:tc>
+          <w:tcPr>
+            <w:tcBorders>
+              <w:top w:color="000000" w:space="0" w:sz="0" w:val="nil"/>
+              <w:left w:color="000000" w:space="0" w:sz="0" w:val="nil"/>
+              <w:bottom w:color="bfbfbf" w:space="0" w:sz="4" w:val="single"/>
+              <w:right w:color="bfbfbf" w:space="0" w:sz="4" w:val="single"/>
+            </w:tcBorders>
+            <w:tcMar>
+              <w:top w:w="80.0" w:type="dxa"/>
+              <w:left w:w="140.0" w:type="dxa"/>
+              <w:bottom w:w="80.0" w:type="dxa"/>
+              <w:right w:w="140.0" w:type="dxa"/>
+            </w:tcMar>
+            <w:vAlign w:val="top"/>
+          </w:tcPr>
+          <w:p>
+            <w:pPr>
+              <w:rPr/>
+            </w:pPr>
+            <w:r>
+              <w:rPr>
+                <w:rtl w:val="0"/>
+              </w:rPr>
+              <w:t xml:space="preserve">Organizar bloques de contenido relacionados y las secciones de información de los cursos.</w:t>
+            </w:r>
+          </w:p>
+        </w:tc>
+      </w:tr>
+      <w:tr>
+        <w:trPr>
+          <w:cantSplit w:val="0"/>
+          <w:trHeight w:val="420" w:hRule="atLeast"/>
+          <w:tblHeader w:val="0"/>
+        </w:trPr>
+        <w:tc>
+          <w:tcPr>
+            <w:tcBorders>
+              <w:top w:color="000000" w:space="0" w:sz="0" w:val="nil"/>
+              <w:left w:color="bfbfbf" w:space="0" w:sz="4" w:val="single"/>
+              <w:bottom w:color="bfbfbf" w:space="0" w:sz="4" w:val="single"/>
+              <w:right w:color="bfbfbf" w:space="0" w:sz="4" w:val="single"/>
+            </w:tcBorders>
+            <w:tcMar>
+              <w:top w:w="80.0" w:type="dxa"/>
+              <w:left w:w="140.0" w:type="dxa"/>
+              <w:bottom w:w="80.0" w:type="dxa"/>
+              <w:right w:w="140.0" w:type="dxa"/>
+            </w:tcMar>
+            <w:vAlign w:val="top"/>
+          </w:tcPr>
+          <w:p>
+            <w:pPr>
+              <w:rPr>
+                <w:b w:val="1"/>
+                <w:bCs w:val="1"/>
+              </w:rPr>
+            </w:pPr>
+            <w:r>
+              <w:rPr>
+                <w:b w:val="1"/>
+                <w:bCs w:val="1"/>
+                <w:rtl w:val="0"/>
+              </w:rPr>
+              <w:t xml:space="preserve">h1, h2 y h3</w:t>
+            </w:r>
+          </w:p>
+        </w:tc>
+        <w:tc>
+          <w:tcPr>
+            <w:tcBorders>
+              <w:top w:color="000000" w:space="0" w:sz="0" w:val="nil"/>
+              <w:left w:color="000000" w:space="0" w:sz="0" w:val="nil"/>
+              <w:bottom w:color="bfbfbf" w:space="0" w:sz="4" w:val="single"/>
+              <w:right w:color="bfbfbf" w:space="0" w:sz="4" w:val="single"/>
+            </w:tcBorders>
+            <w:tcMar>
+              <w:top w:w="80.0" w:type="dxa"/>
+              <w:left w:w="140.0" w:type="dxa"/>
+              <w:bottom w:w="80.0" w:type="dxa"/>
+              <w:right w:w="140.0" w:type="dxa"/>
+            </w:tcMar>
+            <w:vAlign w:val="top"/>
+          </w:tcPr>
+          <w:p>
+            <w:pPr>
+              <w:rPr/>
+            </w:pPr>
+            <w:r>
+              <w:rPr>
+                <w:rtl w:val="0"/>
+              </w:rPr>
+              <w:t xml:space="preserve">Identificar el título principal y los títulos de las subsecciones.</w:t>
+            </w:r>
+          </w:p>
+        </w:tc>
+      </w:tr>
+      <w:tr>
+        <w:trPr>
+          <w:cantSplit w:val="0"/>
+          <w:trHeight w:val="420" w:hRule="atLeast"/>
+          <w:tblHeader w:val="0"/>
+        </w:trPr>
+        <w:tc>
+          <w:tcPr>
+            <w:tcBorders>
+              <w:top w:color="000000" w:space="0" w:sz="0" w:val="nil"/>
+              <w:left w:color="bfbfbf" w:space="0" w:sz="4" w:val="single"/>
+              <w:bottom w:color="bfbfbf" w:space="0" w:sz="4" w:val="single"/>
+              <w:right w:color="bfbfbf" w:space="0" w:sz="4" w:val="single"/>
+            </w:tcBorders>
+            <w:tcMar>
+              <w:top w:w="80.0" w:type="dxa"/>
+              <w:left w:w="140.0" w:type="dxa"/>
+              <w:bottom w:w="80.0" w:type="dxa"/>
+              <w:right w:w="140.0" w:type="dxa"/>
+            </w:tcMar>
+            <w:vAlign w:val="top"/>
+          </w:tcPr>
+          <w:p>
+            <w:pPr>
+              <w:rPr>
+                <w:b w:val="1"/>
+                <w:bCs w:val="1"/>
+              </w:rPr>
+            </w:pPr>
+            <w:r>
+              <w:rPr>
+                <w:b w:val="1"/>
+                <w:bCs w:val="1"/>
+                <w:rtl w:val="0"/>
+              </w:rPr>
+              <w:t xml:space="preserve">footer</w:t>
+            </w:r>
+          </w:p>
+        </w:tc>
+        <w:tc>
+          <w:tcPr>
+            <w:tcBorders>
+              <w:top w:color="000000" w:space="0" w:sz="0" w:val="nil"/>
+              <w:left w:color="000000" w:space="0" w:sz="0" w:val="nil"/>
+              <w:bottom w:color="bfbfbf" w:space="0" w:sz="4" w:val="single"/>
+              <w:right w:color="bfbfbf" w:space="0" w:sz="4" w:val="single"/>
+            </w:tcBorders>
+            <w:tcMar>
+              <w:top w:w="80.0" w:type="dxa"/>
+              <w:left w:w="140.0" w:type="dxa"/>
+              <w:bottom w:w="80.0" w:type="dxa"/>
+              <w:right w:w="140.0" w:type="dxa"/>
+            </w:tcMar>
+            <w:vAlign w:val="top"/>
+          </w:tcPr>
+          <w:p>
+            <w:pPr>
+              <w:rPr/>
+            </w:pPr>
+            <w:r>
+              <w:rPr>
+                <w:rtl w:val="0"/>
+              </w:rPr>
+              <w:t xml:space="preserve">Mostrar la información institucional o del proyecto correspondiente al pie de página.</w:t>
+            </w:r>
+          </w:p>
+        </w:tc>
+      </w:tr>
+      <w:tr>
+        <w:trPr>
+          <w:cantSplit w:val="0"/>
+          <w:trHeight w:val="420" w:hRule="atLeast"/>
+          <w:tblHeader w:val="0"/>
+        </w:trPr>
+        <w:tc>
+          <w:tcPr>
+            <w:tcBorders>
+              <w:top w:color="000000" w:space="0" w:sz="0" w:val="nil"/>
+              <w:left w:color="bfbfbf" w:space="0" w:sz="4" w:val="single"/>
+              <w:bottom w:color="bfbfbf" w:space="0" w:sz="4" w:val="single"/>
+              <w:right w:color="bfbfbf" w:space="0" w:sz="4" w:val="single"/>
+            </w:tcBorders>
+            <w:tcMar>
+              <w:top w:w="80.0" w:type="dxa"/>
+              <w:left w:w="140.0" w:type="dxa"/>
+              <w:bottom w:w="80.0" w:type="dxa"/>
+              <w:right w:w="140.0" w:type="dxa"/>
+            </w:tcMar>
+            <w:vAlign w:val="top"/>
+          </w:tcPr>
+          <w:p>
+            <w:pPr>
+              <w:rPr>
+                <w:b w:val="1"/>
+                <w:bCs w:val="1"/>
+              </w:rPr>
+            </w:pPr>
+            <w:r>
+              <w:rPr>
+                <w:b w:val="1"/>
+                <w:bCs w:val="1"/>
+                <w:rtl w:val="0"/>
+              </w:rPr>
+              <w:t xml:space="preserve">table, thead, tbody, th y td</w:t>
+            </w:r>
+          </w:p>
+        </w:tc>
+        <w:tc>
+          <w:tcPr>
+            <w:tcBorders>
+              <w:top w:color="000000" w:space="0" w:sz="0" w:val="nil"/>
+              <w:left w:color="000000" w:space="0" w:sz="0" w:val="nil"/>
+              <w:bottom w:color="bfbfbf" w:space="0" w:sz="4" w:val="single"/>
+              <w:right w:color="bfbfbf" w:space="0" w:sz="4" w:val="single"/>
+            </w:tcBorders>
+            <w:tcMar>
+              <w:top w:w="80.0" w:type="dxa"/>
+              <w:left w:w="140.0" w:type="dxa"/>
+              <w:bottom w:w="80.0" w:type="dxa"/>
+              <w:right w:w="140.0" w:type="dxa"/>
+            </w:tcMar>
+            <w:vAlign w:val="top"/>
+          </w:tcPr>
+          <w:p>
+            <w:pPr>
+              <w:rPr/>
+            </w:pPr>
+            <w:r>
+              <w:rPr>
+                <w:rtl w:val="0"/>
+              </w:rPr>
+              <w:t xml:space="preserve">Organizar los listados de usuarios, registros de catálogos y cursos mediante encabezados y filas de datos.</w:t>
+            </w:r>
+          </w:p>
+        </w:tc>
+      </w:tr>
+    </w:tbl>
+    <w:p>
+      <w:pPr>
+        <w:rPr/>
+      </w:pPr>
+      <w:r>
+        <w:rPr>
+          <w:rtl w:val="0"/>
+        </w:rPr>
+      </w:r>
+    </w:p>
+    <w:p>
+      <w:pPr>
+        <w:pStyle w:val="Heading2"/>
+        <w:keepNext w:val="0"/>
+        <w:keepLines w:val="0"/>
+        <w:spacing w:before="220" w:line="240" w:lineRule="auto"/>
+        <w:rPr>
+          <w:b w:val="1"/>
+          <w:bCs w:val="1"/>
+          <w:color w:val="2e75b6"/>
+          <w:sz w:val="25"/>
+          <w:szCs w:val="25"/>
+        </w:rPr>
+      </w:pPr>
+      <w:bookmarkStart w:colFirst="0" w:colLast="0" w:name="_nx594hr1r0p6" w:id="21"/>
+      <w:bookmarkEnd w:id="21"/>
+      <w:r>
+        <w:rPr>
+          <w:b w:val="1"/>
+          <w:bCs w:val="1"/>
+          <w:color w:val="2e75b6"/>
+          <w:sz w:val="25"/>
+          <w:szCs w:val="25"/>
+          <w:rtl w:val="0"/>
+        </w:rPr>
+        <w:t xml:space="preserve">5.2 Estructura de los formularios</w:t>
+      </w:r>
+    </w:p>
+    <w:p>
+      <w:pPr>
+        <w:spacing w:after="240" w:before="240" w:lineRule="auto"/>
+        <w:rPr/>
+      </w:pPr>
+      <w:r>
+        <w:rPr>
+          <w:rtl w:val="0"/>
+        </w:rPr>
+        <w:t xml:space="preserve">Cada formulario se delimitará con la etiqueta “form”. Los controles tendrán un identificador id único dentro de la página y un atributo “name” que permita reconocer el dato. Cada campo editable tendrá una etiqueta visible “label”, cuyo atributo “for” coincidirá con el id del control, para facilitar su identificación y uso.</w:t>
+      </w:r>
+    </w:p>
+    <w:p>
+      <w:pPr>
+        <w:spacing w:after="240" w:before="240" w:lineRule="auto"/>
+        <w:rPr/>
+      </w:pPr>
+      <w:r>
+        <w:rPr>
+          <w:rtl w:val="0"/>
+        </w:rPr>
+      </w:r>
+    </w:p>
+    <w:p>
+      <w:pPr>
+        <w:pStyle w:val="Heading3"/>
+        <w:keepNext w:val="0"/>
+        <w:keepLines w:val="0"/>
+        <w:spacing w:before="220" w:line="240" w:lineRule="auto"/>
+        <w:rPr/>
+      </w:pPr>
+      <w:bookmarkStart w:colFirst="0" w:colLast="0" w:name="_28bq6yyhjrwf" w:id="22"/>
+      <w:bookmarkEnd w:id="22"/>
+      <w:r>
+        <w:rPr>
+          <w:rtl w:val="0"/>
+        </w:rPr>
+        <w:t xml:space="preserve">5.2.1 Formularios de acceso y gestión de contraseñas</w:t>
+      </w:r>
+    </w:p>
+    <w:p>
+      <w:pPr>
+        <w:rPr/>
+      </w:pPr>
+      <w:r>
+        <w:rPr>
+          <w:rtl w:val="0"/>
+        </w:rPr>
+      </w:r>
+    </w:p>
+    <w:tbl>
+      <w:tblPr>
+        <w:tblStyle w:val="Table5"/>
+        <w:tblW w:w="9025.511811023625" w:type="dxa"/>
+        <w:jc w:val="left"/>
+        <w:tblBorders>
+          <w:top w:color="000000" w:space="0" w:sz="0" w:val="nil"/>
+          <w:left w:color="000000" w:space="0" w:sz="0" w:val="nil"/>
+          <w:bottom w:color="000000" w:space="0" w:sz="0" w:val="nil"/>
+          <w:right w:color="000000" w:space="0" w:sz="0" w:val="nil"/>
+          <w:insideH w:color="000000" w:space="0" w:sz="0" w:val="nil"/>
+          <w:insideV w:color="000000" w:space="0" w:sz="0" w:val="nil"/>
+        </w:tblBorders>
+        <w:tblLayout w:type="fixed"/>
+        <w:tblLook w:val="0600"/>
+      </w:tblPr>
+      <w:tblGrid>
+        <w:gridCol w:w="2069.385304737461"/>
+        <w:gridCol w:w="3478.063253143082"/>
+        <w:gridCol w:w="3478.063253143082"/>
+        <w:tblGridChange w:id="0">
+          <w:tblGrid>
+            <w:gridCol w:w="2069.385304737461"/>
+            <w:gridCol w:w="3478.063253143082"/>
+            <w:gridCol w:w="3478.063253143082"/>
+          </w:tblGrid>
+        </w:tblGridChange>
+      </w:tblGrid>
+      <w:tr>
+        <w:trPr>
+          <w:cantSplit w:val="0"/>
+          <w:trHeight w:val="420" w:hRule="atLeast"/>
+          <w:tblHeader w:val="0"/>
+        </w:trPr>
+        <w:tc>
+          <w:tcPr>
+            <w:tcBorders>
+              <w:top w:color="bfbfbf" w:space="0" w:sz="4" w:val="single"/>
+              <w:left w:color="bfbfbf" w:space="0" w:sz="4" w:val="single"/>
+              <w:bottom w:color="bfbfbf" w:space="0" w:sz="4" w:val="single"/>
+              <w:right w:color="bfbfbf" w:space="0" w:sz="4" w:val="single"/>
+            </w:tcBorders>
+            <w:shd w:fill="1f4e79" w:val="clear"/>
+            <w:tcMar>
+              <w:top w:w="80.0" w:type="dxa"/>
+              <w:left w:w="140.0" w:type="dxa"/>
+              <w:bottom w:w="80.0" w:type="dxa"/>
+              <w:right w:w="140.0" w:type="dxa"/>
+            </w:tcMar>
+            <w:vAlign w:val="top"/>
+          </w:tcPr>
+          <w:p>
+            <w:pPr>
+              <w:rPr>
+                <w:b w:val="1"/>
+                <w:bCs w:val="1"/>
+                <w:color w:val="ffffff"/>
+              </w:rPr>
+            </w:pPr>
+            <w:r>
+              <w:rPr>
+                <w:b w:val="1"/>
+                <w:bCs w:val="1"/>
+                <w:color w:val="ffffff"/>
+                <w:rtl w:val="0"/>
+              </w:rPr>
+              <w:t xml:space="preserve">Página</w:t>
+            </w:r>
+          </w:p>
+        </w:tc>
+        <w:tc>
+          <w:tcPr>
+            <w:tcBorders>
+              <w:top w:color="bfbfbf" w:space="0" w:sz="4" w:val="single"/>
+              <w:left w:color="000000" w:space="0" w:sz="0" w:val="nil"/>
+              <w:bottom w:color="bfbfbf" w:space="0" w:sz="4" w:val="single"/>
+              <w:right w:color="bfbfbf" w:space="0" w:sz="4" w:val="single"/>
+            </w:tcBorders>
+            <w:shd w:fill="1f4e79" w:val="clear"/>
+            <w:tcMar>
+              <w:top w:w="80.0" w:type="dxa"/>
+              <w:left w:w="140.0" w:type="dxa"/>
+              <w:bottom w:w="80.0" w:type="dxa"/>
+              <w:right w:w="140.0" w:type="dxa"/>
+            </w:tcMar>
+            <w:vAlign w:val="top"/>
+          </w:tcPr>
+          <w:p>
+            <w:pPr>
+              <w:rPr>
+                <w:b w:val="1"/>
+                <w:bCs w:val="1"/>
+                <w:color w:val="ffffff"/>
+              </w:rPr>
+            </w:pPr>
+            <w:r>
+              <w:rPr>
+                <w:b w:val="1"/>
+                <w:bCs w:val="1"/>
+                <w:color w:val="ffffff"/>
+                <w:rtl w:val="0"/>
+              </w:rPr>
+              <w:t xml:space="preserve">Campos previstos</w:t>
+            </w:r>
+          </w:p>
+        </w:tc>
+        <w:tc>
+          <w:tcPr>
+            <w:tcBorders>
+              <w:top w:color="bfbfbf" w:space="0" w:sz="4" w:val="single"/>
+              <w:left w:color="000000" w:space="0" w:sz="0" w:val="nil"/>
+              <w:bottom w:color="bfbfbf" w:space="0" w:sz="4" w:val="single"/>
+              <w:right w:color="bfbfbf" w:space="0" w:sz="4" w:val="single"/>
+            </w:tcBorders>
+            <w:shd w:fill="1f4e79" w:val="clear"/>
+            <w:tcMar>
+              <w:top w:w="80.0" w:type="dxa"/>
+              <w:left w:w="140.0" w:type="dxa"/>
+              <w:bottom w:w="80.0" w:type="dxa"/>
+              <w:right w:w="140.0" w:type="dxa"/>
+            </w:tcMar>
+            <w:vAlign w:val="top"/>
+          </w:tcPr>
+          <w:p>
+            <w:pPr>
+              <w:rPr>
+                <w:b w:val="1"/>
+                <w:bCs w:val="1"/>
+                <w:color w:val="ffffff"/>
+              </w:rPr>
+            </w:pPr>
+            <w:r>
+              <w:rPr>
+                <w:b w:val="1"/>
+                <w:bCs w:val="1"/>
+                <w:color w:val="ffffff"/>
+                <w:rtl w:val="0"/>
+              </w:rPr>
+              <w:t xml:space="preserve">Controles HTML</w:t>
+            </w:r>
+          </w:p>
+        </w:tc>
+      </w:tr>
+      <w:tr>
+        <w:trPr>
+          <w:cantSplit w:val="0"/>
+          <w:trHeight w:val="420" w:hRule="atLeast"/>
+          <w:tblHeader w:val="0"/>
+        </w:trPr>
+        <w:tc>
+          <w:tcPr>
+            <w:tcBorders>
+              <w:top w:color="000000" w:space="0" w:sz="0" w:val="nil"/>
+              <w:left w:color="bfbfbf" w:space="0" w:sz="4" w:val="single"/>
+              <w:bottom w:color="bfbfbf" w:space="0" w:sz="4" w:val="single"/>
+              <w:right w:color="bfbfbf" w:space="0" w:sz="4" w:val="single"/>
+            </w:tcBorders>
+            <w:tcMar>
+              <w:top w:w="80.0" w:type="dxa"/>
+              <w:left w:w="140.0" w:type="dxa"/>
+              <w:bottom w:w="80.0" w:type="dxa"/>
+              <w:right w:w="140.0" w:type="dxa"/>
+            </w:tcMar>
+            <w:vAlign w:val="top"/>
+          </w:tcPr>
+          <w:p>
+            <w:pPr>
+              <w:rPr>
+                <w:b w:val="1"/>
+                <w:bCs w:val="1"/>
+              </w:rPr>
+            </w:pPr>
+            <w:r>
+              <w:rPr>
+                <w:b w:val="1"/>
+                <w:bCs w:val="1"/>
+                <w:rtl w:val="0"/>
+              </w:rPr>
+              <w:t xml:space="preserve">login.html</w:t>
+            </w:r>
+          </w:p>
+        </w:tc>
+        <w:tc>
+          <w:tcPr>
+            <w:tcBorders>
+              <w:top w:color="000000" w:space="0" w:sz="0" w:val="nil"/>
+              <w:left w:color="000000" w:space="0" w:sz="0" w:val="nil"/>
+              <w:bottom w:color="bfbfbf" w:space="0" w:sz="4" w:val="single"/>
+              <w:right w:color="bfbfbf" w:space="0" w:sz="4" w:val="single"/>
+            </w:tcBorders>
+            <w:tcMar>
+              <w:top w:w="80.0" w:type="dxa"/>
+              <w:left w:w="140.0" w:type="dxa"/>
+              <w:bottom w:w="80.0" w:type="dxa"/>
+              <w:right w:w="140.0" w:type="dxa"/>
+            </w:tcMar>
+            <w:vAlign w:val="top"/>
+          </w:tcPr>
+          <w:p>
+            <w:pPr>
+              <w:rPr/>
+            </w:pPr>
+            <w:r>
+              <w:rPr>
+                <w:rtl w:val="0"/>
+              </w:rPr>
+              <w:t xml:space="preserve">Correo institucional y contraseña.</w:t>
+            </w:r>
+          </w:p>
+        </w:tc>
+        <w:tc>
+          <w:tcPr>
+            <w:tcBorders>
+              <w:top w:color="000000" w:space="0" w:sz="0" w:val="nil"/>
+              <w:left w:color="000000" w:space="0" w:sz="0" w:val="nil"/>
+              <w:bottom w:color="bfbfbf" w:space="0" w:sz="4" w:val="single"/>
+              <w:right w:color="bfbfbf" w:space="0" w:sz="4" w:val="single"/>
+            </w:tcBorders>
+            <w:tcMar>
+              <w:top w:w="80.0" w:type="dxa"/>
+              <w:left w:w="140.0" w:type="dxa"/>
+              <w:bottom w:w="80.0" w:type="dxa"/>
+              <w:right w:w="140.0" w:type="dxa"/>
+            </w:tcMar>
+            <w:vAlign w:val="top"/>
+          </w:tcPr>
+          <w:p>
+            <w:pPr>
+              <w:rPr/>
+            </w:pPr>
+            <w:r>
+              <w:rPr>
+                <w:rtl w:val="0"/>
+              </w:rPr>
+              <w:t xml:space="preserve">input type="email" y input type="password".</w:t>
+            </w:r>
+          </w:p>
+        </w:tc>
+      </w:tr>
+      <w:tr>
+        <w:trPr>
+          <w:cantSplit w:val="0"/>
+          <w:trHeight w:val="420" w:hRule="atLeast"/>
+          <w:tblHeader w:val="0"/>
+        </w:trPr>
+        <w:tc>
+          <w:tcPr>
+            <w:tcBorders>
+              <w:top w:color="000000" w:space="0" w:sz="0" w:val="nil"/>
+              <w:left w:color="bfbfbf" w:space="0" w:sz="4" w:val="single"/>
+              <w:bottom w:color="bfbfbf" w:space="0" w:sz="4" w:val="single"/>
+              <w:right w:color="bfbfbf" w:space="0" w:sz="4" w:val="single"/>
+            </w:tcBorders>
+            <w:tcMar>
+              <w:top w:w="80.0" w:type="dxa"/>
+              <w:left w:w="140.0" w:type="dxa"/>
+              <w:bottom w:w="80.0" w:type="dxa"/>
+              <w:right w:w="140.0" w:type="dxa"/>
+            </w:tcMar>
+            <w:vAlign w:val="top"/>
+          </w:tcPr>
+          <w:p>
+            <w:pPr>
+              <w:rPr>
+                <w:b w:val="1"/>
+                <w:bCs w:val="1"/>
+              </w:rPr>
+            </w:pPr>
+            <w:r>
+              <w:rPr>
+                <w:b w:val="1"/>
+                <w:bCs w:val="1"/>
+                <w:rtl w:val="0"/>
+              </w:rPr>
+              <w:t xml:space="preserve">cambiar-contrasena.html</w:t>
+            </w:r>
+          </w:p>
+        </w:tc>
+        <w:tc>
+          <w:tcPr>
+            <w:tcBorders>
+              <w:top w:color="000000" w:space="0" w:sz="0" w:val="nil"/>
+              <w:left w:color="000000" w:space="0" w:sz="0" w:val="nil"/>
+              <w:bottom w:color="bfbfbf" w:space="0" w:sz="4" w:val="single"/>
+              <w:right w:color="bfbfbf" w:space="0" w:sz="4" w:val="single"/>
+            </w:tcBorders>
+            <w:tcMar>
+              <w:top w:w="80.0" w:type="dxa"/>
+              <w:left w:w="140.0" w:type="dxa"/>
+              <w:bottom w:w="80.0" w:type="dxa"/>
+              <w:right w:w="140.0" w:type="dxa"/>
+            </w:tcMar>
+            <w:vAlign w:val="top"/>
+          </w:tcPr>
+          <w:p>
+            <w:pPr>
+              <w:rPr/>
+            </w:pPr>
+            <w:r>
+              <w:rPr>
+                <w:rtl w:val="0"/>
+              </w:rPr>
+              <w:t xml:space="preserve">Contraseña actual, nueva contraseña y confirmación.</w:t>
+            </w:r>
+          </w:p>
+        </w:tc>
+        <w:tc>
+          <w:tcPr>
+            <w:tcBorders>
+              <w:top w:color="000000" w:space="0" w:sz="0" w:val="nil"/>
+              <w:left w:color="000000" w:space="0" w:sz="0" w:val="nil"/>
+              <w:bottom w:color="bfbfbf" w:space="0" w:sz="4" w:val="single"/>
+              <w:right w:color="bfbfbf" w:space="0" w:sz="4" w:val="single"/>
+            </w:tcBorders>
+            <w:tcMar>
+              <w:top w:w="80.0" w:type="dxa"/>
+              <w:left w:w="140.0" w:type="dxa"/>
+              <w:bottom w:w="80.0" w:type="dxa"/>
+              <w:right w:w="140.0" w:type="dxa"/>
+            </w:tcMar>
+            <w:vAlign w:val="top"/>
+          </w:tcPr>
+          <w:p>
+            <w:pPr>
+              <w:rPr/>
+            </w:pPr>
+            <w:r>
+              <w:rPr>
+                <w:rtl w:val="0"/>
+              </w:rPr>
+              <w:t xml:space="preserve">Tres controles input type="password".</w:t>
+            </w:r>
+          </w:p>
+        </w:tc>
+      </w:tr>
+      <w:tr>
+        <w:trPr>
+          <w:cantSplit w:val="0"/>
+          <w:trHeight w:val="420" w:hRule="atLeast"/>
+          <w:tblHeader w:val="0"/>
+        </w:trPr>
+        <w:tc>
+          <w:tcPr>
+            <w:tcBorders>
+              <w:top w:color="000000" w:space="0" w:sz="0" w:val="nil"/>
+              <w:left w:color="bfbfbf" w:space="0" w:sz="4" w:val="single"/>
+              <w:bottom w:color="bfbfbf" w:space="0" w:sz="4" w:val="single"/>
+              <w:right w:color="bfbfbf" w:space="0" w:sz="4" w:val="single"/>
+            </w:tcBorders>
+            <w:tcMar>
+              <w:top w:w="80.0" w:type="dxa"/>
+              <w:left w:w="140.0" w:type="dxa"/>
+              <w:bottom w:w="80.0" w:type="dxa"/>
+              <w:right w:w="140.0" w:type="dxa"/>
+            </w:tcMar>
+            <w:vAlign w:val="top"/>
+          </w:tcPr>
+          <w:p>
+            <w:pPr>
+              <w:rPr>
+                <w:b w:val="1"/>
+                <w:bCs w:val="1"/>
+              </w:rPr>
+            </w:pPr>
+            <w:r>
+              <w:rPr>
+                <w:b w:val="1"/>
+                <w:bCs w:val="1"/>
+                <w:rtl w:val="0"/>
+              </w:rPr>
+              <w:t xml:space="preserve">recuperar-contrasena.html</w:t>
+            </w:r>
+          </w:p>
+        </w:tc>
+        <w:tc>
+          <w:tcPr>
+            <w:tcBorders>
+              <w:top w:color="000000" w:space="0" w:sz="0" w:val="nil"/>
+              <w:left w:color="000000" w:space="0" w:sz="0" w:val="nil"/>
+              <w:bottom w:color="bfbfbf" w:space="0" w:sz="4" w:val="single"/>
+              <w:right w:color="bfbfbf" w:space="0" w:sz="4" w:val="single"/>
+            </w:tcBorders>
+            <w:tcMar>
+              <w:top w:w="80.0" w:type="dxa"/>
+              <w:left w:w="140.0" w:type="dxa"/>
+              <w:bottom w:w="80.0" w:type="dxa"/>
+              <w:right w:w="140.0" w:type="dxa"/>
+            </w:tcMar>
+            <w:vAlign w:val="top"/>
+          </w:tcPr>
+          <w:p>
+            <w:pPr>
+              <w:rPr/>
+            </w:pPr>
+            <w:r>
+              <w:rPr>
+                <w:rtl w:val="0"/>
+              </w:rPr>
+              <w:t xml:space="preserve">Correo electrónico para representar la solicitud de recuperación.</w:t>
+            </w:r>
+          </w:p>
+        </w:tc>
+        <w:tc>
+          <w:tcPr>
+            <w:tcBorders>
+              <w:top w:color="000000" w:space="0" w:sz="0" w:val="nil"/>
+              <w:left w:color="000000" w:space="0" w:sz="0" w:val="nil"/>
+              <w:bottom w:color="bfbfbf" w:space="0" w:sz="4" w:val="single"/>
+              <w:right w:color="bfbfbf" w:space="0" w:sz="4" w:val="single"/>
+            </w:tcBorders>
+            <w:tcMar>
+              <w:top w:w="80.0" w:type="dxa"/>
+              <w:left w:w="140.0" w:type="dxa"/>
+              <w:bottom w:w="80.0" w:type="dxa"/>
+              <w:right w:w="140.0" w:type="dxa"/>
+            </w:tcMar>
+            <w:vAlign w:val="top"/>
+          </w:tcPr>
+          <w:p>
+            <w:pPr>
+              <w:rPr/>
+            </w:pPr>
+            <w:r>
+              <w:rPr>
+                <w:rtl w:val="0"/>
+              </w:rPr>
+              <w:t xml:space="preserve">input type="email".</w:t>
+            </w:r>
+          </w:p>
+        </w:tc>
+      </w:tr>
+    </w:tbl>
+    <w:p>
+      <w:pPr>
+        <w:rPr/>
+      </w:pPr>
+      <w:r>
+        <w:rPr>
+          <w:rtl w:val="0"/>
+        </w:rPr>
+      </w:r>
+    </w:p>
+    <w:p>
+      <w:pPr>
+        <w:rPr/>
+      </w:pPr>
+      <w:r>
+        <w:rPr>
+          <w:rtl w:val="0"/>
+        </w:rPr>
+      </w:r>
+    </w:p>
+    <w:p>
+      <w:pPr>
+        <w:pStyle w:val="Heading3"/>
+        <w:keepNext w:val="0"/>
+        <w:keepLines w:val="0"/>
+        <w:spacing w:before="220" w:line="240" w:lineRule="auto"/>
+        <w:rPr/>
+      </w:pPr>
+      <w:bookmarkStart w:colFirst="0" w:colLast="0" w:name="_eprxzlmoo47k" w:id="23"/>
+      <w:bookmarkEnd w:id="23"/>
+      <w:r>
+        <w:rPr>
+          <w:rtl w:val="0"/>
+        </w:rPr>
+        <w:t xml:space="preserve">5.2.2 Formulario de usuarios</w:t>
+      </w:r>
+    </w:p>
+    <w:p>
+      <w:pPr>
+        <w:rPr/>
+      </w:pPr>
+      <w:r>
+        <w:rPr>
+          <w:rtl w:val="0"/>
+        </w:rPr>
+      </w:r>
+    </w:p>
+    <w:tbl>
+      <w:tblPr>
+        <w:tblStyle w:val="Table6"/>
+        <w:tblW w:w="6956.126506286164" w:type="dxa"/>
+        <w:jc w:val="left"/>
+        <w:tblBorders>
+          <w:top w:color="000000" w:space="0" w:sz="0" w:val="nil"/>
+          <w:left w:color="000000" w:space="0" w:sz="0" w:val="nil"/>
+          <w:bottom w:color="000000" w:space="0" w:sz="0" w:val="nil"/>
+          <w:right w:color="000000" w:space="0" w:sz="0" w:val="nil"/>
+          <w:insideH w:color="000000" w:space="0" w:sz="0" w:val="nil"/>
+          <w:insideV w:color="000000" w:space="0" w:sz="0" w:val="nil"/>
+        </w:tblBorders>
+        <w:tblLayout w:type="fixed"/>
+        <w:tblLook w:val="0600"/>
+      </w:tblPr>
+      <w:tblGrid>
+        <w:gridCol w:w="3478.063253143082"/>
+        <w:gridCol w:w="3478.063253143082"/>
+        <w:tblGridChange w:id="0">
+          <w:tblGrid>
+            <w:gridCol w:w="3478.063253143082"/>
+            <w:gridCol w:w="3478.063253143082"/>
+          </w:tblGrid>
+        </w:tblGridChange>
+      </w:tblGrid>
+      <w:tr>
+        <w:trPr>
+          <w:cantSplit w:val="0"/>
+          <w:trHeight w:val="420" w:hRule="atLeast"/>
+          <w:tblHeader w:val="0"/>
+        </w:trPr>
+        <w:tc>
+          <w:tcPr>
+            <w:tcBorders>
+              <w:top w:color="bfbfbf" w:space="0" w:sz="4" w:val="single"/>
+              <w:left w:color="000000" w:space="0" w:sz="0" w:val="nil"/>
+              <w:bottom w:color="bfbfbf" w:space="0" w:sz="4" w:val="single"/>
+              <w:right w:color="bfbfbf" w:space="0" w:sz="4" w:val="single"/>
+            </w:tcBorders>
+            <w:shd w:fill="1f4e79" w:val="clear"/>
+            <w:tcMar>
+              <w:top w:w="80.0" w:type="dxa"/>
+              <w:left w:w="140.0" w:type="dxa"/>
+              <w:bottom w:w="80.0" w:type="dxa"/>
+              <w:right w:w="140.0" w:type="dxa"/>
+            </w:tcMar>
+            <w:vAlign w:val="top"/>
+          </w:tcPr>
+          <w:p>
+            <w:pPr>
+              <w:rPr>
+                <w:b w:val="1"/>
+                <w:bCs w:val="1"/>
+                <w:color w:val="ffffff"/>
+              </w:rPr>
+            </w:pPr>
+            <w:r>
+              <w:rPr>
+                <w:b w:val="1"/>
+                <w:bCs w:val="1"/>
+                <w:color w:val="ffffff"/>
+                <w:rtl w:val="0"/>
+              </w:rPr>
+              <w:t xml:space="preserve">Campos previstos</w:t>
+            </w:r>
+          </w:p>
+        </w:tc>
+        <w:tc>
+          <w:tcPr>
+            <w:tcBorders>
+              <w:top w:color="bfbfbf" w:space="0" w:sz="4" w:val="single"/>
+              <w:left w:color="000000" w:space="0" w:sz="0" w:val="nil"/>
+              <w:bottom w:color="bfbfbf" w:space="0" w:sz="4" w:val="single"/>
+              <w:right w:color="bfbfbf" w:space="0" w:sz="4" w:val="single"/>
+            </w:tcBorders>
+            <w:shd w:fill="1f4e79" w:val="clear"/>
+            <w:tcMar>
+              <w:top w:w="80.0" w:type="dxa"/>
+              <w:left w:w="140.0" w:type="dxa"/>
+              <w:bottom w:w="80.0" w:type="dxa"/>
+              <w:right w:w="140.0" w:type="dxa"/>
+            </w:tcMar>
+            <w:vAlign w:val="top"/>
+          </w:tcPr>
+          <w:p>
+            <w:pPr>
+              <w:rPr>
+                <w:b w:val="1"/>
+                <w:bCs w:val="1"/>
+                <w:color w:val="ffffff"/>
+              </w:rPr>
+            </w:pPr>
+            <w:r>
+              <w:rPr>
+                <w:b w:val="1"/>
+                <w:bCs w:val="1"/>
+                <w:color w:val="ffffff"/>
+                <w:rtl w:val="0"/>
+              </w:rPr>
+              <w:t xml:space="preserve">Controles HTML</w:t>
+            </w:r>
+          </w:p>
+        </w:tc>
+      </w:tr>
+      <w:tr>
+        <w:trPr>
+          <w:cantSplit w:val="0"/>
+          <w:trHeight w:val="420" w:hRule="atLeast"/>
+          <w:tblHeader w:val="0"/>
+        </w:trPr>
+        <w:tc>
+          <w:tcPr>
+            <w:tcBorders>
+              <w:top w:color="000000" w:space="0" w:sz="0" w:val="nil"/>
+              <w:left w:color="000000" w:space="0" w:sz="0" w:val="nil"/>
+              <w:bottom w:color="bfbfbf" w:space="0" w:sz="4" w:val="single"/>
+              <w:right w:color="bfbfbf" w:space="0" w:sz="4" w:val="single"/>
+            </w:tcBorders>
+            <w:tcMar>
+              <w:top w:w="80.0" w:type="dxa"/>
+              <w:left w:w="140.0" w:type="dxa"/>
+              <w:bottom w:w="80.0" w:type="dxa"/>
+              <w:right w:w="140.0" w:type="dxa"/>
+            </w:tcMar>
+            <w:vAlign w:val="top"/>
+          </w:tcPr>
+          <w:p>
+            <w:pPr>
+              <w:rPr/>
+            </w:pPr>
+            <w:r>
+              <w:rPr>
+                <w:rtl w:val="0"/>
+              </w:rPr>
+              <w:t xml:space="preserve">Nombre, primer apellido, segundo apellido e identificación.</w:t>
+            </w:r>
+          </w:p>
+        </w:tc>
+        <w:tc>
+          <w:tcPr>
+            <w:tcBorders>
+              <w:top w:color="000000" w:space="0" w:sz="0" w:val="nil"/>
+              <w:left w:color="000000" w:space="0" w:sz="0" w:val="nil"/>
+              <w:bottom w:color="bfbfbf" w:space="0" w:sz="4" w:val="single"/>
+              <w:right w:color="bfbfbf" w:space="0" w:sz="4" w:val="single"/>
+            </w:tcBorders>
+            <w:tcMar>
+              <w:top w:w="80.0" w:type="dxa"/>
+              <w:left w:w="140.0" w:type="dxa"/>
+              <w:bottom w:w="80.0" w:type="dxa"/>
+              <w:right w:w="140.0" w:type="dxa"/>
+            </w:tcMar>
+            <w:vAlign w:val="top"/>
+          </w:tcPr>
+          <w:p>
+            <w:pPr>
+              <w:rPr/>
+            </w:pPr>
+            <w:r>
+              <w:rPr>
+                <w:rtl w:val="0"/>
+              </w:rPr>
+              <w:t xml:space="preserve">input type="text".</w:t>
+            </w:r>
+          </w:p>
+        </w:tc>
+      </w:tr>
+      <w:tr>
+        <w:trPr>
+          <w:cantSplit w:val="0"/>
+          <w:trHeight w:val="420" w:hRule="atLeast"/>
+          <w:tblHeader w:val="0"/>
+        </w:trPr>
+        <w:tc>
+          <w:tcPr>
+            <w:tcBorders>
+              <w:top w:color="000000" w:space="0" w:sz="0" w:val="nil"/>
+              <w:left w:color="000000" w:space="0" w:sz="0" w:val="nil"/>
+              <w:bottom w:color="bfbfbf" w:space="0" w:sz="4" w:val="single"/>
+              <w:right w:color="bfbfbf" w:space="0" w:sz="4" w:val="single"/>
+            </w:tcBorders>
+            <w:tcMar>
+              <w:top w:w="80.0" w:type="dxa"/>
+              <w:left w:w="140.0" w:type="dxa"/>
+              <w:bottom w:w="80.0" w:type="dxa"/>
+              <w:right w:w="140.0" w:type="dxa"/>
+            </w:tcMar>
+            <w:vAlign w:val="top"/>
+          </w:tcPr>
+          <w:p>
+            <w:pPr>
+              <w:rPr/>
+            </w:pPr>
+            <w:r>
+              <w:rPr>
+                <w:rtl w:val="0"/>
+              </w:rPr>
+              <w:t xml:space="preserve">Correo institucional y correo personal.</w:t>
+            </w:r>
+          </w:p>
+        </w:tc>
+        <w:tc>
+          <w:tcPr>
+            <w:tcBorders>
+              <w:top w:color="000000" w:space="0" w:sz="0" w:val="nil"/>
+              <w:left w:color="000000" w:space="0" w:sz="0" w:val="nil"/>
+              <w:bottom w:color="bfbfbf" w:space="0" w:sz="4" w:val="single"/>
+              <w:right w:color="bfbfbf" w:space="0" w:sz="4" w:val="single"/>
+            </w:tcBorders>
+            <w:tcMar>
+              <w:top w:w="80.0" w:type="dxa"/>
+              <w:left w:w="140.0" w:type="dxa"/>
+              <w:bottom w:w="80.0" w:type="dxa"/>
+              <w:right w:w="140.0" w:type="dxa"/>
+            </w:tcMar>
+            <w:vAlign w:val="top"/>
+          </w:tcPr>
+          <w:p>
+            <w:pPr>
+              <w:rPr/>
+            </w:pPr>
+            <w:r>
+              <w:rPr>
+                <w:rtl w:val="0"/>
+              </w:rPr>
+              <w:t xml:space="preserve">input type="email".</w:t>
+            </w:r>
+          </w:p>
+        </w:tc>
+      </w:tr>
+      <w:tr>
+        <w:trPr>
+          <w:cantSplit w:val="0"/>
+          <w:trHeight w:val="420" w:hRule="atLeast"/>
+          <w:tblHeader w:val="0"/>
+        </w:trPr>
+        <w:tc>
+          <w:tcPr>
+            <w:tcBorders>
+              <w:top w:color="000000" w:space="0" w:sz="0" w:val="nil"/>
+              <w:left w:color="000000" w:space="0" w:sz="0" w:val="nil"/>
+              <w:bottom w:color="bfbfbf" w:space="0" w:sz="4" w:val="single"/>
+              <w:right w:color="bfbfbf" w:space="0" w:sz="4" w:val="single"/>
+            </w:tcBorders>
+            <w:tcMar>
+              <w:top w:w="80.0" w:type="dxa"/>
+              <w:left w:w="140.0" w:type="dxa"/>
+              <w:bottom w:w="80.0" w:type="dxa"/>
+              <w:right w:w="140.0" w:type="dxa"/>
+            </w:tcMar>
+            <w:vAlign w:val="top"/>
+          </w:tcPr>
+          <w:p>
+            <w:pPr>
+              <w:rPr/>
+            </w:pPr>
+            <w:r>
+              <w:rPr>
+                <w:rtl w:val="0"/>
+              </w:rPr>
+              <w:t xml:space="preserve">Teléfono celular.</w:t>
+            </w:r>
+          </w:p>
+        </w:tc>
+        <w:tc>
+          <w:tcPr>
+            <w:tcBorders>
+              <w:top w:color="000000" w:space="0" w:sz="0" w:val="nil"/>
+              <w:left w:color="000000" w:space="0" w:sz="0" w:val="nil"/>
+              <w:bottom w:color="bfbfbf" w:space="0" w:sz="4" w:val="single"/>
+              <w:right w:color="bfbfbf" w:space="0" w:sz="4" w:val="single"/>
+            </w:tcBorders>
+            <w:tcMar>
+              <w:top w:w="80.0" w:type="dxa"/>
+              <w:left w:w="140.0" w:type="dxa"/>
+              <w:bottom w:w="80.0" w:type="dxa"/>
+              <w:right w:w="140.0" w:type="dxa"/>
+            </w:tcMar>
+            <w:vAlign w:val="top"/>
+          </w:tcPr>
+          <w:p>
+            <w:pPr>
+              <w:rPr/>
+            </w:pPr>
+            <w:r>
+              <w:rPr>
+                <w:rtl w:val="0"/>
+              </w:rPr>
+              <w:t xml:space="preserve">input type="tel".</w:t>
+            </w:r>
+          </w:p>
+        </w:tc>
+      </w:tr>
+      <w:tr>
+        <w:trPr>
+          <w:cantSplit w:val="0"/>
+          <w:trHeight w:val="420" w:hRule="atLeast"/>
+          <w:tblHeader w:val="0"/>
+        </w:trPr>
+        <w:tc>
+          <w:tcPr>
+            <w:tcBorders>
+              <w:top w:color="000000" w:space="0" w:sz="0" w:val="nil"/>
+              <w:left w:color="000000" w:space="0" w:sz="0" w:val="nil"/>
+              <w:bottom w:color="bfbfbf" w:space="0" w:sz="4" w:val="single"/>
+              <w:right w:color="bfbfbf" w:space="0" w:sz="4" w:val="single"/>
+            </w:tcBorders>
+            <w:tcMar>
+              <w:top w:w="80.0" w:type="dxa"/>
+              <w:left w:w="140.0" w:type="dxa"/>
+              <w:bottom w:w="80.0" w:type="dxa"/>
+              <w:right w:w="140.0" w:type="dxa"/>
+            </w:tcMar>
+            <w:vAlign w:val="top"/>
+          </w:tcPr>
+          <w:p>
+            <w:pPr>
+              <w:rPr/>
+            </w:pPr>
+            <w:r>
+              <w:rPr>
+                <w:rtl w:val="0"/>
+              </w:rPr>
+              <w:t xml:space="preserve">Fecha de nacimiento.</w:t>
+            </w:r>
+          </w:p>
+        </w:tc>
+        <w:tc>
+          <w:tcPr>
+            <w:tcBorders>
+              <w:top w:color="000000" w:space="0" w:sz="0" w:val="nil"/>
+              <w:left w:color="000000" w:space="0" w:sz="0" w:val="nil"/>
+              <w:bottom w:color="bfbfbf" w:space="0" w:sz="4" w:val="single"/>
+              <w:right w:color="bfbfbf" w:space="0" w:sz="4" w:val="single"/>
+            </w:tcBorders>
+            <w:tcMar>
+              <w:top w:w="80.0" w:type="dxa"/>
+              <w:left w:w="140.0" w:type="dxa"/>
+              <w:bottom w:w="80.0" w:type="dxa"/>
+              <w:right w:w="140.0" w:type="dxa"/>
+            </w:tcMar>
+            <w:vAlign w:val="top"/>
+          </w:tcPr>
+          <w:p>
+            <w:pPr>
+              <w:rPr/>
+            </w:pPr>
+            <w:r>
+              <w:rPr>
+                <w:rtl w:val="0"/>
+              </w:rPr>
+              <w:t xml:space="preserve">input type="date".</w:t>
+            </w:r>
+          </w:p>
+        </w:tc>
+      </w:tr>
+      <w:tr>
+        <w:trPr>
+          <w:cantSplit w:val="0"/>
+          <w:trHeight w:val="420" w:hRule="atLeast"/>
+          <w:tblHeader w:val="0"/>
+        </w:trPr>
+        <w:tc>
+          <w:tcPr>
+            <w:tcBorders>
+              <w:top w:color="000000" w:space="0" w:sz="0" w:val="nil"/>
+              <w:left w:color="000000" w:space="0" w:sz="0" w:val="nil"/>
+              <w:bottom w:color="bfbfbf" w:space="0" w:sz="4" w:val="single"/>
+              <w:right w:color="bfbfbf" w:space="0" w:sz="4" w:val="single"/>
+            </w:tcBorders>
+            <w:tcMar>
+              <w:top w:w="80.0" w:type="dxa"/>
+              <w:left w:w="140.0" w:type="dxa"/>
+              <w:bottom w:w="80.0" w:type="dxa"/>
+              <w:right w:w="140.0" w:type="dxa"/>
+            </w:tcMar>
+            <w:vAlign w:val="top"/>
+          </w:tcPr>
+          <w:p>
+            <w:pPr>
+              <w:rPr/>
+            </w:pPr>
+            <w:r>
+              <w:rPr>
+                <w:rtl w:val="0"/>
+              </w:rPr>
+              <w:t xml:space="preserve">Sexo y rol.</w:t>
+            </w:r>
+          </w:p>
+        </w:tc>
+        <w:tc>
+          <w:tcPr>
+            <w:tcBorders>
+              <w:top w:color="000000" w:space="0" w:sz="0" w:val="nil"/>
+              <w:left w:color="000000" w:space="0" w:sz="0" w:val="nil"/>
+              <w:bottom w:color="bfbfbf" w:space="0" w:sz="4" w:val="single"/>
+              <w:right w:color="bfbfbf" w:space="0" w:sz="4" w:val="single"/>
+            </w:tcBorders>
+            <w:tcMar>
+              <w:top w:w="80.0" w:type="dxa"/>
+              <w:left w:w="140.0" w:type="dxa"/>
+              <w:bottom w:w="80.0" w:type="dxa"/>
+              <w:right w:w="140.0" w:type="dxa"/>
+            </w:tcMar>
+            <w:vAlign w:val="top"/>
+          </w:tcPr>
+          <w:p>
+            <w:pPr>
+              <w:rPr/>
+            </w:pPr>
+            <w:r>
+              <w:rPr>
+                <w:rtl w:val="0"/>
+              </w:rPr>
+              <w:t xml:space="preserve">select con las opciones correspondientes.</w:t>
+            </w:r>
+          </w:p>
+        </w:tc>
+      </w:tr>
+      <w:tr>
+        <w:trPr>
+          <w:cantSplit w:val="0"/>
+          <w:trHeight w:val="420" w:hRule="atLeast"/>
+          <w:tblHeader w:val="0"/>
+        </w:trPr>
+        <w:tc>
+          <w:tcPr>
+            <w:tcBorders>
+              <w:top w:color="000000" w:space="0" w:sz="0" w:val="nil"/>
+              <w:left w:color="000000" w:space="0" w:sz="0" w:val="nil"/>
+              <w:bottom w:color="bfbfbf" w:space="0" w:sz="4" w:val="single"/>
+              <w:right w:color="bfbfbf" w:space="0" w:sz="4" w:val="single"/>
+            </w:tcBorders>
+            <w:tcMar>
+              <w:top w:w="80.0" w:type="dxa"/>
+              <w:left w:w="140.0" w:type="dxa"/>
+              <w:bottom w:w="80.0" w:type="dxa"/>
+              <w:right w:w="140.0" w:type="dxa"/>
+            </w:tcMar>
+            <w:vAlign w:val="top"/>
+          </w:tcPr>
+          <w:p>
+            <w:pPr>
+              <w:rPr/>
+            </w:pPr>
+            <w:r>
+              <w:rPr>
+                <w:rtl w:val="0"/>
+              </w:rPr>
+              <w:t xml:space="preserve">Contraseña</w:t>
+            </w:r>
+          </w:p>
+        </w:tc>
+        <w:tc>
+          <w:tcPr>
+            <w:tcBorders>
+              <w:top w:color="000000" w:space="0" w:sz="0" w:val="nil"/>
+              <w:left w:color="000000" w:space="0" w:sz="0" w:val="nil"/>
+              <w:bottom w:color="bfbfbf" w:space="0" w:sz="4" w:val="single"/>
+              <w:right w:color="bfbfbf" w:space="0" w:sz="4" w:val="single"/>
+            </w:tcBorders>
+            <w:tcMar>
+              <w:top w:w="80.0" w:type="dxa"/>
+              <w:left w:w="140.0" w:type="dxa"/>
+              <w:bottom w:w="80.0" w:type="dxa"/>
+              <w:right w:w="140.0" w:type="dxa"/>
+            </w:tcMar>
+            <w:vAlign w:val="top"/>
+          </w:tcPr>
+          <w:p>
+            <w:pPr>
+              <w:rPr/>
+            </w:pPr>
+            <w:r>
+              <w:rPr>
+                <w:rtl w:val="0"/>
+              </w:rPr>
+              <w:t xml:space="preserve">input type="password".</w:t>
+            </w:r>
+          </w:p>
+        </w:tc>
+      </w:tr>
+      <w:tr>
+        <w:trPr>
+          <w:cantSplit w:val="0"/>
+          <w:trHeight w:val="420" w:hRule="atLeast"/>
+          <w:tblHeader w:val="0"/>
+        </w:trPr>
+        <w:tc>
+          <w:tcPr>
+            <w:tcBorders>
+              <w:top w:color="000000" w:space="0" w:sz="0" w:val="nil"/>
+              <w:left w:color="000000" w:space="0" w:sz="0" w:val="nil"/>
+              <w:bottom w:color="bfbfbf" w:space="0" w:sz="4" w:val="single"/>
+              <w:right w:color="bfbfbf" w:space="0" w:sz="4" w:val="single"/>
+            </w:tcBorders>
+            <w:tcMar>
+              <w:top w:w="80.0" w:type="dxa"/>
+              <w:left w:w="140.0" w:type="dxa"/>
+              <w:bottom w:w="80.0" w:type="dxa"/>
+              <w:right w:w="140.0" w:type="dxa"/>
+            </w:tcMar>
+            <w:vAlign w:val="top"/>
+          </w:tcPr>
+          <w:p>
+            <w:pPr>
+              <w:rPr/>
+            </w:pPr>
+            <w:r>
+              <w:rPr>
+                <w:rtl w:val="0"/>
+              </w:rPr>
+              <w:t xml:space="preserve">Imagen de perfil opcional.</w:t>
+            </w:r>
+          </w:p>
+        </w:tc>
+        <w:tc>
+          <w:tcPr>
+            <w:tcBorders>
+              <w:top w:color="000000" w:space="0" w:sz="0" w:val="nil"/>
+              <w:left w:color="000000" w:space="0" w:sz="0" w:val="nil"/>
+              <w:bottom w:color="bfbfbf" w:space="0" w:sz="4" w:val="single"/>
+              <w:right w:color="bfbfbf" w:space="0" w:sz="4" w:val="single"/>
+            </w:tcBorders>
+            <w:tcMar>
+              <w:top w:w="80.0" w:type="dxa"/>
+              <w:left w:w="140.0" w:type="dxa"/>
+              <w:bottom w:w="80.0" w:type="dxa"/>
+              <w:right w:w="140.0" w:type="dxa"/>
+            </w:tcMar>
+            <w:vAlign w:val="top"/>
+          </w:tcPr>
+          <w:p>
+            <w:pPr>
+              <w:rPr/>
+            </w:pPr>
+            <w:r>
+              <w:rPr>
+                <w:rtl w:val="0"/>
+              </w:rPr>
+              <w:t xml:space="preserve">input type="file".</w:t>
+            </w:r>
+          </w:p>
+        </w:tc>
+      </w:tr>
+      <w:tr>
+        <w:trPr>
+          <w:cantSplit w:val="0"/>
+          <w:trHeight w:val="420" w:hRule="atLeast"/>
+          <w:tblHeader w:val="0"/>
+        </w:trPr>
+        <w:tc>
+          <w:tcPr>
+            <w:tcBorders>
+              <w:top w:color="000000" w:space="0" w:sz="0" w:val="nil"/>
+              <w:left w:color="000000" w:space="0" w:sz="0" w:val="nil"/>
+              <w:bottom w:color="bfbfbf" w:space="0" w:sz="4" w:val="single"/>
+              <w:right w:color="bfbfbf" w:space="0" w:sz="4" w:val="single"/>
+            </w:tcBorders>
+            <w:tcMar>
+              <w:top w:w="80.0" w:type="dxa"/>
+              <w:left w:w="140.0" w:type="dxa"/>
+              <w:bottom w:w="80.0" w:type="dxa"/>
+              <w:right w:w="140.0" w:type="dxa"/>
+            </w:tcMar>
+            <w:vAlign w:val="top"/>
+          </w:tcPr>
+          <w:p>
+            <w:pPr>
+              <w:rPr/>
+            </w:pPr>
+            <w:r>
+              <w:rPr>
+                <w:rtl w:val="0"/>
+              </w:rPr>
+              <w:t xml:space="preserve">Edad calculada.</w:t>
+            </w:r>
+          </w:p>
+        </w:tc>
+        <w:tc>
+          <w:tcPr>
+            <w:tcBorders>
+              <w:top w:color="000000" w:space="0" w:sz="0" w:val="nil"/>
+              <w:left w:color="000000" w:space="0" w:sz="0" w:val="nil"/>
+              <w:bottom w:color="bfbfbf" w:space="0" w:sz="4" w:val="single"/>
+              <w:right w:color="bfbfbf" w:space="0" w:sz="4" w:val="single"/>
+            </w:tcBorders>
+            <w:tcMar>
+              <w:top w:w="80.0" w:type="dxa"/>
+              <w:left w:w="140.0" w:type="dxa"/>
+              <w:bottom w:w="80.0" w:type="dxa"/>
+              <w:right w:w="140.0" w:type="dxa"/>
+            </w:tcMar>
+            <w:vAlign w:val="top"/>
+          </w:tcPr>
+          <w:p>
+            <w:pPr>
+              <w:rPr/>
+            </w:pPr>
+            <w:r>
+              <w:rPr>
+                <w:rtl w:val="0"/>
+              </w:rPr>
+              <w:t xml:space="preserve">output, actualizado mediante JavaScript.</w:t>
+            </w:r>
+          </w:p>
+        </w:tc>
+      </w:tr>
+    </w:tbl>
+    <w:p>
+      <w:pPr>
+        <w:rPr/>
+      </w:pPr>
+      <w:r>
+        <w:rPr>
+          <w:rtl w:val="0"/>
+        </w:rPr>
+      </w:r>
+    </w:p>
+    <w:p>
+      <w:pPr>
+        <w:pStyle w:val="Heading3"/>
+        <w:keepNext w:val="0"/>
+        <w:keepLines w:val="0"/>
+        <w:spacing w:before="220" w:line="240" w:lineRule="auto"/>
+        <w:rPr/>
+      </w:pPr>
+      <w:bookmarkStart w:colFirst="0" w:colLast="0" w:name="_483q2c4c212g" w:id="24"/>
+      <w:bookmarkEnd w:id="24"/>
+      <w:r>
+        <w:rPr>
+          <w:rtl w:val="0"/>
+        </w:rPr>
+        <w:t xml:space="preserve">5.2.3 Formulario de catálogos</w:t>
+      </w:r>
+    </w:p>
+    <w:p>
+      <w:pPr>
+        <w:rPr/>
+      </w:pPr>
+      <w:r>
+        <w:rPr>
+          <w:rtl w:val="0"/>
+        </w:rPr>
+      </w:r>
+    </w:p>
+    <w:tbl>
+      <w:tblPr>
+        <w:tblStyle w:val="Table7"/>
+        <w:tblW w:w="6956.126506286164" w:type="dxa"/>
+        <w:jc w:val="left"/>
+        <w:tblBorders>
+          <w:top w:color="000000" w:space="0" w:sz="0" w:val="nil"/>
+          <w:left w:color="000000" w:space="0" w:sz="0" w:val="nil"/>
+          <w:bottom w:color="000000" w:space="0" w:sz="0" w:val="nil"/>
+          <w:right w:color="000000" w:space="0" w:sz="0" w:val="nil"/>
+          <w:insideH w:color="000000" w:space="0" w:sz="0" w:val="nil"/>
+          <w:insideV w:color="000000" w:space="0" w:sz="0" w:val="nil"/>
+        </w:tblBorders>
+        <w:tblLayout w:type="fixed"/>
+        <w:tblLook w:val="0600"/>
+      </w:tblPr>
+      <w:tblGrid>
+        <w:gridCol w:w="3478.063253143082"/>
+        <w:gridCol w:w="3478.063253143082"/>
+        <w:tblGridChange w:id="0">
+          <w:tblGrid>
+            <w:gridCol w:w="3478.063253143082"/>
+            <w:gridCol w:w="3478.063253143082"/>
+          </w:tblGrid>
+        </w:tblGridChange>
+      </w:tblGrid>
+      <w:tr>
+        <w:trPr>
+          <w:cantSplit w:val="0"/>
+          <w:trHeight w:val="420" w:hRule="atLeast"/>
+          <w:tblHeader w:val="0"/>
+        </w:trPr>
+        <w:tc>
+          <w:tcPr>
+            <w:tcBorders>
+              <w:top w:color="bfbfbf" w:space="0" w:sz="4" w:val="single"/>
+              <w:left w:color="000000" w:space="0" w:sz="0" w:val="nil"/>
+              <w:bottom w:color="bfbfbf" w:space="0" w:sz="4" w:val="single"/>
+              <w:right w:color="bfbfbf" w:space="0" w:sz="4" w:val="single"/>
+            </w:tcBorders>
+            <w:shd w:fill="1f4e79" w:val="clear"/>
+            <w:tcMar>
+              <w:top w:w="80.0" w:type="dxa"/>
+              <w:left w:w="140.0" w:type="dxa"/>
+              <w:bottom w:w="80.0" w:type="dxa"/>
+              <w:right w:w="140.0" w:type="dxa"/>
+            </w:tcMar>
+            <w:vAlign w:val="top"/>
+          </w:tcPr>
+          <w:p>
+            <w:pPr>
+              <w:rPr>
+                <w:b w:val="1"/>
+                <w:bCs w:val="1"/>
+                <w:color w:val="ffffff"/>
+              </w:rPr>
+            </w:pPr>
+            <w:r>
+              <w:rPr>
+                <w:b w:val="1"/>
+                <w:bCs w:val="1"/>
+                <w:color w:val="ffffff"/>
+                <w:rtl w:val="0"/>
+              </w:rPr>
+              <w:t xml:space="preserve">Catálogo</w:t>
+            </w:r>
+          </w:p>
+        </w:tc>
+        <w:tc>
+          <w:tcPr>
+            <w:tcBorders>
+              <w:top w:color="bfbfbf" w:space="0" w:sz="4" w:val="single"/>
+              <w:left w:color="000000" w:space="0" w:sz="0" w:val="nil"/>
+              <w:bottom w:color="bfbfbf" w:space="0" w:sz="4" w:val="single"/>
+              <w:right w:color="bfbfbf" w:space="0" w:sz="4" w:val="single"/>
+            </w:tcBorders>
+            <w:shd w:fill="1f4e79" w:val="clear"/>
+            <w:tcMar>
+              <w:top w:w="80.0" w:type="dxa"/>
+              <w:left w:w="140.0" w:type="dxa"/>
+              <w:bottom w:w="80.0" w:type="dxa"/>
+              <w:right w:w="140.0" w:type="dxa"/>
+            </w:tcMar>
+            <w:vAlign w:val="top"/>
+          </w:tcPr>
+          <w:p>
+            <w:pPr>
+              <w:rPr>
+                <w:b w:val="1"/>
+                <w:bCs w:val="1"/>
+                <w:color w:val="ffffff"/>
+              </w:rPr>
+            </w:pPr>
+            <w:r>
+              <w:rPr>
+                <w:b w:val="1"/>
+                <w:bCs w:val="1"/>
+                <w:color w:val="ffffff"/>
+                <w:rtl w:val="0"/>
+              </w:rPr>
+              <w:t xml:space="preserve">Campos previstos</w:t>
+            </w:r>
+          </w:p>
+        </w:tc>
+      </w:tr>
+      <w:tr>
+        <w:trPr>
+          <w:cantSplit w:val="0"/>
+          <w:trHeight w:val="420" w:hRule="atLeast"/>
+          <w:tblHeader w:val="0"/>
+        </w:trPr>
+        <w:tc>
+          <w:tcPr>
+            <w:tcBorders>
+              <w:top w:color="000000" w:space="0" w:sz="0" w:val="nil"/>
+              <w:left w:color="000000" w:space="0" w:sz="0" w:val="nil"/>
+              <w:bottom w:color="bfbfbf" w:space="0" w:sz="4" w:val="single"/>
+              <w:right w:color="bfbfbf" w:space="0" w:sz="4" w:val="single"/>
+            </w:tcBorders>
+            <w:tcMar>
+              <w:top w:w="80.0" w:type="dxa"/>
+              <w:left w:w="140.0" w:type="dxa"/>
+              <w:bottom w:w="80.0" w:type="dxa"/>
+              <w:right w:w="140.0" w:type="dxa"/>
+            </w:tcMar>
+            <w:vAlign w:val="top"/>
+          </w:tcPr>
+          <w:p>
+            <w:pPr>
+              <w:rPr/>
+            </w:pPr>
+            <w:r>
+              <w:rPr>
+                <w:rtl w:val="0"/>
+              </w:rPr>
+              <w:t xml:space="preserve">Escuelas</w:t>
+            </w:r>
+          </w:p>
+        </w:tc>
+        <w:tc>
+          <w:tcPr>
+            <w:tcBorders>
+              <w:top w:color="000000" w:space="0" w:sz="0" w:val="nil"/>
+              <w:left w:color="000000" w:space="0" w:sz="0" w:val="nil"/>
+              <w:bottom w:color="bfbfbf" w:space="0" w:sz="4" w:val="single"/>
+              <w:right w:color="bfbfbf" w:space="0" w:sz="4" w:val="single"/>
+            </w:tcBorders>
+            <w:tcMar>
+              <w:top w:w="80.0" w:type="dxa"/>
+              <w:left w:w="140.0" w:type="dxa"/>
+              <w:bottom w:w="80.0" w:type="dxa"/>
+              <w:right w:w="140.0" w:type="dxa"/>
+            </w:tcMar>
+            <w:vAlign w:val="top"/>
+          </w:tcPr>
+          <w:p>
+            <w:pPr>
+              <w:rPr/>
+            </w:pPr>
+            <w:r>
+              <w:rPr>
+                <w:rtl w:val="0"/>
+              </w:rPr>
+              <w:t xml:space="preserve">Código, nombre y director asociado.</w:t>
+            </w:r>
+          </w:p>
+        </w:tc>
+      </w:tr>
+      <w:tr>
+        <w:trPr>
+          <w:cantSplit w:val="0"/>
+          <w:trHeight w:val="420" w:hRule="atLeast"/>
+          <w:tblHeader w:val="0"/>
+        </w:trPr>
+        <w:tc>
+          <w:tcPr>
+            <w:tcBorders>
+              <w:top w:color="000000" w:space="0" w:sz="0" w:val="nil"/>
+              <w:left w:color="000000" w:space="0" w:sz="0" w:val="nil"/>
+              <w:bottom w:color="bfbfbf" w:space="0" w:sz="4" w:val="single"/>
+              <w:right w:color="bfbfbf" w:space="0" w:sz="4" w:val="single"/>
+            </w:tcBorders>
+            <w:tcMar>
+              <w:top w:w="80.0" w:type="dxa"/>
+              <w:left w:w="140.0" w:type="dxa"/>
+              <w:bottom w:w="80.0" w:type="dxa"/>
+              <w:right w:w="140.0" w:type="dxa"/>
+            </w:tcMar>
+            <w:vAlign w:val="top"/>
+          </w:tcPr>
+          <w:p>
+            <w:pPr>
+              <w:rPr/>
+            </w:pPr>
+            <w:r>
+              <w:rPr>
+                <w:rtl w:val="0"/>
+              </w:rPr>
+              <w:t xml:space="preserve">Carreras</w:t>
+            </w:r>
+          </w:p>
+        </w:tc>
+        <w:tc>
+          <w:tcPr>
+            <w:tcBorders>
+              <w:top w:color="000000" w:space="0" w:sz="0" w:val="nil"/>
+              <w:left w:color="000000" w:space="0" w:sz="0" w:val="nil"/>
+              <w:bottom w:color="bfbfbf" w:space="0" w:sz="4" w:val="single"/>
+              <w:right w:color="bfbfbf" w:space="0" w:sz="4" w:val="single"/>
+            </w:tcBorders>
+            <w:tcMar>
+              <w:top w:w="80.0" w:type="dxa"/>
+              <w:left w:w="140.0" w:type="dxa"/>
+              <w:bottom w:w="80.0" w:type="dxa"/>
+              <w:right w:w="140.0" w:type="dxa"/>
+            </w:tcMar>
+            <w:vAlign w:val="top"/>
+          </w:tcPr>
+          <w:p>
+            <w:pPr>
+              <w:rPr/>
+            </w:pPr>
+            <w:r>
+              <w:rPr>
+                <w:rtl w:val="0"/>
+              </w:rPr>
+              <w:t xml:space="preserve">Código, nombre y escuela asociada.</w:t>
+            </w:r>
+          </w:p>
+        </w:tc>
+      </w:tr>
+      <w:tr>
+        <w:trPr>
+          <w:cantSplit w:val="0"/>
+          <w:trHeight w:val="420" w:hRule="atLeast"/>
+          <w:tblHeader w:val="0"/>
+        </w:trPr>
+        <w:tc>
+          <w:tcPr>
+            <w:tcBorders>
+              <w:top w:color="000000" w:space="0" w:sz="0" w:val="nil"/>
+              <w:left w:color="000000" w:space="0" w:sz="0" w:val="nil"/>
+              <w:bottom w:color="bfbfbf" w:space="0" w:sz="4" w:val="single"/>
+              <w:right w:color="bfbfbf" w:space="0" w:sz="4" w:val="single"/>
+            </w:tcBorders>
+            <w:tcMar>
+              <w:top w:w="80.0" w:type="dxa"/>
+              <w:left w:w="140.0" w:type="dxa"/>
+              <w:bottom w:w="80.0" w:type="dxa"/>
+              <w:right w:w="140.0" w:type="dxa"/>
+            </w:tcMar>
+            <w:vAlign w:val="top"/>
+          </w:tcPr>
+          <w:p>
+            <w:pPr>
+              <w:rPr/>
+            </w:pPr>
+            <w:r>
+              <w:rPr>
+                <w:rtl w:val="0"/>
+              </w:rPr>
+              <w:t xml:space="preserve">Estados del curso</w:t>
+            </w:r>
+          </w:p>
+        </w:tc>
+        <w:tc>
+          <w:tcPr>
+            <w:tcBorders>
+              <w:top w:color="000000" w:space="0" w:sz="0" w:val="nil"/>
+              <w:left w:color="000000" w:space="0" w:sz="0" w:val="nil"/>
+              <w:bottom w:color="bfbfbf" w:space="0" w:sz="4" w:val="single"/>
+              <w:right w:color="bfbfbf" w:space="0" w:sz="4" w:val="single"/>
+            </w:tcBorders>
+            <w:tcMar>
+              <w:top w:w="80.0" w:type="dxa"/>
+              <w:left w:w="140.0" w:type="dxa"/>
+              <w:bottom w:w="80.0" w:type="dxa"/>
+              <w:right w:w="140.0" w:type="dxa"/>
+            </w:tcMar>
+            <w:vAlign w:val="top"/>
+          </w:tcPr>
+          <w:p>
+            <w:pPr>
+              <w:rPr/>
+            </w:pPr>
+            <w:r>
+              <w:rPr>
+                <w:rtl w:val="0"/>
+              </w:rPr>
+              <w:t xml:space="preserve">Código, nombre y descripción.</w:t>
+            </w:r>
+          </w:p>
+        </w:tc>
+      </w:tr>
+      <w:tr>
+        <w:trPr>
+          <w:cantSplit w:val="0"/>
+          <w:trHeight w:val="420" w:hRule="atLeast"/>
+          <w:tblHeader w:val="0"/>
+        </w:trPr>
+        <w:tc>
+          <w:tcPr>
+            <w:tcBorders>
+              <w:top w:color="000000" w:space="0" w:sz="0" w:val="nil"/>
+              <w:left w:color="000000" w:space="0" w:sz="0" w:val="nil"/>
+              <w:bottom w:color="bfbfbf" w:space="0" w:sz="4" w:val="single"/>
+              <w:right w:color="bfbfbf" w:space="0" w:sz="4" w:val="single"/>
+            </w:tcBorders>
+            <w:tcMar>
+              <w:top w:w="80.0" w:type="dxa"/>
+              <w:left w:w="140.0" w:type="dxa"/>
+              <w:bottom w:w="80.0" w:type="dxa"/>
+              <w:right w:w="140.0" w:type="dxa"/>
+            </w:tcMar>
+            <w:vAlign w:val="top"/>
+          </w:tcPr>
+          <w:p>
+            <w:pPr>
+              <w:rPr/>
+            </w:pPr>
+            <w:r>
+              <w:rPr>
+                <w:rtl w:val="0"/>
+              </w:rPr>
+              <w:t xml:space="preserve">Áreas SEFIA</w:t>
+            </w:r>
+          </w:p>
+        </w:tc>
+        <w:tc>
+          <w:tcPr>
+            <w:tcBorders>
+              <w:top w:color="000000" w:space="0" w:sz="0" w:val="nil"/>
+              <w:left w:color="000000" w:space="0" w:sz="0" w:val="nil"/>
+              <w:bottom w:color="bfbfbf" w:space="0" w:sz="4" w:val="single"/>
+              <w:right w:color="bfbfbf" w:space="0" w:sz="4" w:val="single"/>
+            </w:tcBorders>
+            <w:tcMar>
+              <w:top w:w="80.0" w:type="dxa"/>
+              <w:left w:w="140.0" w:type="dxa"/>
+              <w:bottom w:w="80.0" w:type="dxa"/>
+              <w:right w:w="140.0" w:type="dxa"/>
+            </w:tcMar>
+            <w:vAlign w:val="top"/>
+          </w:tcPr>
+          <w:p>
+            <w:pPr>
+              <w:rPr/>
+            </w:pPr>
+            <w:r>
+              <w:rPr>
+                <w:rtl w:val="0"/>
+              </w:rPr>
+              <w:t xml:space="preserve">Código autonumérico, nombre y descripción opcional.</w:t>
+            </w:r>
+          </w:p>
+        </w:tc>
+      </w:tr>
+      <w:tr>
+        <w:trPr>
+          <w:cantSplit w:val="0"/>
+          <w:trHeight w:val="420" w:hRule="atLeast"/>
+          <w:tblHeader w:val="0"/>
+        </w:trPr>
+        <w:tc>
+          <w:tcPr>
+            <w:tcBorders>
+              <w:top w:color="000000" w:space="0" w:sz="0" w:val="nil"/>
+              <w:left w:color="000000" w:space="0" w:sz="0" w:val="nil"/>
+              <w:bottom w:color="bfbfbf" w:space="0" w:sz="4" w:val="single"/>
+              <w:right w:color="bfbfbf" w:space="0" w:sz="4" w:val="single"/>
+            </w:tcBorders>
+            <w:tcMar>
+              <w:top w:w="80.0" w:type="dxa"/>
+              <w:left w:w="140.0" w:type="dxa"/>
+              <w:bottom w:w="80.0" w:type="dxa"/>
+              <w:right w:w="140.0" w:type="dxa"/>
+            </w:tcMar>
+            <w:vAlign w:val="top"/>
+          </w:tcPr>
+          <w:p>
+            <w:pPr>
+              <w:rPr/>
+            </w:pPr>
+            <w:r>
+              <w:rPr>
+                <w:rtl w:val="0"/>
+              </w:rPr>
+              <w:t xml:space="preserve">Temáticas</w:t>
+            </w:r>
+          </w:p>
+        </w:tc>
+        <w:tc>
+          <w:tcPr>
+            <w:tcBorders>
+              <w:top w:color="000000" w:space="0" w:sz="0" w:val="nil"/>
+              <w:left w:color="000000" w:space="0" w:sz="0" w:val="nil"/>
+              <w:bottom w:color="bfbfbf" w:space="0" w:sz="4" w:val="single"/>
+              <w:right w:color="bfbfbf" w:space="0" w:sz="4" w:val="single"/>
+            </w:tcBorders>
+            <w:tcMar>
+              <w:top w:w="80.0" w:type="dxa"/>
+              <w:left w:w="140.0" w:type="dxa"/>
+              <w:bottom w:w="80.0" w:type="dxa"/>
+              <w:right w:w="140.0" w:type="dxa"/>
+            </w:tcMar>
+            <w:vAlign w:val="top"/>
+          </w:tcPr>
+          <w:p>
+            <w:pPr>
+              <w:rPr/>
+            </w:pPr>
+            <w:r>
+              <w:rPr>
+                <w:rtl w:val="0"/>
+              </w:rPr>
+              <w:t xml:space="preserve">Código autonumérico, nombre y descripción opcional.</w:t>
+            </w:r>
+          </w:p>
+        </w:tc>
+      </w:tr>
+      <w:tr>
+        <w:trPr>
+          <w:cantSplit w:val="0"/>
+          <w:trHeight w:val="420" w:hRule="atLeast"/>
+          <w:tblHeader w:val="0"/>
+        </w:trPr>
+        <w:tc>
+          <w:tcPr>
+            <w:tcBorders>
+              <w:top w:color="000000" w:space="0" w:sz="0" w:val="nil"/>
+              <w:left w:color="000000" w:space="0" w:sz="0" w:val="nil"/>
+              <w:bottom w:color="bfbfbf" w:space="0" w:sz="4" w:val="single"/>
+              <w:right w:color="bfbfbf" w:space="0" w:sz="4" w:val="single"/>
+            </w:tcBorders>
+            <w:tcMar>
+              <w:top w:w="80.0" w:type="dxa"/>
+              <w:left w:w="140.0" w:type="dxa"/>
+              <w:bottom w:w="80.0" w:type="dxa"/>
+              <w:right w:w="140.0" w:type="dxa"/>
+            </w:tcMar>
+            <w:vAlign w:val="top"/>
+          </w:tcPr>
+          <w:p>
+            <w:pPr>
+              <w:rPr/>
+            </w:pPr>
+            <w:r>
+              <w:rPr>
+                <w:rtl w:val="0"/>
+              </w:rPr>
+              <w:t xml:space="preserve">Metodologías de aprendizaje</w:t>
+            </w:r>
+          </w:p>
+        </w:tc>
+        <w:tc>
+          <w:tcPr>
+            <w:tcBorders>
+              <w:top w:color="000000" w:space="0" w:sz="0" w:val="nil"/>
+              <w:left w:color="000000" w:space="0" w:sz="0" w:val="nil"/>
+              <w:bottom w:color="bfbfbf" w:space="0" w:sz="4" w:val="single"/>
+              <w:right w:color="bfbfbf" w:space="0" w:sz="4" w:val="single"/>
+            </w:tcBorders>
+            <w:tcMar>
+              <w:top w:w="80.0" w:type="dxa"/>
+              <w:left w:w="140.0" w:type="dxa"/>
+              <w:bottom w:w="80.0" w:type="dxa"/>
+              <w:right w:w="140.0" w:type="dxa"/>
+            </w:tcMar>
+            <w:vAlign w:val="top"/>
+          </w:tcPr>
+          <w:p>
+            <w:pPr>
+              <w:rPr/>
+            </w:pPr>
+            <w:r>
+              <w:rPr>
+                <w:rtl w:val="0"/>
+              </w:rPr>
+              <w:t xml:space="preserve">Código numérico, nombre y descripción.</w:t>
+            </w:r>
+          </w:p>
+        </w:tc>
+      </w:tr>
+      <w:tr>
+        <w:trPr>
+          <w:cantSplit w:val="0"/>
+          <w:trHeight w:val="420" w:hRule="atLeast"/>
+          <w:tblHeader w:val="0"/>
+        </w:trPr>
+        <w:tc>
+          <w:tcPr>
+            <w:tcBorders>
+              <w:top w:color="000000" w:space="0" w:sz="0" w:val="nil"/>
+              <w:left w:color="000000" w:space="0" w:sz="0" w:val="nil"/>
+              <w:bottom w:color="bfbfbf" w:space="0" w:sz="4" w:val="single"/>
+              <w:right w:color="bfbfbf" w:space="0" w:sz="4" w:val="single"/>
+            </w:tcBorders>
+            <w:tcMar>
+              <w:top w:w="80.0" w:type="dxa"/>
+              <w:left w:w="140.0" w:type="dxa"/>
+              <w:bottom w:w="80.0" w:type="dxa"/>
+              <w:right w:w="140.0" w:type="dxa"/>
+            </w:tcMar>
+            <w:vAlign w:val="top"/>
+          </w:tcPr>
+          <w:p>
+            <w:pPr>
+              <w:rPr/>
+            </w:pPr>
+            <w:r>
+              <w:rPr>
+                <w:rtl w:val="0"/>
+              </w:rPr>
+              <w:t xml:space="preserve">Niveles de complejidad</w:t>
+            </w:r>
+          </w:p>
+        </w:tc>
+        <w:tc>
+          <w:tcPr>
+            <w:tcBorders>
+              <w:top w:color="000000" w:space="0" w:sz="0" w:val="nil"/>
+              <w:left w:color="000000" w:space="0" w:sz="0" w:val="nil"/>
+              <w:bottom w:color="bfbfbf" w:space="0" w:sz="4" w:val="single"/>
+              <w:right w:color="bfbfbf" w:space="0" w:sz="4" w:val="single"/>
+            </w:tcBorders>
+            <w:tcMar>
+              <w:top w:w="80.0" w:type="dxa"/>
+              <w:left w:w="140.0" w:type="dxa"/>
+              <w:bottom w:w="80.0" w:type="dxa"/>
+              <w:right w:w="140.0" w:type="dxa"/>
+            </w:tcMar>
+            <w:vAlign w:val="top"/>
+          </w:tcPr>
+          <w:p>
+            <w:pPr>
+              <w:rPr/>
+            </w:pPr>
+            <w:r>
+              <w:rPr>
+                <w:rtl w:val="0"/>
+              </w:rPr>
+              <w:t xml:space="preserve">Código numérico, nombre y descripción.</w:t>
+            </w:r>
+          </w:p>
+        </w:tc>
+      </w:tr>
+      <w:tr>
+        <w:trPr>
+          <w:cantSplit w:val="0"/>
+          <w:trHeight w:val="420" w:hRule="atLeast"/>
+          <w:tblHeader w:val="0"/>
+        </w:trPr>
+        <w:tc>
+          <w:tcPr>
+            <w:tcBorders>
+              <w:top w:color="000000" w:space="0" w:sz="0" w:val="nil"/>
+              <w:left w:color="000000" w:space="0" w:sz="0" w:val="nil"/>
+              <w:bottom w:color="bfbfbf" w:space="0" w:sz="4" w:val="single"/>
+              <w:right w:color="bfbfbf" w:space="0" w:sz="4" w:val="single"/>
+            </w:tcBorders>
+            <w:tcMar>
+              <w:top w:w="80.0" w:type="dxa"/>
+              <w:left w:w="140.0" w:type="dxa"/>
+              <w:bottom w:w="80.0" w:type="dxa"/>
+              <w:right w:w="140.0" w:type="dxa"/>
+            </w:tcMar>
+            <w:vAlign w:val="top"/>
+          </w:tcPr>
+          <w:p>
+            <w:pPr>
+              <w:rPr/>
+            </w:pPr>
+            <w:r>
+              <w:rPr>
+                <w:rtl w:val="0"/>
+              </w:rPr>
+              <w:t xml:space="preserve">Casas certificadoras</w:t>
+            </w:r>
+          </w:p>
+        </w:tc>
+        <w:tc>
+          <w:tcPr>
+            <w:tcBorders>
+              <w:top w:color="000000" w:space="0" w:sz="0" w:val="nil"/>
+              <w:left w:color="000000" w:space="0" w:sz="0" w:val="nil"/>
+              <w:bottom w:color="bfbfbf" w:space="0" w:sz="4" w:val="single"/>
+              <w:right w:color="bfbfbf" w:space="0" w:sz="4" w:val="single"/>
+            </w:tcBorders>
+            <w:tcMar>
+              <w:top w:w="80.0" w:type="dxa"/>
+              <w:left w:w="140.0" w:type="dxa"/>
+              <w:bottom w:w="80.0" w:type="dxa"/>
+              <w:right w:w="140.0" w:type="dxa"/>
+            </w:tcMar>
+            <w:vAlign w:val="top"/>
+          </w:tcPr>
+          <w:p>
+            <w:pPr>
+              <w:rPr/>
+            </w:pPr>
+            <w:r>
+              <w:rPr>
+                <w:rtl w:val="0"/>
+              </w:rPr>
+              <w:t xml:space="preserve">Código numérico y nombre.</w:t>
+            </w:r>
+          </w:p>
+        </w:tc>
+      </w:tr>
+    </w:tbl>
+    <w:p>
+      <w:pPr>
+        <w:rPr/>
+      </w:pPr>
+      <w:r>
+        <w:rPr>
+          <w:rtl w:val="0"/>
+        </w:rPr>
+      </w:r>
+    </w:p>
+    <w:p>
+      <w:pPr>
+        <w:pStyle w:val="Heading3"/>
+        <w:keepNext w:val="0"/>
+        <w:keepLines w:val="0"/>
+        <w:spacing w:before="220" w:line="240" w:lineRule="auto"/>
+        <w:rPr/>
+      </w:pPr>
+      <w:bookmarkStart w:colFirst="0" w:colLast="0" w:name="_8jl0wpq6ajf0" w:id="25"/>
+      <w:bookmarkEnd w:id="25"/>
+      <w:r>
+        <w:rPr>
+          <w:rtl w:val="0"/>
+        </w:rPr>
+        <w:t xml:space="preserve">5.2.4 Formulario de cursos</w:t>
+      </w:r>
+    </w:p>
+    <w:p>
+      <w:pPr>
+        <w:rPr/>
+      </w:pPr>
+      <w:r>
+        <w:rPr>
+          <w:rtl w:val="0"/>
+        </w:rPr>
+      </w:r>
+    </w:p>
+    <w:tbl>
+      <w:tblPr>
+        <w:tblStyle w:val="Table8"/>
+        <w:tblW w:w="9025.511811023625" w:type="dxa"/>
+        <w:jc w:val="left"/>
+        <w:tblBorders>
+          <w:top w:color="000000" w:space="0" w:sz="0" w:val="nil"/>
+          <w:left w:color="000000" w:space="0" w:sz="0" w:val="nil"/>
+          <w:bottom w:color="000000" w:space="0" w:sz="0" w:val="nil"/>
+          <w:right w:color="000000" w:space="0" w:sz="0" w:val="nil"/>
+          <w:insideH w:color="000000" w:space="0" w:sz="0" w:val="nil"/>
+          <w:insideV w:color="000000" w:space="0" w:sz="0" w:val="nil"/>
+        </w:tblBorders>
+        <w:tblLayout w:type="fixed"/>
+        <w:tblLook w:val="0600"/>
+      </w:tblPr>
+      <w:tblGrid>
+        <w:gridCol w:w="2069.385304737461"/>
+        <w:gridCol w:w="3478.063253143082"/>
+        <w:gridCol w:w="3478.063253143082"/>
+        <w:tblGridChange w:id="0">
+          <w:tblGrid>
+            <w:gridCol w:w="2069.385304737461"/>
+            <w:gridCol w:w="3478.063253143082"/>
+            <w:gridCol w:w="3478.063253143082"/>
+          </w:tblGrid>
+        </w:tblGridChange>
+      </w:tblGrid>
+      <w:tr>
+        <w:trPr>
+          <w:cantSplit w:val="0"/>
+          <w:trHeight w:val="420" w:hRule="atLeast"/>
+          <w:tblHeader w:val="0"/>
+        </w:trPr>
+        <w:tc>
+          <w:tcPr>
+            <w:tcBorders>
+              <w:top w:color="bfbfbf" w:space="0" w:sz="4" w:val="single"/>
+              <w:left w:color="bfbfbf" w:space="0" w:sz="4" w:val="single"/>
+              <w:bottom w:color="bfbfbf" w:space="0" w:sz="4" w:val="single"/>
+              <w:right w:color="bfbfbf" w:space="0" w:sz="4" w:val="single"/>
+            </w:tcBorders>
+            <w:shd w:fill="1f4e79" w:val="clear"/>
+            <w:tcMar>
+              <w:top w:w="80.0" w:type="dxa"/>
+              <w:left w:w="140.0" w:type="dxa"/>
+              <w:bottom w:w="80.0" w:type="dxa"/>
+              <w:right w:w="140.0" w:type="dxa"/>
+            </w:tcMar>
+            <w:vAlign w:val="top"/>
+          </w:tcPr>
+          <w:p>
+            <w:pPr>
+              <w:rPr>
+                <w:b w:val="1"/>
+                <w:bCs w:val="1"/>
+                <w:color w:val="ffffff"/>
+              </w:rPr>
+            </w:pPr>
+            <w:r>
+              <w:rPr>
+                <w:b w:val="1"/>
+                <w:bCs w:val="1"/>
+                <w:color w:val="ffffff"/>
+                <w:rtl w:val="0"/>
+              </w:rPr>
+              <w:t xml:space="preserve">Sección</w:t>
+            </w:r>
+          </w:p>
+        </w:tc>
+        <w:tc>
+          <w:tcPr>
+            <w:tcBorders>
+              <w:top w:color="bfbfbf" w:space="0" w:sz="4" w:val="single"/>
+              <w:left w:color="000000" w:space="0" w:sz="0" w:val="nil"/>
+              <w:bottom w:color="bfbfbf" w:space="0" w:sz="4" w:val="single"/>
+              <w:right w:color="bfbfbf" w:space="0" w:sz="4" w:val="single"/>
+            </w:tcBorders>
+            <w:shd w:fill="1f4e79" w:val="clear"/>
+            <w:tcMar>
+              <w:top w:w="80.0" w:type="dxa"/>
+              <w:left w:w="140.0" w:type="dxa"/>
+              <w:bottom w:w="80.0" w:type="dxa"/>
+              <w:right w:w="140.0" w:type="dxa"/>
+            </w:tcMar>
+            <w:vAlign w:val="top"/>
+          </w:tcPr>
+          <w:p>
+            <w:pPr>
+              <w:rPr>
+                <w:b w:val="1"/>
+                <w:bCs w:val="1"/>
+                <w:color w:val="ffffff"/>
+              </w:rPr>
+            </w:pPr>
+            <w:r>
+              <w:rPr>
+                <w:b w:val="1"/>
+                <w:bCs w:val="1"/>
+                <w:color w:val="ffffff"/>
+                <w:rtl w:val="0"/>
+              </w:rPr>
+              <w:t xml:space="preserve">Campos previstos</w:t>
+            </w:r>
+          </w:p>
+        </w:tc>
+        <w:tc>
+          <w:tcPr>
+            <w:tcBorders>
+              <w:top w:color="bfbfbf" w:space="0" w:sz="4" w:val="single"/>
+              <w:left w:color="000000" w:space="0" w:sz="0" w:val="nil"/>
+              <w:bottom w:color="bfbfbf" w:space="0" w:sz="4" w:val="single"/>
+              <w:right w:color="bfbfbf" w:space="0" w:sz="4" w:val="single"/>
+            </w:tcBorders>
+            <w:shd w:fill="1f4e79" w:val="clear"/>
+            <w:tcMar>
+              <w:top w:w="80.0" w:type="dxa"/>
+              <w:left w:w="140.0" w:type="dxa"/>
+              <w:bottom w:w="80.0" w:type="dxa"/>
+              <w:right w:w="140.0" w:type="dxa"/>
+            </w:tcMar>
+            <w:vAlign w:val="top"/>
+          </w:tcPr>
+          <w:p>
+            <w:pPr>
+              <w:rPr>
+                <w:b w:val="1"/>
+                <w:bCs w:val="1"/>
+                <w:color w:val="ffffff"/>
+              </w:rPr>
+            </w:pPr>
+            <w:r>
+              <w:rPr>
+                <w:b w:val="1"/>
+                <w:bCs w:val="1"/>
+                <w:color w:val="ffffff"/>
+                <w:rtl w:val="0"/>
+              </w:rPr>
+              <w:t xml:space="preserve">Controles HTML</w:t>
+            </w:r>
+          </w:p>
+        </w:tc>
+      </w:tr>
+      <w:tr>
+        <w:trPr>
+          <w:cantSplit w:val="0"/>
+          <w:trHeight w:val="420" w:hRule="atLeast"/>
+          <w:tblHeader w:val="0"/>
+        </w:trPr>
+        <w:tc>
+          <w:tcPr>
+            <w:tcBorders>
+              <w:top w:color="000000" w:space="0" w:sz="0" w:val="nil"/>
+              <w:left w:color="bfbfbf" w:space="0" w:sz="4" w:val="single"/>
+              <w:bottom w:color="bfbfbf" w:space="0" w:sz="4" w:val="single"/>
+              <w:right w:color="bfbfbf" w:space="0" w:sz="4" w:val="single"/>
+            </w:tcBorders>
+            <w:tcMar>
+              <w:top w:w="80.0" w:type="dxa"/>
+              <w:left w:w="140.0" w:type="dxa"/>
+              <w:bottom w:w="80.0" w:type="dxa"/>
+              <w:right w:w="140.0" w:type="dxa"/>
+            </w:tcMar>
+            <w:vAlign w:val="top"/>
+          </w:tcPr>
+          <w:p>
+            <w:pPr>
+              <w:rPr>
+                <w:b w:val="1"/>
+                <w:bCs w:val="1"/>
+              </w:rPr>
+            </w:pPr>
+            <w:r>
+              <w:rPr>
+                <w:b w:val="1"/>
+                <w:bCs w:val="1"/>
+                <w:rtl w:val="0"/>
+              </w:rPr>
+              <w:t xml:space="preserve">Identificación</w:t>
+            </w:r>
+          </w:p>
+        </w:tc>
+        <w:tc>
+          <w:tcPr>
+            <w:tcBorders>
+              <w:top w:color="000000" w:space="0" w:sz="0" w:val="nil"/>
+              <w:left w:color="000000" w:space="0" w:sz="0" w:val="nil"/>
+              <w:bottom w:color="bfbfbf" w:space="0" w:sz="4" w:val="single"/>
+              <w:right w:color="bfbfbf" w:space="0" w:sz="4" w:val="single"/>
+            </w:tcBorders>
+            <w:tcMar>
+              <w:top w:w="80.0" w:type="dxa"/>
+              <w:left w:w="140.0" w:type="dxa"/>
+              <w:bottom w:w="80.0" w:type="dxa"/>
+              <w:right w:w="140.0" w:type="dxa"/>
+            </w:tcMar>
+            <w:vAlign w:val="top"/>
+          </w:tcPr>
+          <w:p>
+            <w:pPr>
+              <w:rPr/>
+            </w:pPr>
+            <w:r>
+              <w:rPr>
+                <w:rtl w:val="0"/>
+              </w:rPr>
+              <w:t xml:space="preserve">Escuela, código y nombre del curso.</w:t>
+            </w:r>
+          </w:p>
+        </w:tc>
+        <w:tc>
+          <w:tcPr>
+            <w:tcBorders>
+              <w:top w:color="000000" w:space="0" w:sz="0" w:val="nil"/>
+              <w:left w:color="000000" w:space="0" w:sz="0" w:val="nil"/>
+              <w:bottom w:color="bfbfbf" w:space="0" w:sz="4" w:val="single"/>
+              <w:right w:color="bfbfbf" w:space="0" w:sz="4" w:val="single"/>
+            </w:tcBorders>
+            <w:tcMar>
+              <w:top w:w="80.0" w:type="dxa"/>
+              <w:left w:w="140.0" w:type="dxa"/>
+              <w:bottom w:w="80.0" w:type="dxa"/>
+              <w:right w:w="140.0" w:type="dxa"/>
+            </w:tcMar>
+            <w:vAlign w:val="top"/>
+          </w:tcPr>
+          <w:p>
+            <w:pPr>
+              <w:rPr/>
+            </w:pPr>
+            <w:r>
+              <w:rPr>
+                <w:rtl w:val="0"/>
+              </w:rPr>
+              <w:t xml:space="preserve">select para la escuela e input type="text" para código y nombre.</w:t>
+            </w:r>
+          </w:p>
+        </w:tc>
+      </w:tr>
+      <w:tr>
+        <w:trPr>
+          <w:cantSplit w:val="0"/>
+          <w:trHeight w:val="420" w:hRule="atLeast"/>
+          <w:tblHeader w:val="0"/>
+        </w:trPr>
+        <w:tc>
+          <w:tcPr>
+            <w:tcBorders>
+              <w:top w:color="000000" w:space="0" w:sz="0" w:val="nil"/>
+              <w:left w:color="bfbfbf" w:space="0" w:sz="4" w:val="single"/>
+              <w:bottom w:color="bfbfbf" w:space="0" w:sz="4" w:val="single"/>
+              <w:right w:color="bfbfbf" w:space="0" w:sz="4" w:val="single"/>
+            </w:tcBorders>
+            <w:tcMar>
+              <w:top w:w="80.0" w:type="dxa"/>
+              <w:left w:w="140.0" w:type="dxa"/>
+              <w:bottom w:w="80.0" w:type="dxa"/>
+              <w:right w:w="140.0" w:type="dxa"/>
+            </w:tcMar>
+            <w:vAlign w:val="top"/>
+          </w:tcPr>
+          <w:p>
+            <w:pPr>
+              <w:rPr>
+                <w:b w:val="1"/>
+                <w:bCs w:val="1"/>
+              </w:rPr>
+            </w:pPr>
+            <w:r>
+              <w:rPr>
+                <w:b w:val="1"/>
+                <w:bCs w:val="1"/>
+                <w:rtl w:val="0"/>
+              </w:rPr>
+              <w:t xml:space="preserve">Clasificación</w:t>
+            </w:r>
+          </w:p>
+        </w:tc>
+        <w:tc>
+          <w:tcPr>
+            <w:tcBorders>
+              <w:top w:color="000000" w:space="0" w:sz="0" w:val="nil"/>
+              <w:left w:color="000000" w:space="0" w:sz="0" w:val="nil"/>
+              <w:bottom w:color="bfbfbf" w:space="0" w:sz="4" w:val="single"/>
+              <w:right w:color="bfbfbf" w:space="0" w:sz="4" w:val="single"/>
+            </w:tcBorders>
+            <w:tcMar>
+              <w:top w:w="80.0" w:type="dxa"/>
+              <w:left w:w="140.0" w:type="dxa"/>
+              <w:bottom w:w="80.0" w:type="dxa"/>
+              <w:right w:w="140.0" w:type="dxa"/>
+            </w:tcMar>
+            <w:vAlign w:val="top"/>
+          </w:tcPr>
+          <w:p>
+            <w:pPr>
+              <w:rPr/>
+            </w:pPr>
+            <w:r>
+              <w:rPr>
+                <w:rtl w:val="0"/>
+              </w:rPr>
+              <w:t xml:space="preserve">Estado del curso, área SEFIA, temática, metodología, nivel de complejidad y modalidad.</w:t>
+            </w:r>
+          </w:p>
+        </w:tc>
+        <w:tc>
+          <w:tcPr>
+            <w:tcBorders>
+              <w:top w:color="000000" w:space="0" w:sz="0" w:val="nil"/>
+              <w:left w:color="000000" w:space="0" w:sz="0" w:val="nil"/>
+              <w:bottom w:color="bfbfbf" w:space="0" w:sz="4" w:val="single"/>
+              <w:right w:color="bfbfbf" w:space="0" w:sz="4" w:val="single"/>
+            </w:tcBorders>
+            <w:tcMar>
+              <w:top w:w="80.0" w:type="dxa"/>
+              <w:left w:w="140.0" w:type="dxa"/>
+              <w:bottom w:w="80.0" w:type="dxa"/>
+              <w:right w:w="140.0" w:type="dxa"/>
+            </w:tcMar>
+            <w:vAlign w:val="top"/>
+          </w:tcPr>
+          <w:p>
+            <w:pPr>
+              <w:rPr/>
+            </w:pPr>
+            <w:r>
+              <w:rPr>
+                <w:rtl w:val="0"/>
+              </w:rPr>
+              <w:t xml:space="preserve">select con los valores correspondientes.</w:t>
+            </w:r>
+          </w:p>
+        </w:tc>
+      </w:tr>
+      <w:tr>
+        <w:trPr>
+          <w:cantSplit w:val="0"/>
+          <w:trHeight w:val="420" w:hRule="atLeast"/>
+          <w:tblHeader w:val="0"/>
+        </w:trPr>
+        <w:tc>
+          <w:tcPr>
+            <w:tcBorders>
+              <w:top w:color="000000" w:space="0" w:sz="0" w:val="nil"/>
+              <w:left w:color="bfbfbf" w:space="0" w:sz="4" w:val="single"/>
+              <w:bottom w:color="bfbfbf" w:space="0" w:sz="4" w:val="single"/>
+              <w:right w:color="bfbfbf" w:space="0" w:sz="4" w:val="single"/>
+            </w:tcBorders>
+            <w:tcMar>
+              <w:top w:w="80.0" w:type="dxa"/>
+              <w:left w:w="140.0" w:type="dxa"/>
+              <w:bottom w:w="80.0" w:type="dxa"/>
+              <w:right w:w="140.0" w:type="dxa"/>
+            </w:tcMar>
+            <w:vAlign w:val="top"/>
+          </w:tcPr>
+          <w:p>
+            <w:pPr>
+              <w:rPr>
+                <w:b w:val="1"/>
+                <w:bCs w:val="1"/>
+              </w:rPr>
+            </w:pPr>
+            <w:r>
+              <w:rPr>
+                <w:b w:val="1"/>
+                <w:bCs w:val="1"/>
+                <w:rtl w:val="0"/>
+              </w:rPr>
+              <w:t xml:space="preserve">Carga académica</w:t>
+            </w:r>
+          </w:p>
+        </w:tc>
+        <w:tc>
+          <w:tcPr>
+            <w:tcBorders>
+              <w:top w:color="000000" w:space="0" w:sz="0" w:val="nil"/>
+              <w:left w:color="000000" w:space="0" w:sz="0" w:val="nil"/>
+              <w:bottom w:color="bfbfbf" w:space="0" w:sz="4" w:val="single"/>
+              <w:right w:color="bfbfbf" w:space="0" w:sz="4" w:val="single"/>
+            </w:tcBorders>
+            <w:tcMar>
+              <w:top w:w="80.0" w:type="dxa"/>
+              <w:left w:w="140.0" w:type="dxa"/>
+              <w:bottom w:w="80.0" w:type="dxa"/>
+              <w:right w:w="140.0" w:type="dxa"/>
+            </w:tcMar>
+            <w:vAlign w:val="top"/>
+          </w:tcPr>
+          <w:p>
+            <w:pPr>
+              <w:rPr/>
+            </w:pPr>
+            <w:r>
+              <w:rPr>
+                <w:rtl w:val="0"/>
+              </w:rPr>
+              <w:t xml:space="preserve">Créditos, horas de clase, horas extraclase y total de horas.</w:t>
+            </w:r>
+          </w:p>
+        </w:tc>
+        <w:tc>
+          <w:tcPr>
+            <w:tcBorders>
+              <w:top w:color="000000" w:space="0" w:sz="0" w:val="nil"/>
+              <w:left w:color="000000" w:space="0" w:sz="0" w:val="nil"/>
+              <w:bottom w:color="bfbfbf" w:space="0" w:sz="4" w:val="single"/>
+              <w:right w:color="bfbfbf" w:space="0" w:sz="4" w:val="single"/>
+            </w:tcBorders>
+            <w:tcMar>
+              <w:top w:w="80.0" w:type="dxa"/>
+              <w:left w:w="140.0" w:type="dxa"/>
+              <w:bottom w:w="80.0" w:type="dxa"/>
+              <w:right w:w="140.0" w:type="dxa"/>
+            </w:tcMar>
+            <w:vAlign w:val="top"/>
+          </w:tcPr>
+          <w:p>
+            <w:pPr>
+              <w:rPr/>
+            </w:pPr>
+            <w:r>
+              <w:rPr>
+                <w:rtl w:val="0"/>
+              </w:rPr>
+              <w:t xml:space="preserve">input type="number" para los valores editables y output para el total calculado.</w:t>
+            </w:r>
+          </w:p>
+        </w:tc>
+      </w:tr>
+      <w:tr>
+        <w:trPr>
+          <w:cantSplit w:val="0"/>
+          <w:trHeight w:val="420" w:hRule="atLeast"/>
+          <w:tblHeader w:val="0"/>
+        </w:trPr>
+        <w:tc>
+          <w:tcPr>
+            <w:tcBorders>
+              <w:top w:color="000000" w:space="0" w:sz="0" w:val="nil"/>
+              <w:left w:color="bfbfbf" w:space="0" w:sz="4" w:val="single"/>
+              <w:bottom w:color="bfbfbf" w:space="0" w:sz="4" w:val="single"/>
+              <w:right w:color="bfbfbf" w:space="0" w:sz="4" w:val="single"/>
+            </w:tcBorders>
+            <w:tcMar>
+              <w:top w:w="80.0" w:type="dxa"/>
+              <w:left w:w="140.0" w:type="dxa"/>
+              <w:bottom w:w="80.0" w:type="dxa"/>
+              <w:right w:w="140.0" w:type="dxa"/>
+            </w:tcMar>
+            <w:vAlign w:val="top"/>
+          </w:tcPr>
+          <w:p>
+            <w:pPr>
+              <w:rPr>
+                <w:b w:val="1"/>
+                <w:bCs w:val="1"/>
+              </w:rPr>
+            </w:pPr>
+            <w:r>
+              <w:rPr>
+                <w:b w:val="1"/>
+                <w:bCs w:val="1"/>
+                <w:rtl w:val="0"/>
+              </w:rPr>
+              <w:t xml:space="preserve">Power Campus</w:t>
+            </w:r>
+          </w:p>
+        </w:tc>
+        <w:tc>
+          <w:tcPr>
+            <w:tcBorders>
+              <w:top w:color="000000" w:space="0" w:sz="0" w:val="nil"/>
+              <w:left w:color="000000" w:space="0" w:sz="0" w:val="nil"/>
+              <w:bottom w:color="bfbfbf" w:space="0" w:sz="4" w:val="single"/>
+              <w:right w:color="bfbfbf" w:space="0" w:sz="4" w:val="single"/>
+            </w:tcBorders>
+            <w:tcMar>
+              <w:top w:w="80.0" w:type="dxa"/>
+              <w:left w:w="140.0" w:type="dxa"/>
+              <w:bottom w:w="80.0" w:type="dxa"/>
+              <w:right w:w="140.0" w:type="dxa"/>
+            </w:tcMar>
+            <w:vAlign w:val="top"/>
+          </w:tcPr>
+          <w:p>
+            <w:pPr>
+              <w:rPr/>
+            </w:pPr>
+            <w:r>
+              <w:rPr>
+                <w:rtl w:val="0"/>
+              </w:rPr>
+              <w:t xml:space="preserve">Nombre del curso en Power Campus y cantidad de caracteres.</w:t>
+            </w:r>
+          </w:p>
+        </w:tc>
+        <w:tc>
+          <w:tcPr>
+            <w:tcBorders>
+              <w:top w:color="000000" w:space="0" w:sz="0" w:val="nil"/>
+              <w:left w:color="000000" w:space="0" w:sz="0" w:val="nil"/>
+              <w:bottom w:color="bfbfbf" w:space="0" w:sz="4" w:val="single"/>
+              <w:right w:color="bfbfbf" w:space="0" w:sz="4" w:val="single"/>
+            </w:tcBorders>
+            <w:tcMar>
+              <w:top w:w="80.0" w:type="dxa"/>
+              <w:left w:w="140.0" w:type="dxa"/>
+              <w:bottom w:w="80.0" w:type="dxa"/>
+              <w:right w:w="140.0" w:type="dxa"/>
+            </w:tcMar>
+            <w:vAlign w:val="top"/>
+          </w:tcPr>
+          <w:p>
+            <w:pPr>
+              <w:rPr/>
+            </w:pPr>
+            <w:r>
+              <w:rPr>
+                <w:rtl w:val="0"/>
+              </w:rPr>
+              <w:t xml:space="preserve">input type="text" y output para la longitud calculada.</w:t>
+            </w:r>
+          </w:p>
+        </w:tc>
+      </w:tr>
+      <w:tr>
+        <w:trPr>
+          <w:cantSplit w:val="0"/>
+          <w:trHeight w:val="420" w:hRule="atLeast"/>
+          <w:tblHeader w:val="0"/>
+        </w:trPr>
+        <w:tc>
+          <w:tcPr>
+            <w:tcBorders>
+              <w:top w:color="000000" w:space="0" w:sz="0" w:val="nil"/>
+              <w:left w:color="bfbfbf" w:space="0" w:sz="4" w:val="single"/>
+              <w:bottom w:color="bfbfbf" w:space="0" w:sz="4" w:val="single"/>
+              <w:right w:color="bfbfbf" w:space="0" w:sz="4" w:val="single"/>
+            </w:tcBorders>
+            <w:tcMar>
+              <w:top w:w="80.0" w:type="dxa"/>
+              <w:left w:w="140.0" w:type="dxa"/>
+              <w:bottom w:w="80.0" w:type="dxa"/>
+              <w:right w:w="140.0" w:type="dxa"/>
+            </w:tcMar>
+            <w:vAlign w:val="top"/>
+          </w:tcPr>
+          <w:p>
+            <w:pPr>
+              <w:rPr>
+                <w:b w:val="1"/>
+                <w:bCs w:val="1"/>
+              </w:rPr>
+            </w:pPr>
+            <w:r>
+              <w:rPr>
+                <w:b w:val="1"/>
+                <w:bCs w:val="1"/>
+                <w:rtl w:val="0"/>
+              </w:rPr>
+              <w:t xml:space="preserve">Información descriptiva</w:t>
+            </w:r>
+          </w:p>
+        </w:tc>
+        <w:tc>
+          <w:tcPr>
+            <w:tcBorders>
+              <w:top w:color="000000" w:space="0" w:sz="0" w:val="nil"/>
+              <w:left w:color="000000" w:space="0" w:sz="0" w:val="nil"/>
+              <w:bottom w:color="bfbfbf" w:space="0" w:sz="4" w:val="single"/>
+              <w:right w:color="bfbfbf" w:space="0" w:sz="4" w:val="single"/>
+            </w:tcBorders>
+            <w:tcMar>
+              <w:top w:w="80.0" w:type="dxa"/>
+              <w:left w:w="140.0" w:type="dxa"/>
+              <w:bottom w:w="80.0" w:type="dxa"/>
+              <w:right w:w="140.0" w:type="dxa"/>
+            </w:tcMar>
+            <w:vAlign w:val="top"/>
+          </w:tcPr>
+          <w:p>
+            <w:pPr>
+              <w:rPr/>
+            </w:pPr>
+            <w:r>
+              <w:rPr>
+                <w:rtl w:val="0"/>
+              </w:rPr>
+              <w:t xml:space="preserve">Descripción corta, metadescripción, descripción larga, competencia, capacidades específicas, requisitos indispensables y deseables, perfiles de ingreso y salida y palabras clave.</w:t>
+            </w:r>
+          </w:p>
+        </w:tc>
+        <w:tc>
+          <w:tcPr>
+            <w:tcBorders>
+              <w:top w:color="000000" w:space="0" w:sz="0" w:val="nil"/>
+              <w:left w:color="000000" w:space="0" w:sz="0" w:val="nil"/>
+              <w:bottom w:color="bfbfbf" w:space="0" w:sz="4" w:val="single"/>
+              <w:right w:color="bfbfbf" w:space="0" w:sz="4" w:val="single"/>
+            </w:tcBorders>
+            <w:tcMar>
+              <w:top w:w="80.0" w:type="dxa"/>
+              <w:left w:w="140.0" w:type="dxa"/>
+              <w:bottom w:w="80.0" w:type="dxa"/>
+              <w:right w:w="140.0" w:type="dxa"/>
+            </w:tcMar>
+            <w:vAlign w:val="top"/>
+          </w:tcPr>
+          <w:p>
+            <w:pPr>
+              <w:rPr/>
+            </w:pPr>
+            <w:r>
+              <w:rPr>
+                <w:rtl w:val="0"/>
+              </w:rPr>
+              <w:t xml:space="preserve">textarea para los textos extensos e input type="text" para las palabras clave.</w:t>
+            </w:r>
+          </w:p>
+        </w:tc>
+      </w:tr>
+      <w:tr>
+        <w:trPr>
+          <w:cantSplit w:val="0"/>
+          <w:trHeight w:val="420" w:hRule="atLeast"/>
+          <w:tblHeader w:val="0"/>
+        </w:trPr>
+        <w:tc>
+          <w:tcPr>
+            <w:tcBorders>
+              <w:top w:color="000000" w:space="0" w:sz="0" w:val="nil"/>
+              <w:left w:color="bfbfbf" w:space="0" w:sz="4" w:val="single"/>
+              <w:bottom w:color="bfbfbf" w:space="0" w:sz="4" w:val="single"/>
+              <w:right w:color="bfbfbf" w:space="0" w:sz="4" w:val="single"/>
+            </w:tcBorders>
+            <w:tcMar>
+              <w:top w:w="80.0" w:type="dxa"/>
+              <w:left w:w="140.0" w:type="dxa"/>
+              <w:bottom w:w="80.0" w:type="dxa"/>
+              <w:right w:w="140.0" w:type="dxa"/>
+            </w:tcMar>
+            <w:vAlign w:val="top"/>
+          </w:tcPr>
+          <w:p>
+            <w:pPr>
+              <w:rPr>
+                <w:b w:val="1"/>
+                <w:bCs w:val="1"/>
+              </w:rPr>
+            </w:pPr>
+            <w:r>
+              <w:rPr>
+                <w:b w:val="1"/>
+                <w:bCs w:val="1"/>
+                <w:rtl w:val="0"/>
+              </w:rPr>
+              <w:t xml:space="preserve">Información administrativa</w:t>
+            </w:r>
+          </w:p>
+        </w:tc>
+        <w:tc>
+          <w:tcPr>
+            <w:tcBorders>
+              <w:top w:color="000000" w:space="0" w:sz="0" w:val="nil"/>
+              <w:left w:color="000000" w:space="0" w:sz="0" w:val="nil"/>
+              <w:bottom w:color="bfbfbf" w:space="0" w:sz="4" w:val="single"/>
+              <w:right w:color="bfbfbf" w:space="0" w:sz="4" w:val="single"/>
+            </w:tcBorders>
+            <w:tcMar>
+              <w:top w:w="80.0" w:type="dxa"/>
+              <w:left w:w="140.0" w:type="dxa"/>
+              <w:bottom w:w="80.0" w:type="dxa"/>
+              <w:right w:w="140.0" w:type="dxa"/>
+            </w:tcMar>
+            <w:vAlign w:val="top"/>
+          </w:tcPr>
+          <w:p>
+            <w:pPr>
+              <w:rPr/>
+            </w:pPr>
+            <w:r>
+              <w:rPr>
+                <w:rtl w:val="0"/>
+              </w:rPr>
+              <w:t xml:space="preserve">Indicador de e-commerce, período de e-commerce, pertenencia a un programa, nombre del programa y moneda.</w:t>
+            </w:r>
+          </w:p>
+        </w:tc>
+        <w:tc>
+          <w:tcPr>
+            <w:tcBorders>
+              <w:top w:color="000000" w:space="0" w:sz="0" w:val="nil"/>
+              <w:left w:color="000000" w:space="0" w:sz="0" w:val="nil"/>
+              <w:bottom w:color="bfbfbf" w:space="0" w:sz="4" w:val="single"/>
+              <w:right w:color="bfbfbf" w:space="0" w:sz="4" w:val="single"/>
+            </w:tcBorders>
+            <w:tcMar>
+              <w:top w:w="80.0" w:type="dxa"/>
+              <w:left w:w="140.0" w:type="dxa"/>
+              <w:bottom w:w="80.0" w:type="dxa"/>
+              <w:right w:w="140.0" w:type="dxa"/>
+            </w:tcMar>
+            <w:vAlign w:val="top"/>
+          </w:tcPr>
+          <w:p>
+            <w:pPr>
+              <w:rPr/>
+            </w:pPr>
+            <w:r>
+              <w:rPr>
+                <w:rtl w:val="0"/>
+              </w:rPr>
+              <w:t xml:space="preserve">select para las opciones e input type="text" para el período y el nombre del programa.</w:t>
+            </w:r>
+          </w:p>
+        </w:tc>
+      </w:tr>
+      <w:tr>
+        <w:trPr>
+          <w:cantSplit w:val="0"/>
+          <w:trHeight w:val="420" w:hRule="atLeast"/>
+          <w:tblHeader w:val="0"/>
+        </w:trPr>
+        <w:tc>
+          <w:tcPr>
+            <w:tcBorders>
+              <w:top w:color="000000" w:space="0" w:sz="0" w:val="nil"/>
+              <w:left w:color="bfbfbf" w:space="0" w:sz="4" w:val="single"/>
+              <w:bottom w:color="bfbfbf" w:space="0" w:sz="4" w:val="single"/>
+              <w:right w:color="bfbfbf" w:space="0" w:sz="4" w:val="single"/>
+            </w:tcBorders>
+            <w:tcMar>
+              <w:top w:w="80.0" w:type="dxa"/>
+              <w:left w:w="140.0" w:type="dxa"/>
+              <w:bottom w:w="80.0" w:type="dxa"/>
+              <w:right w:w="140.0" w:type="dxa"/>
+            </w:tcMar>
+            <w:vAlign w:val="top"/>
+          </w:tcPr>
+          <w:p>
+            <w:pPr>
+              <w:rPr>
+                <w:b w:val="1"/>
+                <w:bCs w:val="1"/>
+              </w:rPr>
+            </w:pPr>
+            <w:r>
+              <w:rPr>
+                <w:b w:val="1"/>
+                <w:bCs w:val="1"/>
+                <w:rtl w:val="0"/>
+              </w:rPr>
+              <w:t xml:space="preserve">Certificación</w:t>
+            </w:r>
+          </w:p>
+        </w:tc>
+        <w:tc>
+          <w:tcPr>
+            <w:tcBorders>
+              <w:top w:color="000000" w:space="0" w:sz="0" w:val="nil"/>
+              <w:left w:color="000000" w:space="0" w:sz="0" w:val="nil"/>
+              <w:bottom w:color="bfbfbf" w:space="0" w:sz="4" w:val="single"/>
+              <w:right w:color="bfbfbf" w:space="0" w:sz="4" w:val="single"/>
+            </w:tcBorders>
+            <w:tcMar>
+              <w:top w:w="80.0" w:type="dxa"/>
+              <w:left w:w="140.0" w:type="dxa"/>
+              <w:bottom w:w="80.0" w:type="dxa"/>
+              <w:right w:w="140.0" w:type="dxa"/>
+            </w:tcMar>
+            <w:vAlign w:val="top"/>
+          </w:tcPr>
+          <w:p>
+            <w:pPr>
+              <w:rPr/>
+            </w:pPr>
+            <w:r>
+              <w:rPr>
+                <w:rtl w:val="0"/>
+              </w:rPr>
+              <w:t xml:space="preserve">Casa certificadora y nombre de la certificación, cuando corresponda.</w:t>
+            </w:r>
+          </w:p>
+        </w:tc>
+        <w:tc>
+          <w:tcPr>
+            <w:tcBorders>
+              <w:top w:color="000000" w:space="0" w:sz="0" w:val="nil"/>
+              <w:left w:color="000000" w:space="0" w:sz="0" w:val="nil"/>
+              <w:bottom w:color="bfbfbf" w:space="0" w:sz="4" w:val="single"/>
+              <w:right w:color="bfbfbf" w:space="0" w:sz="4" w:val="single"/>
+            </w:tcBorders>
+            <w:tcMar>
+              <w:top w:w="80.0" w:type="dxa"/>
+              <w:left w:w="140.0" w:type="dxa"/>
+              <w:bottom w:w="80.0" w:type="dxa"/>
+              <w:right w:w="140.0" w:type="dxa"/>
+            </w:tcMar>
+            <w:vAlign w:val="top"/>
+          </w:tcPr>
+          <w:p>
+            <w:pPr>
+              <w:rPr/>
+            </w:pPr>
+            <w:r>
+              <w:rPr>
+                <w:rtl w:val="0"/>
+              </w:rPr>
+              <w:t xml:space="preserve">select e input type="text".</w:t>
+            </w:r>
+          </w:p>
+        </w:tc>
+      </w:tr>
+      <w:tr>
+        <w:trPr>
+          <w:cantSplit w:val="0"/>
+          <w:trHeight w:val="420" w:hRule="atLeast"/>
+          <w:tblHeader w:val="0"/>
+        </w:trPr>
+        <w:tc>
+          <w:tcPr>
+            <w:tcBorders>
+              <w:top w:color="000000" w:space="0" w:sz="0" w:val="nil"/>
+              <w:left w:color="bfbfbf" w:space="0" w:sz="4" w:val="single"/>
+              <w:bottom w:color="bfbfbf" w:space="0" w:sz="4" w:val="single"/>
+              <w:right w:color="bfbfbf" w:space="0" w:sz="4" w:val="single"/>
+            </w:tcBorders>
+            <w:tcMar>
+              <w:top w:w="80.0" w:type="dxa"/>
+              <w:left w:w="140.0" w:type="dxa"/>
+              <w:bottom w:w="80.0" w:type="dxa"/>
+              <w:right w:w="140.0" w:type="dxa"/>
+            </w:tcMar>
+            <w:vAlign w:val="top"/>
+          </w:tcPr>
+          <w:p>
+            <w:pPr>
+              <w:rPr>
+                <w:b w:val="1"/>
+                <w:bCs w:val="1"/>
+              </w:rPr>
+            </w:pPr>
+            <w:r>
+              <w:rPr>
+                <w:b w:val="1"/>
+                <w:bCs w:val="1"/>
+                <w:rtl w:val="0"/>
+              </w:rPr>
+              <w:t xml:space="preserve">Información complementaria</w:t>
+            </w:r>
+          </w:p>
+        </w:tc>
+        <w:tc>
+          <w:tcPr>
+            <w:tcBorders>
+              <w:top w:color="000000" w:space="0" w:sz="0" w:val="nil"/>
+              <w:left w:color="000000" w:space="0" w:sz="0" w:val="nil"/>
+              <w:bottom w:color="bfbfbf" w:space="0" w:sz="4" w:val="single"/>
+              <w:right w:color="bfbfbf" w:space="0" w:sz="4" w:val="single"/>
+            </w:tcBorders>
+            <w:tcMar>
+              <w:top w:w="80.0" w:type="dxa"/>
+              <w:left w:w="140.0" w:type="dxa"/>
+              <w:bottom w:w="80.0" w:type="dxa"/>
+              <w:right w:w="140.0" w:type="dxa"/>
+            </w:tcMar>
+            <w:vAlign w:val="top"/>
+          </w:tcPr>
+          <w:p>
+            <w:pPr>
+              <w:rPr/>
+            </w:pPr>
+            <w:r>
+              <w:rPr>
+                <w:rtl w:val="0"/>
+              </w:rPr>
+              <w:t xml:space="preserve">Metadata y fechas de modificación del curso y de la metadata.</w:t>
+            </w:r>
+          </w:p>
+        </w:tc>
+        <w:tc>
+          <w:tcPr>
+            <w:tcBorders>
+              <w:top w:color="000000" w:space="0" w:sz="0" w:val="nil"/>
+              <w:left w:color="000000" w:space="0" w:sz="0" w:val="nil"/>
+              <w:bottom w:color="bfbfbf" w:space="0" w:sz="4" w:val="single"/>
+              <w:right w:color="bfbfbf" w:space="0" w:sz="4" w:val="single"/>
+            </w:tcBorders>
+            <w:tcMar>
+              <w:top w:w="80.0" w:type="dxa"/>
+              <w:left w:w="140.0" w:type="dxa"/>
+              <w:bottom w:w="80.0" w:type="dxa"/>
+              <w:right w:w="140.0" w:type="dxa"/>
+            </w:tcMar>
+            <w:vAlign w:val="top"/>
+          </w:tcPr>
+          <w:p>
+            <w:pPr>
+              <w:rPr/>
+            </w:pPr>
+            <w:r>
+              <w:rPr>
+                <w:rtl w:val="0"/>
+              </w:rPr>
+              <w:t xml:space="preserve">textarea para la metadata y elementos time para mostrar las fechas registradas automáticamente.</w:t>
+            </w:r>
+          </w:p>
+        </w:tc>
+      </w:tr>
+    </w:tbl>
+    <w:p>
+      <w:pPr>
+        <w:rPr/>
+      </w:pPr>
+      <w:r>
+        <w:rPr>
+          <w:rtl w:val="0"/>
+        </w:rPr>
+      </w:r>
+    </w:p>
+    <w:p>
+      <w:pPr>
+        <w:spacing w:after="240" w:before="240" w:lineRule="auto"/>
+        <w:rPr/>
+      </w:pPr>
+      <w:r>
+        <w:rPr>
+          <w:rtl w:val="0"/>
+        </w:rPr>
+        <w:t xml:space="preserve">El formulario permitirá guardar un registro inicial con escuela, código y nombre del curso. Los demás campos podrán completarse posteriormente, manteniendo la validación del formato y los límites de los datos que se ingresen.</w:t>
+      </w:r>
+    </w:p>
+    <w:p>
+      <w:pPr>
+        <w:pStyle w:val="Heading2"/>
+        <w:keepNext w:val="0"/>
+        <w:keepLines w:val="0"/>
+        <w:spacing w:before="220" w:line="240" w:lineRule="auto"/>
+        <w:rPr>
+          <w:b w:val="1"/>
+          <w:bCs w:val="1"/>
+          <w:color w:val="2e75b6"/>
+          <w:sz w:val="25"/>
+          <w:szCs w:val="25"/>
+        </w:rPr>
+      </w:pPr>
+      <w:bookmarkStart w:colFirst="0" w:colLast="0" w:name="_ruzf916lzf4u" w:id="26"/>
+      <w:bookmarkEnd w:id="26"/>
+      <w:r>
+        <w:rPr>
+          <w:b w:val="1"/>
+          <w:bCs w:val="1"/>
+          <w:color w:val="2e75b6"/>
+          <w:sz w:val="25"/>
+          <w:szCs w:val="25"/>
+          <w:rtl w:val="0"/>
+        </w:rPr>
+        <w:t xml:space="preserve">5.3 Atributos de validación nativa</w:t>
+      </w:r>
+    </w:p>
+    <w:p>
+      <w:pPr>
+        <w:rPr/>
+      </w:pPr>
+      <w:r>
+        <w:rPr>
+          <w:rtl w:val="0"/>
+        </w:rPr>
+      </w:r>
+    </w:p>
+    <w:tbl>
+      <w:tblPr>
+        <w:tblStyle w:val="Table9"/>
+        <w:tblW w:w="6956.126506286164" w:type="dxa"/>
+        <w:jc w:val="left"/>
+        <w:tblBorders>
+          <w:top w:color="000000" w:space="0" w:sz="0" w:val="nil"/>
+          <w:left w:color="000000" w:space="0" w:sz="0" w:val="nil"/>
+          <w:bottom w:color="000000" w:space="0" w:sz="0" w:val="nil"/>
+          <w:right w:color="000000" w:space="0" w:sz="0" w:val="nil"/>
+          <w:insideH w:color="000000" w:space="0" w:sz="0" w:val="nil"/>
+          <w:insideV w:color="000000" w:space="0" w:sz="0" w:val="nil"/>
+        </w:tblBorders>
+        <w:tblLayout w:type="fixed"/>
+        <w:tblLook w:val="0600"/>
+      </w:tblPr>
+      <w:tblGrid>
+        <w:gridCol w:w="3478.063253143082"/>
+        <w:gridCol w:w="3478.063253143082"/>
+        <w:tblGridChange w:id="0">
+          <w:tblGrid>
+            <w:gridCol w:w="3478.063253143082"/>
+            <w:gridCol w:w="3478.063253143082"/>
+          </w:tblGrid>
+        </w:tblGridChange>
+      </w:tblGrid>
+      <w:tr>
+        <w:trPr>
+          <w:cantSplit w:val="0"/>
+          <w:trHeight w:val="420" w:hRule="atLeast"/>
+          <w:tblHeader w:val="0"/>
+        </w:trPr>
+        <w:tc>
+          <w:tcPr>
+            <w:tcBorders>
+              <w:top w:color="bfbfbf" w:space="0" w:sz="4" w:val="single"/>
+              <w:left w:color="000000" w:space="0" w:sz="0" w:val="nil"/>
+              <w:bottom w:color="bfbfbf" w:space="0" w:sz="4" w:val="single"/>
+              <w:right w:color="bfbfbf" w:space="0" w:sz="4" w:val="single"/>
+            </w:tcBorders>
+            <w:shd w:fill="1f4e79" w:val="clear"/>
+            <w:tcMar>
+              <w:top w:w="80.0" w:type="dxa"/>
+              <w:left w:w="140.0" w:type="dxa"/>
+              <w:bottom w:w="80.0" w:type="dxa"/>
+              <w:right w:w="140.0" w:type="dxa"/>
+            </w:tcMar>
+            <w:vAlign w:val="top"/>
+          </w:tcPr>
+          <w:p>
+            <w:pPr>
+              <w:rPr>
+                <w:b w:val="1"/>
+                <w:bCs w:val="1"/>
+                <w:color w:val="ffffff"/>
+              </w:rPr>
+            </w:pPr>
+            <w:r>
+              <w:rPr>
+                <w:b w:val="1"/>
+                <w:bCs w:val="1"/>
+                <w:color w:val="ffffff"/>
+                <w:rtl w:val="0"/>
+              </w:rPr>
+              <w:t xml:space="preserve">Atributo</w:t>
+            </w:r>
+          </w:p>
+        </w:tc>
+        <w:tc>
+          <w:tcPr>
+            <w:tcBorders>
+              <w:top w:color="bfbfbf" w:space="0" w:sz="4" w:val="single"/>
+              <w:left w:color="000000" w:space="0" w:sz="0" w:val="nil"/>
+              <w:bottom w:color="bfbfbf" w:space="0" w:sz="4" w:val="single"/>
+              <w:right w:color="bfbfbf" w:space="0" w:sz="4" w:val="single"/>
+            </w:tcBorders>
+            <w:shd w:fill="1f4e79" w:val="clear"/>
+            <w:tcMar>
+              <w:top w:w="80.0" w:type="dxa"/>
+              <w:left w:w="140.0" w:type="dxa"/>
+              <w:bottom w:w="80.0" w:type="dxa"/>
+              <w:right w:w="140.0" w:type="dxa"/>
+            </w:tcMar>
+            <w:vAlign w:val="top"/>
+          </w:tcPr>
+          <w:p>
+            <w:pPr>
+              <w:rPr>
+                <w:b w:val="1"/>
+                <w:bCs w:val="1"/>
+                <w:color w:val="ffffff"/>
+              </w:rPr>
+            </w:pPr>
+            <w:r>
+              <w:rPr>
+                <w:b w:val="1"/>
+                <w:bCs w:val="1"/>
+                <w:color w:val="ffffff"/>
+                <w:rtl w:val="0"/>
+              </w:rPr>
+              <w:t xml:space="preserve">Aplicación</w:t>
+            </w:r>
+          </w:p>
+        </w:tc>
+      </w:tr>
+      <w:tr>
+        <w:trPr>
+          <w:cantSplit w:val="0"/>
+          <w:trHeight w:val="420" w:hRule="atLeast"/>
+          <w:tblHeader w:val="0"/>
+        </w:trPr>
+        <w:tc>
+          <w:tcPr>
+            <w:tcBorders>
+              <w:top w:color="000000" w:space="0" w:sz="0" w:val="nil"/>
+              <w:left w:color="000000" w:space="0" w:sz="0" w:val="nil"/>
+              <w:bottom w:color="bfbfbf" w:space="0" w:sz="4" w:val="single"/>
+              <w:right w:color="bfbfbf" w:space="0" w:sz="4" w:val="single"/>
+            </w:tcBorders>
+            <w:tcMar>
+              <w:top w:w="80.0" w:type="dxa"/>
+              <w:left w:w="140.0" w:type="dxa"/>
+              <w:bottom w:w="80.0" w:type="dxa"/>
+              <w:right w:w="140.0" w:type="dxa"/>
+            </w:tcMar>
+            <w:vAlign w:val="top"/>
+          </w:tcPr>
+          <w:p>
+            <w:pPr>
+              <w:rPr>
+                <w:b w:val="1"/>
+                <w:bCs w:val="1"/>
+              </w:rPr>
+            </w:pPr>
+            <w:r>
+              <w:rPr>
+                <w:b w:val="1"/>
+                <w:bCs w:val="1"/>
+                <w:rtl w:val="0"/>
+              </w:rPr>
+              <w:t xml:space="preserve">required</w:t>
+            </w:r>
+          </w:p>
+        </w:tc>
+        <w:tc>
+          <w:tcPr>
+            <w:tcBorders>
+              <w:top w:color="000000" w:space="0" w:sz="0" w:val="nil"/>
+              <w:left w:color="000000" w:space="0" w:sz="0" w:val="nil"/>
+              <w:bottom w:color="bfbfbf" w:space="0" w:sz="4" w:val="single"/>
+              <w:right w:color="bfbfbf" w:space="0" w:sz="4" w:val="single"/>
+            </w:tcBorders>
+            <w:tcMar>
+              <w:top w:w="80.0" w:type="dxa"/>
+              <w:left w:w="140.0" w:type="dxa"/>
+              <w:bottom w:w="80.0" w:type="dxa"/>
+              <w:right w:w="140.0" w:type="dxa"/>
+            </w:tcMar>
+            <w:vAlign w:val="top"/>
+          </w:tcPr>
+          <w:p>
+            <w:pPr>
+              <w:rPr/>
+            </w:pPr>
+            <w:r>
+              <w:rPr>
+                <w:rtl w:val="0"/>
+              </w:rPr>
+              <w:t xml:space="preserve">Identificar los campos obligatorios de cada formulario. En el guardado inicial de cursos se aplicará a escuela, código y nombre.</w:t>
+            </w:r>
+          </w:p>
+        </w:tc>
+      </w:tr>
+      <w:tr>
+        <w:trPr>
+          <w:cantSplit w:val="0"/>
+          <w:trHeight w:val="420" w:hRule="atLeast"/>
+          <w:tblHeader w:val="0"/>
+        </w:trPr>
+        <w:tc>
+          <w:tcPr>
+            <w:tcBorders>
+              <w:top w:color="000000" w:space="0" w:sz="0" w:val="nil"/>
+              <w:left w:color="000000" w:space="0" w:sz="0" w:val="nil"/>
+              <w:bottom w:color="bfbfbf" w:space="0" w:sz="4" w:val="single"/>
+              <w:right w:color="bfbfbf" w:space="0" w:sz="4" w:val="single"/>
+            </w:tcBorders>
+            <w:tcMar>
+              <w:top w:w="80.0" w:type="dxa"/>
+              <w:left w:w="140.0" w:type="dxa"/>
+              <w:bottom w:w="80.0" w:type="dxa"/>
+              <w:right w:w="140.0" w:type="dxa"/>
+            </w:tcMar>
+            <w:vAlign w:val="top"/>
+          </w:tcPr>
+          <w:p>
+            <w:pPr>
+              <w:rPr>
+                <w:b w:val="1"/>
+                <w:bCs w:val="1"/>
+              </w:rPr>
+            </w:pPr>
+            <w:r>
+              <w:rPr>
+                <w:b w:val="1"/>
+                <w:bCs w:val="1"/>
+                <w:rtl w:val="0"/>
+              </w:rPr>
+              <w:t xml:space="preserve">type="email"</w:t>
+            </w:r>
+          </w:p>
+        </w:tc>
+        <w:tc>
+          <w:tcPr>
+            <w:tcBorders>
+              <w:top w:color="000000" w:space="0" w:sz="0" w:val="nil"/>
+              <w:left w:color="000000" w:space="0" w:sz="0" w:val="nil"/>
+              <w:bottom w:color="bfbfbf" w:space="0" w:sz="4" w:val="single"/>
+              <w:right w:color="bfbfbf" w:space="0" w:sz="4" w:val="single"/>
+            </w:tcBorders>
+            <w:tcMar>
+              <w:top w:w="80.0" w:type="dxa"/>
+              <w:left w:w="140.0" w:type="dxa"/>
+              <w:bottom w:w="80.0" w:type="dxa"/>
+              <w:right w:w="140.0" w:type="dxa"/>
+            </w:tcMar>
+            <w:vAlign w:val="top"/>
+          </w:tcPr>
+          <w:p>
+            <w:pPr>
+              <w:rPr/>
+            </w:pPr>
+            <w:r>
+              <w:rPr>
+                <w:rtl w:val="0"/>
+              </w:rPr>
+              <w:t xml:space="preserve">Comprobar el formato básico de los correos electrónicos.</w:t>
+            </w:r>
+          </w:p>
+        </w:tc>
+      </w:tr>
+      <w:tr>
+        <w:trPr>
+          <w:cantSplit w:val="0"/>
+          <w:trHeight w:val="420" w:hRule="atLeast"/>
+          <w:tblHeader w:val="0"/>
+        </w:trPr>
+        <w:tc>
+          <w:tcPr>
+            <w:tcBorders>
+              <w:top w:color="000000" w:space="0" w:sz="0" w:val="nil"/>
+              <w:left w:color="000000" w:space="0" w:sz="0" w:val="nil"/>
+              <w:bottom w:color="bfbfbf" w:space="0" w:sz="4" w:val="single"/>
+              <w:right w:color="bfbfbf" w:space="0" w:sz="4" w:val="single"/>
+            </w:tcBorders>
+            <w:tcMar>
+              <w:top w:w="80.0" w:type="dxa"/>
+              <w:left w:w="140.0" w:type="dxa"/>
+              <w:bottom w:w="80.0" w:type="dxa"/>
+              <w:right w:w="140.0" w:type="dxa"/>
+            </w:tcMar>
+            <w:vAlign w:val="top"/>
+          </w:tcPr>
+          <w:p>
+            <w:pPr>
+              <w:rPr>
+                <w:b w:val="1"/>
+                <w:bCs w:val="1"/>
+              </w:rPr>
+            </w:pPr>
+            <w:r>
+              <w:rPr>
+                <w:b w:val="1"/>
+                <w:bCs w:val="1"/>
+                <w:rtl w:val="0"/>
+              </w:rPr>
+              <w:t xml:space="preserve">minlength y maxlength</w:t>
+            </w:r>
+          </w:p>
+        </w:tc>
+        <w:tc>
+          <w:tcPr>
+            <w:tcBorders>
+              <w:top w:color="000000" w:space="0" w:sz="0" w:val="nil"/>
+              <w:left w:color="000000" w:space="0" w:sz="0" w:val="nil"/>
+              <w:bottom w:color="bfbfbf" w:space="0" w:sz="4" w:val="single"/>
+              <w:right w:color="bfbfbf" w:space="0" w:sz="4" w:val="single"/>
+            </w:tcBorders>
+            <w:tcMar>
+              <w:top w:w="80.0" w:type="dxa"/>
+              <w:left w:w="140.0" w:type="dxa"/>
+              <w:bottom w:w="80.0" w:type="dxa"/>
+              <w:right w:w="140.0" w:type="dxa"/>
+            </w:tcMar>
+            <w:vAlign w:val="top"/>
+          </w:tcPr>
+          <w:p>
+            <w:pPr>
+              <w:rPr/>
+            </w:pPr>
+            <w:r>
+              <w:rPr>
+                <w:rtl w:val="0"/>
+              </w:rPr>
+              <w:t xml:space="preserve">Establecer una longitud de entre 8 y 15 caracteres para las nuevas contraseñas.</w:t>
+            </w:r>
+          </w:p>
+        </w:tc>
+      </w:tr>
+      <w:tr>
+        <w:trPr>
+          <w:cantSplit w:val="0"/>
+          <w:trHeight w:val="420" w:hRule="atLeast"/>
+          <w:tblHeader w:val="0"/>
+        </w:trPr>
+        <w:tc>
+          <w:tcPr>
+            <w:tcBorders>
+              <w:top w:color="000000" w:space="0" w:sz="0" w:val="nil"/>
+              <w:left w:color="000000" w:space="0" w:sz="0" w:val="nil"/>
+              <w:bottom w:color="bfbfbf" w:space="0" w:sz="4" w:val="single"/>
+              <w:right w:color="bfbfbf" w:space="0" w:sz="4" w:val="single"/>
+            </w:tcBorders>
+            <w:tcMar>
+              <w:top w:w="80.0" w:type="dxa"/>
+              <w:left w:w="140.0" w:type="dxa"/>
+              <w:bottom w:w="80.0" w:type="dxa"/>
+              <w:right w:w="140.0" w:type="dxa"/>
+            </w:tcMar>
+            <w:vAlign w:val="top"/>
+          </w:tcPr>
+          <w:p>
+            <w:pPr>
+              <w:rPr>
+                <w:b w:val="1"/>
+                <w:bCs w:val="1"/>
+              </w:rPr>
+            </w:pPr>
+            <w:r>
+              <w:rPr>
+                <w:b w:val="1"/>
+                <w:bCs w:val="1"/>
+                <w:rtl w:val="0"/>
+              </w:rPr>
+              <w:t xml:space="preserve">maxlength</w:t>
+            </w:r>
+          </w:p>
+        </w:tc>
+        <w:tc>
+          <w:tcPr>
+            <w:tcBorders>
+              <w:top w:color="000000" w:space="0" w:sz="0" w:val="nil"/>
+              <w:left w:color="000000" w:space="0" w:sz="0" w:val="nil"/>
+              <w:bottom w:color="bfbfbf" w:space="0" w:sz="4" w:val="single"/>
+              <w:right w:color="bfbfbf" w:space="0" w:sz="4" w:val="single"/>
+            </w:tcBorders>
+            <w:tcMar>
+              <w:top w:w="80.0" w:type="dxa"/>
+              <w:left w:w="140.0" w:type="dxa"/>
+              <w:bottom w:w="80.0" w:type="dxa"/>
+              <w:right w:w="140.0" w:type="dxa"/>
+            </w:tcMar>
+            <w:vAlign w:val="top"/>
+          </w:tcPr>
+          <w:p>
+            <w:pPr>
+              <w:rPr/>
+            </w:pPr>
+            <w:r>
+              <w:rPr>
+                <w:rtl w:val="0"/>
+              </w:rPr>
+              <w:t xml:space="preserve">Limitar el nombre en Power Campus a 40 caracteres, la descripción corta a 250 y la metadescripción a 155.</w:t>
+            </w:r>
+          </w:p>
+        </w:tc>
+      </w:tr>
+      <w:tr>
+        <w:trPr>
+          <w:cantSplit w:val="0"/>
+          <w:trHeight w:val="420" w:hRule="atLeast"/>
+          <w:tblHeader w:val="0"/>
+        </w:trPr>
+        <w:tc>
+          <w:tcPr>
+            <w:tcBorders>
+              <w:top w:color="000000" w:space="0" w:sz="0" w:val="nil"/>
+              <w:left w:color="000000" w:space="0" w:sz="0" w:val="nil"/>
+              <w:bottom w:color="bfbfbf" w:space="0" w:sz="4" w:val="single"/>
+              <w:right w:color="bfbfbf" w:space="0" w:sz="4" w:val="single"/>
+            </w:tcBorders>
+            <w:tcMar>
+              <w:top w:w="80.0" w:type="dxa"/>
+              <w:left w:w="140.0" w:type="dxa"/>
+              <w:bottom w:w="80.0" w:type="dxa"/>
+              <w:right w:w="140.0" w:type="dxa"/>
+            </w:tcMar>
+            <w:vAlign w:val="top"/>
+          </w:tcPr>
+          <w:p>
+            <w:pPr>
+              <w:rPr>
+                <w:b w:val="1"/>
+                <w:bCs w:val="1"/>
+              </w:rPr>
+            </w:pPr>
+            <w:r>
+              <w:rPr>
+                <w:b w:val="1"/>
+                <w:bCs w:val="1"/>
+                <w:rtl w:val="0"/>
+              </w:rPr>
+              <w:t xml:space="preserve">pattern</w:t>
+            </w:r>
+          </w:p>
+        </w:tc>
+        <w:tc>
+          <w:tcPr>
+            <w:tcBorders>
+              <w:top w:color="000000" w:space="0" w:sz="0" w:val="nil"/>
+              <w:left w:color="000000" w:space="0" w:sz="0" w:val="nil"/>
+              <w:bottom w:color="bfbfbf" w:space="0" w:sz="4" w:val="single"/>
+              <w:right w:color="bfbfbf" w:space="0" w:sz="4" w:val="single"/>
+            </w:tcBorders>
+            <w:tcMar>
+              <w:top w:w="80.0" w:type="dxa"/>
+              <w:left w:w="140.0" w:type="dxa"/>
+              <w:bottom w:w="80.0" w:type="dxa"/>
+              <w:right w:w="140.0" w:type="dxa"/>
+            </w:tcMar>
+            <w:vAlign w:val="top"/>
+          </w:tcPr>
+          <w:p>
+            <w:pPr>
+              <w:rPr/>
+            </w:pPr>
+            <w:r>
+              <w:rPr>
+                <w:rtl w:val="0"/>
+              </w:rPr>
+              <w:t xml:space="preserve">Aplicar los patrones definidos para las nuevas contraseñas y los códigos numéricos editables de los catálogos.</w:t>
+            </w:r>
+          </w:p>
+        </w:tc>
+      </w:tr>
+      <w:tr>
+        <w:trPr>
+          <w:cantSplit w:val="0"/>
+          <w:trHeight w:val="420" w:hRule="atLeast"/>
+          <w:tblHeader w:val="0"/>
+        </w:trPr>
+        <w:tc>
+          <w:tcPr>
+            <w:tcBorders>
+              <w:top w:color="000000" w:space="0" w:sz="0" w:val="nil"/>
+              <w:left w:color="000000" w:space="0" w:sz="0" w:val="nil"/>
+              <w:bottom w:color="bfbfbf" w:space="0" w:sz="4" w:val="single"/>
+              <w:right w:color="bfbfbf" w:space="0" w:sz="4" w:val="single"/>
+            </w:tcBorders>
+            <w:tcMar>
+              <w:top w:w="80.0" w:type="dxa"/>
+              <w:left w:w="140.0" w:type="dxa"/>
+              <w:bottom w:w="80.0" w:type="dxa"/>
+              <w:right w:w="140.0" w:type="dxa"/>
+            </w:tcMar>
+            <w:vAlign w:val="top"/>
+          </w:tcPr>
+          <w:p>
+            <w:pPr>
+              <w:rPr>
+                <w:b w:val="1"/>
+                <w:bCs w:val="1"/>
+              </w:rPr>
+            </w:pPr>
+            <w:r>
+              <w:rPr>
+                <w:b w:val="1"/>
+                <w:bCs w:val="1"/>
+                <w:rtl w:val="0"/>
+              </w:rPr>
+              <w:t xml:space="preserve">min, max y step</w:t>
+            </w:r>
+          </w:p>
+        </w:tc>
+        <w:tc>
+          <w:tcPr>
+            <w:tcBorders>
+              <w:top w:color="000000" w:space="0" w:sz="0" w:val="nil"/>
+              <w:left w:color="000000" w:space="0" w:sz="0" w:val="nil"/>
+              <w:bottom w:color="bfbfbf" w:space="0" w:sz="4" w:val="single"/>
+              <w:right w:color="bfbfbf" w:space="0" w:sz="4" w:val="single"/>
+            </w:tcBorders>
+            <w:tcMar>
+              <w:top w:w="80.0" w:type="dxa"/>
+              <w:left w:w="140.0" w:type="dxa"/>
+              <w:bottom w:w="80.0" w:type="dxa"/>
+              <w:right w:w="140.0" w:type="dxa"/>
+            </w:tcMar>
+            <w:vAlign w:val="top"/>
+          </w:tcPr>
+          <w:p>
+            <w:pPr>
+              <w:rPr/>
+            </w:pPr>
+            <w:r>
+              <w:rPr>
+                <w:rtl w:val="0"/>
+              </w:rPr>
+              <w:t xml:space="preserve">Aplicar los rangos e incrementos de números o fechas cuando estén definidos en las reglas de validación.</w:t>
+            </w:r>
+          </w:p>
+        </w:tc>
+      </w:tr>
+      <w:tr>
+        <w:trPr>
+          <w:cantSplit w:val="0"/>
+          <w:trHeight w:val="420" w:hRule="atLeast"/>
+          <w:tblHeader w:val="0"/>
+        </w:trPr>
+        <w:tc>
+          <w:tcPr>
+            <w:tcBorders>
+              <w:top w:color="000000" w:space="0" w:sz="0" w:val="nil"/>
+              <w:left w:color="000000" w:space="0" w:sz="0" w:val="nil"/>
+              <w:bottom w:color="bfbfbf" w:space="0" w:sz="4" w:val="single"/>
+              <w:right w:color="bfbfbf" w:space="0" w:sz="4" w:val="single"/>
+            </w:tcBorders>
+            <w:tcMar>
+              <w:top w:w="80.0" w:type="dxa"/>
+              <w:left w:w="140.0" w:type="dxa"/>
+              <w:bottom w:w="80.0" w:type="dxa"/>
+              <w:right w:w="140.0" w:type="dxa"/>
+            </w:tcMar>
+            <w:vAlign w:val="top"/>
+          </w:tcPr>
+          <w:p>
+            <w:pPr>
+              <w:rPr>
+                <w:b w:val="1"/>
+                <w:bCs w:val="1"/>
+              </w:rPr>
+            </w:pPr>
+            <w:r>
+              <w:rPr>
+                <w:b w:val="1"/>
+                <w:bCs w:val="1"/>
+                <w:rtl w:val="0"/>
+              </w:rPr>
+              <w:t xml:space="preserve">accept="image/*"</w:t>
+            </w:r>
+          </w:p>
+        </w:tc>
+        <w:tc>
+          <w:tcPr>
+            <w:tcBorders>
+              <w:top w:color="000000" w:space="0" w:sz="0" w:val="nil"/>
+              <w:left w:color="000000" w:space="0" w:sz="0" w:val="nil"/>
+              <w:bottom w:color="bfbfbf" w:space="0" w:sz="4" w:val="single"/>
+              <w:right w:color="bfbfbf" w:space="0" w:sz="4" w:val="single"/>
+            </w:tcBorders>
+            <w:tcMar>
+              <w:top w:w="80.0" w:type="dxa"/>
+              <w:left w:w="140.0" w:type="dxa"/>
+              <w:bottom w:w="80.0" w:type="dxa"/>
+              <w:right w:w="140.0" w:type="dxa"/>
+            </w:tcMar>
+            <w:vAlign w:val="top"/>
+          </w:tcPr>
+          <w:p>
+            <w:pPr>
+              <w:rPr/>
+            </w:pPr>
+            <w:r>
+              <w:rPr>
+                <w:rtl w:val="0"/>
+              </w:rPr>
+              <w:t xml:space="preserve">Orientar la selección de la imagen de perfil hacia archivos de imagen.</w:t>
+            </w:r>
+          </w:p>
+        </w:tc>
+      </w:tr>
+    </w:tbl>
     <w:p>
       <w:pPr>
         <w:rPr/>
@@ -4188,6 +8393,54 @@
     </w:tblPr>
   </w:style>
   <w:style w:type="table" w:styleId="Table3">
+    <w:basedOn w:val="TableNormal"/>
+    <w:tblPr>
+      <w:tblStyleRowBandSize w:val="1"/>
+      <w:tblStyleColBandSize w:val="1"/>
+      <w:tblCellMar/>
+    </w:tblPr>
+  </w:style>
+  <w:style w:type="table" w:styleId="Table4">
+    <w:basedOn w:val="TableNormal"/>
+    <w:tblPr>
+      <w:tblStyleRowBandSize w:val="1"/>
+      <w:tblStyleColBandSize w:val="1"/>
+      <w:tblCellMar/>
+    </w:tblPr>
+  </w:style>
+  <w:style w:type="table" w:styleId="Table5">
+    <w:basedOn w:val="TableNormal"/>
+    <w:tblPr>
+      <w:tblStyleRowBandSize w:val="1"/>
+      <w:tblStyleColBandSize w:val="1"/>
+      <w:tblCellMar/>
+    </w:tblPr>
+  </w:style>
+  <w:style w:type="table" w:styleId="Table6">
+    <w:basedOn w:val="TableNormal"/>
+    <w:tblPr>
+      <w:tblStyleRowBandSize w:val="1"/>
+      <w:tblStyleColBandSize w:val="1"/>
+      <w:tblCellMar/>
+    </w:tblPr>
+  </w:style>
+  <w:style w:type="table" w:styleId="Table7">
+    <w:basedOn w:val="TableNormal"/>
+    <w:tblPr>
+      <w:tblStyleRowBandSize w:val="1"/>
+      <w:tblStyleColBandSize w:val="1"/>
+      <w:tblCellMar/>
+    </w:tblPr>
+  </w:style>
+  <w:style w:type="table" w:styleId="Table8">
+    <w:basedOn w:val="TableNormal"/>
+    <w:tblPr>
+      <w:tblStyleRowBandSize w:val="1"/>
+      <w:tblStyleColBandSize w:val="1"/>
+      <w:tblCellMar/>
+    </w:tblPr>
+  </w:style>
+  <w:style w:type="table" w:styleId="Table9">
     <w:basedOn w:val="TableNormal"/>
     <w:tblPr>
       <w:tblStyleRowBandSize w:val="1"/>

</xml_diff>

<commit_message>
Rediseña los bocetos de la interfaz
</commit_message>
<xml_diff>
--- a/Documento de diseno Iteracion 1.docx
+++ b/Documento de diseno Iteracion 1.docx
@@ -3933,7 +3933,7 @@
           <w:color w:val="000000"/>
           <w:sz w:val="22"/>
         </w:rPr>
-        <w:t>La interfaz del Sistema de Gestión Curricular utilizará una estructura común para consultar registros y completar formularios. Se propone una presentación sobria, con fondos claros, navegación azul y acciones fáciles de reconocer. Las pantallas administrativas conservarán el menú, el título de la vista y la identificación del administrador.</w:t>
+        <w:t>La interfaz del Sistema de Gestión Curricular combinará una identidad institucional común con composiciones propias para cada tarea. La presentación tendrá una composición editorial; el panel priorizará los módulos; los listados facilitarán la comparación de registros; y los formularios agruparán la información por secciones. El azul, la tipografía y los controles conectarán las vistas sin repetir la misma distribución en todas las pantallas.</w:t>
       </w:r>
     </w:p>
     <w:p>
@@ -4267,7 +4267,7 @@
           <w:color w:val="000000"/>
           <w:sz w:val="21"/>
         </w:rPr>
-        <w:t>El formulario agrupa datos personales, contacto y acceso, e incluye imagen opcional y edad calculada. El rol procede de opciones predefinidas; para el prototipo funcional se utilizará administrador. Los ocho catálogos tienen el mismo patrón de acceso.</w:t>
+        <w:t>El formulario distingue el perfil de los grupos de datos personales, contacto y acceso. La imagen es opcional y la edad se calcula. El rol procede de opciones predefinidas; el prototipo funcional utilizará administrador. Los ocho catálogos se presentan con iconos y nombres, agrupados según su relación con la estructura institucional o el diseño académico.</w:t>
       </w:r>
     </w:p>
     <w:p>
@@ -4567,7 +4567,7 @@
           <w:color w:val="000000"/>
           <w:sz w:val="21"/>
         </w:rPr>
-        <w:t>El detalle conserva el orden del formulario y distingue información registrada de datos pendientes. La aprobación depende de completar los datos obligatorios según la sección 7.3. En móvil, navegación, campos y botones se apilan sin ocultar información.</w:t>
+        <w:t>El detalle destaca la identidad y el estado del curso, y diferencia descripción, clasificación y carga académica. Los datos faltantes se indican como pendientes. La aprobación depende de completar los datos obligatorios según 7.3. En móvil se muestran el formulario en una columna y el listado con desplazamiento horizontal limitado a la tabla.</w:t>
       </w:r>
     </w:p>
     <w:p>

</xml_diff>

<commit_message>
Actualiza el documento de diseño de la iteración 1
</commit_message>
<xml_diff>
--- a/Documento de diseno Iteracion 1.docx
+++ b/Documento de diseno Iteracion 1.docx
@@ -22,12 +22,12 @@
           <wp:inline distB="0" distT="0" distL="0" distR="0">
             <wp:extent cx="1865630" cy="902335"/>
             <wp:effectExtent b="0" l="0" r="0" t="0"/>
-            <wp:docPr id="5" name="image3.png"/>
+            <wp:docPr id="5" name="image2.png"/>
             <a:graphic>
               <a:graphicData uri="http://schemas.openxmlformats.org/drawingml/2006/picture">
                 <pic:pic>
                   <pic:nvPicPr>
-                    <pic:cNvPr id="0" name="image3.png"/>
+                    <pic:cNvPr id="0" name="image2.png"/>
                     <pic:cNvPicPr preferRelativeResize="0"/>
                   </pic:nvPicPr>
                   <pic:blipFill>
@@ -351,7 +351,7 @@
     </w:p>
     <w:sdt>
       <w:sdtPr>
-        <w:id w:val="-1343003638"/>
+        <w:id w:val="-564679941"/>
         <w:docPartObj>
           <w:docPartGallery w:val="Table of Contents"/>
           <w:docPartUnique w:val="1"/>
@@ -362,7 +362,7 @@
           <w:pPr>
             <w:widowControl w:val="0"/>
             <w:tabs>
-              <w:tab w:val="right" w:leader="dot" w:pos="9025.511811023624"/>
+              <w:tab w:val="right" w:leader="dot" w:pos="12000"/>
             </w:tabs>
             <w:spacing w:before="60" w:line="240" w:lineRule="auto"/>
             <w:rPr>
@@ -380,32 +380,26 @@
           <w:hyperlink w:anchor="">
             <w:r>
               <w:rPr>
+                <w:rFonts w:ascii="Arial" w:cs="Arial" w:eastAsia="Arial" w:hAnsi="Arial"/>
                 <w:b w:val="1"/>
                 <w:bCs w:val="1"/>
+                <w:i w:val="0"/>
+                <w:iCs w:val="0"/>
+                <w:smallCaps w:val="0"/>
+                <w:strike w:val="0"/>
                 <w:color w:val="000000"/>
+                <w:sz w:val="22"/>
+                <w:szCs w:val="22"/>
                 <w:u w:val="none"/>
+                <w:shd w:fill="auto" w:val="clear"/>
+                <w:vertAlign w:val="baseline"/>
                 <w:rtl w:val="0"/>
               </w:rPr>
               <w:t xml:space="preserve">Tabla de contenidos</w:t>
               <w:tab/>
+              <w:t xml:space="preserve">2</w:t>
             </w:r>
           </w:hyperlink>
-          <w:r>
-            <w:fldChar w:fldCharType="begin"/>
-            <w:instrText xml:space="preserve"> PAGEREF  \h </w:instrText>
-            <w:fldChar w:fldCharType="separate"/>
-          </w:r>
-          <w:r>
-            <w:rPr>
-              <w:b w:val="1"/>
-              <w:bCs w:val="1"/>
-              <w:rtl w:val="0"/>
-            </w:rPr>
-            <w:t xml:space="preserve">2</w:t>
-          </w:r>
-          <w:r>
-            <w:fldChar w:fldCharType="end"/>
-          </w:r>
           <w:r>
             <w:rPr>
               <w:rtl w:val="0"/>
@@ -416,7 +410,7 @@
           <w:pPr>
             <w:widowControl w:val="0"/>
             <w:tabs>
-              <w:tab w:val="right" w:leader="dot" w:pos="9025.511811023624"/>
+              <w:tab w:val="right" w:leader="dot" w:pos="12000"/>
             </w:tabs>
             <w:spacing w:before="60" w:line="240" w:lineRule="auto"/>
             <w:rPr>
@@ -429,32 +423,26 @@
           <w:hyperlink w:anchor="">
             <w:r>
               <w:rPr>
+                <w:rFonts w:ascii="Arial" w:cs="Arial" w:eastAsia="Arial" w:hAnsi="Arial"/>
                 <w:b w:val="1"/>
                 <w:bCs w:val="1"/>
+                <w:i w:val="0"/>
+                <w:iCs w:val="0"/>
+                <w:smallCaps w:val="0"/>
+                <w:strike w:val="0"/>
                 <w:color w:val="000000"/>
+                <w:sz w:val="22"/>
+                <w:szCs w:val="22"/>
                 <w:u w:val="none"/>
+                <w:shd w:fill="auto" w:val="clear"/>
+                <w:vertAlign w:val="baseline"/>
                 <w:rtl w:val="0"/>
               </w:rPr>
               <w:t xml:space="preserve">1. Introducción</w:t>
               <w:tab/>
+              <w:t xml:space="preserve">4</w:t>
             </w:r>
           </w:hyperlink>
-          <w:r>
-            <w:fldChar w:fldCharType="begin"/>
-            <w:instrText xml:space="preserve"> PAGEREF  \h </w:instrText>
-            <w:fldChar w:fldCharType="separate"/>
-          </w:r>
-          <w:r>
-            <w:rPr>
-              <w:b w:val="1"/>
-              <w:bCs w:val="1"/>
-              <w:rtl w:val="0"/>
-            </w:rPr>
-            <w:t xml:space="preserve">4</w:t>
-          </w:r>
-          <w:r>
-            <w:fldChar w:fldCharType="end"/>
-          </w:r>
           <w:r>
             <w:rPr>
               <w:rtl w:val="0"/>
@@ -465,7 +453,7 @@
           <w:pPr>
             <w:widowControl w:val="0"/>
             <w:tabs>
-              <w:tab w:val="right" w:leader="dot" w:pos="9025.511811023624"/>
+              <w:tab w:val="right" w:leader="dot" w:pos="12000"/>
             </w:tabs>
             <w:spacing w:before="60" w:line="240" w:lineRule="auto"/>
             <w:ind w:left="360" w:firstLine="0"/>
@@ -477,28 +465,26 @@
           <w:hyperlink w:anchor="_yjmij7bdvb8s">
             <w:r>
               <w:rPr>
+                <w:rFonts w:ascii="Arial" w:cs="Arial" w:eastAsia="Arial" w:hAnsi="Arial"/>
+                <w:b w:val="0"/>
+                <w:bCs w:val="0"/>
+                <w:i w:val="0"/>
+                <w:iCs w:val="0"/>
+                <w:smallCaps w:val="0"/>
+                <w:strike w:val="0"/>
                 <w:color w:val="000000"/>
+                <w:sz w:val="22"/>
+                <w:szCs w:val="22"/>
                 <w:u w:val="none"/>
+                <w:shd w:fill="auto" w:val="clear"/>
+                <w:vertAlign w:val="baseline"/>
                 <w:rtl w:val="0"/>
               </w:rPr>
               <w:t xml:space="preserve">1.1 Propósito</w:t>
               <w:tab/>
+              <w:t xml:space="preserve">4</w:t>
             </w:r>
           </w:hyperlink>
-          <w:r>
-            <w:fldChar w:fldCharType="begin"/>
-            <w:instrText xml:space="preserve"> PAGEREF _yjmij7bdvb8s \h </w:instrText>
-            <w:fldChar w:fldCharType="separate"/>
-          </w:r>
-          <w:r>
-            <w:rPr>
-              <w:rtl w:val="0"/>
-            </w:rPr>
-            <w:t xml:space="preserve">4</w:t>
-          </w:r>
-          <w:r>
-            <w:fldChar w:fldCharType="end"/>
-          </w:r>
           <w:r>
             <w:rPr>
               <w:rtl w:val="0"/>
@@ -509,7 +495,7 @@
           <w:pPr>
             <w:widowControl w:val="0"/>
             <w:tabs>
-              <w:tab w:val="right" w:leader="dot" w:pos="9025.511811023624"/>
+              <w:tab w:val="right" w:leader="dot" w:pos="12000"/>
             </w:tabs>
             <w:spacing w:before="60" w:line="240" w:lineRule="auto"/>
             <w:ind w:left="360" w:firstLine="0"/>
@@ -521,28 +507,26 @@
           <w:hyperlink w:anchor="_qag7rdnewzf9">
             <w:r>
               <w:rPr>
+                <w:rFonts w:ascii="Arial" w:cs="Arial" w:eastAsia="Arial" w:hAnsi="Arial"/>
+                <w:b w:val="0"/>
+                <w:bCs w:val="0"/>
+                <w:i w:val="0"/>
+                <w:iCs w:val="0"/>
+                <w:smallCaps w:val="0"/>
+                <w:strike w:val="0"/>
                 <w:color w:val="000000"/>
+                <w:sz w:val="22"/>
+                <w:szCs w:val="22"/>
                 <w:u w:val="none"/>
+                <w:shd w:fill="auto" w:val="clear"/>
+                <w:vertAlign w:val="baseline"/>
                 <w:rtl w:val="0"/>
               </w:rPr>
               <w:t xml:space="preserve">1.2 Alcance</w:t>
               <w:tab/>
+              <w:t xml:space="preserve">4</w:t>
             </w:r>
           </w:hyperlink>
-          <w:r>
-            <w:fldChar w:fldCharType="begin"/>
-            <w:instrText xml:space="preserve"> PAGEREF _qag7rdnewzf9 \h </w:instrText>
-            <w:fldChar w:fldCharType="separate"/>
-          </w:r>
-          <w:r>
-            <w:rPr>
-              <w:rtl w:val="0"/>
-            </w:rPr>
-            <w:t xml:space="preserve">4</w:t>
-          </w:r>
-          <w:r>
-            <w:fldChar w:fldCharType="end"/>
-          </w:r>
           <w:r>
             <w:rPr>
               <w:rtl w:val="0"/>
@@ -553,7 +537,7 @@
           <w:pPr>
             <w:widowControl w:val="0"/>
             <w:tabs>
-              <w:tab w:val="right" w:leader="dot" w:pos="9025.511811023624"/>
+              <w:tab w:val="right" w:leader="dot" w:pos="12000"/>
             </w:tabs>
             <w:spacing w:before="60" w:line="240" w:lineRule="auto"/>
             <w:ind w:left="360" w:firstLine="0"/>
@@ -565,28 +549,26 @@
           <w:hyperlink w:anchor="_3xh4dieqcta5">
             <w:r>
               <w:rPr>
+                <w:rFonts w:ascii="Arial" w:cs="Arial" w:eastAsia="Arial" w:hAnsi="Arial"/>
+                <w:b w:val="0"/>
+                <w:bCs w:val="0"/>
+                <w:i w:val="0"/>
+                <w:iCs w:val="0"/>
+                <w:smallCaps w:val="0"/>
+                <w:strike w:val="0"/>
                 <w:color w:val="000000"/>
+                <w:sz w:val="22"/>
+                <w:szCs w:val="22"/>
                 <w:u w:val="none"/>
+                <w:shd w:fill="auto" w:val="clear"/>
+                <w:vertAlign w:val="baseline"/>
                 <w:rtl w:val="0"/>
               </w:rPr>
               <w:t xml:space="preserve">1.3 Definiciones, acrónimos y abreviaturas</w:t>
               <w:tab/>
+              <w:t xml:space="preserve">4</w:t>
             </w:r>
           </w:hyperlink>
-          <w:r>
-            <w:fldChar w:fldCharType="begin"/>
-            <w:instrText xml:space="preserve"> PAGEREF _3xh4dieqcta5 \h </w:instrText>
-            <w:fldChar w:fldCharType="separate"/>
-          </w:r>
-          <w:r>
-            <w:rPr>
-              <w:rtl w:val="0"/>
-            </w:rPr>
-            <w:t xml:space="preserve">4</w:t>
-          </w:r>
-          <w:r>
-            <w:fldChar w:fldCharType="end"/>
-          </w:r>
           <w:r>
             <w:rPr>
               <w:rtl w:val="0"/>
@@ -597,7 +579,7 @@
           <w:pPr>
             <w:widowControl w:val="0"/>
             <w:tabs>
-              <w:tab w:val="right" w:leader="dot" w:pos="9025.511811023624"/>
+              <w:tab w:val="right" w:leader="dot" w:pos="12000"/>
             </w:tabs>
             <w:spacing w:before="60" w:line="240" w:lineRule="auto"/>
             <w:rPr>
@@ -610,32 +592,26 @@
           <w:hyperlink w:anchor="_lowz6eqyxpin">
             <w:r>
               <w:rPr>
+                <w:rFonts w:ascii="Arial" w:cs="Arial" w:eastAsia="Arial" w:hAnsi="Arial"/>
                 <w:b w:val="1"/>
                 <w:bCs w:val="1"/>
+                <w:i w:val="0"/>
+                <w:iCs w:val="0"/>
+                <w:smallCaps w:val="0"/>
+                <w:strike w:val="0"/>
                 <w:color w:val="000000"/>
+                <w:sz w:val="22"/>
+                <w:szCs w:val="22"/>
                 <w:u w:val="none"/>
+                <w:shd w:fill="auto" w:val="clear"/>
+                <w:vertAlign w:val="baseline"/>
                 <w:rtl w:val="0"/>
               </w:rPr>
               <w:t xml:space="preserve">2. Descripción General del Diseño</w:t>
               <w:tab/>
+              <w:t xml:space="preserve">5</w:t>
             </w:r>
           </w:hyperlink>
-          <w:r>
-            <w:fldChar w:fldCharType="begin"/>
-            <w:instrText xml:space="preserve"> PAGEREF _lowz6eqyxpin \h </w:instrText>
-            <w:fldChar w:fldCharType="separate"/>
-          </w:r>
-          <w:r>
-            <w:rPr>
-              <w:b w:val="1"/>
-              <w:bCs w:val="1"/>
-              <w:rtl w:val="0"/>
-            </w:rPr>
-            <w:t xml:space="preserve">5</w:t>
-          </w:r>
-          <w:r>
-            <w:fldChar w:fldCharType="end"/>
-          </w:r>
           <w:r>
             <w:rPr>
               <w:rtl w:val="0"/>
@@ -646,7 +622,7 @@
           <w:pPr>
             <w:widowControl w:val="0"/>
             <w:tabs>
-              <w:tab w:val="right" w:leader="dot" w:pos="9025.511811023624"/>
+              <w:tab w:val="right" w:leader="dot" w:pos="12000"/>
             </w:tabs>
             <w:spacing w:before="60" w:line="240" w:lineRule="auto"/>
             <w:ind w:left="360" w:firstLine="0"/>
@@ -658,28 +634,26 @@
           <w:hyperlink w:anchor="_2z8x59ybht1t">
             <w:r>
               <w:rPr>
+                <w:rFonts w:ascii="Arial" w:cs="Arial" w:eastAsia="Arial" w:hAnsi="Arial"/>
+                <w:b w:val="0"/>
+                <w:bCs w:val="0"/>
+                <w:i w:val="0"/>
+                <w:iCs w:val="0"/>
+                <w:smallCaps w:val="0"/>
+                <w:strike w:val="0"/>
                 <w:color w:val="000000"/>
+                <w:sz w:val="22"/>
+                <w:szCs w:val="22"/>
                 <w:u w:val="none"/>
+                <w:shd w:fill="auto" w:val="clear"/>
+                <w:vertAlign w:val="baseline"/>
                 <w:rtl w:val="0"/>
               </w:rPr>
               <w:t xml:space="preserve">2.1 Visión del producto</w:t>
               <w:tab/>
+              <w:t xml:space="preserve">5</w:t>
             </w:r>
           </w:hyperlink>
-          <w:r>
-            <w:fldChar w:fldCharType="begin"/>
-            <w:instrText xml:space="preserve"> PAGEREF _2z8x59ybht1t \h </w:instrText>
-            <w:fldChar w:fldCharType="separate"/>
-          </w:r>
-          <w:r>
-            <w:rPr>
-              <w:rtl w:val="0"/>
-            </w:rPr>
-            <w:t xml:space="preserve">5</w:t>
-          </w:r>
-          <w:r>
-            <w:fldChar w:fldCharType="end"/>
-          </w:r>
           <w:r>
             <w:rPr>
               <w:rtl w:val="0"/>
@@ -690,7 +664,7 @@
           <w:pPr>
             <w:widowControl w:val="0"/>
             <w:tabs>
-              <w:tab w:val="right" w:leader="dot" w:pos="9025.511811023624"/>
+              <w:tab w:val="right" w:leader="dot" w:pos="12000"/>
             </w:tabs>
             <w:spacing w:before="60" w:line="240" w:lineRule="auto"/>
             <w:ind w:left="360" w:firstLine="0"/>
@@ -702,28 +676,26 @@
           <w:hyperlink w:anchor="_5slpk3nrdguf">
             <w:r>
               <w:rPr>
+                <w:rFonts w:ascii="Arial" w:cs="Arial" w:eastAsia="Arial" w:hAnsi="Arial"/>
+                <w:b w:val="0"/>
+                <w:bCs w:val="0"/>
+                <w:i w:val="0"/>
+                <w:iCs w:val="0"/>
+                <w:smallCaps w:val="0"/>
+                <w:strike w:val="0"/>
                 <w:color w:val="000000"/>
+                <w:sz w:val="22"/>
+                <w:szCs w:val="22"/>
                 <w:u w:val="none"/>
+                <w:shd w:fill="auto" w:val="clear"/>
+                <w:vertAlign w:val="baseline"/>
                 <w:rtl w:val="0"/>
               </w:rPr>
               <w:t xml:space="preserve">2.2 Objetivos del diseño</w:t>
               <w:tab/>
+              <w:t xml:space="preserve">5</w:t>
             </w:r>
           </w:hyperlink>
-          <w:r>
-            <w:fldChar w:fldCharType="begin"/>
-            <w:instrText xml:space="preserve"> PAGEREF _5slpk3nrdguf \h </w:instrText>
-            <w:fldChar w:fldCharType="separate"/>
-          </w:r>
-          <w:r>
-            <w:rPr>
-              <w:rtl w:val="0"/>
-            </w:rPr>
-            <w:t xml:space="preserve">5</w:t>
-          </w:r>
-          <w:r>
-            <w:fldChar w:fldCharType="end"/>
-          </w:r>
           <w:r>
             <w:rPr>
               <w:rtl w:val="0"/>
@@ -734,7 +706,7 @@
           <w:pPr>
             <w:widowControl w:val="0"/>
             <w:tabs>
-              <w:tab w:val="right" w:leader="dot" w:pos="9025.511811023624"/>
+              <w:tab w:val="right" w:leader="dot" w:pos="12000"/>
             </w:tabs>
             <w:spacing w:before="60" w:line="240" w:lineRule="auto"/>
             <w:ind w:left="360" w:firstLine="0"/>
@@ -746,28 +718,26 @@
           <w:hyperlink w:anchor="_1kk0wq113n0i">
             <w:r>
               <w:rPr>
+                <w:rFonts w:ascii="Arial" w:cs="Arial" w:eastAsia="Arial" w:hAnsi="Arial"/>
+                <w:b w:val="0"/>
+                <w:bCs w:val="0"/>
+                <w:i w:val="0"/>
+                <w:iCs w:val="0"/>
+                <w:smallCaps w:val="0"/>
+                <w:strike w:val="0"/>
                 <w:color w:val="000000"/>
+                <w:sz w:val="22"/>
+                <w:szCs w:val="22"/>
                 <w:u w:val="none"/>
+                <w:shd w:fill="auto" w:val="clear"/>
+                <w:vertAlign w:val="baseline"/>
                 <w:rtl w:val="0"/>
               </w:rPr>
               <w:t xml:space="preserve">2.3 Supuestos y dependencias</w:t>
               <w:tab/>
+              <w:t xml:space="preserve">5</w:t>
             </w:r>
           </w:hyperlink>
-          <w:r>
-            <w:fldChar w:fldCharType="begin"/>
-            <w:instrText xml:space="preserve"> PAGEREF _1kk0wq113n0i \h </w:instrText>
-            <w:fldChar w:fldCharType="separate"/>
-          </w:r>
-          <w:r>
-            <w:rPr>
-              <w:rtl w:val="0"/>
-            </w:rPr>
-            <w:t xml:space="preserve">5</w:t>
-          </w:r>
-          <w:r>
-            <w:fldChar w:fldCharType="end"/>
-          </w:r>
           <w:r>
             <w:rPr>
               <w:rtl w:val="0"/>
@@ -778,7 +748,7 @@
           <w:pPr>
             <w:widowControl w:val="0"/>
             <w:tabs>
-              <w:tab w:val="right" w:leader="dot" w:pos="9025.511811023624"/>
+              <w:tab w:val="right" w:leader="dot" w:pos="12000"/>
             </w:tabs>
             <w:spacing w:before="60" w:line="240" w:lineRule="auto"/>
             <w:rPr>
@@ -791,32 +761,26 @@
           <w:hyperlink w:anchor="_9u2vcu68nv3p">
             <w:r>
               <w:rPr>
+                <w:rFonts w:ascii="Arial" w:cs="Arial" w:eastAsia="Arial" w:hAnsi="Arial"/>
                 <w:b w:val="1"/>
                 <w:bCs w:val="1"/>
+                <w:i w:val="0"/>
+                <w:iCs w:val="0"/>
+                <w:smallCaps w:val="0"/>
+                <w:strike w:val="0"/>
                 <w:color w:val="000000"/>
+                <w:sz w:val="22"/>
+                <w:szCs w:val="22"/>
                 <w:u w:val="none"/>
+                <w:shd w:fill="auto" w:val="clear"/>
+                <w:vertAlign w:val="baseline"/>
                 <w:rtl w:val="0"/>
               </w:rPr>
               <w:t xml:space="preserve">3. Arquitectura y Estructura del Proyecto</w:t>
               <w:tab/>
+              <w:t xml:space="preserve">6</w:t>
             </w:r>
           </w:hyperlink>
-          <w:r>
-            <w:fldChar w:fldCharType="begin"/>
-            <w:instrText xml:space="preserve"> PAGEREF _9u2vcu68nv3p \h </w:instrText>
-            <w:fldChar w:fldCharType="separate"/>
-          </w:r>
-          <w:r>
-            <w:rPr>
-              <w:b w:val="1"/>
-              <w:bCs w:val="1"/>
-              <w:rtl w:val="0"/>
-            </w:rPr>
-            <w:t xml:space="preserve">6</w:t>
-          </w:r>
-          <w:r>
-            <w:fldChar w:fldCharType="end"/>
-          </w:r>
           <w:r>
             <w:rPr>
               <w:rtl w:val="0"/>
@@ -827,7 +791,7 @@
           <w:pPr>
             <w:widowControl w:val="0"/>
             <w:tabs>
-              <w:tab w:val="right" w:leader="dot" w:pos="9025.511811023624"/>
+              <w:tab w:val="right" w:leader="dot" w:pos="12000"/>
             </w:tabs>
             <w:spacing w:before="60" w:line="240" w:lineRule="auto"/>
             <w:ind w:left="360" w:firstLine="0"/>
@@ -839,28 +803,26 @@
           <w:hyperlink w:anchor="_c7aqch8qqxu3">
             <w:r>
               <w:rPr>
+                <w:rFonts w:ascii="Arial" w:cs="Arial" w:eastAsia="Arial" w:hAnsi="Arial"/>
+                <w:b w:val="0"/>
+                <w:bCs w:val="0"/>
+                <w:i w:val="0"/>
+                <w:iCs w:val="0"/>
+                <w:smallCaps w:val="0"/>
+                <w:strike w:val="0"/>
                 <w:color w:val="000000"/>
+                <w:sz w:val="22"/>
+                <w:szCs w:val="22"/>
                 <w:u w:val="none"/>
+                <w:shd w:fill="auto" w:val="clear"/>
+                <w:vertAlign w:val="baseline"/>
                 <w:rtl w:val="0"/>
               </w:rPr>
               <w:t xml:space="preserve">3.1 Estructura de carpetas y archivos</w:t>
               <w:tab/>
+              <w:t xml:space="preserve">6</w:t>
             </w:r>
           </w:hyperlink>
-          <w:r>
-            <w:fldChar w:fldCharType="begin"/>
-            <w:instrText xml:space="preserve"> PAGEREF _c7aqch8qqxu3 \h </w:instrText>
-            <w:fldChar w:fldCharType="separate"/>
-          </w:r>
-          <w:r>
-            <w:rPr>
-              <w:rtl w:val="0"/>
-            </w:rPr>
-            <w:t xml:space="preserve">6</w:t>
-          </w:r>
-          <w:r>
-            <w:fldChar w:fldCharType="end"/>
-          </w:r>
           <w:r>
             <w:rPr>
               <w:rtl w:val="0"/>
@@ -871,7 +833,7 @@
           <w:pPr>
             <w:widowControl w:val="0"/>
             <w:tabs>
-              <w:tab w:val="right" w:leader="dot" w:pos="9025.511811023624"/>
+              <w:tab w:val="right" w:leader="dot" w:pos="12000"/>
             </w:tabs>
             <w:spacing w:before="60" w:line="240" w:lineRule="auto"/>
             <w:ind w:left="360" w:firstLine="0"/>
@@ -883,28 +845,26 @@
           <w:hyperlink w:anchor="_nxn0n57a2kas">
             <w:r>
               <w:rPr>
+                <w:rFonts w:ascii="Arial" w:cs="Arial" w:eastAsia="Arial" w:hAnsi="Arial"/>
+                <w:b w:val="0"/>
+                <w:bCs w:val="0"/>
+                <w:i w:val="0"/>
+                <w:iCs w:val="0"/>
+                <w:smallCaps w:val="0"/>
+                <w:strike w:val="0"/>
                 <w:color w:val="000000"/>
+                <w:sz w:val="22"/>
+                <w:szCs w:val="22"/>
                 <w:u w:val="none"/>
+                <w:shd w:fill="auto" w:val="clear"/>
+                <w:vertAlign w:val="baseline"/>
                 <w:rtl w:val="0"/>
               </w:rPr>
               <w:t xml:space="preserve">3.2 Páginas / vistas</w:t>
               <w:tab/>
+              <w:t xml:space="preserve">6</w:t>
             </w:r>
           </w:hyperlink>
-          <w:r>
-            <w:fldChar w:fldCharType="begin"/>
-            <w:instrText xml:space="preserve"> PAGEREF _nxn0n57a2kas \h </w:instrText>
-            <w:fldChar w:fldCharType="separate"/>
-          </w:r>
-          <w:r>
-            <w:rPr>
-              <w:rtl w:val="0"/>
-            </w:rPr>
-            <w:t xml:space="preserve">6</w:t>
-          </w:r>
-          <w:r>
-            <w:fldChar w:fldCharType="end"/>
-          </w:r>
           <w:r>
             <w:rPr>
               <w:rtl w:val="0"/>
@@ -915,7 +875,7 @@
           <w:pPr>
             <w:widowControl w:val="0"/>
             <w:tabs>
-              <w:tab w:val="right" w:leader="dot" w:pos="9025.511811023624"/>
+              <w:tab w:val="right" w:leader="dot" w:pos="12000"/>
             </w:tabs>
             <w:spacing w:before="60" w:line="240" w:lineRule="auto"/>
             <w:rPr>
@@ -928,32 +888,26 @@
           <w:hyperlink w:anchor="">
             <w:r>
               <w:rPr>
+                <w:rFonts w:ascii="Arial" w:cs="Arial" w:eastAsia="Arial" w:hAnsi="Arial"/>
                 <w:b w:val="1"/>
                 <w:bCs w:val="1"/>
+                <w:i w:val="0"/>
+                <w:iCs w:val="0"/>
+                <w:smallCaps w:val="0"/>
+                <w:strike w:val="0"/>
                 <w:color w:val="000000"/>
+                <w:sz w:val="22"/>
+                <w:szCs w:val="22"/>
                 <w:u w:val="none"/>
+                <w:shd w:fill="auto" w:val="clear"/>
+                <w:vertAlign w:val="baseline"/>
                 <w:rtl w:val="0"/>
               </w:rPr>
               <w:t xml:space="preserve">4. Diseño de la Interfaz</w:t>
               <w:tab/>
+              <w:t xml:space="preserve">9</w:t>
             </w:r>
           </w:hyperlink>
-          <w:r>
-            <w:fldChar w:fldCharType="begin"/>
-            <w:instrText xml:space="preserve"> PAGEREF  \h </w:instrText>
-            <w:fldChar w:fldCharType="separate"/>
-          </w:r>
-          <w:r>
-            <w:rPr>
-              <w:b w:val="1"/>
-              <w:bCs w:val="1"/>
-              <w:rtl w:val="0"/>
-            </w:rPr>
-            <w:t xml:space="preserve">9</w:t>
-          </w:r>
-          <w:r>
-            <w:fldChar w:fldCharType="end"/>
-          </w:r>
           <w:r>
             <w:rPr>
               <w:rtl w:val="0"/>
@@ -964,7 +918,7 @@
           <w:pPr>
             <w:widowControl w:val="0"/>
             <w:tabs>
-              <w:tab w:val="right" w:leader="dot" w:pos="9025.511811023624"/>
+              <w:tab w:val="right" w:leader="dot" w:pos="12000"/>
             </w:tabs>
             <w:spacing w:before="60" w:line="240" w:lineRule="auto"/>
             <w:ind w:left="360" w:firstLine="0"/>
@@ -976,28 +930,23 @@
           <w:hyperlink w:anchor="">
             <w:r>
               <w:rPr>
+                <w:i w:val="0"/>
+                <w:iCs w:val="0"/>
+                <w:smallCaps w:val="0"/>
+                <w:strike w:val="0"/>
                 <w:color w:val="000000"/>
+                <w:sz w:val="22"/>
+                <w:szCs w:val="22"/>
                 <w:u w:val="none"/>
+                <w:shd w:fill="auto" w:val="clear"/>
+                <w:vertAlign w:val="baseline"/>
                 <w:rtl w:val="0"/>
               </w:rPr>
               <w:t xml:space="preserve">4.1 Wireframes y bocetos</w:t>
               <w:tab/>
+              <w:t xml:space="preserve">9</w:t>
             </w:r>
           </w:hyperlink>
-          <w:r>
-            <w:fldChar w:fldCharType="begin"/>
-            <w:instrText xml:space="preserve"> PAGEREF  \h </w:instrText>
-            <w:fldChar w:fldCharType="separate"/>
-          </w:r>
-          <w:r>
-            <w:rPr>
-              <w:rtl w:val="0"/>
-            </w:rPr>
-            <w:t xml:space="preserve">9</w:t>
-          </w:r>
-          <w:r>
-            <w:fldChar w:fldCharType="end"/>
-          </w:r>
           <w:r>
             <w:rPr>
               <w:rtl w:val="0"/>
@@ -1008,7 +957,7 @@
           <w:pPr>
             <w:widowControl w:val="0"/>
             <w:tabs>
-              <w:tab w:val="right" w:leader="dot" w:pos="9025.511811023624"/>
+              <w:tab w:val="right" w:leader="dot" w:pos="12000"/>
             </w:tabs>
             <w:spacing w:before="60" w:line="240" w:lineRule="auto"/>
             <w:ind w:left="360" w:firstLine="0"/>
@@ -1020,28 +969,23 @@
           <w:hyperlink w:anchor="">
             <w:r>
               <w:rPr>
+                <w:i w:val="0"/>
+                <w:iCs w:val="0"/>
+                <w:smallCaps w:val="0"/>
+                <w:strike w:val="0"/>
                 <w:color w:val="000000"/>
+                <w:sz w:val="22"/>
+                <w:szCs w:val="22"/>
                 <w:u w:val="none"/>
+                <w:shd w:fill="auto" w:val="clear"/>
+                <w:vertAlign w:val="baseline"/>
                 <w:rtl w:val="0"/>
               </w:rPr>
               <w:t xml:space="preserve">4.1.1 Presentación e inicio de sesión</w:t>
               <w:tab/>
+              <w:t xml:space="preserve">9</w:t>
             </w:r>
           </w:hyperlink>
-          <w:r>
-            <w:fldChar w:fldCharType="begin"/>
-            <w:instrText xml:space="preserve"> PAGEREF  \h </w:instrText>
-            <w:fldChar w:fldCharType="separate"/>
-          </w:r>
-          <w:r>
-            <w:rPr>
-              <w:rtl w:val="0"/>
-            </w:rPr>
-            <w:t xml:space="preserve">9</w:t>
-          </w:r>
-          <w:r>
-            <w:fldChar w:fldCharType="end"/>
-          </w:r>
           <w:r>
             <w:rPr>
               <w:rtl w:val="0"/>
@@ -1052,7 +996,7 @@
           <w:pPr>
             <w:widowControl w:val="0"/>
             <w:tabs>
-              <w:tab w:val="right" w:leader="dot" w:pos="9025.511811023624"/>
+              <w:tab w:val="right" w:leader="dot" w:pos="12000"/>
             </w:tabs>
             <w:spacing w:before="60" w:line="240" w:lineRule="auto"/>
             <w:ind w:left="360" w:firstLine="0"/>
@@ -1064,28 +1008,23 @@
           <w:hyperlink w:anchor="">
             <w:r>
               <w:rPr>
+                <w:i w:val="0"/>
+                <w:iCs w:val="0"/>
+                <w:smallCaps w:val="0"/>
+                <w:strike w:val="0"/>
                 <w:color w:val="000000"/>
+                <w:sz w:val="22"/>
+                <w:szCs w:val="22"/>
                 <w:u w:val="none"/>
-                <w:rtl w:val="0"/>
-              </w:rPr>
-              <w:t xml:space="preserve">4.1.2 Panel principal y listado de usuarios</w:t>
+                <w:shd w:fill="auto" w:val="clear"/>
+                <w:vertAlign w:val="baseline"/>
+                <w:rtl w:val="0"/>
+              </w:rPr>
+              <w:t xml:space="preserve">4.1.3 Registro de usuarios y selección de catálogos</w:t>
               <w:tab/>
+              <w:t xml:space="preserve">11</w:t>
             </w:r>
           </w:hyperlink>
-          <w:r>
-            <w:fldChar w:fldCharType="begin"/>
-            <w:instrText xml:space="preserve"> PAGEREF  \h </w:instrText>
-            <w:fldChar w:fldCharType="separate"/>
-          </w:r>
-          <w:r>
-            <w:rPr>
-              <w:rtl w:val="0"/>
-            </w:rPr>
-            <w:t xml:space="preserve">10</w:t>
-          </w:r>
-          <w:r>
-            <w:fldChar w:fldCharType="end"/>
-          </w:r>
           <w:r>
             <w:rPr>
               <w:rtl w:val="0"/>
@@ -1096,7 +1035,7 @@
           <w:pPr>
             <w:widowControl w:val="0"/>
             <w:tabs>
-              <w:tab w:val="right" w:leader="dot" w:pos="9025.511811023624"/>
+              <w:tab w:val="right" w:leader="dot" w:pos="12000"/>
             </w:tabs>
             <w:spacing w:before="60" w:line="240" w:lineRule="auto"/>
             <w:ind w:left="360" w:firstLine="0"/>
@@ -1108,28 +1047,23 @@
           <w:hyperlink w:anchor="">
             <w:r>
               <w:rPr>
+                <w:i w:val="0"/>
+                <w:iCs w:val="0"/>
+                <w:smallCaps w:val="0"/>
+                <w:strike w:val="0"/>
                 <w:color w:val="000000"/>
+                <w:sz w:val="22"/>
+                <w:szCs w:val="22"/>
                 <w:u w:val="none"/>
-                <w:rtl w:val="0"/>
-              </w:rPr>
-              <w:t xml:space="preserve">4.1.3 Registro de usuarios y selección de catálogos</w:t>
+                <w:shd w:fill="auto" w:val="clear"/>
+                <w:vertAlign w:val="baseline"/>
+                <w:rtl w:val="0"/>
+              </w:rPr>
+              <w:t xml:space="preserve">4.1.4 Listado y formulario de un catálogo</w:t>
               <w:tab/>
+              <w:t xml:space="preserve">12</w:t>
             </w:r>
           </w:hyperlink>
-          <w:r>
-            <w:fldChar w:fldCharType="begin"/>
-            <w:instrText xml:space="preserve"> PAGEREF  \h </w:instrText>
-            <w:fldChar w:fldCharType="separate"/>
-          </w:r>
-          <w:r>
-            <w:rPr>
-              <w:rtl w:val="0"/>
-            </w:rPr>
-            <w:t xml:space="preserve">11</w:t>
-          </w:r>
-          <w:r>
-            <w:fldChar w:fldCharType="end"/>
-          </w:r>
           <w:r>
             <w:rPr>
               <w:rtl w:val="0"/>
@@ -1140,7 +1074,7 @@
           <w:pPr>
             <w:widowControl w:val="0"/>
             <w:tabs>
-              <w:tab w:val="right" w:leader="dot" w:pos="9025.511811023624"/>
+              <w:tab w:val="right" w:leader="dot" w:pos="12000"/>
             </w:tabs>
             <w:spacing w:before="60" w:line="240" w:lineRule="auto"/>
             <w:ind w:left="360" w:firstLine="0"/>
@@ -1152,28 +1086,23 @@
           <w:hyperlink w:anchor="">
             <w:r>
               <w:rPr>
+                <w:i w:val="0"/>
+                <w:iCs w:val="0"/>
+                <w:smallCaps w:val="0"/>
+                <w:strike w:val="0"/>
                 <w:color w:val="000000"/>
+                <w:sz w:val="22"/>
+                <w:szCs w:val="22"/>
                 <w:u w:val="none"/>
-                <w:rtl w:val="0"/>
-              </w:rPr>
-              <w:t xml:space="preserve">4.1.4 Listado y formulario de un catálogo</w:t>
+                <w:shd w:fill="auto" w:val="clear"/>
+                <w:vertAlign w:val="baseline"/>
+                <w:rtl w:val="0"/>
+              </w:rPr>
+              <w:t xml:space="preserve">4.1.5 Listado y registro progresivo de cursos</w:t>
               <w:tab/>
+              <w:t xml:space="preserve">13</w:t>
             </w:r>
           </w:hyperlink>
-          <w:r>
-            <w:fldChar w:fldCharType="begin"/>
-            <w:instrText xml:space="preserve"> PAGEREF  \h </w:instrText>
-            <w:fldChar w:fldCharType="separate"/>
-          </w:r>
-          <w:r>
-            <w:rPr>
-              <w:rtl w:val="0"/>
-            </w:rPr>
-            <w:t xml:space="preserve">12</w:t>
-          </w:r>
-          <w:r>
-            <w:fldChar w:fldCharType="end"/>
-          </w:r>
           <w:r>
             <w:rPr>
               <w:rtl w:val="0"/>
@@ -1184,7 +1113,7 @@
           <w:pPr>
             <w:widowControl w:val="0"/>
             <w:tabs>
-              <w:tab w:val="right" w:leader="dot" w:pos="9025.511811023624"/>
+              <w:tab w:val="right" w:leader="dot" w:pos="12000"/>
             </w:tabs>
             <w:spacing w:before="60" w:line="240" w:lineRule="auto"/>
             <w:ind w:left="360" w:firstLine="0"/>
@@ -1196,28 +1125,23 @@
           <w:hyperlink w:anchor="">
             <w:r>
               <w:rPr>
+                <w:i w:val="0"/>
+                <w:iCs w:val="0"/>
+                <w:smallCaps w:val="0"/>
+                <w:strike w:val="0"/>
                 <w:color w:val="000000"/>
+                <w:sz w:val="22"/>
+                <w:szCs w:val="22"/>
                 <w:u w:val="none"/>
-                <w:rtl w:val="0"/>
-              </w:rPr>
-              <w:t xml:space="preserve">4.1.5 Listado y registro progresivo de cursos</w:t>
+                <w:shd w:fill="auto" w:val="clear"/>
+                <w:vertAlign w:val="baseline"/>
+                <w:rtl w:val="0"/>
+              </w:rPr>
+              <w:t xml:space="preserve">4.1.6 Detalle del curso y adaptación a móvil</w:t>
               <w:tab/>
+              <w:t xml:space="preserve">14</w:t>
             </w:r>
           </w:hyperlink>
-          <w:r>
-            <w:fldChar w:fldCharType="begin"/>
-            <w:instrText xml:space="preserve"> PAGEREF  \h </w:instrText>
-            <w:fldChar w:fldCharType="separate"/>
-          </w:r>
-          <w:r>
-            <w:rPr>
-              <w:rtl w:val="0"/>
-            </w:rPr>
-            <w:t xml:space="preserve">13</w:t>
-          </w:r>
-          <w:r>
-            <w:fldChar w:fldCharType="end"/>
-          </w:r>
           <w:r>
             <w:rPr>
               <w:rtl w:val="0"/>
@@ -1228,7 +1152,7 @@
           <w:pPr>
             <w:widowControl w:val="0"/>
             <w:tabs>
-              <w:tab w:val="right" w:leader="dot" w:pos="9025.511811023624"/>
+              <w:tab w:val="right" w:leader="dot" w:pos="12000"/>
             </w:tabs>
             <w:spacing w:before="60" w:line="240" w:lineRule="auto"/>
             <w:ind w:left="360" w:firstLine="0"/>
@@ -1240,28 +1164,23 @@
           <w:hyperlink w:anchor="">
             <w:r>
               <w:rPr>
+                <w:i w:val="0"/>
+                <w:iCs w:val="0"/>
+                <w:smallCaps w:val="0"/>
+                <w:strike w:val="0"/>
                 <w:color w:val="000000"/>
+                <w:sz w:val="22"/>
+                <w:szCs w:val="22"/>
                 <w:u w:val="none"/>
-                <w:rtl w:val="0"/>
-              </w:rPr>
-              <w:t xml:space="preserve">4.1.6 Detalle del curso y adaptación a móvil</w:t>
+                <w:shd w:fill="auto" w:val="clear"/>
+                <w:vertAlign w:val="baseline"/>
+                <w:rtl w:val="0"/>
+              </w:rPr>
+              <w:t xml:space="preserve">4.1.7 Vistas de gestión de contraseñas</w:t>
               <w:tab/>
+              <w:t xml:space="preserve">15</w:t>
             </w:r>
           </w:hyperlink>
-          <w:r>
-            <w:fldChar w:fldCharType="begin"/>
-            <w:instrText xml:space="preserve"> PAGEREF  \h </w:instrText>
-            <w:fldChar w:fldCharType="separate"/>
-          </w:r>
-          <w:r>
-            <w:rPr>
-              <w:rtl w:val="0"/>
-            </w:rPr>
-            <w:t xml:space="preserve">14</w:t>
-          </w:r>
-          <w:r>
-            <w:fldChar w:fldCharType="end"/>
-          </w:r>
           <w:r>
             <w:rPr>
               <w:rtl w:val="0"/>
@@ -1272,7 +1191,7 @@
           <w:pPr>
             <w:widowControl w:val="0"/>
             <w:tabs>
-              <w:tab w:val="right" w:leader="dot" w:pos="9025.511811023624"/>
+              <w:tab w:val="right" w:leader="dot" w:pos="12000"/>
             </w:tabs>
             <w:spacing w:before="60" w:line="240" w:lineRule="auto"/>
             <w:ind w:left="360" w:firstLine="0"/>
@@ -1284,28 +1203,23 @@
           <w:hyperlink w:anchor="">
             <w:r>
               <w:rPr>
+                <w:i w:val="0"/>
+                <w:iCs w:val="0"/>
+                <w:smallCaps w:val="0"/>
+                <w:strike w:val="0"/>
                 <w:color w:val="000000"/>
+                <w:sz w:val="22"/>
+                <w:szCs w:val="22"/>
                 <w:u w:val="none"/>
-                <w:rtl w:val="0"/>
-              </w:rPr>
-              <w:t xml:space="preserve">4.1.7 Vistas de gestión de contraseñas</w:t>
+                <w:shd w:fill="auto" w:val="clear"/>
+                <w:vertAlign w:val="baseline"/>
+                <w:rtl w:val="0"/>
+              </w:rPr>
+              <w:t xml:space="preserve">4.2 Guía de estilo</w:t>
               <w:tab/>
+              <w:t xml:space="preserve">16</w:t>
             </w:r>
           </w:hyperlink>
-          <w:r>
-            <w:fldChar w:fldCharType="begin"/>
-            <w:instrText xml:space="preserve"> PAGEREF  \h </w:instrText>
-            <w:fldChar w:fldCharType="separate"/>
-          </w:r>
-          <w:r>
-            <w:rPr>
-              <w:rtl w:val="0"/>
-            </w:rPr>
-            <w:t xml:space="preserve">15</w:t>
-          </w:r>
-          <w:r>
-            <w:fldChar w:fldCharType="end"/>
-          </w:r>
           <w:r>
             <w:rPr>
               <w:rtl w:val="0"/>
@@ -1316,10 +1230,10 @@
           <w:pPr>
             <w:widowControl w:val="0"/>
             <w:tabs>
-              <w:tab w:val="right" w:leader="dot" w:pos="9025.511811023624"/>
+              <w:tab w:val="right" w:leader="dot" w:pos="12000"/>
             </w:tabs>
             <w:spacing w:before="60" w:line="240" w:lineRule="auto"/>
-            <w:ind w:left="360" w:firstLine="0"/>
+            <w:ind w:left="720" w:firstLine="0"/>
             <w:rPr>
               <w:color w:val="000000"/>
               <w:u w:val="none"/>
@@ -1328,28 +1242,23 @@
           <w:hyperlink w:anchor="">
             <w:r>
               <w:rPr>
+                <w:i w:val="0"/>
+                <w:iCs w:val="0"/>
+                <w:smallCaps w:val="0"/>
+                <w:strike w:val="0"/>
                 <w:color w:val="000000"/>
+                <w:sz w:val="22"/>
+                <w:szCs w:val="22"/>
                 <w:u w:val="none"/>
-                <w:rtl w:val="0"/>
-              </w:rPr>
-              <w:t xml:space="preserve">4.2 Guía de estilo</w:t>
+                <w:shd w:fill="auto" w:val="clear"/>
+                <w:vertAlign w:val="baseline"/>
+                <w:rtl w:val="0"/>
+              </w:rPr>
+              <w:t xml:space="preserve">4.2.1 Paleta de colores</w:t>
               <w:tab/>
+              <w:t xml:space="preserve">16</w:t>
             </w:r>
           </w:hyperlink>
-          <w:r>
-            <w:fldChar w:fldCharType="begin"/>
-            <w:instrText xml:space="preserve"> PAGEREF  \h </w:instrText>
-            <w:fldChar w:fldCharType="separate"/>
-          </w:r>
-          <w:r>
-            <w:rPr>
-              <w:rtl w:val="0"/>
-            </w:rPr>
-            <w:t xml:space="preserve">16</w:t>
-          </w:r>
-          <w:r>
-            <w:fldChar w:fldCharType="end"/>
-          </w:r>
           <w:r>
             <w:rPr>
               <w:rtl w:val="0"/>
@@ -1360,7 +1269,7 @@
           <w:pPr>
             <w:widowControl w:val="0"/>
             <w:tabs>
-              <w:tab w:val="right" w:leader="dot" w:pos="9025.511811023624"/>
+              <w:tab w:val="right" w:leader="dot" w:pos="12000"/>
             </w:tabs>
             <w:spacing w:before="60" w:line="240" w:lineRule="auto"/>
             <w:ind w:left="720" w:firstLine="0"/>
@@ -1372,28 +1281,23 @@
           <w:hyperlink w:anchor="">
             <w:r>
               <w:rPr>
+                <w:i w:val="0"/>
+                <w:iCs w:val="0"/>
+                <w:smallCaps w:val="0"/>
+                <w:strike w:val="0"/>
                 <w:color w:val="000000"/>
+                <w:sz w:val="22"/>
+                <w:szCs w:val="22"/>
                 <w:u w:val="none"/>
-                <w:rtl w:val="0"/>
-              </w:rPr>
-              <w:t xml:space="preserve">4.2.1 Paleta de colores</w:t>
+                <w:shd w:fill="auto" w:val="clear"/>
+                <w:vertAlign w:val="baseline"/>
+                <w:rtl w:val="0"/>
+              </w:rPr>
+              <w:t xml:space="preserve">4.2.2 Tipografía y espaciado</w:t>
               <w:tab/>
+              <w:t xml:space="preserve">16</w:t>
             </w:r>
           </w:hyperlink>
-          <w:r>
-            <w:fldChar w:fldCharType="begin"/>
-            <w:instrText xml:space="preserve"> PAGEREF  \h </w:instrText>
-            <w:fldChar w:fldCharType="separate"/>
-          </w:r>
-          <w:r>
-            <w:rPr>
-              <w:rtl w:val="0"/>
-            </w:rPr>
-            <w:t xml:space="preserve">16</w:t>
-          </w:r>
-          <w:r>
-            <w:fldChar w:fldCharType="end"/>
-          </w:r>
           <w:r>
             <w:rPr>
               <w:rtl w:val="0"/>
@@ -1404,7 +1308,7 @@
           <w:pPr>
             <w:widowControl w:val="0"/>
             <w:tabs>
-              <w:tab w:val="right" w:leader="dot" w:pos="9025.511811023624"/>
+              <w:tab w:val="right" w:leader="dot" w:pos="12000"/>
             </w:tabs>
             <w:spacing w:before="60" w:line="240" w:lineRule="auto"/>
             <w:ind w:left="720" w:firstLine="0"/>
@@ -1416,28 +1320,23 @@
           <w:hyperlink w:anchor="">
             <w:r>
               <w:rPr>
+                <w:i w:val="0"/>
+                <w:iCs w:val="0"/>
+                <w:smallCaps w:val="0"/>
+                <w:strike w:val="0"/>
                 <w:color w:val="000000"/>
+                <w:sz w:val="22"/>
+                <w:szCs w:val="22"/>
                 <w:u w:val="none"/>
-                <w:rtl w:val="0"/>
-              </w:rPr>
-              <w:t xml:space="preserve">4.2.2 Tipografía y espaciado</w:t>
+                <w:shd w:fill="auto" w:val="clear"/>
+                <w:vertAlign w:val="baseline"/>
+                <w:rtl w:val="0"/>
+              </w:rPr>
+              <w:t xml:space="preserve">4.2.3 Botones formularios y listados</w:t>
               <w:tab/>
+              <w:t xml:space="preserve">17</w:t>
             </w:r>
           </w:hyperlink>
-          <w:r>
-            <w:fldChar w:fldCharType="begin"/>
-            <w:instrText xml:space="preserve"> PAGEREF  \h </w:instrText>
-            <w:fldChar w:fldCharType="separate"/>
-          </w:r>
-          <w:r>
-            <w:rPr>
-              <w:rtl w:val="0"/>
-            </w:rPr>
-            <w:t xml:space="preserve">16</w:t>
-          </w:r>
-          <w:r>
-            <w:fldChar w:fldCharType="end"/>
-          </w:r>
           <w:r>
             <w:rPr>
               <w:rtl w:val="0"/>
@@ -1448,7 +1347,7 @@
           <w:pPr>
             <w:widowControl w:val="0"/>
             <w:tabs>
-              <w:tab w:val="right" w:leader="dot" w:pos="9025.511811023624"/>
+              <w:tab w:val="right" w:leader="dot" w:pos="12000"/>
             </w:tabs>
             <w:spacing w:before="60" w:line="240" w:lineRule="auto"/>
             <w:ind w:left="720" w:firstLine="0"/>
@@ -1460,28 +1359,23 @@
           <w:hyperlink w:anchor="">
             <w:r>
               <w:rPr>
+                <w:i w:val="0"/>
+                <w:iCs w:val="0"/>
+                <w:smallCaps w:val="0"/>
+                <w:strike w:val="0"/>
                 <w:color w:val="000000"/>
+                <w:sz w:val="22"/>
+                <w:szCs w:val="22"/>
                 <w:u w:val="none"/>
-                <w:rtl w:val="0"/>
-              </w:rPr>
-              <w:t xml:space="preserve">4.2.3 Botones formularios y listados</w:t>
+                <w:shd w:fill="auto" w:val="clear"/>
+                <w:vertAlign w:val="baseline"/>
+                <w:rtl w:val="0"/>
+              </w:rPr>
+              <w:t xml:space="preserve">4.2.4 Respuesta visual a la validación</w:t>
               <w:tab/>
+              <w:t xml:space="preserve">17</w:t>
             </w:r>
           </w:hyperlink>
-          <w:r>
-            <w:fldChar w:fldCharType="begin"/>
-            <w:instrText xml:space="preserve"> PAGEREF  \h </w:instrText>
-            <w:fldChar w:fldCharType="separate"/>
-          </w:r>
-          <w:r>
-            <w:rPr>
-              <w:rtl w:val="0"/>
-            </w:rPr>
-            <w:t xml:space="preserve">17</w:t>
-          </w:r>
-          <w:r>
-            <w:fldChar w:fldCharType="end"/>
-          </w:r>
           <w:r>
             <w:rPr>
               <w:rtl w:val="0"/>
@@ -1492,40 +1386,39 @@
           <w:pPr>
             <w:widowControl w:val="0"/>
             <w:tabs>
-              <w:tab w:val="right" w:leader="dot" w:pos="9025.511811023624"/>
+              <w:tab w:val="right" w:leader="dot" w:pos="12000"/>
             </w:tabs>
             <w:spacing w:before="60" w:line="240" w:lineRule="auto"/>
-            <w:ind w:left="720" w:firstLine="0"/>
             <w:rPr>
+              <w:b w:val="1"/>
+              <w:bCs w:val="1"/>
               <w:color w:val="000000"/>
               <w:u w:val="none"/>
             </w:rPr>
           </w:pPr>
-          <w:hyperlink w:anchor="">
-            <w:r>
-              <w:rPr>
+          <w:hyperlink w:anchor="_q7xi3c4psgs4">
+            <w:r>
+              <w:rPr>
+                <w:rFonts w:ascii="Arial" w:cs="Arial" w:eastAsia="Arial" w:hAnsi="Arial"/>
+                <w:b w:val="1"/>
+                <w:bCs w:val="1"/>
+                <w:i w:val="0"/>
+                <w:iCs w:val="0"/>
+                <w:smallCaps w:val="0"/>
+                <w:strike w:val="0"/>
                 <w:color w:val="000000"/>
+                <w:sz w:val="22"/>
+                <w:szCs w:val="22"/>
                 <w:u w:val="none"/>
-                <w:rtl w:val="0"/>
-              </w:rPr>
-              <w:t xml:space="preserve">4.2.4 Respuesta visual a la validación</w:t>
+                <w:shd w:fill="auto" w:val="clear"/>
+                <w:vertAlign w:val="baseline"/>
+                <w:rtl w:val="0"/>
+              </w:rPr>
+              <w:t xml:space="preserve">5. Diseño de la Maquetación (HTML)</w:t>
               <w:tab/>
+              <w:t xml:space="preserve">17</w:t>
             </w:r>
           </w:hyperlink>
-          <w:r>
-            <w:fldChar w:fldCharType="begin"/>
-            <w:instrText xml:space="preserve"> PAGEREF  \h </w:instrText>
-            <w:fldChar w:fldCharType="separate"/>
-          </w:r>
-          <w:r>
-            <w:rPr>
-              <w:rtl w:val="0"/>
-            </w:rPr>
-            <w:t xml:space="preserve">17</w:t>
-          </w:r>
-          <w:r>
-            <w:fldChar w:fldCharType="end"/>
-          </w:r>
           <w:r>
             <w:rPr>
               <w:rtl w:val="0"/>
@@ -1536,45 +1429,38 @@
           <w:pPr>
             <w:widowControl w:val="0"/>
             <w:tabs>
-              <w:tab w:val="right" w:leader="dot" w:pos="9025.511811023624"/>
+              <w:tab w:val="right" w:leader="dot" w:pos="12000"/>
             </w:tabs>
             <w:spacing w:before="60" w:line="240" w:lineRule="auto"/>
+            <w:ind w:left="360" w:firstLine="0"/>
             <w:rPr>
-              <w:b w:val="1"/>
-              <w:bCs w:val="1"/>
               <w:color w:val="000000"/>
               <w:u w:val="none"/>
             </w:rPr>
           </w:pPr>
-          <w:hyperlink w:anchor="_q7xi3c4psgs4">
-            <w:r>
-              <w:rPr>
-                <w:b w:val="1"/>
-                <w:bCs w:val="1"/>
+          <w:hyperlink w:anchor="_h79y6tc1os5a">
+            <w:r>
+              <w:rPr>
+                <w:rFonts w:ascii="Arial" w:cs="Arial" w:eastAsia="Arial" w:hAnsi="Arial"/>
+                <w:b w:val="0"/>
+                <w:bCs w:val="0"/>
+                <w:i w:val="0"/>
+                <w:iCs w:val="0"/>
+                <w:smallCaps w:val="0"/>
+                <w:strike w:val="0"/>
                 <w:color w:val="000000"/>
+                <w:sz w:val="22"/>
+                <w:szCs w:val="22"/>
                 <w:u w:val="none"/>
-                <w:rtl w:val="0"/>
-              </w:rPr>
-              <w:t xml:space="preserve">5. Diseño de la Maquetación (HTML)</w:t>
+                <w:shd w:fill="auto" w:val="clear"/>
+                <w:vertAlign w:val="baseline"/>
+                <w:rtl w:val="0"/>
+              </w:rPr>
+              <w:t xml:space="preserve">5.1 Estructura semántica</w:t>
               <w:tab/>
+              <w:t xml:space="preserve">18</w:t>
             </w:r>
           </w:hyperlink>
-          <w:r>
-            <w:fldChar w:fldCharType="begin"/>
-            <w:instrText xml:space="preserve"> PAGEREF _q7xi3c4psgs4 \h </w:instrText>
-            <w:fldChar w:fldCharType="separate"/>
-          </w:r>
-          <w:r>
-            <w:rPr>
-              <w:b w:val="1"/>
-              <w:bCs w:val="1"/>
-              <w:rtl w:val="0"/>
-            </w:rPr>
-            <w:t xml:space="preserve">17</w:t>
-          </w:r>
-          <w:r>
-            <w:fldChar w:fldCharType="end"/>
-          </w:r>
           <w:r>
             <w:rPr>
               <w:rtl w:val="0"/>
@@ -1585,7 +1471,7 @@
           <w:pPr>
             <w:widowControl w:val="0"/>
             <w:tabs>
-              <w:tab w:val="right" w:leader="dot" w:pos="9025.511811023624"/>
+              <w:tab w:val="right" w:leader="dot" w:pos="12000"/>
             </w:tabs>
             <w:spacing w:before="60" w:line="240" w:lineRule="auto"/>
             <w:ind w:left="360" w:firstLine="0"/>
@@ -1594,31 +1480,29 @@
               <w:u w:val="none"/>
             </w:rPr>
           </w:pPr>
-          <w:hyperlink w:anchor="_h79y6tc1os5a">
-            <w:r>
-              <w:rPr>
+          <w:hyperlink w:anchor="_5yj73au8sn7c">
+            <w:r>
+              <w:rPr>
+                <w:rFonts w:ascii="Arial" w:cs="Arial" w:eastAsia="Arial" w:hAnsi="Arial"/>
+                <w:b w:val="0"/>
+                <w:bCs w:val="0"/>
+                <w:i w:val="0"/>
+                <w:iCs w:val="0"/>
+                <w:smallCaps w:val="0"/>
+                <w:strike w:val="0"/>
                 <w:color w:val="000000"/>
+                <w:sz w:val="22"/>
+                <w:szCs w:val="22"/>
                 <w:u w:val="none"/>
-                <w:rtl w:val="0"/>
-              </w:rPr>
-              <w:t xml:space="preserve">5.1 Estructura semántica</w:t>
+                <w:shd w:fill="auto" w:val="clear"/>
+                <w:vertAlign w:val="baseline"/>
+                <w:rtl w:val="0"/>
+              </w:rPr>
+              <w:t xml:space="preserve">5.2 Estructura de los formularios</w:t>
               <w:tab/>
+              <w:t xml:space="preserve">18</w:t>
             </w:r>
           </w:hyperlink>
-          <w:r>
-            <w:fldChar w:fldCharType="begin"/>
-            <w:instrText xml:space="preserve"> PAGEREF _h79y6tc1os5a \h </w:instrText>
-            <w:fldChar w:fldCharType="separate"/>
-          </w:r>
-          <w:r>
-            <w:rPr>
-              <w:rtl w:val="0"/>
-            </w:rPr>
-            <w:t xml:space="preserve">18</w:t>
-          </w:r>
-          <w:r>
-            <w:fldChar w:fldCharType="end"/>
-          </w:r>
           <w:r>
             <w:rPr>
               <w:rtl w:val="0"/>
@@ -1629,40 +1513,38 @@
           <w:pPr>
             <w:widowControl w:val="0"/>
             <w:tabs>
-              <w:tab w:val="right" w:leader="dot" w:pos="9025.511811023624"/>
+              <w:tab w:val="right" w:leader="dot" w:pos="12000"/>
             </w:tabs>
             <w:spacing w:before="60" w:line="240" w:lineRule="auto"/>
-            <w:ind w:left="360" w:firstLine="0"/>
+            <w:ind w:left="720" w:firstLine="0"/>
             <w:rPr>
               <w:color w:val="000000"/>
               <w:u w:val="none"/>
             </w:rPr>
           </w:pPr>
-          <w:hyperlink w:anchor="_5yj73au8sn7c">
-            <w:r>
-              <w:rPr>
+          <w:hyperlink w:anchor="_ducexw5z57w4">
+            <w:r>
+              <w:rPr>
+                <w:rFonts w:ascii="Arial" w:cs="Arial" w:eastAsia="Arial" w:hAnsi="Arial"/>
+                <w:b w:val="0"/>
+                <w:bCs w:val="0"/>
+                <w:i w:val="0"/>
+                <w:iCs w:val="0"/>
+                <w:smallCaps w:val="0"/>
+                <w:strike w:val="0"/>
                 <w:color w:val="000000"/>
+                <w:sz w:val="22"/>
+                <w:szCs w:val="22"/>
                 <w:u w:val="none"/>
-                <w:rtl w:val="0"/>
-              </w:rPr>
-              <w:t xml:space="preserve">5.2 Estructura de los formularios</w:t>
+                <w:shd w:fill="auto" w:val="clear"/>
+                <w:vertAlign w:val="baseline"/>
+                <w:rtl w:val="0"/>
+              </w:rPr>
+              <w:t xml:space="preserve">5.2.1 Formularios de acceso y gestión de contraseñas</w:t>
               <w:tab/>
+              <w:t xml:space="preserve">18</w:t>
             </w:r>
           </w:hyperlink>
-          <w:r>
-            <w:fldChar w:fldCharType="begin"/>
-            <w:instrText xml:space="preserve"> PAGEREF _5yj73au8sn7c \h </w:instrText>
-            <w:fldChar w:fldCharType="separate"/>
-          </w:r>
-          <w:r>
-            <w:rPr>
-              <w:rtl w:val="0"/>
-            </w:rPr>
-            <w:t xml:space="preserve">18</w:t>
-          </w:r>
-          <w:r>
-            <w:fldChar w:fldCharType="end"/>
-          </w:r>
           <w:r>
             <w:rPr>
               <w:rtl w:val="0"/>
@@ -1673,7 +1555,7 @@
           <w:pPr>
             <w:widowControl w:val="0"/>
             <w:tabs>
-              <w:tab w:val="right" w:leader="dot" w:pos="9025.511811023624"/>
+              <w:tab w:val="right" w:leader="dot" w:pos="12000"/>
             </w:tabs>
             <w:spacing w:before="60" w:line="240" w:lineRule="auto"/>
             <w:ind w:left="720" w:firstLine="0"/>
@@ -1682,31 +1564,29 @@
               <w:u w:val="none"/>
             </w:rPr>
           </w:pPr>
-          <w:hyperlink w:anchor="_ducexw5z57w4">
-            <w:r>
-              <w:rPr>
+          <w:hyperlink w:anchor="_7ljq1lu9sgn2">
+            <w:r>
+              <w:rPr>
+                <w:rFonts w:ascii="Arial" w:cs="Arial" w:eastAsia="Arial" w:hAnsi="Arial"/>
+                <w:b w:val="0"/>
+                <w:bCs w:val="0"/>
+                <w:i w:val="0"/>
+                <w:iCs w:val="0"/>
+                <w:smallCaps w:val="0"/>
+                <w:strike w:val="0"/>
                 <w:color w:val="000000"/>
+                <w:sz w:val="22"/>
+                <w:szCs w:val="22"/>
                 <w:u w:val="none"/>
-                <w:rtl w:val="0"/>
-              </w:rPr>
-              <w:t xml:space="preserve">5.2.1 Formularios de acceso y gestión de contraseñas</w:t>
+                <w:shd w:fill="auto" w:val="clear"/>
+                <w:vertAlign w:val="baseline"/>
+                <w:rtl w:val="0"/>
+              </w:rPr>
+              <w:t xml:space="preserve">5.2.2 Formulario de usuarios</w:t>
               <w:tab/>
+              <w:t xml:space="preserve">19</w:t>
             </w:r>
           </w:hyperlink>
-          <w:r>
-            <w:fldChar w:fldCharType="begin"/>
-            <w:instrText xml:space="preserve"> PAGEREF _ducexw5z57w4 \h </w:instrText>
-            <w:fldChar w:fldCharType="separate"/>
-          </w:r>
-          <w:r>
-            <w:rPr>
-              <w:rtl w:val="0"/>
-            </w:rPr>
-            <w:t xml:space="preserve">18</w:t>
-          </w:r>
-          <w:r>
-            <w:fldChar w:fldCharType="end"/>
-          </w:r>
           <w:r>
             <w:rPr>
               <w:rtl w:val="0"/>
@@ -1717,7 +1597,7 @@
           <w:pPr>
             <w:widowControl w:val="0"/>
             <w:tabs>
-              <w:tab w:val="right" w:leader="dot" w:pos="9025.511811023624"/>
+              <w:tab w:val="right" w:leader="dot" w:pos="12000"/>
             </w:tabs>
             <w:spacing w:before="60" w:line="240" w:lineRule="auto"/>
             <w:ind w:left="720" w:firstLine="0"/>
@@ -1726,31 +1606,29 @@
               <w:u w:val="none"/>
             </w:rPr>
           </w:pPr>
-          <w:hyperlink w:anchor="_7ljq1lu9sgn2">
-            <w:r>
-              <w:rPr>
+          <w:hyperlink w:anchor="_3dnrggtbtbfb">
+            <w:r>
+              <w:rPr>
+                <w:rFonts w:ascii="Arial" w:cs="Arial" w:eastAsia="Arial" w:hAnsi="Arial"/>
+                <w:b w:val="0"/>
+                <w:bCs w:val="0"/>
+                <w:i w:val="0"/>
+                <w:iCs w:val="0"/>
+                <w:smallCaps w:val="0"/>
+                <w:strike w:val="0"/>
                 <w:color w:val="000000"/>
+                <w:sz w:val="22"/>
+                <w:szCs w:val="22"/>
                 <w:u w:val="none"/>
-                <w:rtl w:val="0"/>
-              </w:rPr>
-              <w:t xml:space="preserve">5.2.2 Formulario de usuarios</w:t>
+                <w:shd w:fill="auto" w:val="clear"/>
+                <w:vertAlign w:val="baseline"/>
+                <w:rtl w:val="0"/>
+              </w:rPr>
+              <w:t xml:space="preserve">5.2.3 Formulario de catálogos</w:t>
               <w:tab/>
+              <w:t xml:space="preserve">19</w:t>
             </w:r>
           </w:hyperlink>
-          <w:r>
-            <w:fldChar w:fldCharType="begin"/>
-            <w:instrText xml:space="preserve"> PAGEREF _7ljq1lu9sgn2 \h </w:instrText>
-            <w:fldChar w:fldCharType="separate"/>
-          </w:r>
-          <w:r>
-            <w:rPr>
-              <w:rtl w:val="0"/>
-            </w:rPr>
-            <w:t xml:space="preserve">19</w:t>
-          </w:r>
-          <w:r>
-            <w:fldChar w:fldCharType="end"/>
-          </w:r>
           <w:r>
             <w:rPr>
               <w:rtl w:val="0"/>
@@ -1761,7 +1639,7 @@
           <w:pPr>
             <w:widowControl w:val="0"/>
             <w:tabs>
-              <w:tab w:val="right" w:leader="dot" w:pos="9025.511811023624"/>
+              <w:tab w:val="right" w:leader="dot" w:pos="12000"/>
             </w:tabs>
             <w:spacing w:before="60" w:line="240" w:lineRule="auto"/>
             <w:ind w:left="720" w:firstLine="0"/>
@@ -1770,31 +1648,29 @@
               <w:u w:val="none"/>
             </w:rPr>
           </w:pPr>
-          <w:hyperlink w:anchor="_3dnrggtbtbfb">
-            <w:r>
-              <w:rPr>
+          <w:hyperlink w:anchor="_gaczdf2jl5jy">
+            <w:r>
+              <w:rPr>
+                <w:rFonts w:ascii="Arial" w:cs="Arial" w:eastAsia="Arial" w:hAnsi="Arial"/>
+                <w:b w:val="0"/>
+                <w:bCs w:val="0"/>
+                <w:i w:val="0"/>
+                <w:iCs w:val="0"/>
+                <w:smallCaps w:val="0"/>
+                <w:strike w:val="0"/>
                 <w:color w:val="000000"/>
+                <w:sz w:val="22"/>
+                <w:szCs w:val="22"/>
                 <w:u w:val="none"/>
-                <w:rtl w:val="0"/>
-              </w:rPr>
-              <w:t xml:space="preserve">5.2.3 Formulario de catálogos</w:t>
+                <w:shd w:fill="auto" w:val="clear"/>
+                <w:vertAlign w:val="baseline"/>
+                <w:rtl w:val="0"/>
+              </w:rPr>
+              <w:t xml:space="preserve">5.2.4 Formulario de cursos</w:t>
               <w:tab/>
+              <w:t xml:space="preserve">19</w:t>
             </w:r>
           </w:hyperlink>
-          <w:r>
-            <w:fldChar w:fldCharType="begin"/>
-            <w:instrText xml:space="preserve"> PAGEREF _3dnrggtbtbfb \h </w:instrText>
-            <w:fldChar w:fldCharType="separate"/>
-          </w:r>
-          <w:r>
-            <w:rPr>
-              <w:rtl w:val="0"/>
-            </w:rPr>
-            <w:t xml:space="preserve">19</w:t>
-          </w:r>
-          <w:r>
-            <w:fldChar w:fldCharType="end"/>
-          </w:r>
           <w:r>
             <w:rPr>
               <w:rtl w:val="0"/>
@@ -1805,40 +1681,38 @@
           <w:pPr>
             <w:widowControl w:val="0"/>
             <w:tabs>
-              <w:tab w:val="right" w:leader="dot" w:pos="9025.511811023624"/>
+              <w:tab w:val="right" w:leader="dot" w:pos="12000"/>
             </w:tabs>
             <w:spacing w:before="60" w:line="240" w:lineRule="auto"/>
-            <w:ind w:left="720" w:firstLine="0"/>
+            <w:ind w:left="360" w:firstLine="0"/>
             <w:rPr>
               <w:color w:val="000000"/>
               <w:u w:val="none"/>
             </w:rPr>
           </w:pPr>
-          <w:hyperlink w:anchor="_gaczdf2jl5jy">
-            <w:r>
-              <w:rPr>
+          <w:hyperlink w:anchor="_oalpuryrossv">
+            <w:r>
+              <w:rPr>
+                <w:rFonts w:ascii="Arial" w:cs="Arial" w:eastAsia="Arial" w:hAnsi="Arial"/>
+                <w:b w:val="0"/>
+                <w:bCs w:val="0"/>
+                <w:i w:val="0"/>
+                <w:iCs w:val="0"/>
+                <w:smallCaps w:val="0"/>
+                <w:strike w:val="0"/>
                 <w:color w:val="000000"/>
+                <w:sz w:val="22"/>
+                <w:szCs w:val="22"/>
                 <w:u w:val="none"/>
-                <w:rtl w:val="0"/>
-              </w:rPr>
-              <w:t xml:space="preserve">5.2.4 Formulario de cursos</w:t>
+                <w:shd w:fill="auto" w:val="clear"/>
+                <w:vertAlign w:val="baseline"/>
+                <w:rtl w:val="0"/>
+              </w:rPr>
+              <w:t xml:space="preserve">5.3 Atributos de validación nativa</w:t>
               <w:tab/>
+              <w:t xml:space="preserve">20</w:t>
             </w:r>
           </w:hyperlink>
-          <w:r>
-            <w:fldChar w:fldCharType="begin"/>
-            <w:instrText xml:space="preserve"> PAGEREF _gaczdf2jl5jy \h </w:instrText>
-            <w:fldChar w:fldCharType="separate"/>
-          </w:r>
-          <w:r>
-            <w:rPr>
-              <w:rtl w:val="0"/>
-            </w:rPr>
-            <w:t xml:space="preserve">19</w:t>
-          </w:r>
-          <w:r>
-            <w:fldChar w:fldCharType="end"/>
-          </w:r>
           <w:r>
             <w:rPr>
               <w:rtl w:val="0"/>
@@ -1849,40 +1723,39 @@
           <w:pPr>
             <w:widowControl w:val="0"/>
             <w:tabs>
-              <w:tab w:val="right" w:leader="dot" w:pos="9025.511811023624"/>
+              <w:tab w:val="right" w:leader="dot" w:pos="12000"/>
             </w:tabs>
             <w:spacing w:before="60" w:line="240" w:lineRule="auto"/>
-            <w:ind w:left="360" w:firstLine="0"/>
             <w:rPr>
+              <w:b w:val="1"/>
+              <w:bCs w:val="1"/>
               <w:color w:val="000000"/>
               <w:u w:val="none"/>
             </w:rPr>
           </w:pPr>
-          <w:hyperlink w:anchor="_oalpuryrossv">
-            <w:r>
-              <w:rPr>
+          <w:hyperlink w:anchor="">
+            <w:r>
+              <w:rPr>
+                <w:rFonts w:ascii="Arial" w:cs="Arial" w:eastAsia="Arial" w:hAnsi="Arial"/>
+                <w:b w:val="1"/>
+                <w:bCs w:val="1"/>
+                <w:i w:val="0"/>
+                <w:iCs w:val="0"/>
+                <w:smallCaps w:val="0"/>
+                <w:strike w:val="0"/>
                 <w:color w:val="000000"/>
+                <w:sz w:val="22"/>
+                <w:szCs w:val="22"/>
                 <w:u w:val="none"/>
-                <w:rtl w:val="0"/>
-              </w:rPr>
-              <w:t xml:space="preserve">5.3 Atributos de validación nativa</w:t>
+                <w:shd w:fill="auto" w:val="clear"/>
+                <w:vertAlign w:val="baseline"/>
+                <w:rtl w:val="0"/>
+              </w:rPr>
+              <w:t xml:space="preserve">6. Diseño de los Estilos CSS</w:t>
               <w:tab/>
+              <w:t xml:space="preserve">22</w:t>
             </w:r>
           </w:hyperlink>
-          <w:r>
-            <w:fldChar w:fldCharType="begin"/>
-            <w:instrText xml:space="preserve"> PAGEREF _oalpuryrossv \h </w:instrText>
-            <w:fldChar w:fldCharType="separate"/>
-          </w:r>
-          <w:r>
-            <w:rPr>
-              <w:rtl w:val="0"/>
-            </w:rPr>
-            <w:t xml:space="preserve">20</w:t>
-          </w:r>
-          <w:r>
-            <w:fldChar w:fldCharType="end"/>
-          </w:r>
           <w:r>
             <w:rPr>
               <w:rtl w:val="0"/>
@@ -1893,7 +1766,217 @@
           <w:pPr>
             <w:widowControl w:val="0"/>
             <w:tabs>
-              <w:tab w:val="right" w:leader="dot" w:pos="9025.511811023624"/>
+              <w:tab w:val="right" w:leader="dot" w:pos="12000"/>
+            </w:tabs>
+            <w:spacing w:before="60" w:line="240" w:lineRule="auto"/>
+            <w:ind w:left="360" w:firstLine="0"/>
+            <w:rPr>
+              <w:color w:val="000000"/>
+              <w:u w:val="none"/>
+            </w:rPr>
+          </w:pPr>
+          <w:hyperlink w:anchor="">
+            <w:r>
+              <w:rPr>
+                <w:rFonts w:ascii="Arial" w:cs="Arial" w:eastAsia="Arial" w:hAnsi="Arial"/>
+                <w:b w:val="1"/>
+                <w:bCs w:val="1"/>
+                <w:i w:val="0"/>
+                <w:iCs w:val="0"/>
+                <w:smallCaps w:val="0"/>
+                <w:strike w:val="0"/>
+                <w:color w:val="000000"/>
+                <w:sz w:val="22"/>
+                <w:szCs w:val="22"/>
+                <w:u w:val="none"/>
+                <w:shd w:fill="auto" w:val="clear"/>
+                <w:vertAlign w:val="baseline"/>
+                <w:rtl w:val="0"/>
+              </w:rPr>
+              <w:t xml:space="preserve">6.1 Organización de la hoja de estilos</w:t>
+              <w:tab/>
+              <w:t xml:space="preserve">22</w:t>
+            </w:r>
+          </w:hyperlink>
+          <w:r>
+            <w:rPr>
+              <w:rtl w:val="0"/>
+            </w:rPr>
+          </w:r>
+        </w:p>
+        <w:p>
+          <w:pPr>
+            <w:widowControl w:val="0"/>
+            <w:tabs>
+              <w:tab w:val="right" w:leader="dot" w:pos="12000"/>
+            </w:tabs>
+            <w:spacing w:before="60" w:line="240" w:lineRule="auto"/>
+            <w:ind w:left="360" w:firstLine="0"/>
+            <w:rPr>
+              <w:color w:val="000000"/>
+              <w:u w:val="none"/>
+            </w:rPr>
+          </w:pPr>
+          <w:hyperlink w:anchor="">
+            <w:r>
+              <w:rPr>
+                <w:rFonts w:ascii="Arial" w:cs="Arial" w:eastAsia="Arial" w:hAnsi="Arial"/>
+                <w:b w:val="1"/>
+                <w:bCs w:val="1"/>
+                <w:i w:val="0"/>
+                <w:iCs w:val="0"/>
+                <w:smallCaps w:val="0"/>
+                <w:strike w:val="0"/>
+                <w:color w:val="000000"/>
+                <w:sz w:val="22"/>
+                <w:szCs w:val="22"/>
+                <w:u w:val="none"/>
+                <w:shd w:fill="auto" w:val="clear"/>
+                <w:vertAlign w:val="baseline"/>
+                <w:rtl w:val="0"/>
+              </w:rPr>
+              <w:t xml:space="preserve">6.2 Convención de nombres de clases</w:t>
+              <w:tab/>
+              <w:t xml:space="preserve">22</w:t>
+            </w:r>
+          </w:hyperlink>
+          <w:r>
+            <w:rPr>
+              <w:rtl w:val="0"/>
+            </w:rPr>
+          </w:r>
+        </w:p>
+        <w:p>
+          <w:pPr>
+            <w:widowControl w:val="0"/>
+            <w:tabs>
+              <w:tab w:val="right" w:leader="dot" w:pos="12000"/>
+            </w:tabs>
+            <w:spacing w:before="60" w:line="240" w:lineRule="auto"/>
+            <w:ind w:left="360" w:firstLine="0"/>
+            <w:rPr>
+              <w:color w:val="000000"/>
+              <w:u w:val="none"/>
+            </w:rPr>
+          </w:pPr>
+          <w:hyperlink w:anchor="">
+            <w:r>
+              <w:rPr>
+                <w:rFonts w:ascii="Arial" w:cs="Arial" w:eastAsia="Arial" w:hAnsi="Arial"/>
+                <w:b w:val="1"/>
+                <w:bCs w:val="1"/>
+                <w:i w:val="0"/>
+                <w:iCs w:val="0"/>
+                <w:smallCaps w:val="0"/>
+                <w:strike w:val="0"/>
+                <w:color w:val="000000"/>
+                <w:sz w:val="22"/>
+                <w:szCs w:val="22"/>
+                <w:u w:val="none"/>
+                <w:shd w:fill="auto" w:val="clear"/>
+                <w:vertAlign w:val="baseline"/>
+                <w:rtl w:val="0"/>
+              </w:rPr>
+              <w:t xml:space="preserve">6.3 Estrategia responsive</w:t>
+              <w:tab/>
+              <w:t xml:space="preserve">23</w:t>
+            </w:r>
+          </w:hyperlink>
+          <w:r>
+            <w:rPr>
+              <w:rtl w:val="0"/>
+            </w:rPr>
+          </w:r>
+        </w:p>
+        <w:p>
+          <w:pPr>
+            <w:widowControl w:val="0"/>
+            <w:tabs>
+              <w:tab w:val="right" w:leader="dot" w:pos="12000"/>
+            </w:tabs>
+            <w:spacing w:before="60" w:line="240" w:lineRule="auto"/>
+            <w:ind w:left="360" w:firstLine="0"/>
+            <w:rPr>
+              <w:color w:val="000000"/>
+              <w:u w:val="none"/>
+            </w:rPr>
+          </w:pPr>
+          <w:hyperlink w:anchor="">
+            <w:r>
+              <w:rPr>
+                <w:rFonts w:ascii="Arial" w:cs="Arial" w:eastAsia="Arial" w:hAnsi="Arial"/>
+                <w:b w:val="1"/>
+                <w:bCs w:val="1"/>
+                <w:i w:val="0"/>
+                <w:iCs w:val="0"/>
+                <w:smallCaps w:val="0"/>
+                <w:strike w:val="0"/>
+                <w:color w:val="000000"/>
+                <w:sz w:val="22"/>
+                <w:szCs w:val="22"/>
+                <w:u w:val="none"/>
+                <w:shd w:fill="auto" w:val="clear"/>
+                <w:vertAlign w:val="baseline"/>
+                <w:rtl w:val="0"/>
+              </w:rPr>
+              <w:t xml:space="preserve">6.4 Manejo visual de la validación</w:t>
+              <w:tab/>
+              <w:t xml:space="preserve">23</w:t>
+            </w:r>
+          </w:hyperlink>
+          <w:r>
+            <w:rPr>
+              <w:rtl w:val="0"/>
+            </w:rPr>
+          </w:r>
+        </w:p>
+        <w:p>
+          <w:pPr>
+            <w:widowControl w:val="0"/>
+            <w:tabs>
+              <w:tab w:val="right" w:leader="dot" w:pos="12000"/>
+            </w:tabs>
+            <w:spacing w:before="60" w:line="240" w:lineRule="auto"/>
+            <w:ind w:left="360" w:firstLine="0"/>
+            <w:rPr>
+              <w:color w:val="000000"/>
+              <w:u w:val="none"/>
+            </w:rPr>
+          </w:pPr>
+          <w:hyperlink w:anchor="">
+            <w:r>
+              <w:rPr>
+                <w:rFonts w:ascii="Arial" w:cs="Arial" w:eastAsia="Arial" w:hAnsi="Arial"/>
+                <w:b w:val="1"/>
+                <w:bCs w:val="1"/>
+                <w:i w:val="0"/>
+                <w:iCs w:val="0"/>
+                <w:smallCaps w:val="0"/>
+                <w:strike w:val="0"/>
+                <w:color w:val="000000"/>
+                <w:sz w:val="22"/>
+                <w:szCs w:val="22"/>
+                <w:u w:val="none"/>
+                <w:shd w:fill="auto" w:val="clear"/>
+                <w:vertAlign w:val="baseline"/>
+                <w:rtl w:val="0"/>
+              </w:rPr>
+              <w:t xml:space="preserve">6.5 Accesibilidad y verificación visual</w:t>
+              <w:tab/>
+              <w:t xml:space="preserve">24</w:t>
+            </w:r>
+          </w:hyperlink>
+          <w:r>
+            <w:rPr>
+              <w:rtl w:val="0"/>
+            </w:rPr>
+          </w:r>
+        </w:p>
+        <w:p>
+          <w:pPr>
+            <w:widowControl w:val="0"/>
+            <w:tabs>
+              <w:tab w:val="right" w:leader="dot" w:pos="12000"/>
             </w:tabs>
             <w:spacing w:before="60" w:line="240" w:lineRule="auto"/>
             <w:rPr>
@@ -1906,32 +1989,26 @@
           <w:hyperlink w:anchor="">
             <w:r>
               <w:rPr>
+                <w:rFonts w:ascii="Arial" w:cs="Arial" w:eastAsia="Arial" w:hAnsi="Arial"/>
                 <w:b w:val="1"/>
                 <w:bCs w:val="1"/>
+                <w:i w:val="0"/>
+                <w:iCs w:val="0"/>
+                <w:smallCaps w:val="0"/>
+                <w:strike w:val="0"/>
                 <w:color w:val="000000"/>
+                <w:sz w:val="22"/>
+                <w:szCs w:val="22"/>
                 <w:u w:val="none"/>
-                <w:rtl w:val="0"/>
-              </w:rPr>
-              <w:t xml:space="preserve">6. Diseño de los Estilos CSS</w:t>
+                <w:shd w:fill="auto" w:val="clear"/>
+                <w:vertAlign w:val="baseline"/>
+                <w:rtl w:val="0"/>
+              </w:rPr>
+              <w:t xml:space="preserve">7. Diseño de la Validación (JavaScript)</w:t>
               <w:tab/>
+              <w:t xml:space="preserve">24</w:t>
             </w:r>
           </w:hyperlink>
-          <w:r>
-            <w:fldChar w:fldCharType="begin"/>
-            <w:instrText xml:space="preserve"> PAGEREF  \h </w:instrText>
-            <w:fldChar w:fldCharType="separate"/>
-          </w:r>
-          <w:r>
-            <w:rPr>
-              <w:b w:val="1"/>
-              <w:bCs w:val="1"/>
-              <w:rtl w:val="0"/>
-            </w:rPr>
-            <w:t xml:space="preserve">22</w:t>
-          </w:r>
-          <w:r>
-            <w:fldChar w:fldCharType="end"/>
-          </w:r>
           <w:r>
             <w:rPr>
               <w:rtl w:val="0"/>
@@ -1942,7 +2019,7 @@
           <w:pPr>
             <w:widowControl w:val="0"/>
             <w:tabs>
-              <w:tab w:val="right" w:leader="dot" w:pos="9025.511811023624"/>
+              <w:tab w:val="right" w:leader="dot" w:pos="12000"/>
             </w:tabs>
             <w:spacing w:before="60" w:line="240" w:lineRule="auto"/>
             <w:ind w:left="360" w:firstLine="0"/>
@@ -1954,28 +2031,26 @@
           <w:hyperlink w:anchor="">
             <w:r>
               <w:rPr>
+                <w:rFonts w:ascii="Arial" w:cs="Arial" w:eastAsia="Arial" w:hAnsi="Arial"/>
+                <w:b w:val="1"/>
+                <w:bCs w:val="1"/>
+                <w:i w:val="0"/>
+                <w:iCs w:val="0"/>
+                <w:smallCaps w:val="0"/>
+                <w:strike w:val="0"/>
                 <w:color w:val="000000"/>
+                <w:sz w:val="22"/>
+                <w:szCs w:val="22"/>
                 <w:u w:val="none"/>
-                <w:rtl w:val="0"/>
-              </w:rPr>
-              <w:t xml:space="preserve">6.1 Organización de la hoja de estilos</w:t>
+                <w:shd w:fill="auto" w:val="clear"/>
+                <w:vertAlign w:val="baseline"/>
+                <w:rtl w:val="0"/>
+              </w:rPr>
+              <w:t xml:space="preserve">7.1 Estrategia general</w:t>
               <w:tab/>
+              <w:t xml:space="preserve">25</w:t>
             </w:r>
           </w:hyperlink>
-          <w:r>
-            <w:fldChar w:fldCharType="begin"/>
-            <w:instrText xml:space="preserve"> PAGEREF  \h </w:instrText>
-            <w:fldChar w:fldCharType="separate"/>
-          </w:r>
-          <w:r>
-            <w:rPr>
-              <w:rtl w:val="0"/>
-            </w:rPr>
-            <w:t xml:space="preserve">22</w:t>
-          </w:r>
-          <w:r>
-            <w:fldChar w:fldCharType="end"/>
-          </w:r>
           <w:r>
             <w:rPr>
               <w:rtl w:val="0"/>
@@ -1986,10 +2061,10 @@
           <w:pPr>
             <w:widowControl w:val="0"/>
             <w:tabs>
-              <w:tab w:val="right" w:leader="dot" w:pos="9025.511811023624"/>
+              <w:tab w:val="right" w:leader="dot" w:pos="12000"/>
             </w:tabs>
             <w:spacing w:before="60" w:line="240" w:lineRule="auto"/>
-            <w:ind w:left="360" w:firstLine="0"/>
+            <w:ind w:left="720" w:firstLine="0"/>
             <w:rPr>
               <w:color w:val="000000"/>
               <w:u w:val="none"/>
@@ -1998,28 +2073,26 @@
           <w:hyperlink w:anchor="">
             <w:r>
               <w:rPr>
+                <w:rFonts w:ascii="Arial" w:cs="Arial" w:eastAsia="Arial" w:hAnsi="Arial"/>
+                <w:b w:val="1"/>
+                <w:bCs w:val="1"/>
+                <w:i w:val="0"/>
+                <w:iCs w:val="0"/>
+                <w:smallCaps w:val="0"/>
+                <w:strike w:val="0"/>
                 <w:color w:val="000000"/>
+                <w:sz w:val="22"/>
+                <w:szCs w:val="22"/>
                 <w:u w:val="none"/>
-                <w:rtl w:val="0"/>
-              </w:rPr>
-              <w:t xml:space="preserve">6.2 Convención de nombres de clases</w:t>
+                <w:shd w:fill="auto" w:val="clear"/>
+                <w:vertAlign w:val="baseline"/>
+                <w:rtl w:val="0"/>
+              </w:rPr>
+              <w:t xml:space="preserve">7.1.1 Comportamiento general de la validación</w:t>
               <w:tab/>
+              <w:t xml:space="preserve">25</w:t>
             </w:r>
           </w:hyperlink>
-          <w:r>
-            <w:fldChar w:fldCharType="begin"/>
-            <w:instrText xml:space="preserve"> PAGEREF  \h </w:instrText>
-            <w:fldChar w:fldCharType="separate"/>
-          </w:r>
-          <w:r>
-            <w:rPr>
-              <w:rtl w:val="0"/>
-            </w:rPr>
-            <w:t xml:space="preserve">22</w:t>
-          </w:r>
-          <w:r>
-            <w:fldChar w:fldCharType="end"/>
-          </w:r>
           <w:r>
             <w:rPr>
               <w:rtl w:val="0"/>
@@ -2030,7 +2103,7 @@
           <w:pPr>
             <w:widowControl w:val="0"/>
             <w:tabs>
-              <w:tab w:val="right" w:leader="dot" w:pos="9025.511811023624"/>
+              <w:tab w:val="right" w:leader="dot" w:pos="12000"/>
             </w:tabs>
             <w:spacing w:before="60" w:line="240" w:lineRule="auto"/>
             <w:ind w:left="360" w:firstLine="0"/>
@@ -2042,28 +2115,26 @@
           <w:hyperlink w:anchor="">
             <w:r>
               <w:rPr>
+                <w:rFonts w:ascii="Arial" w:cs="Arial" w:eastAsia="Arial" w:hAnsi="Arial"/>
+                <w:b w:val="1"/>
+                <w:bCs w:val="1"/>
+                <w:i w:val="0"/>
+                <w:iCs w:val="0"/>
+                <w:smallCaps w:val="0"/>
+                <w:strike w:val="0"/>
                 <w:color w:val="000000"/>
+                <w:sz w:val="22"/>
+                <w:szCs w:val="22"/>
                 <w:u w:val="none"/>
-                <w:rtl w:val="0"/>
-              </w:rPr>
-              <w:t xml:space="preserve">6.3 Estrategia responsive</w:t>
+                <w:shd w:fill="auto" w:val="clear"/>
+                <w:vertAlign w:val="baseline"/>
+                <w:rtl w:val="0"/>
+              </w:rPr>
+              <w:t xml:space="preserve">7.2 Reglas de validación por campo</w:t>
               <w:tab/>
+              <w:t xml:space="preserve">25</w:t>
             </w:r>
           </w:hyperlink>
-          <w:r>
-            <w:fldChar w:fldCharType="begin"/>
-            <w:instrText xml:space="preserve"> PAGEREF  \h </w:instrText>
-            <w:fldChar w:fldCharType="separate"/>
-          </w:r>
-          <w:r>
-            <w:rPr>
-              <w:rtl w:val="0"/>
-            </w:rPr>
-            <w:t xml:space="preserve">23</w:t>
-          </w:r>
-          <w:r>
-            <w:fldChar w:fldCharType="end"/>
-          </w:r>
           <w:r>
             <w:rPr>
               <w:rtl w:val="0"/>
@@ -2074,10 +2145,10 @@
           <w:pPr>
             <w:widowControl w:val="0"/>
             <w:tabs>
-              <w:tab w:val="right" w:leader="dot" w:pos="9025.511811023624"/>
+              <w:tab w:val="right" w:leader="dot" w:pos="12000"/>
             </w:tabs>
             <w:spacing w:before="60" w:line="240" w:lineRule="auto"/>
-            <w:ind w:left="360" w:firstLine="0"/>
+            <w:ind w:left="720" w:firstLine="0"/>
             <w:rPr>
               <w:color w:val="000000"/>
               <w:u w:val="none"/>
@@ -2086,28 +2157,26 @@
           <w:hyperlink w:anchor="">
             <w:r>
               <w:rPr>
+                <w:rFonts w:ascii="Arial" w:cs="Arial" w:eastAsia="Arial" w:hAnsi="Arial"/>
+                <w:b w:val="1"/>
+                <w:bCs w:val="1"/>
+                <w:i w:val="0"/>
+                <w:iCs w:val="0"/>
+                <w:smallCaps w:val="0"/>
+                <w:strike w:val="0"/>
                 <w:color w:val="000000"/>
+                <w:sz w:val="22"/>
+                <w:szCs w:val="22"/>
                 <w:u w:val="none"/>
-                <w:rtl w:val="0"/>
-              </w:rPr>
-              <w:t xml:space="preserve">6.4 Manejo visual de la validación</w:t>
+                <w:shd w:fill="auto" w:val="clear"/>
+                <w:vertAlign w:val="baseline"/>
+                <w:rtl w:val="0"/>
+              </w:rPr>
+              <w:t xml:space="preserve">7.2.1 Inicio de sesión</w:t>
               <w:tab/>
+              <w:t xml:space="preserve">25</w:t>
             </w:r>
           </w:hyperlink>
-          <w:r>
-            <w:fldChar w:fldCharType="begin"/>
-            <w:instrText xml:space="preserve"> PAGEREF  \h </w:instrText>
-            <w:fldChar w:fldCharType="separate"/>
-          </w:r>
-          <w:r>
-            <w:rPr>
-              <w:rtl w:val="0"/>
-            </w:rPr>
-            <w:t xml:space="preserve">23</w:t>
-          </w:r>
-          <w:r>
-            <w:fldChar w:fldCharType="end"/>
-          </w:r>
           <w:r>
             <w:rPr>
               <w:rtl w:val="0"/>
@@ -2118,10 +2187,10 @@
           <w:pPr>
             <w:widowControl w:val="0"/>
             <w:tabs>
-              <w:tab w:val="right" w:leader="dot" w:pos="9025.511811023624"/>
+              <w:tab w:val="right" w:leader="dot" w:pos="12000"/>
             </w:tabs>
             <w:spacing w:before="60" w:line="240" w:lineRule="auto"/>
-            <w:ind w:left="360" w:firstLine="0"/>
+            <w:ind w:left="720" w:firstLine="0"/>
             <w:rPr>
               <w:color w:val="000000"/>
               <w:u w:val="none"/>
@@ -2130,28 +2199,26 @@
           <w:hyperlink w:anchor="">
             <w:r>
               <w:rPr>
+                <w:rFonts w:ascii="Arial" w:cs="Arial" w:eastAsia="Arial" w:hAnsi="Arial"/>
+                <w:b w:val="1"/>
+                <w:bCs w:val="1"/>
+                <w:i w:val="0"/>
+                <w:iCs w:val="0"/>
+                <w:smallCaps w:val="0"/>
+                <w:strike w:val="0"/>
                 <w:color w:val="000000"/>
+                <w:sz w:val="22"/>
+                <w:szCs w:val="22"/>
                 <w:u w:val="none"/>
-                <w:rtl w:val="0"/>
-              </w:rPr>
-              <w:t xml:space="preserve">6.5 Accesibilidad y verificación visual</w:t>
+                <w:shd w:fill="auto" w:val="clear"/>
+                <w:vertAlign w:val="baseline"/>
+                <w:rtl w:val="0"/>
+              </w:rPr>
+              <w:t xml:space="preserve">7.2.2 Formulario de usuarios</w:t>
               <w:tab/>
+              <w:t xml:space="preserve">26</w:t>
             </w:r>
           </w:hyperlink>
-          <w:r>
-            <w:fldChar w:fldCharType="begin"/>
-            <w:instrText xml:space="preserve"> PAGEREF  \h </w:instrText>
-            <w:fldChar w:fldCharType="separate"/>
-          </w:r>
-          <w:r>
-            <w:rPr>
-              <w:rtl w:val="0"/>
-            </w:rPr>
-            <w:t xml:space="preserve">24</w:t>
-          </w:r>
-          <w:r>
-            <w:fldChar w:fldCharType="end"/>
-          </w:r>
           <w:r>
             <w:rPr>
               <w:rtl w:val="0"/>
@@ -2162,7 +2229,301 @@
           <w:pPr>
             <w:widowControl w:val="0"/>
             <w:tabs>
-              <w:tab w:val="right" w:leader="dot" w:pos="9025.511811023624"/>
+              <w:tab w:val="right" w:leader="dot" w:pos="12000"/>
+            </w:tabs>
+            <w:spacing w:before="60" w:line="240" w:lineRule="auto"/>
+            <w:ind w:left="720" w:firstLine="0"/>
+            <w:rPr>
+              <w:color w:val="000000"/>
+              <w:u w:val="none"/>
+            </w:rPr>
+          </w:pPr>
+          <w:hyperlink w:anchor="">
+            <w:r>
+              <w:rPr>
+                <w:rFonts w:ascii="Arial" w:cs="Arial" w:eastAsia="Arial" w:hAnsi="Arial"/>
+                <w:b w:val="1"/>
+                <w:bCs w:val="1"/>
+                <w:i w:val="0"/>
+                <w:iCs w:val="0"/>
+                <w:smallCaps w:val="0"/>
+                <w:strike w:val="0"/>
+                <w:color w:val="000000"/>
+                <w:sz w:val="22"/>
+                <w:szCs w:val="22"/>
+                <w:u w:val="none"/>
+                <w:shd w:fill="auto" w:val="clear"/>
+                <w:vertAlign w:val="baseline"/>
+                <w:rtl w:val="0"/>
+              </w:rPr>
+              <w:t xml:space="preserve">7.2.3 Formularios de catálogos</w:t>
+              <w:tab/>
+              <w:t xml:space="preserve">27</w:t>
+            </w:r>
+          </w:hyperlink>
+          <w:r>
+            <w:rPr>
+              <w:rtl w:val="0"/>
+            </w:rPr>
+          </w:r>
+        </w:p>
+        <w:p>
+          <w:pPr>
+            <w:widowControl w:val="0"/>
+            <w:tabs>
+              <w:tab w:val="right" w:leader="dot" w:pos="12000"/>
+            </w:tabs>
+            <w:spacing w:before="60" w:line="240" w:lineRule="auto"/>
+            <w:ind w:left="720" w:firstLine="0"/>
+            <w:rPr>
+              <w:color w:val="000000"/>
+              <w:u w:val="none"/>
+            </w:rPr>
+          </w:pPr>
+          <w:hyperlink w:anchor="">
+            <w:r>
+              <w:rPr>
+                <w:rFonts w:ascii="Arial" w:cs="Arial" w:eastAsia="Arial" w:hAnsi="Arial"/>
+                <w:b w:val="1"/>
+                <w:bCs w:val="1"/>
+                <w:i w:val="0"/>
+                <w:iCs w:val="0"/>
+                <w:smallCaps w:val="0"/>
+                <w:strike w:val="0"/>
+                <w:color w:val="000000"/>
+                <w:sz w:val="22"/>
+                <w:szCs w:val="22"/>
+                <w:u w:val="none"/>
+                <w:shd w:fill="auto" w:val="clear"/>
+                <w:vertAlign w:val="baseline"/>
+                <w:rtl w:val="0"/>
+              </w:rPr>
+              <w:t xml:space="preserve">7.2.4 Formulario de cursos</w:t>
+              <w:tab/>
+              <w:t xml:space="preserve">28</w:t>
+            </w:r>
+          </w:hyperlink>
+          <w:r>
+            <w:rPr>
+              <w:rtl w:val="0"/>
+            </w:rPr>
+          </w:r>
+        </w:p>
+        <w:p>
+          <w:pPr>
+            <w:widowControl w:val="0"/>
+            <w:tabs>
+              <w:tab w:val="right" w:leader="dot" w:pos="12000"/>
+            </w:tabs>
+            <w:spacing w:before="60" w:line="240" w:lineRule="auto"/>
+            <w:ind w:left="360" w:firstLine="0"/>
+            <w:rPr>
+              <w:color w:val="000000"/>
+              <w:u w:val="none"/>
+            </w:rPr>
+          </w:pPr>
+          <w:hyperlink w:anchor="">
+            <w:r>
+              <w:rPr>
+                <w:rFonts w:ascii="Arial" w:cs="Arial" w:eastAsia="Arial" w:hAnsi="Arial"/>
+                <w:b w:val="1"/>
+                <w:bCs w:val="1"/>
+                <w:i w:val="0"/>
+                <w:iCs w:val="0"/>
+                <w:smallCaps w:val="0"/>
+                <w:strike w:val="0"/>
+                <w:color w:val="000000"/>
+                <w:sz w:val="22"/>
+                <w:szCs w:val="22"/>
+                <w:u w:val="none"/>
+                <w:shd w:fill="auto" w:val="clear"/>
+                <w:vertAlign w:val="baseline"/>
+                <w:rtl w:val="0"/>
+              </w:rPr>
+              <w:t xml:space="preserve">7.3 Lógica / pseudocódigo</w:t>
+              <w:tab/>
+              <w:t xml:space="preserve">31</w:t>
+            </w:r>
+          </w:hyperlink>
+          <w:r>
+            <w:rPr>
+              <w:rtl w:val="0"/>
+            </w:rPr>
+          </w:r>
+        </w:p>
+        <w:p>
+          <w:pPr>
+            <w:widowControl w:val="0"/>
+            <w:tabs>
+              <w:tab w:val="right" w:leader="dot" w:pos="12000"/>
+            </w:tabs>
+            <w:spacing w:before="60" w:line="240" w:lineRule="auto"/>
+            <w:ind w:left="720" w:firstLine="0"/>
+            <w:rPr>
+              <w:color w:val="000000"/>
+              <w:u w:val="none"/>
+            </w:rPr>
+          </w:pPr>
+          <w:hyperlink w:anchor="">
+            <w:r>
+              <w:rPr>
+                <w:rFonts w:ascii="Arial" w:cs="Arial" w:eastAsia="Arial" w:hAnsi="Arial"/>
+                <w:b w:val="1"/>
+                <w:bCs w:val="1"/>
+                <w:i w:val="0"/>
+                <w:iCs w:val="0"/>
+                <w:smallCaps w:val="0"/>
+                <w:strike w:val="0"/>
+                <w:color w:val="000000"/>
+                <w:sz w:val="22"/>
+                <w:szCs w:val="22"/>
+                <w:u w:val="none"/>
+                <w:shd w:fill="auto" w:val="clear"/>
+                <w:vertAlign w:val="baseline"/>
+                <w:rtl w:val="0"/>
+              </w:rPr>
+              <w:t xml:space="preserve">Validación general de formularios</w:t>
+              <w:tab/>
+              <w:t xml:space="preserve">31</w:t>
+            </w:r>
+          </w:hyperlink>
+          <w:r>
+            <w:rPr>
+              <w:rtl w:val="0"/>
+            </w:rPr>
+          </w:r>
+        </w:p>
+        <w:p>
+          <w:pPr>
+            <w:widowControl w:val="0"/>
+            <w:tabs>
+              <w:tab w:val="right" w:leader="dot" w:pos="12000"/>
+            </w:tabs>
+            <w:spacing w:before="60" w:line="240" w:lineRule="auto"/>
+            <w:ind w:left="720" w:firstLine="0"/>
+            <w:rPr>
+              <w:color w:val="000000"/>
+              <w:u w:val="none"/>
+            </w:rPr>
+          </w:pPr>
+          <w:hyperlink w:anchor="">
+            <w:r>
+              <w:rPr>
+                <w:rFonts w:ascii="Arial" w:cs="Arial" w:eastAsia="Arial" w:hAnsi="Arial"/>
+                <w:b w:val="1"/>
+                <w:bCs w:val="1"/>
+                <w:i w:val="0"/>
+                <w:iCs w:val="0"/>
+                <w:smallCaps w:val="0"/>
+                <w:strike w:val="0"/>
+                <w:color w:val="000000"/>
+                <w:sz w:val="22"/>
+                <w:szCs w:val="22"/>
+                <w:u w:val="none"/>
+                <w:shd w:fill="auto" w:val="clear"/>
+                <w:vertAlign w:val="baseline"/>
+                <w:rtl w:val="0"/>
+              </w:rPr>
+              <w:t xml:space="preserve">Inicio de sesión</w:t>
+              <w:tab/>
+              <w:t xml:space="preserve">32</w:t>
+            </w:r>
+          </w:hyperlink>
+          <w:r>
+            <w:rPr>
+              <w:rtl w:val="0"/>
+            </w:rPr>
+          </w:r>
+        </w:p>
+        <w:p>
+          <w:pPr>
+            <w:widowControl w:val="0"/>
+            <w:tabs>
+              <w:tab w:val="right" w:leader="dot" w:pos="12000"/>
+            </w:tabs>
+            <w:spacing w:before="60" w:line="240" w:lineRule="auto"/>
+            <w:ind w:left="720" w:firstLine="0"/>
+            <w:rPr>
+              <w:color w:val="000000"/>
+              <w:u w:val="none"/>
+            </w:rPr>
+          </w:pPr>
+          <w:hyperlink w:anchor="">
+            <w:r>
+              <w:rPr>
+                <w:rFonts w:ascii="Arial" w:cs="Arial" w:eastAsia="Arial" w:hAnsi="Arial"/>
+                <w:b w:val="1"/>
+                <w:bCs w:val="1"/>
+                <w:i w:val="0"/>
+                <w:iCs w:val="0"/>
+                <w:smallCaps w:val="0"/>
+                <w:strike w:val="0"/>
+                <w:color w:val="000000"/>
+                <w:sz w:val="22"/>
+                <w:szCs w:val="22"/>
+                <w:u w:val="none"/>
+                <w:shd w:fill="auto" w:val="clear"/>
+                <w:vertAlign w:val="baseline"/>
+                <w:rtl w:val="0"/>
+              </w:rPr>
+              <w:t xml:space="preserve">Guardado inicial de un curso</w:t>
+              <w:tab/>
+              <w:t xml:space="preserve">32</w:t>
+            </w:r>
+          </w:hyperlink>
+          <w:r>
+            <w:rPr>
+              <w:rtl w:val="0"/>
+            </w:rPr>
+          </w:r>
+        </w:p>
+        <w:p>
+          <w:pPr>
+            <w:widowControl w:val="0"/>
+            <w:tabs>
+              <w:tab w:val="right" w:leader="dot" w:pos="12000"/>
+            </w:tabs>
+            <w:spacing w:before="60" w:line="240" w:lineRule="auto"/>
+            <w:ind w:left="720" w:firstLine="0"/>
+            <w:rPr>
+              <w:color w:val="000000"/>
+              <w:u w:val="none"/>
+            </w:rPr>
+          </w:pPr>
+          <w:hyperlink w:anchor="">
+            <w:r>
+              <w:rPr>
+                <w:rFonts w:ascii="Arial" w:cs="Arial" w:eastAsia="Arial" w:hAnsi="Arial"/>
+                <w:b w:val="1"/>
+                <w:bCs w:val="1"/>
+                <w:i w:val="0"/>
+                <w:iCs w:val="0"/>
+                <w:smallCaps w:val="0"/>
+                <w:strike w:val="0"/>
+                <w:color w:val="000000"/>
+                <w:sz w:val="22"/>
+                <w:szCs w:val="22"/>
+                <w:u w:val="none"/>
+                <w:shd w:fill="auto" w:val="clear"/>
+                <w:vertAlign w:val="baseline"/>
+                <w:rtl w:val="0"/>
+              </w:rPr>
+              <w:t xml:space="preserve">Flujo de aprobación del curso</w:t>
+              <w:tab/>
+              <w:t xml:space="preserve">32</w:t>
+            </w:r>
+          </w:hyperlink>
+          <w:r>
+            <w:rPr>
+              <w:rtl w:val="0"/>
+            </w:rPr>
+          </w:r>
+        </w:p>
+        <w:p>
+          <w:pPr>
+            <w:widowControl w:val="0"/>
+            <w:tabs>
+              <w:tab w:val="right" w:leader="dot" w:pos="12000"/>
             </w:tabs>
             <w:spacing w:before="60" w:line="240" w:lineRule="auto"/>
             <w:rPr>
@@ -2175,32 +2536,26 @@
           <w:hyperlink w:anchor="">
             <w:r>
               <w:rPr>
+                <w:rFonts w:ascii="Arial" w:cs="Arial" w:eastAsia="Arial" w:hAnsi="Arial"/>
                 <w:b w:val="1"/>
                 <w:bCs w:val="1"/>
+                <w:i w:val="0"/>
+                <w:iCs w:val="0"/>
+                <w:smallCaps w:val="0"/>
+                <w:strike w:val="0"/>
                 <w:color w:val="000000"/>
+                <w:sz w:val="22"/>
+                <w:szCs w:val="22"/>
                 <w:u w:val="none"/>
-                <w:rtl w:val="0"/>
-              </w:rPr>
-              <w:t xml:space="preserve">7. Diseño de la Validación (JavaScript)</w:t>
+                <w:shd w:fill="auto" w:val="clear"/>
+                <w:vertAlign w:val="baseline"/>
+                <w:rtl w:val="0"/>
+              </w:rPr>
+              <w:t xml:space="preserve">8. Casos de Prueba</w:t>
               <w:tab/>
+              <w:t xml:space="preserve">33</w:t>
             </w:r>
           </w:hyperlink>
-          <w:r>
-            <w:fldChar w:fldCharType="begin"/>
-            <w:instrText xml:space="preserve"> PAGEREF  \h </w:instrText>
-            <w:fldChar w:fldCharType="separate"/>
-          </w:r>
-          <w:r>
-            <w:rPr>
-              <w:b w:val="1"/>
-              <w:bCs w:val="1"/>
-              <w:rtl w:val="0"/>
-            </w:rPr>
-            <w:t xml:space="preserve">24</w:t>
-          </w:r>
-          <w:r>
-            <w:fldChar w:fldCharType="end"/>
-          </w:r>
           <w:r>
             <w:rPr>
               <w:rtl w:val="0"/>
@@ -2211,11 +2566,12 @@
           <w:pPr>
             <w:widowControl w:val="0"/>
             <w:tabs>
-              <w:tab w:val="right" w:leader="dot" w:pos="9025.511811023624"/>
+              <w:tab w:val="right" w:leader="dot" w:pos="12000"/>
             </w:tabs>
             <w:spacing w:before="60" w:line="240" w:lineRule="auto"/>
-            <w:ind w:left="360" w:firstLine="0"/>
             <w:rPr>
+              <w:b w:val="1"/>
+              <w:bCs w:val="1"/>
               <w:color w:val="000000"/>
               <w:u w:val="none"/>
             </w:rPr>
@@ -2223,28 +2579,26 @@
           <w:hyperlink w:anchor="">
             <w:r>
               <w:rPr>
+                <w:rFonts w:ascii="Arial" w:cs="Arial" w:eastAsia="Arial" w:hAnsi="Arial"/>
+                <w:b w:val="1"/>
+                <w:bCs w:val="1"/>
+                <w:i w:val="0"/>
+                <w:iCs w:val="0"/>
+                <w:smallCaps w:val="0"/>
+                <w:strike w:val="0"/>
                 <w:color w:val="000000"/>
+                <w:sz w:val="22"/>
+                <w:szCs w:val="22"/>
                 <w:u w:val="none"/>
-                <w:rtl w:val="0"/>
-              </w:rPr>
-              <w:t xml:space="preserve">7.1 Estrategia general</w:t>
+                <w:shd w:fill="auto" w:val="clear"/>
+                <w:vertAlign w:val="baseline"/>
+                <w:rtl w:val="0"/>
+              </w:rPr>
+              <w:t xml:space="preserve">9. Plan de Trabajo y Responsabilidades</w:t>
               <w:tab/>
+              <w:t xml:space="preserve">36</w:t>
             </w:r>
           </w:hyperlink>
-          <w:r>
-            <w:fldChar w:fldCharType="begin"/>
-            <w:instrText xml:space="preserve"> PAGEREF  \h </w:instrText>
-            <w:fldChar w:fldCharType="separate"/>
-          </w:r>
-          <w:r>
-            <w:rPr>
-              <w:rtl w:val="0"/>
-            </w:rPr>
-            <w:t xml:space="preserve">25</w:t>
-          </w:r>
-          <w:r>
-            <w:fldChar w:fldCharType="end"/>
-          </w:r>
           <w:r>
             <w:rPr>
               <w:rtl w:val="0"/>
@@ -2255,491 +2609,7 @@
           <w:pPr>
             <w:widowControl w:val="0"/>
             <w:tabs>
-              <w:tab w:val="right" w:leader="dot" w:pos="9025.511811023624"/>
-            </w:tabs>
-            <w:spacing w:before="60" w:line="240" w:lineRule="auto"/>
-            <w:ind w:left="720" w:firstLine="0"/>
-            <w:rPr>
-              <w:color w:val="000000"/>
-              <w:u w:val="none"/>
-            </w:rPr>
-          </w:pPr>
-          <w:hyperlink w:anchor="">
-            <w:r>
-              <w:rPr>
-                <w:color w:val="000000"/>
-                <w:u w:val="none"/>
-                <w:rtl w:val="0"/>
-              </w:rPr>
-              <w:t xml:space="preserve">7.1.1 Comportamiento general de la validación</w:t>
-              <w:tab/>
-            </w:r>
-          </w:hyperlink>
-          <w:r>
-            <w:fldChar w:fldCharType="begin"/>
-            <w:instrText xml:space="preserve"> PAGEREF  \h </w:instrText>
-            <w:fldChar w:fldCharType="separate"/>
-          </w:r>
-          <w:r>
-            <w:rPr>
-              <w:rtl w:val="0"/>
-            </w:rPr>
-            <w:t xml:space="preserve">25</w:t>
-          </w:r>
-          <w:r>
-            <w:fldChar w:fldCharType="end"/>
-          </w:r>
-          <w:r>
-            <w:rPr>
-              <w:rtl w:val="0"/>
-            </w:rPr>
-          </w:r>
-        </w:p>
-        <w:p>
-          <w:pPr>
-            <w:widowControl w:val="0"/>
-            <w:tabs>
-              <w:tab w:val="right" w:leader="dot" w:pos="9025.511811023624"/>
-            </w:tabs>
-            <w:spacing w:before="60" w:line="240" w:lineRule="auto"/>
-            <w:ind w:left="360" w:firstLine="0"/>
-            <w:rPr>
-              <w:color w:val="000000"/>
-              <w:u w:val="none"/>
-            </w:rPr>
-          </w:pPr>
-          <w:hyperlink w:anchor="">
-            <w:r>
-              <w:rPr>
-                <w:color w:val="000000"/>
-                <w:u w:val="none"/>
-                <w:rtl w:val="0"/>
-              </w:rPr>
-              <w:t xml:space="preserve">7.2 Reglas de validación por campo</w:t>
-              <w:tab/>
-            </w:r>
-          </w:hyperlink>
-          <w:r>
-            <w:fldChar w:fldCharType="begin"/>
-            <w:instrText xml:space="preserve"> PAGEREF  \h </w:instrText>
-            <w:fldChar w:fldCharType="separate"/>
-          </w:r>
-          <w:r>
-            <w:rPr>
-              <w:rtl w:val="0"/>
-            </w:rPr>
-            <w:t xml:space="preserve">25</w:t>
-          </w:r>
-          <w:r>
-            <w:fldChar w:fldCharType="end"/>
-          </w:r>
-          <w:r>
-            <w:rPr>
-              <w:rtl w:val="0"/>
-            </w:rPr>
-          </w:r>
-        </w:p>
-        <w:p>
-          <w:pPr>
-            <w:widowControl w:val="0"/>
-            <w:tabs>
-              <w:tab w:val="right" w:leader="dot" w:pos="9025.511811023624"/>
-            </w:tabs>
-            <w:spacing w:before="60" w:line="240" w:lineRule="auto"/>
-            <w:ind w:left="720" w:firstLine="0"/>
-            <w:rPr>
-              <w:color w:val="000000"/>
-              <w:u w:val="none"/>
-            </w:rPr>
-          </w:pPr>
-          <w:hyperlink w:anchor="">
-            <w:r>
-              <w:rPr>
-                <w:color w:val="000000"/>
-                <w:u w:val="none"/>
-                <w:rtl w:val="0"/>
-              </w:rPr>
-              <w:t xml:space="preserve">7.2.1 Inicio de sesión</w:t>
-              <w:tab/>
-            </w:r>
-          </w:hyperlink>
-          <w:r>
-            <w:fldChar w:fldCharType="begin"/>
-            <w:instrText xml:space="preserve"> PAGEREF  \h </w:instrText>
-            <w:fldChar w:fldCharType="separate"/>
-          </w:r>
-          <w:r>
-            <w:rPr>
-              <w:rtl w:val="0"/>
-            </w:rPr>
-            <w:t xml:space="preserve">25</w:t>
-          </w:r>
-          <w:r>
-            <w:fldChar w:fldCharType="end"/>
-          </w:r>
-          <w:r>
-            <w:rPr>
-              <w:rtl w:val="0"/>
-            </w:rPr>
-          </w:r>
-        </w:p>
-        <w:p>
-          <w:pPr>
-            <w:widowControl w:val="0"/>
-            <w:tabs>
-              <w:tab w:val="right" w:leader="dot" w:pos="9025.511811023624"/>
-            </w:tabs>
-            <w:spacing w:before="60" w:line="240" w:lineRule="auto"/>
-            <w:ind w:left="720" w:firstLine="0"/>
-            <w:rPr>
-              <w:color w:val="000000"/>
-              <w:u w:val="none"/>
-            </w:rPr>
-          </w:pPr>
-          <w:hyperlink w:anchor="">
-            <w:r>
-              <w:rPr>
-                <w:color w:val="000000"/>
-                <w:u w:val="none"/>
-                <w:rtl w:val="0"/>
-              </w:rPr>
-              <w:t xml:space="preserve">7.2.2 Formulario de usuarios</w:t>
-              <w:tab/>
-            </w:r>
-          </w:hyperlink>
-          <w:r>
-            <w:fldChar w:fldCharType="begin"/>
-            <w:instrText xml:space="preserve"> PAGEREF  \h </w:instrText>
-            <w:fldChar w:fldCharType="separate"/>
-          </w:r>
-          <w:r>
-            <w:rPr>
-              <w:rtl w:val="0"/>
-            </w:rPr>
-            <w:t xml:space="preserve">26</w:t>
-          </w:r>
-          <w:r>
-            <w:fldChar w:fldCharType="end"/>
-          </w:r>
-          <w:r>
-            <w:rPr>
-              <w:rtl w:val="0"/>
-            </w:rPr>
-          </w:r>
-        </w:p>
-        <w:p>
-          <w:pPr>
-            <w:widowControl w:val="0"/>
-            <w:tabs>
-              <w:tab w:val="right" w:leader="dot" w:pos="9025.511811023624"/>
-            </w:tabs>
-            <w:spacing w:before="60" w:line="240" w:lineRule="auto"/>
-            <w:ind w:left="720" w:firstLine="0"/>
-            <w:rPr>
-              <w:color w:val="000000"/>
-              <w:u w:val="none"/>
-            </w:rPr>
-          </w:pPr>
-          <w:hyperlink w:anchor="">
-            <w:r>
-              <w:rPr>
-                <w:color w:val="000000"/>
-                <w:u w:val="none"/>
-                <w:rtl w:val="0"/>
-              </w:rPr>
-              <w:t xml:space="preserve">7.2.3 Formularios de catálogos</w:t>
-              <w:tab/>
-            </w:r>
-          </w:hyperlink>
-          <w:r>
-            <w:fldChar w:fldCharType="begin"/>
-            <w:instrText xml:space="preserve"> PAGEREF  \h </w:instrText>
-            <w:fldChar w:fldCharType="separate"/>
-          </w:r>
-          <w:r>
-            <w:rPr>
-              <w:rtl w:val="0"/>
-            </w:rPr>
-            <w:t xml:space="preserve">27</w:t>
-          </w:r>
-          <w:r>
-            <w:fldChar w:fldCharType="end"/>
-          </w:r>
-          <w:r>
-            <w:rPr>
-              <w:rtl w:val="0"/>
-            </w:rPr>
-          </w:r>
-        </w:p>
-        <w:p>
-          <w:pPr>
-            <w:widowControl w:val="0"/>
-            <w:tabs>
-              <w:tab w:val="right" w:leader="dot" w:pos="9025.511811023624"/>
-            </w:tabs>
-            <w:spacing w:before="60" w:line="240" w:lineRule="auto"/>
-            <w:ind w:left="720" w:firstLine="0"/>
-            <w:rPr>
-              <w:color w:val="000000"/>
-              <w:u w:val="none"/>
-            </w:rPr>
-          </w:pPr>
-          <w:hyperlink w:anchor="">
-            <w:r>
-              <w:rPr>
-                <w:color w:val="000000"/>
-                <w:u w:val="none"/>
-                <w:rtl w:val="0"/>
-              </w:rPr>
-              <w:t xml:space="preserve">7.2.4 Formulario de cursos</w:t>
-              <w:tab/>
-            </w:r>
-          </w:hyperlink>
-          <w:r>
-            <w:fldChar w:fldCharType="begin"/>
-            <w:instrText xml:space="preserve"> PAGEREF  \h </w:instrText>
-            <w:fldChar w:fldCharType="separate"/>
-          </w:r>
-          <w:r>
-            <w:rPr>
-              <w:rtl w:val="0"/>
-            </w:rPr>
-            <w:t xml:space="preserve">28</w:t>
-          </w:r>
-          <w:r>
-            <w:fldChar w:fldCharType="end"/>
-          </w:r>
-          <w:r>
-            <w:rPr>
-              <w:rtl w:val="0"/>
-            </w:rPr>
-          </w:r>
-        </w:p>
-        <w:p>
-          <w:pPr>
-            <w:widowControl w:val="0"/>
-            <w:tabs>
-              <w:tab w:val="right" w:leader="dot" w:pos="9025.511811023624"/>
-            </w:tabs>
-            <w:spacing w:before="60" w:line="240" w:lineRule="auto"/>
-            <w:ind w:left="360" w:firstLine="0"/>
-            <w:rPr>
-              <w:color w:val="000000"/>
-              <w:u w:val="none"/>
-            </w:rPr>
-          </w:pPr>
-          <w:hyperlink w:anchor="">
-            <w:r>
-              <w:rPr>
-                <w:color w:val="000000"/>
-                <w:u w:val="none"/>
-                <w:rtl w:val="0"/>
-              </w:rPr>
-              <w:t xml:space="preserve">7.3 Lógica / pseudocódigo</w:t>
-              <w:tab/>
-            </w:r>
-          </w:hyperlink>
-          <w:r>
-            <w:fldChar w:fldCharType="begin"/>
-            <w:instrText xml:space="preserve"> PAGEREF  \h </w:instrText>
-            <w:fldChar w:fldCharType="separate"/>
-          </w:r>
-          <w:r>
-            <w:rPr>
-              <w:rtl w:val="0"/>
-            </w:rPr>
-            <w:t xml:space="preserve">31</w:t>
-          </w:r>
-          <w:r>
-            <w:fldChar w:fldCharType="end"/>
-          </w:r>
-          <w:r>
-            <w:rPr>
-              <w:rtl w:val="0"/>
-            </w:rPr>
-          </w:r>
-        </w:p>
-        <w:p>
-          <w:pPr>
-            <w:widowControl w:val="0"/>
-            <w:tabs>
-              <w:tab w:val="right" w:leader="dot" w:pos="9025.511811023624"/>
-            </w:tabs>
-            <w:spacing w:before="60" w:line="240" w:lineRule="auto"/>
-            <w:ind w:left="720" w:firstLine="0"/>
-            <w:rPr>
-              <w:color w:val="000000"/>
-              <w:u w:val="none"/>
-            </w:rPr>
-          </w:pPr>
-          <w:hyperlink w:anchor="">
-            <w:r>
-              <w:rPr>
-                <w:color w:val="000000"/>
-                <w:u w:val="none"/>
-                <w:rtl w:val="0"/>
-              </w:rPr>
-              <w:t xml:space="preserve">Validación general de formularios</w:t>
-              <w:tab/>
-            </w:r>
-          </w:hyperlink>
-          <w:r>
-            <w:fldChar w:fldCharType="begin"/>
-            <w:instrText xml:space="preserve"> PAGEREF  \h </w:instrText>
-            <w:fldChar w:fldCharType="separate"/>
-          </w:r>
-          <w:r>
-            <w:rPr>
-              <w:rtl w:val="0"/>
-            </w:rPr>
-            <w:t xml:space="preserve">31</w:t>
-          </w:r>
-          <w:r>
-            <w:fldChar w:fldCharType="end"/>
-          </w:r>
-          <w:r>
-            <w:rPr>
-              <w:rtl w:val="0"/>
-            </w:rPr>
-          </w:r>
-        </w:p>
-        <w:p>
-          <w:pPr>
-            <w:widowControl w:val="0"/>
-            <w:tabs>
-              <w:tab w:val="right" w:leader="dot" w:pos="9025.511811023624"/>
-            </w:tabs>
-            <w:spacing w:before="60" w:line="240" w:lineRule="auto"/>
-            <w:ind w:left="720" w:firstLine="0"/>
-            <w:rPr>
-              <w:color w:val="000000"/>
-              <w:u w:val="none"/>
-            </w:rPr>
-          </w:pPr>
-          <w:hyperlink w:anchor="">
-            <w:r>
-              <w:rPr>
-                <w:color w:val="000000"/>
-                <w:u w:val="none"/>
-                <w:rtl w:val="0"/>
-              </w:rPr>
-              <w:t xml:space="preserve">Inicio de sesión</w:t>
-              <w:tab/>
-            </w:r>
-          </w:hyperlink>
-          <w:r>
-            <w:fldChar w:fldCharType="begin"/>
-            <w:instrText xml:space="preserve"> PAGEREF  \h </w:instrText>
-            <w:fldChar w:fldCharType="separate"/>
-          </w:r>
-          <w:r>
-            <w:rPr>
-              <w:rtl w:val="0"/>
-            </w:rPr>
-            <w:t xml:space="preserve">32</w:t>
-          </w:r>
-          <w:r>
-            <w:fldChar w:fldCharType="end"/>
-          </w:r>
-          <w:r>
-            <w:rPr>
-              <w:rtl w:val="0"/>
-            </w:rPr>
-          </w:r>
-        </w:p>
-        <w:p>
-          <w:pPr>
-            <w:widowControl w:val="0"/>
-            <w:tabs>
-              <w:tab w:val="right" w:leader="dot" w:pos="9025.511811023624"/>
-            </w:tabs>
-            <w:spacing w:before="60" w:line="240" w:lineRule="auto"/>
-            <w:ind w:left="720" w:firstLine="0"/>
-            <w:rPr>
-              <w:color w:val="000000"/>
-              <w:u w:val="none"/>
-            </w:rPr>
-          </w:pPr>
-          <w:hyperlink w:anchor="">
-            <w:r>
-              <w:rPr>
-                <w:color w:val="000000"/>
-                <w:u w:val="none"/>
-                <w:rtl w:val="0"/>
-              </w:rPr>
-              <w:t xml:space="preserve">Guardado inicial de un curso</w:t>
-              <w:tab/>
-            </w:r>
-          </w:hyperlink>
-          <w:r>
-            <w:fldChar w:fldCharType="begin"/>
-            <w:instrText xml:space="preserve"> PAGEREF  \h </w:instrText>
-            <w:fldChar w:fldCharType="separate"/>
-          </w:r>
-          <w:r>
-            <w:rPr>
-              <w:rtl w:val="0"/>
-            </w:rPr>
-            <w:t xml:space="preserve">32</w:t>
-          </w:r>
-          <w:r>
-            <w:fldChar w:fldCharType="end"/>
-          </w:r>
-          <w:r>
-            <w:rPr>
-              <w:rtl w:val="0"/>
-            </w:rPr>
-          </w:r>
-        </w:p>
-        <w:p>
-          <w:pPr>
-            <w:widowControl w:val="0"/>
-            <w:tabs>
-              <w:tab w:val="right" w:leader="dot" w:pos="9025.511811023624"/>
-            </w:tabs>
-            <w:spacing w:before="60" w:line="240" w:lineRule="auto"/>
-            <w:ind w:left="720" w:firstLine="0"/>
-            <w:rPr>
-              <w:color w:val="000000"/>
-              <w:u w:val="none"/>
-            </w:rPr>
-          </w:pPr>
-          <w:hyperlink w:anchor="">
-            <w:r>
-              <w:rPr>
-                <w:color w:val="000000"/>
-                <w:u w:val="none"/>
-                <w:rtl w:val="0"/>
-              </w:rPr>
-              <w:t xml:space="preserve">Flujo de aprobación del curso</w:t>
-              <w:tab/>
-            </w:r>
-          </w:hyperlink>
-          <w:r>
-            <w:fldChar w:fldCharType="begin"/>
-            <w:instrText xml:space="preserve"> PAGEREF  \h </w:instrText>
-            <w:fldChar w:fldCharType="separate"/>
-          </w:r>
-          <w:r>
-            <w:rPr>
-              <w:rtl w:val="0"/>
-            </w:rPr>
-            <w:t xml:space="preserve">32</w:t>
-          </w:r>
-          <w:r>
-            <w:fldChar w:fldCharType="end"/>
-          </w:r>
-          <w:r>
-            <w:rPr>
-              <w:rtl w:val="0"/>
-            </w:rPr>
-          </w:r>
-        </w:p>
-        <w:p>
-          <w:pPr>
-            <w:widowControl w:val="0"/>
-            <w:tabs>
-              <w:tab w:val="right" w:leader="dot" w:pos="9025.511811023624"/>
+              <w:tab w:val="right" w:leader="dot" w:pos="12000"/>
             </w:tabs>
             <w:spacing w:before="60" w:line="240" w:lineRule="auto"/>
             <w:rPr>
@@ -2752,130 +2622,26 @@
           <w:hyperlink w:anchor="">
             <w:r>
               <w:rPr>
+                <w:rFonts w:ascii="Arial" w:cs="Arial" w:eastAsia="Arial" w:hAnsi="Arial"/>
                 <w:b w:val="1"/>
                 <w:bCs w:val="1"/>
+                <w:i w:val="0"/>
+                <w:iCs w:val="0"/>
+                <w:smallCaps w:val="0"/>
+                <w:strike w:val="0"/>
                 <w:color w:val="000000"/>
+                <w:sz w:val="22"/>
+                <w:szCs w:val="22"/>
                 <w:u w:val="none"/>
-                <w:rtl w:val="0"/>
-              </w:rPr>
-              <w:t xml:space="preserve">8. Casos de Prueba</w:t>
-              <w:tab/>
-            </w:r>
-          </w:hyperlink>
-          <w:r>
-            <w:fldChar w:fldCharType="begin"/>
-            <w:instrText xml:space="preserve"> PAGEREF  \h </w:instrText>
-            <w:fldChar w:fldCharType="separate"/>
-          </w:r>
-          <w:r>
-            <w:rPr>
-              <w:b w:val="1"/>
-              <w:bCs w:val="1"/>
-              <w:rtl w:val="0"/>
-            </w:rPr>
-            <w:t xml:space="preserve">33</w:t>
-          </w:r>
-          <w:r>
-            <w:fldChar w:fldCharType="end"/>
-          </w:r>
-          <w:r>
-            <w:rPr>
-              <w:rtl w:val="0"/>
-            </w:rPr>
-          </w:r>
-        </w:p>
-        <w:p>
-          <w:pPr>
-            <w:widowControl w:val="0"/>
-            <w:tabs>
-              <w:tab w:val="right" w:leader="dot" w:pos="9025.511811023624"/>
-            </w:tabs>
-            <w:spacing w:before="60" w:line="240" w:lineRule="auto"/>
-            <w:rPr>
-              <w:b w:val="1"/>
-              <w:bCs w:val="1"/>
-              <w:color w:val="000000"/>
-              <w:u w:val="none"/>
-            </w:rPr>
-          </w:pPr>
-          <w:hyperlink w:anchor="">
-            <w:r>
-              <w:rPr>
-                <w:b w:val="1"/>
-                <w:bCs w:val="1"/>
-                <w:color w:val="000000"/>
-                <w:u w:val="none"/>
-                <w:rtl w:val="0"/>
-              </w:rPr>
-              <w:t xml:space="preserve">9. Plan de Trabajo y Responsabilidades</w:t>
-              <w:tab/>
-            </w:r>
-          </w:hyperlink>
-          <w:r>
-            <w:fldChar w:fldCharType="begin"/>
-            <w:instrText xml:space="preserve"> PAGEREF  \h </w:instrText>
-            <w:fldChar w:fldCharType="separate"/>
-          </w:r>
-          <w:r>
-            <w:rPr>
-              <w:b w:val="1"/>
-              <w:bCs w:val="1"/>
-              <w:rtl w:val="0"/>
-            </w:rPr>
-            <w:t xml:space="preserve">36</w:t>
-          </w:r>
-          <w:r>
-            <w:fldChar w:fldCharType="end"/>
-          </w:r>
-          <w:r>
-            <w:rPr>
-              <w:rtl w:val="0"/>
-            </w:rPr>
-          </w:r>
-        </w:p>
-        <w:p>
-          <w:pPr>
-            <w:widowControl w:val="0"/>
-            <w:tabs>
-              <w:tab w:val="right" w:leader="dot" w:pos="9025.511811023624"/>
-            </w:tabs>
-            <w:spacing w:before="60" w:line="240" w:lineRule="auto"/>
-            <w:rPr>
-              <w:b w:val="1"/>
-              <w:bCs w:val="1"/>
-              <w:color w:val="000000"/>
-              <w:u w:val="none"/>
-            </w:rPr>
-          </w:pPr>
-          <w:hyperlink w:anchor="">
-            <w:r>
-              <w:rPr>
-                <w:b w:val="1"/>
-                <w:bCs w:val="1"/>
-                <w:color w:val="000000"/>
-                <w:u w:val="none"/>
+                <w:shd w:fill="auto" w:val="clear"/>
+                <w:vertAlign w:val="baseline"/>
                 <w:rtl w:val="0"/>
               </w:rPr>
               <w:t xml:space="preserve">10. Referencias</w:t>
               <w:tab/>
+              <w:t xml:space="preserve">37</w:t>
             </w:r>
           </w:hyperlink>
-          <w:r>
-            <w:fldChar w:fldCharType="begin"/>
-            <w:instrText xml:space="preserve"> PAGEREF  \h </w:instrText>
-            <w:fldChar w:fldCharType="separate"/>
-          </w:r>
-          <w:r>
-            <w:rPr>
-              <w:b w:val="1"/>
-              <w:bCs w:val="1"/>
-              <w:rtl w:val="0"/>
-            </w:rPr>
-            <w:t xml:space="preserve">37</w:t>
-          </w:r>
-          <w:r>
-            <w:fldChar w:fldCharType="end"/>
-          </w:r>
           <w:r>
             <w:rPr>
               <w:rtl w:val="0"/>
@@ -6535,22 +6301,13 @@
     </w:p>
     <w:p>
       <w:pPr>
-        <w:keepNext w:val="0"/>
+        <w:keepNext w:val="1"/>
         <w:pageBreakBefore w:val="0"/>
         <w:widowControl w:val="1"/>
-        <w:spacing w:after="120" w:before="0" w:line="264" w:lineRule="auto"/>
+        <w:spacing w:after="140" w:before="0" w:line="264" w:lineRule="auto"/>
+        <w:jc w:val="center"/>
         <w:rPr/>
       </w:pPr>
-      <w:r>
-        <w:rPr>
-          <w:rFonts w:ascii="Arial" w:cs="Arial" w:eastAsia="Arial" w:hAnsi="Arial"/>
-          <w:color w:val="000000"/>
-          <w:sz w:val="20"/>
-          <w:szCs w:val="20"/>
-          <w:rtl w:val="0"/>
-        </w:rPr>
-        <w:t xml:space="preserve">Figuras 1 y 2. index.html y pages/login.html.</w:t>
-      </w:r>
       <w:r>
         <w:rPr>
           <w:rtl w:val="0"/>
@@ -6569,11 +6326,11 @@
         <w:rPr>
           <w:rFonts w:ascii="Arial" w:cs="Arial" w:eastAsia="Arial" w:hAnsi="Arial"/>
           <w:color w:val="000000"/>
-          <w:sz w:val="21"/>
-          <w:szCs w:val="21"/>
-          <w:rtl w:val="0"/>
-        </w:rPr>
-        <w:t xml:space="preserve">La presentación explica el propósito del sistema y conduce al ingreso. El inicio de sesión agrupa correo y contraseña; los errores se mostrarán junto al campo o como mensaje general de credenciales.</w:t>
+          <w:sz w:val="20"/>
+          <w:szCs w:val="20"/>
+          <w:rtl w:val="0"/>
+        </w:rPr>
+        <w:t xml:space="preserve">Figuras 1 y 2. index.html y pages/login.html.</w:t>
       </w:r>
       <w:r>
         <w:rPr>
@@ -6583,11 +6340,34 @@
     </w:p>
     <w:p>
       <w:pPr>
-        <w:pStyle w:val="Heading2"/>
-        <w:keepNext w:val="1"/>
-        <w:pageBreakBefore w:val="1"/>
+        <w:keepNext w:val="0"/>
+        <w:pageBreakBefore w:val="0"/>
         <w:widowControl w:val="1"/>
-        <w:spacing w:after="140" w:before="200" w:line="264" w:lineRule="auto"/>
+        <w:spacing w:after="120" w:before="0" w:line="264" w:lineRule="auto"/>
+        <w:rPr/>
+      </w:pPr>
+      <w:r>
+        <w:rPr>
+          <w:rFonts w:ascii="Arial" w:cs="Arial" w:eastAsia="Arial" w:hAnsi="Arial"/>
+          <w:color w:val="000000"/>
+          <w:sz w:val="21"/>
+          <w:szCs w:val="21"/>
+          <w:rtl w:val="0"/>
+        </w:rPr>
+        <w:t xml:space="preserve">La presentación explica el propósito del sistema y conduce al ingreso. El inicio de sesión agrupa correo y contraseña; los errores se mostrarán junto al campo o como mensaje general de credenciales.</w:t>
+      </w:r>
+      <w:r>
+        <w:rPr>
+          <w:rtl w:val="0"/>
+        </w:rPr>
+      </w:r>
+    </w:p>
+    <w:p>
+      <w:pPr>
+        <w:keepNext w:val="0"/>
+        <w:pageBreakBefore w:val="0"/>
+        <w:widowControl w:val="1"/>
+        <w:spacing w:after="120" w:before="0" w:line="264" w:lineRule="auto"/>
         <w:rPr/>
       </w:pPr>
       <w:r>
@@ -6623,12 +6403,12 @@
           <wp:inline distB="0" distT="0" distL="114300" distR="114300">
             <wp:extent cx="5715000" cy="5286375"/>
             <wp:effectExtent b="0" l="0" r="0" t="0"/>
-            <wp:docPr descr="Figuras 3 y 4. pages/inicio.html y pages/usuarios.html. El panel ofrece acceso a usuarios, catálogos y cursos. El listado permite una búsqueda sencilla por nombre, registrar y editar. Si no hay coincidencias, se mostrará un mensaje dentro del área del listado." id="6" name="image8.png"/>
+            <wp:docPr descr="Figuras 3 y 4. pages/inicio.html y pages/usuarios.html. El panel ofrece acceso a usuarios, catálogos y cursos. El listado permite una búsqueda sencilla por nombre, registrar y editar. Si no hay coincidencias, se mostrará un mensaje dentro del área del listado." id="6" name="image4.png"/>
             <a:graphic>
               <a:graphicData uri="http://schemas.openxmlformats.org/drawingml/2006/picture">
                 <pic:pic>
                   <pic:nvPicPr>
-                    <pic:cNvPr descr="Figuras 3 y 4. pages/inicio.html y pages/usuarios.html. El panel ofrece acceso a usuarios, catálogos y cursos. El listado permite una búsqueda sencilla por nombre, registrar y editar. Si no hay coincidencias, se mostrará un mensaje dentro del área del listado." id="0" name="image8.png"/>
+                    <pic:cNvPr descr="Figuras 3 y 4. pages/inicio.html y pages/usuarios.html. El panel ofrece acceso a usuarios, catálogos y cursos. El listado permite una búsqueda sencilla por nombre, registrar y editar. Si no hay coincidencias, se mostrará un mensaje dentro del área del listado." id="0" name="image4.png"/>
                     <pic:cNvPicPr preferRelativeResize="0"/>
                   </pic:nvPicPr>
                   <pic:blipFill>
@@ -6748,12 +6528,12 @@
           <wp:inline distB="0" distT="0" distL="114300" distR="114300">
             <wp:extent cx="5715000" cy="5286375"/>
             <wp:effectExtent b="0" l="0" r="0" t="0"/>
-            <wp:docPr descr="Figuras 5 y 6. pages/usuario-formulario.html y pages/catalogos.html. El formulario agrupa datos personales, contacto y acceso, e incluye imagen opcional y edad calculada. El rol procede de opciones predefinidas; para el prototipo funcional se utilizará administrador. Los ocho catálogos tienen el mismo patrón de acceso." id="9" name="image9.png"/>
+            <wp:docPr descr="Figuras 5 y 6. pages/usuario-formulario.html y pages/catalogos.html. El formulario agrupa datos personales, contacto y acceso, e incluye imagen opcional y edad calculada. El rol procede de opciones predefinidas; para el prototipo funcional se utilizará administrador. Los ocho catálogos tienen el mismo patrón de acceso." id="9" name="image1.png"/>
             <a:graphic>
               <a:graphicData uri="http://schemas.openxmlformats.org/drawingml/2006/picture">
                 <pic:pic>
                   <pic:nvPicPr>
-                    <pic:cNvPr descr="Figuras 5 y 6. pages/usuario-formulario.html y pages/catalogos.html. El formulario agrupa datos personales, contacto y acceso, e incluye imagen opcional y edad calculada. El rol procede de opciones predefinidas; para el prototipo funcional se utilizará administrador. Los ocho catálogos tienen el mismo patrón de acceso." id="0" name="image9.png"/>
+                    <pic:cNvPr descr="Figuras 5 y 6. pages/usuario-formulario.html y pages/catalogos.html. El formulario agrupa datos personales, contacto y acceso, e incluye imagen opcional y edad calculada. El rol procede de opciones predefinidas; para el prototipo funcional se utilizará administrador. Los ocho catálogos tienen el mismo patrón de acceso." id="0" name="image1.png"/>
                     <pic:cNvPicPr preferRelativeResize="0"/>
                   </pic:nvPicPr>
                   <pic:blipFill>
@@ -6873,12 +6653,12 @@
           <wp:inline distB="0" distT="0" distL="114300" distR="114300">
             <wp:extent cx="5715000" cy="5286375"/>
             <wp:effectExtent b="0" l="0" r="0" t="0"/>
-            <wp:docPr descr="Figuras 7 y 8. pages/catalogo-listado.html y pages/catalogo-formulario.html. Se representa escuelas como ejemplo del patrón compartido. Los campos cambiarán según el catálogo descrito en la sección 5.2.3. Los códigos automáticos se mostrarán como datos calculados. Registrar y modificar utilizarán el mismo formulario." id="8" name="image1.png"/>
+            <wp:docPr descr="Figuras 7 y 8. pages/catalogo-listado.html y pages/catalogo-formulario.html. Se representa escuelas como ejemplo del patrón compartido. Los campos cambiarán según el catálogo descrito en la sección 5.2.3. Los códigos automáticos se mostrarán como datos calculados. Registrar y modificar utilizarán el mismo formulario." id="8" name="image7.png"/>
             <a:graphic>
               <a:graphicData uri="http://schemas.openxmlformats.org/drawingml/2006/picture">
                 <pic:pic>
                   <pic:nvPicPr>
-                    <pic:cNvPr descr="Figuras 7 y 8. pages/catalogo-listado.html y pages/catalogo-formulario.html. Se representa escuelas como ejemplo del patrón compartido. Los campos cambiarán según el catálogo descrito en la sección 5.2.3. Los códigos automáticos se mostrarán como datos calculados. Registrar y modificar utilizarán el mismo formulario." id="0" name="image1.png"/>
+                    <pic:cNvPr descr="Figuras 7 y 8. pages/catalogo-listado.html y pages/catalogo-formulario.html. Se representa escuelas como ejemplo del patrón compartido. Los campos cambiarán según el catálogo descrito en la sección 5.2.3. Los códigos automáticos se mostrarán como datos calculados. Registrar y modificar utilizarán el mismo formulario." id="0" name="image7.png"/>
                     <pic:cNvPicPr preferRelativeResize="0"/>
                   </pic:nvPicPr>
                   <pic:blipFill>
@@ -6998,12 +6778,12 @@
           <wp:inline distB="0" distT="0" distL="114300" distR="114300">
             <wp:extent cx="5715000" cy="5286375"/>
             <wp:effectExtent b="0" l="0" r="0" t="0"/>
-            <wp:docPr descr="Figuras 9 y 10. pages/cursos.html y pages/curso-formulario.html. El listado ofrece consulta, edición y búsqueda por nombre. El formulario inicia con escuela, código y nombre; después continúa con las ocho secciones definidas en 5.2.4. Los textos extensos ocupan todo el ancho y conservan visibles sus límites de caracteres." id="2" name="image2.png"/>
+            <wp:docPr descr="Figuras 9 y 10. pages/cursos.html y pages/curso-formulario.html. El listado ofrece consulta, edición y búsqueda por nombre. El formulario inicia con escuela, código y nombre; después continúa con las ocho secciones definidas en 5.2.4. Los textos extensos ocupan todo el ancho y conservan visibles sus límites de caracteres." id="2" name="image9.png"/>
             <a:graphic>
               <a:graphicData uri="http://schemas.openxmlformats.org/drawingml/2006/picture">
                 <pic:pic>
                   <pic:nvPicPr>
-                    <pic:cNvPr descr="Figuras 9 y 10. pages/cursos.html y pages/curso-formulario.html. El listado ofrece consulta, edición y búsqueda por nombre. El formulario inicia con escuela, código y nombre; después continúa con las ocho secciones definidas en 5.2.4. Los textos extensos ocupan todo el ancho y conservan visibles sus límites de caracteres." id="0" name="image2.png"/>
+                    <pic:cNvPr descr="Figuras 9 y 10. pages/cursos.html y pages/curso-formulario.html. El listado ofrece consulta, edición y búsqueda por nombre. El formulario inicia con escuela, código y nombre; después continúa con las ocho secciones definidas en 5.2.4. Los textos extensos ocupan todo el ancho y conservan visibles sus límites de caracteres." id="0" name="image9.png"/>
                     <pic:cNvPicPr preferRelativeResize="0"/>
                   </pic:nvPicPr>
                   <pic:blipFill>
@@ -7123,12 +6903,12 @@
           <wp:inline distB="0" distT="0" distL="114300" distR="114300">
             <wp:extent cx="5715000" cy="5286375"/>
             <wp:effectExtent b="0" l="0" r="0" t="0"/>
-            <wp:docPr descr="Figuras 11 y 12. pages/curso-detalle.html y adaptación del formulario de cursos. El detalle conserva el orden del formulario y distingue información registrada de datos pendientes. La aprobación depende de completar los datos obligatorios según la sección 7.3. En móvil, navegación, campos y botones se apilan sin ocultar información." id="1" name="image7.png"/>
+            <wp:docPr descr="Figuras 11 y 12. pages/curso-detalle.html y adaptación del formulario de cursos. El detalle conserva el orden del formulario y distingue información registrada de datos pendientes. La aprobación depende de completar los datos obligatorios según la sección 7.3. En móvil, navegación, campos y botones se apilan sin ocultar información." id="1" name="image8.png"/>
             <a:graphic>
               <a:graphicData uri="http://schemas.openxmlformats.org/drawingml/2006/picture">
                 <pic:pic>
                   <pic:nvPicPr>
-                    <pic:cNvPr descr="Figuras 11 y 12. pages/curso-detalle.html y adaptación del formulario de cursos. El detalle conserva el orden del formulario y distingue información registrada de datos pendientes. La aprobación depende de completar los datos obligatorios según la sección 7.3. En móvil, navegación, campos y botones se apilan sin ocultar información." id="0" name="image7.png"/>
+                    <pic:cNvPr descr="Figuras 11 y 12. pages/curso-detalle.html y adaptación del formulario de cursos. El detalle conserva el orden del formulario y distingue información registrada de datos pendientes. La aprobación depende de completar los datos obligatorios según la sección 7.3. En móvil, navegación, campos y botones se apilan sin ocultar información." id="0" name="image8.png"/>
                     <pic:cNvPicPr preferRelativeResize="0"/>
                   </pic:nvPicPr>
                   <pic:blipFill>
@@ -7248,12 +7028,12 @@
           <wp:inline distB="0" distT="0" distL="114300" distR="114300">
             <wp:extent cx="5715000" cy="5286375"/>
             <wp:effectExtent b="0" l="0" r="0" t="0"/>
-            <wp:docPr descr="Figuras 13 y 14. pages/cambiar-contrasena.html y pages/recuperar-contrasena.html. Estas vistas se incluyen como diseño visual. Según las secciones 7.1 y 7.2.1, el prototipo no cambiará contraseñas ni enviará correos de recuperación. La acción correspondiente permanecerá deshabilitada y se indicará su disponibilidad futura." id="4" name="image4.png"/>
+            <wp:docPr descr="Figuras 13 y 14. pages/cambiar-contrasena.html y pages/recuperar-contrasena.html. Estas vistas se incluyen como diseño visual. Según las secciones 7.1 y 7.2.1, el prototipo no cambiará contraseñas ni enviará correos de recuperación. La acción correspondiente permanecerá deshabilitada y se indicará su disponibilidad futura." id="4" name="image3.png"/>
             <a:graphic>
               <a:graphicData uri="http://schemas.openxmlformats.org/drawingml/2006/picture">
                 <pic:pic>
                   <pic:nvPicPr>
-                    <pic:cNvPr descr="Figuras 13 y 14. pages/cambiar-contrasena.html y pages/recuperar-contrasena.html. Estas vistas se incluyen como diseño visual. Según las secciones 7.1 y 7.2.1, el prototipo no cambiará contraseñas ni enviará correos de recuperación. La acción correspondiente permanecerá deshabilitada y se indicará su disponibilidad futura." id="0" name="image4.png"/>
+                    <pic:cNvPr descr="Figuras 13 y 14. pages/cambiar-contrasena.html y pages/recuperar-contrasena.html. Estas vistas se incluyen como diseño visual. Según las secciones 7.1 y 7.2.1, el prototipo no cambiará contraseñas ni enviará correos de recuperación. La acción correspondiente permanecerá deshabilitada y se indicará su disponibilidad futura." id="0" name="image3.png"/>
                     <pic:cNvPicPr preferRelativeResize="0"/>
                   </pic:nvPicPr>
                   <pic:blipFill>

</xml_diff>